<commit_message>
Use old-Gisola style clone commands in README and manual
</commit_message>
<xml_diff>
--- a/docs/GisolaBaBoo_User_Manual.docx
+++ b/docs/GisolaBaBoo_User_Manual.docx
@@ -149,7 +149,7 @@
       <w:r>
         <w:fldChar w:fldCharType="separate"/>
       </w:r>
-      <w:hyperlink w:anchor="_Toc242733518" w:history="1">
+      <w:hyperlink w:anchor="_Toc242735634" w:history="1">
         <w:r>
           <w:rPr>
             <w:rStyle w:val="Hyperlink"/>
@@ -195,7 +195,7 @@
             <w:noProof/>
             <w:webHidden/>
           </w:rPr>
-          <w:instrText xml:space="preserve"> PAGEREF _Toc242733518 \h </w:instrText>
+          <w:instrText xml:space="preserve"> PAGEREF _Toc242735634 \h </w:instrText>
         </w:r>
         <w:r>
           <w:rPr>
@@ -243,7 +243,7 @@
           <w14:ligatures w14:val="standardContextual"/>
         </w:rPr>
       </w:pPr>
-      <w:hyperlink w:anchor="_Toc242733519" w:history="1">
+      <w:hyperlink w:anchor="_Toc242735635" w:history="1">
         <w:r>
           <w:rPr>
             <w:rStyle w:val="Hyperlink"/>
@@ -289,7 +289,7 @@
             <w:noProof/>
             <w:webHidden/>
           </w:rPr>
-          <w:instrText xml:space="preserve"> PAGEREF _Toc242733519 \h </w:instrText>
+          <w:instrText xml:space="preserve"> PAGEREF _Toc242735635 \h </w:instrText>
         </w:r>
         <w:r>
           <w:rPr>
@@ -337,7 +337,7 @@
           <w14:ligatures w14:val="standardContextual"/>
         </w:rPr>
       </w:pPr>
-      <w:hyperlink w:anchor="_Toc242733520" w:history="1">
+      <w:hyperlink w:anchor="_Toc242735636" w:history="1">
         <w:r>
           <w:rPr>
             <w:rStyle w:val="Hyperlink"/>
@@ -383,7 +383,7 @@
             <w:noProof/>
             <w:webHidden/>
           </w:rPr>
-          <w:instrText xml:space="preserve"> PAGEREF _Toc242733520 \h </w:instrText>
+          <w:instrText xml:space="preserve"> PAGEREF _Toc242735636 \h </w:instrText>
         </w:r>
         <w:r>
           <w:rPr>
@@ -431,7 +431,7 @@
           <w14:ligatures w14:val="standardContextual"/>
         </w:rPr>
       </w:pPr>
-      <w:hyperlink w:anchor="_Toc242733521" w:history="1">
+      <w:hyperlink w:anchor="_Toc242735637" w:history="1">
         <w:r>
           <w:rPr>
             <w:rStyle w:val="Hyperlink"/>
@@ -477,7 +477,7 @@
             <w:noProof/>
             <w:webHidden/>
           </w:rPr>
-          <w:instrText xml:space="preserve"> PAGEREF _Toc242733521 \h </w:instrText>
+          <w:instrText xml:space="preserve"> PAGEREF _Toc242735637 \h </w:instrText>
         </w:r>
         <w:r>
           <w:rPr>
@@ -525,7 +525,7 @@
           <w14:ligatures w14:val="standardContextual"/>
         </w:rPr>
       </w:pPr>
-      <w:hyperlink w:anchor="_Toc242733522" w:history="1">
+      <w:hyperlink w:anchor="_Toc242735638" w:history="1">
         <w:r>
           <w:rPr>
             <w:rStyle w:val="Hyperlink"/>
@@ -571,7 +571,7 @@
             <w:noProof/>
             <w:webHidden/>
           </w:rPr>
-          <w:instrText xml:space="preserve"> PAGEREF _Toc242733522 \h </w:instrText>
+          <w:instrText xml:space="preserve"> PAGEREF _Toc242735638 \h </w:instrText>
         </w:r>
         <w:r>
           <w:rPr>
@@ -619,7 +619,7 @@
           <w14:ligatures w14:val="standardContextual"/>
         </w:rPr>
       </w:pPr>
-      <w:hyperlink w:anchor="_Toc242733523" w:history="1">
+      <w:hyperlink w:anchor="_Toc242735639" w:history="1">
         <w:r>
           <w:rPr>
             <w:rStyle w:val="Hyperlink"/>
@@ -665,7 +665,7 @@
             <w:noProof/>
             <w:webHidden/>
           </w:rPr>
-          <w:instrText xml:space="preserve"> PAGEREF _Toc242733523 \h </w:instrText>
+          <w:instrText xml:space="preserve"> PAGEREF _Toc242735639 \h </w:instrText>
         </w:r>
         <w:r>
           <w:rPr>
@@ -713,7 +713,7 @@
           <w14:ligatures w14:val="standardContextual"/>
         </w:rPr>
       </w:pPr>
-      <w:hyperlink w:anchor="_Toc242733524" w:history="1">
+      <w:hyperlink w:anchor="_Toc242735640" w:history="1">
         <w:r>
           <w:rPr>
             <w:rStyle w:val="Hyperlink"/>
@@ -759,7 +759,7 @@
             <w:noProof/>
             <w:webHidden/>
           </w:rPr>
-          <w:instrText xml:space="preserve"> PAGEREF _Toc242733524 \h </w:instrText>
+          <w:instrText xml:space="preserve"> PAGEREF _Toc242735640 \h </w:instrText>
         </w:r>
         <w:r>
           <w:rPr>
@@ -807,7 +807,7 @@
           <w14:ligatures w14:val="standardContextual"/>
         </w:rPr>
       </w:pPr>
-      <w:hyperlink w:anchor="_Toc242733525" w:history="1">
+      <w:hyperlink w:anchor="_Toc242735641" w:history="1">
         <w:r>
           <w:rPr>
             <w:rStyle w:val="Hyperlink"/>
@@ -853,7 +853,7 @@
             <w:noProof/>
             <w:webHidden/>
           </w:rPr>
-          <w:instrText xml:space="preserve"> PAGEREF _Toc242733525 \h </w:instrText>
+          <w:instrText xml:space="preserve"> PAGEREF _Toc242735641 \h </w:instrText>
         </w:r>
         <w:r>
           <w:rPr>
@@ -901,7 +901,7 @@
           <w14:ligatures w14:val="standardContextual"/>
         </w:rPr>
       </w:pPr>
-      <w:hyperlink w:anchor="_Toc242733526" w:history="1">
+      <w:hyperlink w:anchor="_Toc242735642" w:history="1">
         <w:r>
           <w:rPr>
             <w:rStyle w:val="Hyperlink"/>
@@ -947,7 +947,7 @@
             <w:noProof/>
             <w:webHidden/>
           </w:rPr>
-          <w:instrText xml:space="preserve"> PAGEREF _Toc242733526 \h </w:instrText>
+          <w:instrText xml:space="preserve"> PAGEREF _Toc242735642 \h </w:instrText>
         </w:r>
         <w:r>
           <w:rPr>
@@ -995,7 +995,7 @@
           <w14:ligatures w14:val="standardContextual"/>
         </w:rPr>
       </w:pPr>
-      <w:hyperlink w:anchor="_Toc242733527" w:history="1">
+      <w:hyperlink w:anchor="_Toc242735643" w:history="1">
         <w:r>
           <w:rPr>
             <w:rStyle w:val="Hyperlink"/>
@@ -1041,7 +1041,7 @@
             <w:noProof/>
             <w:webHidden/>
           </w:rPr>
-          <w:instrText xml:space="preserve"> PAGEREF _Toc242733527 \h </w:instrText>
+          <w:instrText xml:space="preserve"> PAGEREF _Toc242735643 \h </w:instrText>
         </w:r>
         <w:r>
           <w:rPr>
@@ -1089,7 +1089,7 @@
           <w14:ligatures w14:val="standardContextual"/>
         </w:rPr>
       </w:pPr>
-      <w:hyperlink w:anchor="_Toc242733528" w:history="1">
+      <w:hyperlink w:anchor="_Toc242735644" w:history="1">
         <w:r>
           <w:rPr>
             <w:rStyle w:val="Hyperlink"/>
@@ -1135,7 +1135,7 @@
             <w:noProof/>
             <w:webHidden/>
           </w:rPr>
-          <w:instrText xml:space="preserve"> PAGEREF _Toc242733528 \h </w:instrText>
+          <w:instrText xml:space="preserve"> PAGEREF _Toc242735644 \h </w:instrText>
         </w:r>
         <w:r>
           <w:rPr>
@@ -1183,7 +1183,7 @@
           <w14:ligatures w14:val="standardContextual"/>
         </w:rPr>
       </w:pPr>
-      <w:hyperlink w:anchor="_Toc242733529" w:history="1">
+      <w:hyperlink w:anchor="_Toc242735645" w:history="1">
         <w:r>
           <w:rPr>
             <w:rStyle w:val="Hyperlink"/>
@@ -1229,7 +1229,7 @@
             <w:noProof/>
             <w:webHidden/>
           </w:rPr>
-          <w:instrText xml:space="preserve"> PAGEREF _Toc242733529 \h </w:instrText>
+          <w:instrText xml:space="preserve"> PAGEREF _Toc242735645 \h </w:instrText>
         </w:r>
         <w:r>
           <w:rPr>
@@ -1277,7 +1277,7 @@
           <w14:ligatures w14:val="standardContextual"/>
         </w:rPr>
       </w:pPr>
-      <w:hyperlink w:anchor="_Toc242733530" w:history="1">
+      <w:hyperlink w:anchor="_Toc242735646" w:history="1">
         <w:r>
           <w:rPr>
             <w:rStyle w:val="Hyperlink"/>
@@ -1323,7 +1323,7 @@
             <w:noProof/>
             <w:webHidden/>
           </w:rPr>
-          <w:instrText xml:space="preserve"> PAGEREF _Toc242733530 \h </w:instrText>
+          <w:instrText xml:space="preserve"> PAGEREF _Toc242735646 \h </w:instrText>
         </w:r>
         <w:r>
           <w:rPr>
@@ -1371,7 +1371,7 @@
           <w14:ligatures w14:val="standardContextual"/>
         </w:rPr>
       </w:pPr>
-      <w:hyperlink w:anchor="_Toc242733531" w:history="1">
+      <w:hyperlink w:anchor="_Toc242735647" w:history="1">
         <w:r>
           <w:rPr>
             <w:rStyle w:val="Hyperlink"/>
@@ -1417,7 +1417,7 @@
             <w:noProof/>
             <w:webHidden/>
           </w:rPr>
-          <w:instrText xml:space="preserve"> PAGEREF _Toc242733531 \h </w:instrText>
+          <w:instrText xml:space="preserve"> PAGEREF _Toc242735647 \h </w:instrText>
         </w:r>
         <w:r>
           <w:rPr>
@@ -1465,7 +1465,7 @@
           <w14:ligatures w14:val="standardContextual"/>
         </w:rPr>
       </w:pPr>
-      <w:hyperlink w:anchor="_Toc242733532" w:history="1">
+      <w:hyperlink w:anchor="_Toc242735648" w:history="1">
         <w:r>
           <w:rPr>
             <w:rStyle w:val="Hyperlink"/>
@@ -1511,7 +1511,7 @@
             <w:noProof/>
             <w:webHidden/>
           </w:rPr>
-          <w:instrText xml:space="preserve"> PAGEREF _Toc242733532 \h </w:instrText>
+          <w:instrText xml:space="preserve"> PAGEREF _Toc242735648 \h </w:instrText>
         </w:r>
         <w:r>
           <w:rPr>
@@ -1559,7 +1559,7 @@
           <w14:ligatures w14:val="standardContextual"/>
         </w:rPr>
       </w:pPr>
-      <w:hyperlink w:anchor="_Toc242733533" w:history="1">
+      <w:hyperlink w:anchor="_Toc242735649" w:history="1">
         <w:r>
           <w:rPr>
             <w:rStyle w:val="Hyperlink"/>
@@ -1605,7 +1605,7 @@
             <w:noProof/>
             <w:webHidden/>
           </w:rPr>
-          <w:instrText xml:space="preserve"> PAGEREF _Toc242733533 \h </w:instrText>
+          <w:instrText xml:space="preserve"> PAGEREF _Toc242735649 \h </w:instrText>
         </w:r>
         <w:r>
           <w:rPr>
@@ -1653,7 +1653,7 @@
           <w14:ligatures w14:val="standardContextual"/>
         </w:rPr>
       </w:pPr>
-      <w:hyperlink w:anchor="_Toc242733534" w:history="1">
+      <w:hyperlink w:anchor="_Toc242735650" w:history="1">
         <w:r>
           <w:rPr>
             <w:rStyle w:val="Hyperlink"/>
@@ -1699,7 +1699,7 @@
             <w:noProof/>
             <w:webHidden/>
           </w:rPr>
-          <w:instrText xml:space="preserve"> PAGEREF _Toc242733534 \h </w:instrText>
+          <w:instrText xml:space="preserve"> PAGEREF _Toc242735650 \h </w:instrText>
         </w:r>
         <w:r>
           <w:rPr>
@@ -1747,7 +1747,7 @@
           <w14:ligatures w14:val="standardContextual"/>
         </w:rPr>
       </w:pPr>
-      <w:hyperlink w:anchor="_Toc242733535" w:history="1">
+      <w:hyperlink w:anchor="_Toc242735651" w:history="1">
         <w:r>
           <w:rPr>
             <w:rStyle w:val="Hyperlink"/>
@@ -1793,7 +1793,7 @@
             <w:noProof/>
             <w:webHidden/>
           </w:rPr>
-          <w:instrText xml:space="preserve"> PAGEREF _Toc242733535 \h </w:instrText>
+          <w:instrText xml:space="preserve"> PAGEREF _Toc242735651 \h </w:instrText>
         </w:r>
         <w:r>
           <w:rPr>
@@ -1841,7 +1841,7 @@
           <w14:ligatures w14:val="standardContextual"/>
         </w:rPr>
       </w:pPr>
-      <w:hyperlink w:anchor="_Toc242733536" w:history="1">
+      <w:hyperlink w:anchor="_Toc242735652" w:history="1">
         <w:r>
           <w:rPr>
             <w:rStyle w:val="Hyperlink"/>
@@ -1887,7 +1887,7 @@
             <w:noProof/>
             <w:webHidden/>
           </w:rPr>
-          <w:instrText xml:space="preserve"> PAGEREF _Toc242733536 \h </w:instrText>
+          <w:instrText xml:space="preserve"> PAGEREF _Toc242735652 \h </w:instrText>
         </w:r>
         <w:r>
           <w:rPr>
@@ -1935,7 +1935,7 @@
           <w14:ligatures w14:val="standardContextual"/>
         </w:rPr>
       </w:pPr>
-      <w:hyperlink w:anchor="_Toc242733537" w:history="1">
+      <w:hyperlink w:anchor="_Toc242735653" w:history="1">
         <w:r>
           <w:rPr>
             <w:rStyle w:val="Hyperlink"/>
@@ -1981,7 +1981,7 @@
             <w:noProof/>
             <w:webHidden/>
           </w:rPr>
-          <w:instrText xml:space="preserve"> PAGEREF _Toc242733537 \h </w:instrText>
+          <w:instrText xml:space="preserve"> PAGEREF _Toc242735653 \h </w:instrText>
         </w:r>
         <w:r>
           <w:rPr>
@@ -2029,7 +2029,7 @@
           <w14:ligatures w14:val="standardContextual"/>
         </w:rPr>
       </w:pPr>
-      <w:hyperlink w:anchor="_Toc242733538" w:history="1">
+      <w:hyperlink w:anchor="_Toc242735654" w:history="1">
         <w:r>
           <w:rPr>
             <w:rStyle w:val="Hyperlink"/>
@@ -2075,7 +2075,7 @@
             <w:noProof/>
             <w:webHidden/>
           </w:rPr>
-          <w:instrText xml:space="preserve"> PAGEREF _Toc242733538 \h </w:instrText>
+          <w:instrText xml:space="preserve"> PAGEREF _Toc242735654 \h </w:instrText>
         </w:r>
         <w:r>
           <w:rPr>
@@ -2123,7 +2123,7 @@
           <w14:ligatures w14:val="standardContextual"/>
         </w:rPr>
       </w:pPr>
-      <w:hyperlink w:anchor="_Toc242733539" w:history="1">
+      <w:hyperlink w:anchor="_Toc242735655" w:history="1">
         <w:r>
           <w:rPr>
             <w:rStyle w:val="Hyperlink"/>
@@ -2169,7 +2169,7 @@
             <w:noProof/>
             <w:webHidden/>
           </w:rPr>
-          <w:instrText xml:space="preserve"> PAGEREF _Toc242733539 \h </w:instrText>
+          <w:instrText xml:space="preserve"> PAGEREF _Toc242735655 \h </w:instrText>
         </w:r>
         <w:r>
           <w:rPr>
@@ -2217,7 +2217,7 @@
           <w14:ligatures w14:val="standardContextual"/>
         </w:rPr>
       </w:pPr>
-      <w:hyperlink w:anchor="_Toc242733540" w:history="1">
+      <w:hyperlink w:anchor="_Toc242735656" w:history="1">
         <w:r>
           <w:rPr>
             <w:rStyle w:val="Hyperlink"/>
@@ -2263,7 +2263,7 @@
             <w:noProof/>
             <w:webHidden/>
           </w:rPr>
-          <w:instrText xml:space="preserve"> PAGEREF _Toc242733540 \h </w:instrText>
+          <w:instrText xml:space="preserve"> PAGEREF _Toc242735656 \h </w:instrText>
         </w:r>
         <w:r>
           <w:rPr>
@@ -2311,7 +2311,7 @@
           <w14:ligatures w14:val="standardContextual"/>
         </w:rPr>
       </w:pPr>
-      <w:hyperlink w:anchor="_Toc242733541" w:history="1">
+      <w:hyperlink w:anchor="_Toc242735657" w:history="1">
         <w:r>
           <w:rPr>
             <w:rStyle w:val="Hyperlink"/>
@@ -2357,7 +2357,7 @@
             <w:noProof/>
             <w:webHidden/>
           </w:rPr>
-          <w:instrText xml:space="preserve"> PAGEREF _Toc242733541 \h </w:instrText>
+          <w:instrText xml:space="preserve"> PAGEREF _Toc242735657 \h </w:instrText>
         </w:r>
         <w:r>
           <w:rPr>
@@ -2405,7 +2405,7 @@
           <w14:ligatures w14:val="standardContextual"/>
         </w:rPr>
       </w:pPr>
-      <w:hyperlink w:anchor="_Toc242733542" w:history="1">
+      <w:hyperlink w:anchor="_Toc242735658" w:history="1">
         <w:r>
           <w:rPr>
             <w:rStyle w:val="Hyperlink"/>
@@ -2451,7 +2451,7 @@
             <w:noProof/>
             <w:webHidden/>
           </w:rPr>
-          <w:instrText xml:space="preserve"> PAGEREF _Toc242733542 \h </w:instrText>
+          <w:instrText xml:space="preserve"> PAGEREF _Toc242735658 \h </w:instrText>
         </w:r>
         <w:r>
           <w:rPr>
@@ -2499,7 +2499,7 @@
           <w14:ligatures w14:val="standardContextual"/>
         </w:rPr>
       </w:pPr>
-      <w:hyperlink w:anchor="_Toc242733543" w:history="1">
+      <w:hyperlink w:anchor="_Toc242735659" w:history="1">
         <w:r>
           <w:rPr>
             <w:rStyle w:val="Hyperlink"/>
@@ -2545,7 +2545,7 @@
             <w:noProof/>
             <w:webHidden/>
           </w:rPr>
-          <w:instrText xml:space="preserve"> PAGEREF _Toc242733543 \h </w:instrText>
+          <w:instrText xml:space="preserve"> PAGEREF _Toc242735659 \h </w:instrText>
         </w:r>
         <w:r>
           <w:rPr>
@@ -2593,7 +2593,7 @@
           <w14:ligatures w14:val="standardContextual"/>
         </w:rPr>
       </w:pPr>
-      <w:hyperlink w:anchor="_Toc242733544" w:history="1">
+      <w:hyperlink w:anchor="_Toc242735660" w:history="1">
         <w:r>
           <w:rPr>
             <w:rStyle w:val="Hyperlink"/>
@@ -2639,7 +2639,7 @@
             <w:noProof/>
             <w:webHidden/>
           </w:rPr>
-          <w:instrText xml:space="preserve"> PAGEREF _Toc242733544 \h </w:instrText>
+          <w:instrText xml:space="preserve"> PAGEREF _Toc242735660 \h </w:instrText>
         </w:r>
         <w:r>
           <w:rPr>
@@ -2687,7 +2687,7 @@
           <w14:ligatures w14:val="standardContextual"/>
         </w:rPr>
       </w:pPr>
-      <w:hyperlink w:anchor="_Toc242733545" w:history="1">
+      <w:hyperlink w:anchor="_Toc242735661" w:history="1">
         <w:r>
           <w:rPr>
             <w:rStyle w:val="Hyperlink"/>
@@ -2733,7 +2733,7 @@
             <w:noProof/>
             <w:webHidden/>
           </w:rPr>
-          <w:instrText xml:space="preserve"> PAGEREF _Toc242733545 \h </w:instrText>
+          <w:instrText xml:space="preserve"> PAGEREF _Toc242735661 \h </w:instrText>
         </w:r>
         <w:r>
           <w:rPr>
@@ -2781,7 +2781,7 @@
           <w14:ligatures w14:val="standardContextual"/>
         </w:rPr>
       </w:pPr>
-      <w:hyperlink w:anchor="_Toc242733546" w:history="1">
+      <w:hyperlink w:anchor="_Toc242735662" w:history="1">
         <w:r>
           <w:rPr>
             <w:rStyle w:val="Hyperlink"/>
@@ -2827,7 +2827,7 @@
             <w:noProof/>
             <w:webHidden/>
           </w:rPr>
-          <w:instrText xml:space="preserve"> PAGEREF _Toc242733546 \h </w:instrText>
+          <w:instrText xml:space="preserve"> PAGEREF _Toc242735662 \h </w:instrText>
         </w:r>
         <w:r>
           <w:rPr>
@@ -2875,7 +2875,7 @@
           <w14:ligatures w14:val="standardContextual"/>
         </w:rPr>
       </w:pPr>
-      <w:hyperlink w:anchor="_Toc242733547" w:history="1">
+      <w:hyperlink w:anchor="_Toc242735663" w:history="1">
         <w:r>
           <w:rPr>
             <w:rStyle w:val="Hyperlink"/>
@@ -2921,7 +2921,7 @@
             <w:noProof/>
             <w:webHidden/>
           </w:rPr>
-          <w:instrText xml:space="preserve"> PAGEREF _Toc242733547 \h </w:instrText>
+          <w:instrText xml:space="preserve"> PAGEREF _Toc242735663 \h </w:instrText>
         </w:r>
         <w:r>
           <w:rPr>
@@ -2969,7 +2969,7 @@
           <w14:ligatures w14:val="standardContextual"/>
         </w:rPr>
       </w:pPr>
-      <w:hyperlink w:anchor="_Toc242733548" w:history="1">
+      <w:hyperlink w:anchor="_Toc242735664" w:history="1">
         <w:r>
           <w:rPr>
             <w:rStyle w:val="Hyperlink"/>
@@ -3015,7 +3015,7 @@
             <w:noProof/>
             <w:webHidden/>
           </w:rPr>
-          <w:instrText xml:space="preserve"> PAGEREF _Toc242733548 \h </w:instrText>
+          <w:instrText xml:space="preserve"> PAGEREF _Toc242735664 \h </w:instrText>
         </w:r>
         <w:r>
           <w:rPr>
@@ -3063,7 +3063,7 @@
           <w14:ligatures w14:val="standardContextual"/>
         </w:rPr>
       </w:pPr>
-      <w:hyperlink w:anchor="_Toc242733549" w:history="1">
+      <w:hyperlink w:anchor="_Toc242735665" w:history="1">
         <w:r>
           <w:rPr>
             <w:rStyle w:val="Hyperlink"/>
@@ -3109,7 +3109,7 @@
             <w:noProof/>
             <w:webHidden/>
           </w:rPr>
-          <w:instrText xml:space="preserve"> PAGEREF _Toc242733549 \h </w:instrText>
+          <w:instrText xml:space="preserve"> PAGEREF _Toc242735665 \h </w:instrText>
         </w:r>
         <w:r>
           <w:rPr>
@@ -3157,7 +3157,7 @@
           <w14:ligatures w14:val="standardContextual"/>
         </w:rPr>
       </w:pPr>
-      <w:hyperlink w:anchor="_Toc242733550" w:history="1">
+      <w:hyperlink w:anchor="_Toc242735666" w:history="1">
         <w:r>
           <w:rPr>
             <w:rStyle w:val="Hyperlink"/>
@@ -3203,7 +3203,7 @@
             <w:noProof/>
             <w:webHidden/>
           </w:rPr>
-          <w:instrText xml:space="preserve"> PAGEREF _Toc242733550 \h </w:instrText>
+          <w:instrText xml:space="preserve"> PAGEREF _Toc242735666 \h </w:instrText>
         </w:r>
         <w:r>
           <w:rPr>
@@ -3251,7 +3251,7 @@
           <w14:ligatures w14:val="standardContextual"/>
         </w:rPr>
       </w:pPr>
-      <w:hyperlink w:anchor="_Toc242733551" w:history="1">
+      <w:hyperlink w:anchor="_Toc242735667" w:history="1">
         <w:r>
           <w:rPr>
             <w:rStyle w:val="Hyperlink"/>
@@ -3297,7 +3297,7 @@
             <w:noProof/>
             <w:webHidden/>
           </w:rPr>
-          <w:instrText xml:space="preserve"> PAGEREF _Toc242733551 \h </w:instrText>
+          <w:instrText xml:space="preserve"> PAGEREF _Toc242735667 \h </w:instrText>
         </w:r>
         <w:r>
           <w:rPr>
@@ -3345,7 +3345,7 @@
           <w14:ligatures w14:val="standardContextual"/>
         </w:rPr>
       </w:pPr>
-      <w:hyperlink w:anchor="_Toc242733552" w:history="1">
+      <w:hyperlink w:anchor="_Toc242735668" w:history="1">
         <w:r>
           <w:rPr>
             <w:rStyle w:val="Hyperlink"/>
@@ -3391,7 +3391,7 @@
             <w:noProof/>
             <w:webHidden/>
           </w:rPr>
-          <w:instrText xml:space="preserve"> PAGEREF _Toc242733552 \h </w:instrText>
+          <w:instrText xml:space="preserve"> PAGEREF _Toc242735668 \h </w:instrText>
         </w:r>
         <w:r>
           <w:rPr>
@@ -3439,7 +3439,7 @@
           <w14:ligatures w14:val="standardContextual"/>
         </w:rPr>
       </w:pPr>
-      <w:hyperlink w:anchor="_Toc242733553" w:history="1">
+      <w:hyperlink w:anchor="_Toc242735669" w:history="1">
         <w:r>
           <w:rPr>
             <w:rStyle w:val="Hyperlink"/>
@@ -3485,7 +3485,7 @@
             <w:noProof/>
             <w:webHidden/>
           </w:rPr>
-          <w:instrText xml:space="preserve"> PAGEREF _Toc242733553 \h </w:instrText>
+          <w:instrText xml:space="preserve"> PAGEREF _Toc242735669 \h </w:instrText>
         </w:r>
         <w:r>
           <w:rPr>
@@ -3533,7 +3533,7 @@
           <w14:ligatures w14:val="standardContextual"/>
         </w:rPr>
       </w:pPr>
-      <w:hyperlink w:anchor="_Toc242733554" w:history="1">
+      <w:hyperlink w:anchor="_Toc242735670" w:history="1">
         <w:r>
           <w:rPr>
             <w:rStyle w:val="Hyperlink"/>
@@ -3579,7 +3579,7 @@
             <w:noProof/>
             <w:webHidden/>
           </w:rPr>
-          <w:instrText xml:space="preserve"> PAGEREF _Toc242733554 \h </w:instrText>
+          <w:instrText xml:space="preserve"> PAGEREF _Toc242735670 \h </w:instrText>
         </w:r>
         <w:r>
           <w:rPr>
@@ -3627,7 +3627,7 @@
           <w14:ligatures w14:val="standardContextual"/>
         </w:rPr>
       </w:pPr>
-      <w:hyperlink w:anchor="_Toc242733555" w:history="1">
+      <w:hyperlink w:anchor="_Toc242735671" w:history="1">
         <w:r>
           <w:rPr>
             <w:rStyle w:val="Hyperlink"/>
@@ -3673,7 +3673,7 @@
             <w:noProof/>
             <w:webHidden/>
           </w:rPr>
-          <w:instrText xml:space="preserve"> PAGEREF _Toc242733555 \h </w:instrText>
+          <w:instrText xml:space="preserve"> PAGEREF _Toc242735671 \h </w:instrText>
         </w:r>
         <w:r>
           <w:rPr>
@@ -3721,7 +3721,7 @@
           <w14:ligatures w14:val="standardContextual"/>
         </w:rPr>
       </w:pPr>
-      <w:hyperlink w:anchor="_Toc242733556" w:history="1">
+      <w:hyperlink w:anchor="_Toc242735672" w:history="1">
         <w:r>
           <w:rPr>
             <w:rStyle w:val="Hyperlink"/>
@@ -3767,7 +3767,7 @@
             <w:noProof/>
             <w:webHidden/>
           </w:rPr>
-          <w:instrText xml:space="preserve"> PAGEREF _Toc242733556 \h </w:instrText>
+          <w:instrText xml:space="preserve"> PAGEREF _Toc242735672 \h </w:instrText>
         </w:r>
         <w:r>
           <w:rPr>
@@ -3815,7 +3815,7 @@
           <w14:ligatures w14:val="standardContextual"/>
         </w:rPr>
       </w:pPr>
-      <w:hyperlink w:anchor="_Toc242733557" w:history="1">
+      <w:hyperlink w:anchor="_Toc242735673" w:history="1">
         <w:r>
           <w:rPr>
             <w:rStyle w:val="Hyperlink"/>
@@ -3861,7 +3861,7 @@
             <w:noProof/>
             <w:webHidden/>
           </w:rPr>
-          <w:instrText xml:space="preserve"> PAGEREF _Toc242733557 \h </w:instrText>
+          <w:instrText xml:space="preserve"> PAGEREF _Toc242735673 \h </w:instrText>
         </w:r>
         <w:r>
           <w:rPr>
@@ -3909,7 +3909,7 @@
           <w14:ligatures w14:val="standardContextual"/>
         </w:rPr>
       </w:pPr>
-      <w:hyperlink w:anchor="_Toc242733558" w:history="1">
+      <w:hyperlink w:anchor="_Toc242735674" w:history="1">
         <w:r>
           <w:rPr>
             <w:rStyle w:val="Hyperlink"/>
@@ -3955,7 +3955,7 @@
             <w:noProof/>
             <w:webHidden/>
           </w:rPr>
-          <w:instrText xml:space="preserve"> PAGEREF _Toc242733558 \h </w:instrText>
+          <w:instrText xml:space="preserve"> PAGEREF _Toc242735674 \h </w:instrText>
         </w:r>
         <w:r>
           <w:rPr>
@@ -4003,7 +4003,7 @@
           <w14:ligatures w14:val="standardContextual"/>
         </w:rPr>
       </w:pPr>
-      <w:hyperlink w:anchor="_Toc242733559" w:history="1">
+      <w:hyperlink w:anchor="_Toc242735675" w:history="1">
         <w:r>
           <w:rPr>
             <w:rStyle w:val="Hyperlink"/>
@@ -4049,7 +4049,7 @@
             <w:noProof/>
             <w:webHidden/>
           </w:rPr>
-          <w:instrText xml:space="preserve"> PAGEREF _Toc242733559 \h </w:instrText>
+          <w:instrText xml:space="preserve"> PAGEREF _Toc242735675 \h </w:instrText>
         </w:r>
         <w:r>
           <w:rPr>
@@ -4097,7 +4097,7 @@
           <w14:ligatures w14:val="standardContextual"/>
         </w:rPr>
       </w:pPr>
-      <w:hyperlink w:anchor="_Toc242733560" w:history="1">
+      <w:hyperlink w:anchor="_Toc242735676" w:history="1">
         <w:r>
           <w:rPr>
             <w:rStyle w:val="Hyperlink"/>
@@ -4143,7 +4143,7 @@
             <w:noProof/>
             <w:webHidden/>
           </w:rPr>
-          <w:instrText xml:space="preserve"> PAGEREF _Toc242733560 \h </w:instrText>
+          <w:instrText xml:space="preserve"> PAGEREF _Toc242735676 \h </w:instrText>
         </w:r>
         <w:r>
           <w:rPr>
@@ -4191,7 +4191,7 @@
           <w14:ligatures w14:val="standardContextual"/>
         </w:rPr>
       </w:pPr>
-      <w:hyperlink w:anchor="_Toc242733561" w:history="1">
+      <w:hyperlink w:anchor="_Toc242735677" w:history="1">
         <w:r>
           <w:rPr>
             <w:rStyle w:val="Hyperlink"/>
@@ -4237,7 +4237,7 @@
             <w:noProof/>
             <w:webHidden/>
           </w:rPr>
-          <w:instrText xml:space="preserve"> PAGEREF _Toc242733561 \h </w:instrText>
+          <w:instrText xml:space="preserve"> PAGEREF _Toc242735677 \h </w:instrText>
         </w:r>
         <w:r>
           <w:rPr>
@@ -4285,7 +4285,7 @@
           <w14:ligatures w14:val="standardContextual"/>
         </w:rPr>
       </w:pPr>
-      <w:hyperlink w:anchor="_Toc242733562" w:history="1">
+      <w:hyperlink w:anchor="_Toc242735678" w:history="1">
         <w:r>
           <w:rPr>
             <w:rStyle w:val="Hyperlink"/>
@@ -4331,7 +4331,7 @@
             <w:noProof/>
             <w:webHidden/>
           </w:rPr>
-          <w:instrText xml:space="preserve"> PAGEREF _Toc242733562 \h </w:instrText>
+          <w:instrText xml:space="preserve"> PAGEREF _Toc242735678 \h </w:instrText>
         </w:r>
         <w:r>
           <w:rPr>
@@ -4379,7 +4379,7 @@
           <w14:ligatures w14:val="standardContextual"/>
         </w:rPr>
       </w:pPr>
-      <w:hyperlink w:anchor="_Toc242733563" w:history="1">
+      <w:hyperlink w:anchor="_Toc242735679" w:history="1">
         <w:r>
           <w:rPr>
             <w:rStyle w:val="Hyperlink"/>
@@ -4425,7 +4425,7 @@
             <w:noProof/>
             <w:webHidden/>
           </w:rPr>
-          <w:instrText xml:space="preserve"> PAGEREF _Toc242733563 \h </w:instrText>
+          <w:instrText xml:space="preserve"> PAGEREF _Toc242735679 \h </w:instrText>
         </w:r>
         <w:r>
           <w:rPr>
@@ -4465,7 +4465,7 @@
       <w:pPr>
         <w:pStyle w:val="Heading1"/>
       </w:pPr>
-      <w:bookmarkStart w:id="0" w:name="_Toc242733518"/>
+      <w:bookmarkStart w:id="0" w:name="_Toc242735634"/>
       <w:r>
         <w:lastRenderedPageBreak/>
         <w:t>Overview</w:t>
@@ -4622,7 +4622,7 @@
       <w:pPr>
         <w:pStyle w:val="Heading1"/>
       </w:pPr>
-      <w:bookmarkStart w:id="1" w:name="_Toc242733519"/>
+      <w:bookmarkStart w:id="1" w:name="_Toc242735635"/>
       <w:r>
         <w:lastRenderedPageBreak/>
         <w:t>Installation</w:t>
@@ -4665,7 +4665,7 @@
       <w:pPr>
         <w:pStyle w:val="Heading2"/>
       </w:pPr>
-      <w:bookmarkStart w:id="2" w:name="_Toc242733520"/>
+      <w:bookmarkStart w:id="2" w:name="_Toc242735636"/>
       <w:r>
         <w:t>Automatic installation</w:t>
       </w:r>
@@ -4713,7 +4713,7 @@
                 <w:color w:val="1A1A1A"/>
                 <w:sz w:val="18"/>
               </w:rPr>
-              <w:t>git clone https://github.com/VasilisVel/Gisola-BaBoo.git ~/Gisola-BaBoo</w:t>
+              <w:t>git clone https://github.com/VasilisVel/Gisola-BaBoo.git</w:t>
             </w:r>
           </w:p>
           <w:p>
@@ -4727,7 +4727,7 @@
                 <w:color w:val="1A1A1A"/>
                 <w:sz w:val="18"/>
               </w:rPr>
-              <w:t>cd ~/Gisola-BaBoo</w:t>
+              <w:t>cd Gisola-BaBoo</w:t>
             </w:r>
           </w:p>
           <w:p>
@@ -4748,6 +4748,26 @@
       </w:tr>
     </w:tbl>
     <w:p/>
+    <w:p>
+      <w:pPr>
+        <w:jc w:val="both"/>
+      </w:pPr>
+      <w:r>
+        <w:t xml:space="preserve">The code is cloned into the current folder, in a new folder </w:t>
+      </w:r>
+      <w:r>
+        <w:rPr>
+          <w:rFonts w:ascii="Consolas" w:hAnsi="Consolas"/>
+          <w:color w:val="1F3864"/>
+          <w:sz w:val="19"/>
+          <w:shd w:val="clear" w:color="auto" w:fill="EEF1F6"/>
+        </w:rPr>
+        <w:t>Gisola-BaBoo</w:t>
+      </w:r>
+      <w:r>
+        <w:t>; the commands in this chapter start from the folder where you cloned it.</w:t>
+      </w:r>
+    </w:p>
     <w:p>
       <w:pPr>
         <w:jc w:val="both"/>
@@ -5014,7 +5034,7 @@
       <w:pPr>
         <w:pStyle w:val="Heading2"/>
       </w:pPr>
-      <w:bookmarkStart w:id="3" w:name="_Toc242733521"/>
+      <w:bookmarkStart w:id="3" w:name="_Toc242735637"/>
       <w:r>
         <w:t>Manual installation</w:t>
       </w:r>
@@ -5090,7 +5110,7 @@
                 <w:color w:val="1A1A1A"/>
                 <w:sz w:val="18"/>
               </w:rPr>
-              <w:t>cd ~/Gisola-BaBoo</w:t>
+              <w:t>cd Gisola-BaBoo</w:t>
             </w:r>
           </w:p>
           <w:p>
@@ -5177,9 +5197,8 @@
       <w:pPr>
         <w:pStyle w:val="Heading2"/>
       </w:pPr>
-      <w:bookmarkStart w:id="4" w:name="_Toc242733522"/>
-      <w:r>
-        <w:lastRenderedPageBreak/>
+      <w:bookmarkStart w:id="4" w:name="_Toc242735638"/>
+      <w:r>
         <w:t>Testing the installation</w:t>
       </w:r>
       <w:bookmarkEnd w:id="4"/>
@@ -5248,7 +5267,7 @@
                 <w:color w:val="1A1A1A"/>
                 <w:sz w:val="18"/>
               </w:rPr>
-              <w:t>cd ~/Gisola-BaBoo/src</w:t>
+              <w:t>cd Gisola-BaBoo/src</w:t>
             </w:r>
           </w:p>
           <w:p>
@@ -5375,7 +5394,7 @@
       <w:pPr>
         <w:pStyle w:val="Heading2"/>
       </w:pPr>
-      <w:bookmarkStart w:id="5" w:name="_Toc242733523"/>
+      <w:bookmarkStart w:id="5" w:name="_Toc242735639"/>
       <w:r>
         <w:t>GPU support (if you have an NVIDIA GPU)</w:t>
       </w:r>
@@ -5640,6 +5659,7 @@
         <w:rPr>
           <w:b/>
         </w:rPr>
+        <w:lastRenderedPageBreak/>
         <w:t>The check.</w:t>
       </w:r>
       <w:r>
@@ -5695,7 +5715,6 @@
         <w:rPr>
           <w:b/>
         </w:rPr>
-        <w:lastRenderedPageBreak/>
         <w:t>Switch it on.</w:t>
       </w:r>
       <w:r>
@@ -5730,7 +5749,7 @@
       <w:pPr>
         <w:pStyle w:val="Heading2"/>
       </w:pPr>
-      <w:bookmarkStart w:id="6" w:name="_Toc242733524"/>
+      <w:bookmarkStart w:id="6" w:name="_Toc242735640"/>
       <w:r>
         <w:t>Pre-compiled kernels</w:t>
       </w:r>
@@ -5811,7 +5830,7 @@
       <w:pPr>
         <w:pStyle w:val="Heading1"/>
       </w:pPr>
-      <w:bookmarkStart w:id="7" w:name="_Toc242733525"/>
+      <w:bookmarkStart w:id="7" w:name="_Toc242735641"/>
       <w:r>
         <w:lastRenderedPageBreak/>
         <w:t>Input Handling</w:t>
@@ -6288,7 +6307,7 @@
       <w:pPr>
         <w:pStyle w:val="Heading2"/>
       </w:pPr>
-      <w:bookmarkStart w:id="8" w:name="_Toc242733526"/>
+      <w:bookmarkStart w:id="8" w:name="_Toc242735642"/>
       <w:r>
         <w:t>External Data Sources</w:t>
       </w:r>
@@ -6898,7 +6917,7 @@
       <w:pPr>
         <w:pStyle w:val="Heading2"/>
       </w:pPr>
-      <w:bookmarkStart w:id="9" w:name="_Toc242733527"/>
+      <w:bookmarkStart w:id="9" w:name="_Toc242735643"/>
       <w:r>
         <w:lastRenderedPageBreak/>
         <w:t>Event Selection (Watcher)</w:t>
@@ -7404,7 +7423,7 @@
       <w:pPr>
         <w:pStyle w:val="Heading1"/>
       </w:pPr>
-      <w:bookmarkStart w:id="10" w:name="_Toc242733528"/>
+      <w:bookmarkStart w:id="10" w:name="_Toc242735644"/>
       <w:r>
         <w:lastRenderedPageBreak/>
         <w:t>Station and Signal Selection</w:t>
@@ -7534,7 +7553,7 @@
       <w:pPr>
         <w:pStyle w:val="Heading2"/>
       </w:pPr>
-      <w:bookmarkStart w:id="11" w:name="_Toc242733529"/>
+      <w:bookmarkStart w:id="11" w:name="_Toc242735645"/>
       <w:r>
         <w:t>Step 1 — Retrieve the event</w:t>
       </w:r>
@@ -7552,7 +7571,7 @@
       <w:pPr>
         <w:pStyle w:val="Heading2"/>
       </w:pPr>
-      <w:bookmarkStart w:id="12" w:name="_Toc242733530"/>
+      <w:bookmarkStart w:id="12" w:name="_Toc242735646"/>
       <w:r>
         <w:t>Step 2 — Retrieve the station metadata</w:t>
       </w:r>
@@ -8322,7 +8341,7 @@
       <w:pPr>
         <w:pStyle w:val="Heading2"/>
       </w:pPr>
-      <w:bookmarkStart w:id="13" w:name="_Toc242733531"/>
+      <w:bookmarkStart w:id="13" w:name="_Toc242735647"/>
       <w:r>
         <w:t>Step 3 — Download the waveforms</w:t>
       </w:r>
@@ -8340,7 +8359,7 @@
       <w:pPr>
         <w:pStyle w:val="Heading2"/>
       </w:pPr>
-      <w:bookmarkStart w:id="14" w:name="_Toc242733532"/>
+      <w:bookmarkStart w:id="14" w:name="_Toc242735648"/>
       <w:r>
         <w:t>Step 4 — Quality checks and instrument correction</w:t>
       </w:r>
@@ -8889,7 +8908,7 @@
       <w:pPr>
         <w:pStyle w:val="Heading2"/>
       </w:pPr>
-      <w:bookmarkStart w:id="15" w:name="_Toc242733533"/>
+      <w:bookmarkStart w:id="15" w:name="_Toc242735649"/>
       <w:r>
         <w:t>Step 5 — Azimuthal selection</w:t>
       </w:r>
@@ -9072,7 +9091,7 @@
       <w:pPr>
         <w:pStyle w:val="Heading1"/>
       </w:pPr>
-      <w:bookmarkStart w:id="16" w:name="_Toc242733534"/>
+      <w:bookmarkStart w:id="16" w:name="_Toc242735650"/>
       <w:r>
         <w:lastRenderedPageBreak/>
         <w:t>Computation Configuration</w:t>
@@ -9156,7 +9175,7 @@
       <w:pPr>
         <w:pStyle w:val="Heading2"/>
       </w:pPr>
-      <w:bookmarkStart w:id="17" w:name="_Toc242733535"/>
+      <w:bookmarkStart w:id="17" w:name="_Toc242735651"/>
       <w:r>
         <w:t>Green's Functions</w:t>
       </w:r>
@@ -9166,7 +9185,7 @@
       <w:pPr>
         <w:pStyle w:val="Heading3"/>
       </w:pPr>
-      <w:bookmarkStart w:id="18" w:name="_Toc242733536"/>
+      <w:bookmarkStart w:id="18" w:name="_Toc242735652"/>
       <w:r>
         <w:t>Regional velocity models</w:t>
       </w:r>
@@ -9351,7 +9370,7 @@
       <w:pPr>
         <w:pStyle w:val="Heading3"/>
       </w:pPr>
-      <w:bookmarkStart w:id="19" w:name="_Toc242733537"/>
+      <w:bookmarkStart w:id="19" w:name="_Toc242735653"/>
       <w:r>
         <w:t>Source grid</w:t>
       </w:r>
@@ -9809,7 +9828,7 @@
       <w:pPr>
         <w:pStyle w:val="Heading3"/>
       </w:pPr>
-      <w:bookmarkStart w:id="20" w:name="_Toc242733538"/>
+      <w:bookmarkStart w:id="20" w:name="_Toc242735654"/>
       <w:r>
         <w:t>Frequency content</w:t>
       </w:r>
@@ -9932,7 +9951,7 @@
       <w:pPr>
         <w:pStyle w:val="Heading2"/>
       </w:pPr>
-      <w:bookmarkStart w:id="21" w:name="_Toc242733539"/>
+      <w:bookmarkStart w:id="21" w:name="_Toc242735655"/>
       <w:r>
         <w:lastRenderedPageBreak/>
         <w:t>Inversion Parameters</w:t>
@@ -9951,7 +9970,7 @@
       <w:pPr>
         <w:pStyle w:val="Heading3"/>
       </w:pPr>
-      <w:bookmarkStart w:id="22" w:name="_Toc242733540"/>
+      <w:bookmarkStart w:id="22" w:name="_Toc242735656"/>
       <w:r>
         <w:t>Frequency band</w:t>
       </w:r>
@@ -10116,7 +10135,7 @@
       <w:pPr>
         <w:pStyle w:val="Heading3"/>
       </w:pPr>
-      <w:bookmarkStart w:id="23" w:name="_Toc242733541"/>
+      <w:bookmarkStart w:id="23" w:name="_Toc242735657"/>
       <w:r>
         <w:t>Waveform window</w:t>
       </w:r>
@@ -10301,7 +10320,7 @@
       <w:pPr>
         <w:pStyle w:val="Heading3"/>
       </w:pPr>
-      <w:bookmarkStart w:id="24" w:name="_Toc242733542"/>
+      <w:bookmarkStart w:id="24" w:name="_Toc242735658"/>
       <w:r>
         <w:lastRenderedPageBreak/>
         <w:t>Centroid time search</w:t>
@@ -10445,7 +10464,7 @@
       <w:pPr>
         <w:pStyle w:val="Heading3"/>
       </w:pPr>
-      <w:bookmarkStart w:id="25" w:name="_Toc242733543"/>
+      <w:bookmarkStart w:id="25" w:name="_Toc242735659"/>
       <w:r>
         <w:t>Source time function</w:t>
       </w:r>
@@ -10574,7 +10593,7 @@
       <w:pPr>
         <w:pStyle w:val="Heading3"/>
       </w:pPr>
-      <w:bookmarkStart w:id="26" w:name="_Toc242733544"/>
+      <w:bookmarkStart w:id="26" w:name="_Toc242735660"/>
       <w:r>
         <w:t>Deviatoric and full moment tensor</w:t>
       </w:r>
@@ -10741,7 +10760,7 @@
       <w:pPr>
         <w:pStyle w:val="Heading2"/>
       </w:pPr>
-      <w:bookmarkStart w:id="27" w:name="_Toc242733545"/>
+      <w:bookmarkStart w:id="27" w:name="_Toc242735661"/>
       <w:r>
         <w:lastRenderedPageBreak/>
         <w:t>Bayesian Bootstrap</w:t>
@@ -11408,7 +11427,7 @@
       <w:pPr>
         <w:pStyle w:val="Heading1"/>
       </w:pPr>
-      <w:bookmarkStart w:id="28" w:name="_Toc242733546"/>
+      <w:bookmarkStart w:id="28" w:name="_Toc242735662"/>
       <w:r>
         <w:lastRenderedPageBreak/>
         <w:t>Outputs</w:t>
@@ -11743,7 +11762,7 @@
       <w:pPr>
         <w:pStyle w:val="Heading2"/>
       </w:pPr>
-      <w:bookmarkStart w:id="29" w:name="_Toc242733547"/>
+      <w:bookmarkStart w:id="29" w:name="_Toc242735663"/>
       <w:r>
         <w:t>Result files</w:t>
       </w:r>
@@ -12598,7 +12617,7 @@
       <w:pPr>
         <w:pStyle w:val="Heading2"/>
       </w:pPr>
-      <w:bookmarkStart w:id="30" w:name="_Toc242733548"/>
+      <w:bookmarkStart w:id="30" w:name="_Toc242735664"/>
       <w:r>
         <w:t>Figures</w:t>
       </w:r>
@@ -13847,7 +13866,7 @@
       <w:pPr>
         <w:pStyle w:val="Heading2"/>
       </w:pPr>
-      <w:bookmarkStart w:id="31" w:name="_Toc242733549"/>
+      <w:bookmarkStart w:id="31" w:name="_Toc242735665"/>
       <w:r>
         <w:t>Web pages</w:t>
       </w:r>
@@ -14275,7 +14294,7 @@
       <w:pPr>
         <w:pStyle w:val="Heading2"/>
       </w:pPr>
-      <w:bookmarkStart w:id="32" w:name="_Toc242733550"/>
+      <w:bookmarkStart w:id="32" w:name="_Toc242735666"/>
       <w:r>
         <w:t>Log</w:t>
       </w:r>
@@ -14293,7 +14312,7 @@
       <w:pPr>
         <w:pStyle w:val="Heading1"/>
       </w:pPr>
-      <w:bookmarkStart w:id="33" w:name="_Toc242733551"/>
+      <w:bookmarkStart w:id="33" w:name="_Toc242735667"/>
       <w:r>
         <w:lastRenderedPageBreak/>
         <w:t>Other Settings</w:t>
@@ -15105,7 +15124,7 @@
       <w:pPr>
         <w:pStyle w:val="Heading1"/>
       </w:pPr>
-      <w:bookmarkStart w:id="34" w:name="_Toc242733552"/>
+      <w:bookmarkStart w:id="34" w:name="_Toc242735668"/>
       <w:r>
         <w:lastRenderedPageBreak/>
         <w:t>Usage</w:t>
@@ -15489,7 +15508,7 @@
       <w:pPr>
         <w:pStyle w:val="Heading2"/>
       </w:pPr>
-      <w:bookmarkStart w:id="35" w:name="_Toc242733553"/>
+      <w:bookmarkStart w:id="35" w:name="_Toc242735669"/>
       <w:r>
         <w:t>Single event (-e)</w:t>
       </w:r>
@@ -15778,7 +15797,7 @@
       <w:pPr>
         <w:pStyle w:val="Heading2"/>
       </w:pPr>
-      <w:bookmarkStart w:id="36" w:name="_Toc242733554"/>
+      <w:bookmarkStart w:id="36" w:name="_Toc242735670"/>
       <w:r>
         <w:lastRenderedPageBreak/>
         <w:t>Event file (--event-file)</w:t>
@@ -16117,7 +16136,7 @@
       <w:pPr>
         <w:pStyle w:val="Heading2"/>
       </w:pPr>
-      <w:bookmarkStart w:id="37" w:name="_Toc242733555"/>
+      <w:bookmarkStart w:id="37" w:name="_Toc242735671"/>
       <w:r>
         <w:t>QuakeML file (--event-xml)</w:t>
       </w:r>
@@ -16184,7 +16203,7 @@
       <w:pPr>
         <w:pStyle w:val="Heading2"/>
       </w:pPr>
-      <w:bookmarkStart w:id="38" w:name="_Toc242733556"/>
+      <w:bookmarkStart w:id="38" w:name="_Toc242735672"/>
       <w:r>
         <w:t>Datetime range (-d)</w:t>
       </w:r>
@@ -16263,7 +16282,7 @@
       <w:pPr>
         <w:pStyle w:val="Heading2"/>
       </w:pPr>
-      <w:bookmarkStart w:id="39" w:name="_Toc242733557"/>
+      <w:bookmarkStart w:id="39" w:name="_Toc242735673"/>
       <w:r>
         <w:lastRenderedPageBreak/>
         <w:t>Real time (--real-time)</w:t>
@@ -16424,7 +16443,7 @@
       <w:pPr>
         <w:pStyle w:val="Heading2"/>
       </w:pPr>
-      <w:bookmarkStart w:id="40" w:name="_Toc242733558"/>
+      <w:bookmarkStart w:id="40" w:name="_Toc242735674"/>
       <w:r>
         <w:t>Revise (--revise)</w:t>
       </w:r>
@@ -17415,7 +17434,7 @@
       <w:pPr>
         <w:pStyle w:val="Heading2"/>
       </w:pPr>
-      <w:bookmarkStart w:id="41" w:name="_Toc242733559"/>
+      <w:bookmarkStart w:id="41" w:name="_Toc242735675"/>
       <w:r>
         <w:t>Web pages (--home)</w:t>
       </w:r>
@@ -17606,7 +17625,7 @@
       <w:pPr>
         <w:pStyle w:val="Heading2"/>
       </w:pPr>
-      <w:bookmarkStart w:id="42" w:name="_Toc242733560"/>
+      <w:bookmarkStart w:id="42" w:name="_Toc242735676"/>
       <w:r>
         <w:t>PPSD tool (for ppsdoffline)</w:t>
       </w:r>
@@ -17723,7 +17742,7 @@
       <w:pPr>
         <w:pStyle w:val="Heading2"/>
       </w:pPr>
-      <w:bookmarkStart w:id="43" w:name="_Toc242733561"/>
+      <w:bookmarkStart w:id="43" w:name="_Toc242735677"/>
       <w:r>
         <w:t>Runtime Overrides</w:t>
       </w:r>
@@ -19189,7 +19208,7 @@
       <w:pPr>
         <w:pStyle w:val="Heading2"/>
       </w:pPr>
-      <w:bookmarkStart w:id="44" w:name="_Toc242733562"/>
+      <w:bookmarkStart w:id="44" w:name="_Toc242735678"/>
       <w:r>
         <w:t>Operational Notes</w:t>
       </w:r>
@@ -19531,7 +19550,7 @@
       <w:pPr>
         <w:pStyle w:val="Heading1"/>
       </w:pPr>
-      <w:bookmarkStart w:id="45" w:name="_Toc242733563"/>
+      <w:bookmarkStart w:id="45" w:name="_Toc242735679"/>
       <w:r>
         <w:lastRenderedPageBreak/>
         <w:t>References</w:t>

</xml_diff>

<commit_message>
Use ~/Gisola-BaBoo paths for clone and cd in README and manual
</commit_message>
<xml_diff>
--- a/docs/GisolaBaBoo_User_Manual.docx
+++ b/docs/GisolaBaBoo_User_Manual.docx
@@ -149,7 +149,7 @@
       <w:r>
         <w:fldChar w:fldCharType="separate"/>
       </w:r>
-      <w:hyperlink w:anchor="_Toc242735634" w:history="1">
+      <w:hyperlink w:anchor="_Toc242733518" w:history="1">
         <w:r>
           <w:rPr>
             <w:rStyle w:val="Hyperlink"/>
@@ -195,7 +195,7 @@
             <w:noProof/>
             <w:webHidden/>
           </w:rPr>
-          <w:instrText xml:space="preserve"> PAGEREF _Toc242735634 \h </w:instrText>
+          <w:instrText xml:space="preserve"> PAGEREF _Toc242733518 \h </w:instrText>
         </w:r>
         <w:r>
           <w:rPr>
@@ -243,7 +243,7 @@
           <w14:ligatures w14:val="standardContextual"/>
         </w:rPr>
       </w:pPr>
-      <w:hyperlink w:anchor="_Toc242735635" w:history="1">
+      <w:hyperlink w:anchor="_Toc242733519" w:history="1">
         <w:r>
           <w:rPr>
             <w:rStyle w:val="Hyperlink"/>
@@ -289,7 +289,7 @@
             <w:noProof/>
             <w:webHidden/>
           </w:rPr>
-          <w:instrText xml:space="preserve"> PAGEREF _Toc242735635 \h </w:instrText>
+          <w:instrText xml:space="preserve"> PAGEREF _Toc242733519 \h </w:instrText>
         </w:r>
         <w:r>
           <w:rPr>
@@ -337,7 +337,7 @@
           <w14:ligatures w14:val="standardContextual"/>
         </w:rPr>
       </w:pPr>
-      <w:hyperlink w:anchor="_Toc242735636" w:history="1">
+      <w:hyperlink w:anchor="_Toc242733520" w:history="1">
         <w:r>
           <w:rPr>
             <w:rStyle w:val="Hyperlink"/>
@@ -383,7 +383,7 @@
             <w:noProof/>
             <w:webHidden/>
           </w:rPr>
-          <w:instrText xml:space="preserve"> PAGEREF _Toc242735636 \h </w:instrText>
+          <w:instrText xml:space="preserve"> PAGEREF _Toc242733520 \h </w:instrText>
         </w:r>
         <w:r>
           <w:rPr>
@@ -431,7 +431,7 @@
           <w14:ligatures w14:val="standardContextual"/>
         </w:rPr>
       </w:pPr>
-      <w:hyperlink w:anchor="_Toc242735637" w:history="1">
+      <w:hyperlink w:anchor="_Toc242733521" w:history="1">
         <w:r>
           <w:rPr>
             <w:rStyle w:val="Hyperlink"/>
@@ -477,7 +477,7 @@
             <w:noProof/>
             <w:webHidden/>
           </w:rPr>
-          <w:instrText xml:space="preserve"> PAGEREF _Toc242735637 \h </w:instrText>
+          <w:instrText xml:space="preserve"> PAGEREF _Toc242733521 \h </w:instrText>
         </w:r>
         <w:r>
           <w:rPr>
@@ -525,7 +525,7 @@
           <w14:ligatures w14:val="standardContextual"/>
         </w:rPr>
       </w:pPr>
-      <w:hyperlink w:anchor="_Toc242735638" w:history="1">
+      <w:hyperlink w:anchor="_Toc242733522" w:history="1">
         <w:r>
           <w:rPr>
             <w:rStyle w:val="Hyperlink"/>
@@ -571,7 +571,7 @@
             <w:noProof/>
             <w:webHidden/>
           </w:rPr>
-          <w:instrText xml:space="preserve"> PAGEREF _Toc242735638 \h </w:instrText>
+          <w:instrText xml:space="preserve"> PAGEREF _Toc242733522 \h </w:instrText>
         </w:r>
         <w:r>
           <w:rPr>
@@ -619,7 +619,7 @@
           <w14:ligatures w14:val="standardContextual"/>
         </w:rPr>
       </w:pPr>
-      <w:hyperlink w:anchor="_Toc242735639" w:history="1">
+      <w:hyperlink w:anchor="_Toc242733523" w:history="1">
         <w:r>
           <w:rPr>
             <w:rStyle w:val="Hyperlink"/>
@@ -665,7 +665,7 @@
             <w:noProof/>
             <w:webHidden/>
           </w:rPr>
-          <w:instrText xml:space="preserve"> PAGEREF _Toc242735639 \h </w:instrText>
+          <w:instrText xml:space="preserve"> PAGEREF _Toc242733523 \h </w:instrText>
         </w:r>
         <w:r>
           <w:rPr>
@@ -713,7 +713,7 @@
           <w14:ligatures w14:val="standardContextual"/>
         </w:rPr>
       </w:pPr>
-      <w:hyperlink w:anchor="_Toc242735640" w:history="1">
+      <w:hyperlink w:anchor="_Toc242733524" w:history="1">
         <w:r>
           <w:rPr>
             <w:rStyle w:val="Hyperlink"/>
@@ -759,7 +759,7 @@
             <w:noProof/>
             <w:webHidden/>
           </w:rPr>
-          <w:instrText xml:space="preserve"> PAGEREF _Toc242735640 \h </w:instrText>
+          <w:instrText xml:space="preserve"> PAGEREF _Toc242733524 \h </w:instrText>
         </w:r>
         <w:r>
           <w:rPr>
@@ -807,7 +807,7 @@
           <w14:ligatures w14:val="standardContextual"/>
         </w:rPr>
       </w:pPr>
-      <w:hyperlink w:anchor="_Toc242735641" w:history="1">
+      <w:hyperlink w:anchor="_Toc242733525" w:history="1">
         <w:r>
           <w:rPr>
             <w:rStyle w:val="Hyperlink"/>
@@ -853,7 +853,7 @@
             <w:noProof/>
             <w:webHidden/>
           </w:rPr>
-          <w:instrText xml:space="preserve"> PAGEREF _Toc242735641 \h </w:instrText>
+          <w:instrText xml:space="preserve"> PAGEREF _Toc242733525 \h </w:instrText>
         </w:r>
         <w:r>
           <w:rPr>
@@ -901,7 +901,7 @@
           <w14:ligatures w14:val="standardContextual"/>
         </w:rPr>
       </w:pPr>
-      <w:hyperlink w:anchor="_Toc242735642" w:history="1">
+      <w:hyperlink w:anchor="_Toc242733526" w:history="1">
         <w:r>
           <w:rPr>
             <w:rStyle w:val="Hyperlink"/>
@@ -947,7 +947,7 @@
             <w:noProof/>
             <w:webHidden/>
           </w:rPr>
-          <w:instrText xml:space="preserve"> PAGEREF _Toc242735642 \h </w:instrText>
+          <w:instrText xml:space="preserve"> PAGEREF _Toc242733526 \h </w:instrText>
         </w:r>
         <w:r>
           <w:rPr>
@@ -995,7 +995,7 @@
           <w14:ligatures w14:val="standardContextual"/>
         </w:rPr>
       </w:pPr>
-      <w:hyperlink w:anchor="_Toc242735643" w:history="1">
+      <w:hyperlink w:anchor="_Toc242733527" w:history="1">
         <w:r>
           <w:rPr>
             <w:rStyle w:val="Hyperlink"/>
@@ -1041,7 +1041,7 @@
             <w:noProof/>
             <w:webHidden/>
           </w:rPr>
-          <w:instrText xml:space="preserve"> PAGEREF _Toc242735643 \h </w:instrText>
+          <w:instrText xml:space="preserve"> PAGEREF _Toc242733527 \h </w:instrText>
         </w:r>
         <w:r>
           <w:rPr>
@@ -1089,7 +1089,7 @@
           <w14:ligatures w14:val="standardContextual"/>
         </w:rPr>
       </w:pPr>
-      <w:hyperlink w:anchor="_Toc242735644" w:history="1">
+      <w:hyperlink w:anchor="_Toc242733528" w:history="1">
         <w:r>
           <w:rPr>
             <w:rStyle w:val="Hyperlink"/>
@@ -1135,7 +1135,7 @@
             <w:noProof/>
             <w:webHidden/>
           </w:rPr>
-          <w:instrText xml:space="preserve"> PAGEREF _Toc242735644 \h </w:instrText>
+          <w:instrText xml:space="preserve"> PAGEREF _Toc242733528 \h </w:instrText>
         </w:r>
         <w:r>
           <w:rPr>
@@ -1183,7 +1183,7 @@
           <w14:ligatures w14:val="standardContextual"/>
         </w:rPr>
       </w:pPr>
-      <w:hyperlink w:anchor="_Toc242735645" w:history="1">
+      <w:hyperlink w:anchor="_Toc242733529" w:history="1">
         <w:r>
           <w:rPr>
             <w:rStyle w:val="Hyperlink"/>
@@ -1229,7 +1229,7 @@
             <w:noProof/>
             <w:webHidden/>
           </w:rPr>
-          <w:instrText xml:space="preserve"> PAGEREF _Toc242735645 \h </w:instrText>
+          <w:instrText xml:space="preserve"> PAGEREF _Toc242733529 \h </w:instrText>
         </w:r>
         <w:r>
           <w:rPr>
@@ -1277,7 +1277,7 @@
           <w14:ligatures w14:val="standardContextual"/>
         </w:rPr>
       </w:pPr>
-      <w:hyperlink w:anchor="_Toc242735646" w:history="1">
+      <w:hyperlink w:anchor="_Toc242733530" w:history="1">
         <w:r>
           <w:rPr>
             <w:rStyle w:val="Hyperlink"/>
@@ -1323,7 +1323,7 @@
             <w:noProof/>
             <w:webHidden/>
           </w:rPr>
-          <w:instrText xml:space="preserve"> PAGEREF _Toc242735646 \h </w:instrText>
+          <w:instrText xml:space="preserve"> PAGEREF _Toc242733530 \h </w:instrText>
         </w:r>
         <w:r>
           <w:rPr>
@@ -1371,7 +1371,7 @@
           <w14:ligatures w14:val="standardContextual"/>
         </w:rPr>
       </w:pPr>
-      <w:hyperlink w:anchor="_Toc242735647" w:history="1">
+      <w:hyperlink w:anchor="_Toc242733531" w:history="1">
         <w:r>
           <w:rPr>
             <w:rStyle w:val="Hyperlink"/>
@@ -1417,7 +1417,7 @@
             <w:noProof/>
             <w:webHidden/>
           </w:rPr>
-          <w:instrText xml:space="preserve"> PAGEREF _Toc242735647 \h </w:instrText>
+          <w:instrText xml:space="preserve"> PAGEREF _Toc242733531 \h </w:instrText>
         </w:r>
         <w:r>
           <w:rPr>
@@ -1465,7 +1465,7 @@
           <w14:ligatures w14:val="standardContextual"/>
         </w:rPr>
       </w:pPr>
-      <w:hyperlink w:anchor="_Toc242735648" w:history="1">
+      <w:hyperlink w:anchor="_Toc242733532" w:history="1">
         <w:r>
           <w:rPr>
             <w:rStyle w:val="Hyperlink"/>
@@ -1511,7 +1511,7 @@
             <w:noProof/>
             <w:webHidden/>
           </w:rPr>
-          <w:instrText xml:space="preserve"> PAGEREF _Toc242735648 \h </w:instrText>
+          <w:instrText xml:space="preserve"> PAGEREF _Toc242733532 \h </w:instrText>
         </w:r>
         <w:r>
           <w:rPr>
@@ -1559,7 +1559,7 @@
           <w14:ligatures w14:val="standardContextual"/>
         </w:rPr>
       </w:pPr>
-      <w:hyperlink w:anchor="_Toc242735649" w:history="1">
+      <w:hyperlink w:anchor="_Toc242733533" w:history="1">
         <w:r>
           <w:rPr>
             <w:rStyle w:val="Hyperlink"/>
@@ -1605,7 +1605,7 @@
             <w:noProof/>
             <w:webHidden/>
           </w:rPr>
-          <w:instrText xml:space="preserve"> PAGEREF _Toc242735649 \h </w:instrText>
+          <w:instrText xml:space="preserve"> PAGEREF _Toc242733533 \h </w:instrText>
         </w:r>
         <w:r>
           <w:rPr>
@@ -1653,7 +1653,7 @@
           <w14:ligatures w14:val="standardContextual"/>
         </w:rPr>
       </w:pPr>
-      <w:hyperlink w:anchor="_Toc242735650" w:history="1">
+      <w:hyperlink w:anchor="_Toc242733534" w:history="1">
         <w:r>
           <w:rPr>
             <w:rStyle w:val="Hyperlink"/>
@@ -1699,7 +1699,7 @@
             <w:noProof/>
             <w:webHidden/>
           </w:rPr>
-          <w:instrText xml:space="preserve"> PAGEREF _Toc242735650 \h </w:instrText>
+          <w:instrText xml:space="preserve"> PAGEREF _Toc242733534 \h </w:instrText>
         </w:r>
         <w:r>
           <w:rPr>
@@ -1747,7 +1747,7 @@
           <w14:ligatures w14:val="standardContextual"/>
         </w:rPr>
       </w:pPr>
-      <w:hyperlink w:anchor="_Toc242735651" w:history="1">
+      <w:hyperlink w:anchor="_Toc242733535" w:history="1">
         <w:r>
           <w:rPr>
             <w:rStyle w:val="Hyperlink"/>
@@ -1793,7 +1793,7 @@
             <w:noProof/>
             <w:webHidden/>
           </w:rPr>
-          <w:instrText xml:space="preserve"> PAGEREF _Toc242735651 \h </w:instrText>
+          <w:instrText xml:space="preserve"> PAGEREF _Toc242733535 \h </w:instrText>
         </w:r>
         <w:r>
           <w:rPr>
@@ -1841,7 +1841,7 @@
           <w14:ligatures w14:val="standardContextual"/>
         </w:rPr>
       </w:pPr>
-      <w:hyperlink w:anchor="_Toc242735652" w:history="1">
+      <w:hyperlink w:anchor="_Toc242733536" w:history="1">
         <w:r>
           <w:rPr>
             <w:rStyle w:val="Hyperlink"/>
@@ -1887,7 +1887,7 @@
             <w:noProof/>
             <w:webHidden/>
           </w:rPr>
-          <w:instrText xml:space="preserve"> PAGEREF _Toc242735652 \h </w:instrText>
+          <w:instrText xml:space="preserve"> PAGEREF _Toc242733536 \h </w:instrText>
         </w:r>
         <w:r>
           <w:rPr>
@@ -1935,7 +1935,7 @@
           <w14:ligatures w14:val="standardContextual"/>
         </w:rPr>
       </w:pPr>
-      <w:hyperlink w:anchor="_Toc242735653" w:history="1">
+      <w:hyperlink w:anchor="_Toc242733537" w:history="1">
         <w:r>
           <w:rPr>
             <w:rStyle w:val="Hyperlink"/>
@@ -1981,7 +1981,7 @@
             <w:noProof/>
             <w:webHidden/>
           </w:rPr>
-          <w:instrText xml:space="preserve"> PAGEREF _Toc242735653 \h </w:instrText>
+          <w:instrText xml:space="preserve"> PAGEREF _Toc242733537 \h </w:instrText>
         </w:r>
         <w:r>
           <w:rPr>
@@ -2029,7 +2029,7 @@
           <w14:ligatures w14:val="standardContextual"/>
         </w:rPr>
       </w:pPr>
-      <w:hyperlink w:anchor="_Toc242735654" w:history="1">
+      <w:hyperlink w:anchor="_Toc242733538" w:history="1">
         <w:r>
           <w:rPr>
             <w:rStyle w:val="Hyperlink"/>
@@ -2075,7 +2075,7 @@
             <w:noProof/>
             <w:webHidden/>
           </w:rPr>
-          <w:instrText xml:space="preserve"> PAGEREF _Toc242735654 \h </w:instrText>
+          <w:instrText xml:space="preserve"> PAGEREF _Toc242733538 \h </w:instrText>
         </w:r>
         <w:r>
           <w:rPr>
@@ -2123,7 +2123,7 @@
           <w14:ligatures w14:val="standardContextual"/>
         </w:rPr>
       </w:pPr>
-      <w:hyperlink w:anchor="_Toc242735655" w:history="1">
+      <w:hyperlink w:anchor="_Toc242733539" w:history="1">
         <w:r>
           <w:rPr>
             <w:rStyle w:val="Hyperlink"/>
@@ -2169,7 +2169,7 @@
             <w:noProof/>
             <w:webHidden/>
           </w:rPr>
-          <w:instrText xml:space="preserve"> PAGEREF _Toc242735655 \h </w:instrText>
+          <w:instrText xml:space="preserve"> PAGEREF _Toc242733539 \h </w:instrText>
         </w:r>
         <w:r>
           <w:rPr>
@@ -2217,7 +2217,7 @@
           <w14:ligatures w14:val="standardContextual"/>
         </w:rPr>
       </w:pPr>
-      <w:hyperlink w:anchor="_Toc242735656" w:history="1">
+      <w:hyperlink w:anchor="_Toc242733540" w:history="1">
         <w:r>
           <w:rPr>
             <w:rStyle w:val="Hyperlink"/>
@@ -2263,7 +2263,7 @@
             <w:noProof/>
             <w:webHidden/>
           </w:rPr>
-          <w:instrText xml:space="preserve"> PAGEREF _Toc242735656 \h </w:instrText>
+          <w:instrText xml:space="preserve"> PAGEREF _Toc242733540 \h </w:instrText>
         </w:r>
         <w:r>
           <w:rPr>
@@ -2311,7 +2311,7 @@
           <w14:ligatures w14:val="standardContextual"/>
         </w:rPr>
       </w:pPr>
-      <w:hyperlink w:anchor="_Toc242735657" w:history="1">
+      <w:hyperlink w:anchor="_Toc242733541" w:history="1">
         <w:r>
           <w:rPr>
             <w:rStyle w:val="Hyperlink"/>
@@ -2357,7 +2357,7 @@
             <w:noProof/>
             <w:webHidden/>
           </w:rPr>
-          <w:instrText xml:space="preserve"> PAGEREF _Toc242735657 \h </w:instrText>
+          <w:instrText xml:space="preserve"> PAGEREF _Toc242733541 \h </w:instrText>
         </w:r>
         <w:r>
           <w:rPr>
@@ -2405,7 +2405,7 @@
           <w14:ligatures w14:val="standardContextual"/>
         </w:rPr>
       </w:pPr>
-      <w:hyperlink w:anchor="_Toc242735658" w:history="1">
+      <w:hyperlink w:anchor="_Toc242733542" w:history="1">
         <w:r>
           <w:rPr>
             <w:rStyle w:val="Hyperlink"/>
@@ -2451,7 +2451,7 @@
             <w:noProof/>
             <w:webHidden/>
           </w:rPr>
-          <w:instrText xml:space="preserve"> PAGEREF _Toc242735658 \h </w:instrText>
+          <w:instrText xml:space="preserve"> PAGEREF _Toc242733542 \h </w:instrText>
         </w:r>
         <w:r>
           <w:rPr>
@@ -2499,7 +2499,7 @@
           <w14:ligatures w14:val="standardContextual"/>
         </w:rPr>
       </w:pPr>
-      <w:hyperlink w:anchor="_Toc242735659" w:history="1">
+      <w:hyperlink w:anchor="_Toc242733543" w:history="1">
         <w:r>
           <w:rPr>
             <w:rStyle w:val="Hyperlink"/>
@@ -2545,7 +2545,7 @@
             <w:noProof/>
             <w:webHidden/>
           </w:rPr>
-          <w:instrText xml:space="preserve"> PAGEREF _Toc242735659 \h </w:instrText>
+          <w:instrText xml:space="preserve"> PAGEREF _Toc242733543 \h </w:instrText>
         </w:r>
         <w:r>
           <w:rPr>
@@ -2593,7 +2593,7 @@
           <w14:ligatures w14:val="standardContextual"/>
         </w:rPr>
       </w:pPr>
-      <w:hyperlink w:anchor="_Toc242735660" w:history="1">
+      <w:hyperlink w:anchor="_Toc242733544" w:history="1">
         <w:r>
           <w:rPr>
             <w:rStyle w:val="Hyperlink"/>
@@ -2639,7 +2639,7 @@
             <w:noProof/>
             <w:webHidden/>
           </w:rPr>
-          <w:instrText xml:space="preserve"> PAGEREF _Toc242735660 \h </w:instrText>
+          <w:instrText xml:space="preserve"> PAGEREF _Toc242733544 \h </w:instrText>
         </w:r>
         <w:r>
           <w:rPr>
@@ -2687,7 +2687,7 @@
           <w14:ligatures w14:val="standardContextual"/>
         </w:rPr>
       </w:pPr>
-      <w:hyperlink w:anchor="_Toc242735661" w:history="1">
+      <w:hyperlink w:anchor="_Toc242733545" w:history="1">
         <w:r>
           <w:rPr>
             <w:rStyle w:val="Hyperlink"/>
@@ -2733,7 +2733,7 @@
             <w:noProof/>
             <w:webHidden/>
           </w:rPr>
-          <w:instrText xml:space="preserve"> PAGEREF _Toc242735661 \h </w:instrText>
+          <w:instrText xml:space="preserve"> PAGEREF _Toc242733545 \h </w:instrText>
         </w:r>
         <w:r>
           <w:rPr>
@@ -2781,7 +2781,7 @@
           <w14:ligatures w14:val="standardContextual"/>
         </w:rPr>
       </w:pPr>
-      <w:hyperlink w:anchor="_Toc242735662" w:history="1">
+      <w:hyperlink w:anchor="_Toc242733546" w:history="1">
         <w:r>
           <w:rPr>
             <w:rStyle w:val="Hyperlink"/>
@@ -2827,7 +2827,7 @@
             <w:noProof/>
             <w:webHidden/>
           </w:rPr>
-          <w:instrText xml:space="preserve"> PAGEREF _Toc242735662 \h </w:instrText>
+          <w:instrText xml:space="preserve"> PAGEREF _Toc242733546 \h </w:instrText>
         </w:r>
         <w:r>
           <w:rPr>
@@ -2875,7 +2875,7 @@
           <w14:ligatures w14:val="standardContextual"/>
         </w:rPr>
       </w:pPr>
-      <w:hyperlink w:anchor="_Toc242735663" w:history="1">
+      <w:hyperlink w:anchor="_Toc242733547" w:history="1">
         <w:r>
           <w:rPr>
             <w:rStyle w:val="Hyperlink"/>
@@ -2921,7 +2921,7 @@
             <w:noProof/>
             <w:webHidden/>
           </w:rPr>
-          <w:instrText xml:space="preserve"> PAGEREF _Toc242735663 \h </w:instrText>
+          <w:instrText xml:space="preserve"> PAGEREF _Toc242733547 \h </w:instrText>
         </w:r>
         <w:r>
           <w:rPr>
@@ -2969,7 +2969,7 @@
           <w14:ligatures w14:val="standardContextual"/>
         </w:rPr>
       </w:pPr>
-      <w:hyperlink w:anchor="_Toc242735664" w:history="1">
+      <w:hyperlink w:anchor="_Toc242733548" w:history="1">
         <w:r>
           <w:rPr>
             <w:rStyle w:val="Hyperlink"/>
@@ -3015,7 +3015,7 @@
             <w:noProof/>
             <w:webHidden/>
           </w:rPr>
-          <w:instrText xml:space="preserve"> PAGEREF _Toc242735664 \h </w:instrText>
+          <w:instrText xml:space="preserve"> PAGEREF _Toc242733548 \h </w:instrText>
         </w:r>
         <w:r>
           <w:rPr>
@@ -3063,7 +3063,7 @@
           <w14:ligatures w14:val="standardContextual"/>
         </w:rPr>
       </w:pPr>
-      <w:hyperlink w:anchor="_Toc242735665" w:history="1">
+      <w:hyperlink w:anchor="_Toc242733549" w:history="1">
         <w:r>
           <w:rPr>
             <w:rStyle w:val="Hyperlink"/>
@@ -3109,7 +3109,7 @@
             <w:noProof/>
             <w:webHidden/>
           </w:rPr>
-          <w:instrText xml:space="preserve"> PAGEREF _Toc242735665 \h </w:instrText>
+          <w:instrText xml:space="preserve"> PAGEREF _Toc242733549 \h </w:instrText>
         </w:r>
         <w:r>
           <w:rPr>
@@ -3157,7 +3157,7 @@
           <w14:ligatures w14:val="standardContextual"/>
         </w:rPr>
       </w:pPr>
-      <w:hyperlink w:anchor="_Toc242735666" w:history="1">
+      <w:hyperlink w:anchor="_Toc242733550" w:history="1">
         <w:r>
           <w:rPr>
             <w:rStyle w:val="Hyperlink"/>
@@ -3203,7 +3203,7 @@
             <w:noProof/>
             <w:webHidden/>
           </w:rPr>
-          <w:instrText xml:space="preserve"> PAGEREF _Toc242735666 \h </w:instrText>
+          <w:instrText xml:space="preserve"> PAGEREF _Toc242733550 \h </w:instrText>
         </w:r>
         <w:r>
           <w:rPr>
@@ -3251,7 +3251,7 @@
           <w14:ligatures w14:val="standardContextual"/>
         </w:rPr>
       </w:pPr>
-      <w:hyperlink w:anchor="_Toc242735667" w:history="1">
+      <w:hyperlink w:anchor="_Toc242733551" w:history="1">
         <w:r>
           <w:rPr>
             <w:rStyle w:val="Hyperlink"/>
@@ -3297,7 +3297,7 @@
             <w:noProof/>
             <w:webHidden/>
           </w:rPr>
-          <w:instrText xml:space="preserve"> PAGEREF _Toc242735667 \h </w:instrText>
+          <w:instrText xml:space="preserve"> PAGEREF _Toc242733551 \h </w:instrText>
         </w:r>
         <w:r>
           <w:rPr>
@@ -3345,7 +3345,7 @@
           <w14:ligatures w14:val="standardContextual"/>
         </w:rPr>
       </w:pPr>
-      <w:hyperlink w:anchor="_Toc242735668" w:history="1">
+      <w:hyperlink w:anchor="_Toc242733552" w:history="1">
         <w:r>
           <w:rPr>
             <w:rStyle w:val="Hyperlink"/>
@@ -3391,7 +3391,7 @@
             <w:noProof/>
             <w:webHidden/>
           </w:rPr>
-          <w:instrText xml:space="preserve"> PAGEREF _Toc242735668 \h </w:instrText>
+          <w:instrText xml:space="preserve"> PAGEREF _Toc242733552 \h </w:instrText>
         </w:r>
         <w:r>
           <w:rPr>
@@ -3439,7 +3439,7 @@
           <w14:ligatures w14:val="standardContextual"/>
         </w:rPr>
       </w:pPr>
-      <w:hyperlink w:anchor="_Toc242735669" w:history="1">
+      <w:hyperlink w:anchor="_Toc242733553" w:history="1">
         <w:r>
           <w:rPr>
             <w:rStyle w:val="Hyperlink"/>
@@ -3485,7 +3485,7 @@
             <w:noProof/>
             <w:webHidden/>
           </w:rPr>
-          <w:instrText xml:space="preserve"> PAGEREF _Toc242735669 \h </w:instrText>
+          <w:instrText xml:space="preserve"> PAGEREF _Toc242733553 \h </w:instrText>
         </w:r>
         <w:r>
           <w:rPr>
@@ -3533,7 +3533,7 @@
           <w14:ligatures w14:val="standardContextual"/>
         </w:rPr>
       </w:pPr>
-      <w:hyperlink w:anchor="_Toc242735670" w:history="1">
+      <w:hyperlink w:anchor="_Toc242733554" w:history="1">
         <w:r>
           <w:rPr>
             <w:rStyle w:val="Hyperlink"/>
@@ -3579,7 +3579,7 @@
             <w:noProof/>
             <w:webHidden/>
           </w:rPr>
-          <w:instrText xml:space="preserve"> PAGEREF _Toc242735670 \h </w:instrText>
+          <w:instrText xml:space="preserve"> PAGEREF _Toc242733554 \h </w:instrText>
         </w:r>
         <w:r>
           <w:rPr>
@@ -3627,7 +3627,7 @@
           <w14:ligatures w14:val="standardContextual"/>
         </w:rPr>
       </w:pPr>
-      <w:hyperlink w:anchor="_Toc242735671" w:history="1">
+      <w:hyperlink w:anchor="_Toc242733555" w:history="1">
         <w:r>
           <w:rPr>
             <w:rStyle w:val="Hyperlink"/>
@@ -3673,7 +3673,7 @@
             <w:noProof/>
             <w:webHidden/>
           </w:rPr>
-          <w:instrText xml:space="preserve"> PAGEREF _Toc242735671 \h </w:instrText>
+          <w:instrText xml:space="preserve"> PAGEREF _Toc242733555 \h </w:instrText>
         </w:r>
         <w:r>
           <w:rPr>
@@ -3721,7 +3721,7 @@
           <w14:ligatures w14:val="standardContextual"/>
         </w:rPr>
       </w:pPr>
-      <w:hyperlink w:anchor="_Toc242735672" w:history="1">
+      <w:hyperlink w:anchor="_Toc242733556" w:history="1">
         <w:r>
           <w:rPr>
             <w:rStyle w:val="Hyperlink"/>
@@ -3767,7 +3767,7 @@
             <w:noProof/>
             <w:webHidden/>
           </w:rPr>
-          <w:instrText xml:space="preserve"> PAGEREF _Toc242735672 \h </w:instrText>
+          <w:instrText xml:space="preserve"> PAGEREF _Toc242733556 \h </w:instrText>
         </w:r>
         <w:r>
           <w:rPr>
@@ -3815,7 +3815,7 @@
           <w14:ligatures w14:val="standardContextual"/>
         </w:rPr>
       </w:pPr>
-      <w:hyperlink w:anchor="_Toc242735673" w:history="1">
+      <w:hyperlink w:anchor="_Toc242733557" w:history="1">
         <w:r>
           <w:rPr>
             <w:rStyle w:val="Hyperlink"/>
@@ -3861,7 +3861,7 @@
             <w:noProof/>
             <w:webHidden/>
           </w:rPr>
-          <w:instrText xml:space="preserve"> PAGEREF _Toc242735673 \h </w:instrText>
+          <w:instrText xml:space="preserve"> PAGEREF _Toc242733557 \h </w:instrText>
         </w:r>
         <w:r>
           <w:rPr>
@@ -3909,7 +3909,7 @@
           <w14:ligatures w14:val="standardContextual"/>
         </w:rPr>
       </w:pPr>
-      <w:hyperlink w:anchor="_Toc242735674" w:history="1">
+      <w:hyperlink w:anchor="_Toc242733558" w:history="1">
         <w:r>
           <w:rPr>
             <w:rStyle w:val="Hyperlink"/>
@@ -3955,7 +3955,7 @@
             <w:noProof/>
             <w:webHidden/>
           </w:rPr>
-          <w:instrText xml:space="preserve"> PAGEREF _Toc242735674 \h </w:instrText>
+          <w:instrText xml:space="preserve"> PAGEREF _Toc242733558 \h </w:instrText>
         </w:r>
         <w:r>
           <w:rPr>
@@ -4003,7 +4003,7 @@
           <w14:ligatures w14:val="standardContextual"/>
         </w:rPr>
       </w:pPr>
-      <w:hyperlink w:anchor="_Toc242735675" w:history="1">
+      <w:hyperlink w:anchor="_Toc242733559" w:history="1">
         <w:r>
           <w:rPr>
             <w:rStyle w:val="Hyperlink"/>
@@ -4049,7 +4049,7 @@
             <w:noProof/>
             <w:webHidden/>
           </w:rPr>
-          <w:instrText xml:space="preserve"> PAGEREF _Toc242735675 \h </w:instrText>
+          <w:instrText xml:space="preserve"> PAGEREF _Toc242733559 \h </w:instrText>
         </w:r>
         <w:r>
           <w:rPr>
@@ -4097,7 +4097,7 @@
           <w14:ligatures w14:val="standardContextual"/>
         </w:rPr>
       </w:pPr>
-      <w:hyperlink w:anchor="_Toc242735676" w:history="1">
+      <w:hyperlink w:anchor="_Toc242733560" w:history="1">
         <w:r>
           <w:rPr>
             <w:rStyle w:val="Hyperlink"/>
@@ -4143,7 +4143,7 @@
             <w:noProof/>
             <w:webHidden/>
           </w:rPr>
-          <w:instrText xml:space="preserve"> PAGEREF _Toc242735676 \h </w:instrText>
+          <w:instrText xml:space="preserve"> PAGEREF _Toc242733560 \h </w:instrText>
         </w:r>
         <w:r>
           <w:rPr>
@@ -4191,7 +4191,7 @@
           <w14:ligatures w14:val="standardContextual"/>
         </w:rPr>
       </w:pPr>
-      <w:hyperlink w:anchor="_Toc242735677" w:history="1">
+      <w:hyperlink w:anchor="_Toc242733561" w:history="1">
         <w:r>
           <w:rPr>
             <w:rStyle w:val="Hyperlink"/>
@@ -4237,7 +4237,7 @@
             <w:noProof/>
             <w:webHidden/>
           </w:rPr>
-          <w:instrText xml:space="preserve"> PAGEREF _Toc242735677 \h </w:instrText>
+          <w:instrText xml:space="preserve"> PAGEREF _Toc242733561 \h </w:instrText>
         </w:r>
         <w:r>
           <w:rPr>
@@ -4285,7 +4285,7 @@
           <w14:ligatures w14:val="standardContextual"/>
         </w:rPr>
       </w:pPr>
-      <w:hyperlink w:anchor="_Toc242735678" w:history="1">
+      <w:hyperlink w:anchor="_Toc242733562" w:history="1">
         <w:r>
           <w:rPr>
             <w:rStyle w:val="Hyperlink"/>
@@ -4331,7 +4331,7 @@
             <w:noProof/>
             <w:webHidden/>
           </w:rPr>
-          <w:instrText xml:space="preserve"> PAGEREF _Toc242735678 \h </w:instrText>
+          <w:instrText xml:space="preserve"> PAGEREF _Toc242733562 \h </w:instrText>
         </w:r>
         <w:r>
           <w:rPr>
@@ -4379,7 +4379,7 @@
           <w14:ligatures w14:val="standardContextual"/>
         </w:rPr>
       </w:pPr>
-      <w:hyperlink w:anchor="_Toc242735679" w:history="1">
+      <w:hyperlink w:anchor="_Toc242733563" w:history="1">
         <w:r>
           <w:rPr>
             <w:rStyle w:val="Hyperlink"/>
@@ -4425,7 +4425,7 @@
             <w:noProof/>
             <w:webHidden/>
           </w:rPr>
-          <w:instrText xml:space="preserve"> PAGEREF _Toc242735679 \h </w:instrText>
+          <w:instrText xml:space="preserve"> PAGEREF _Toc242733563 \h </w:instrText>
         </w:r>
         <w:r>
           <w:rPr>
@@ -4465,7 +4465,7 @@
       <w:pPr>
         <w:pStyle w:val="Heading1"/>
       </w:pPr>
-      <w:bookmarkStart w:id="0" w:name="_Toc242735634"/>
+      <w:bookmarkStart w:id="0" w:name="_Toc242733518"/>
       <w:r>
         <w:lastRenderedPageBreak/>
         <w:t>Overview</w:t>
@@ -4622,7 +4622,7 @@
       <w:pPr>
         <w:pStyle w:val="Heading1"/>
       </w:pPr>
-      <w:bookmarkStart w:id="1" w:name="_Toc242735635"/>
+      <w:bookmarkStart w:id="1" w:name="_Toc242733519"/>
       <w:r>
         <w:lastRenderedPageBreak/>
         <w:t>Installation</w:t>
@@ -4665,7 +4665,7 @@
       <w:pPr>
         <w:pStyle w:val="Heading2"/>
       </w:pPr>
-      <w:bookmarkStart w:id="2" w:name="_Toc242735636"/>
+      <w:bookmarkStart w:id="2" w:name="_Toc242733520"/>
       <w:r>
         <w:t>Automatic installation</w:t>
       </w:r>
@@ -4713,7 +4713,7 @@
                 <w:color w:val="1A1A1A"/>
                 <w:sz w:val="18"/>
               </w:rPr>
-              <w:t>git clone https://github.com/VasilisVel/Gisola-BaBoo.git</w:t>
+              <w:t>git clone https://github.com/VasilisVel/Gisola-BaBoo.git ~/Gisola-BaBoo</w:t>
             </w:r>
           </w:p>
           <w:p>
@@ -4727,7 +4727,7 @@
                 <w:color w:val="1A1A1A"/>
                 <w:sz w:val="18"/>
               </w:rPr>
-              <w:t>cd Gisola-BaBoo</w:t>
+              <w:t>cd ~/Gisola-BaBoo</w:t>
             </w:r>
           </w:p>
           <w:p>
@@ -4748,26 +4748,6 @@
       </w:tr>
     </w:tbl>
     <w:p/>
-    <w:p>
-      <w:pPr>
-        <w:jc w:val="both"/>
-      </w:pPr>
-      <w:r>
-        <w:t xml:space="preserve">The code is cloned into the current folder, in a new folder </w:t>
-      </w:r>
-      <w:r>
-        <w:rPr>
-          <w:rFonts w:ascii="Consolas" w:hAnsi="Consolas"/>
-          <w:color w:val="1F3864"/>
-          <w:sz w:val="19"/>
-          <w:shd w:val="clear" w:color="auto" w:fill="EEF1F6"/>
-        </w:rPr>
-        <w:t>Gisola-BaBoo</w:t>
-      </w:r>
-      <w:r>
-        <w:t>; the commands in this chapter start from the folder where you cloned it.</w:t>
-      </w:r>
-    </w:p>
     <w:p>
       <w:pPr>
         <w:jc w:val="both"/>
@@ -5034,7 +5014,7 @@
       <w:pPr>
         <w:pStyle w:val="Heading2"/>
       </w:pPr>
-      <w:bookmarkStart w:id="3" w:name="_Toc242735637"/>
+      <w:bookmarkStart w:id="3" w:name="_Toc242733521"/>
       <w:r>
         <w:t>Manual installation</w:t>
       </w:r>
@@ -5110,7 +5090,7 @@
                 <w:color w:val="1A1A1A"/>
                 <w:sz w:val="18"/>
               </w:rPr>
-              <w:t>cd Gisola-BaBoo</w:t>
+              <w:t>cd ~/Gisola-BaBoo</w:t>
             </w:r>
           </w:p>
           <w:p>
@@ -5197,8 +5177,9 @@
       <w:pPr>
         <w:pStyle w:val="Heading2"/>
       </w:pPr>
-      <w:bookmarkStart w:id="4" w:name="_Toc242735638"/>
-      <w:r>
+      <w:bookmarkStart w:id="4" w:name="_Toc242733522"/>
+      <w:r>
+        <w:lastRenderedPageBreak/>
         <w:t>Testing the installation</w:t>
       </w:r>
       <w:bookmarkEnd w:id="4"/>
@@ -5267,7 +5248,7 @@
                 <w:color w:val="1A1A1A"/>
                 <w:sz w:val="18"/>
               </w:rPr>
-              <w:t>cd Gisola-BaBoo/src</w:t>
+              <w:t>cd ~/Gisola-BaBoo/src</w:t>
             </w:r>
           </w:p>
           <w:p>
@@ -5394,7 +5375,7 @@
       <w:pPr>
         <w:pStyle w:val="Heading2"/>
       </w:pPr>
-      <w:bookmarkStart w:id="5" w:name="_Toc242735639"/>
+      <w:bookmarkStart w:id="5" w:name="_Toc242733523"/>
       <w:r>
         <w:t>GPU support (if you have an NVIDIA GPU)</w:t>
       </w:r>
@@ -5659,7 +5640,6 @@
         <w:rPr>
           <w:b/>
         </w:rPr>
-        <w:lastRenderedPageBreak/>
         <w:t>The check.</w:t>
       </w:r>
       <w:r>
@@ -5715,6 +5695,7 @@
         <w:rPr>
           <w:b/>
         </w:rPr>
+        <w:lastRenderedPageBreak/>
         <w:t>Switch it on.</w:t>
       </w:r>
       <w:r>
@@ -5749,7 +5730,7 @@
       <w:pPr>
         <w:pStyle w:val="Heading2"/>
       </w:pPr>
-      <w:bookmarkStart w:id="6" w:name="_Toc242735640"/>
+      <w:bookmarkStart w:id="6" w:name="_Toc242733524"/>
       <w:r>
         <w:t>Pre-compiled kernels</w:t>
       </w:r>
@@ -5830,7 +5811,7 @@
       <w:pPr>
         <w:pStyle w:val="Heading1"/>
       </w:pPr>
-      <w:bookmarkStart w:id="7" w:name="_Toc242735641"/>
+      <w:bookmarkStart w:id="7" w:name="_Toc242733525"/>
       <w:r>
         <w:lastRenderedPageBreak/>
         <w:t>Input Handling</w:t>
@@ -6307,7 +6288,7 @@
       <w:pPr>
         <w:pStyle w:val="Heading2"/>
       </w:pPr>
-      <w:bookmarkStart w:id="8" w:name="_Toc242735642"/>
+      <w:bookmarkStart w:id="8" w:name="_Toc242733526"/>
       <w:r>
         <w:t>External Data Sources</w:t>
       </w:r>
@@ -6917,7 +6898,7 @@
       <w:pPr>
         <w:pStyle w:val="Heading2"/>
       </w:pPr>
-      <w:bookmarkStart w:id="9" w:name="_Toc242735643"/>
+      <w:bookmarkStart w:id="9" w:name="_Toc242733527"/>
       <w:r>
         <w:lastRenderedPageBreak/>
         <w:t>Event Selection (Watcher)</w:t>
@@ -7423,7 +7404,7 @@
       <w:pPr>
         <w:pStyle w:val="Heading1"/>
       </w:pPr>
-      <w:bookmarkStart w:id="10" w:name="_Toc242735644"/>
+      <w:bookmarkStart w:id="10" w:name="_Toc242733528"/>
       <w:r>
         <w:lastRenderedPageBreak/>
         <w:t>Station and Signal Selection</w:t>
@@ -7553,7 +7534,7 @@
       <w:pPr>
         <w:pStyle w:val="Heading2"/>
       </w:pPr>
-      <w:bookmarkStart w:id="11" w:name="_Toc242735645"/>
+      <w:bookmarkStart w:id="11" w:name="_Toc242733529"/>
       <w:r>
         <w:t>Step 1 — Retrieve the event</w:t>
       </w:r>
@@ -7571,7 +7552,7 @@
       <w:pPr>
         <w:pStyle w:val="Heading2"/>
       </w:pPr>
-      <w:bookmarkStart w:id="12" w:name="_Toc242735646"/>
+      <w:bookmarkStart w:id="12" w:name="_Toc242733530"/>
       <w:r>
         <w:t>Step 2 — Retrieve the station metadata</w:t>
       </w:r>
@@ -8341,7 +8322,7 @@
       <w:pPr>
         <w:pStyle w:val="Heading2"/>
       </w:pPr>
-      <w:bookmarkStart w:id="13" w:name="_Toc242735647"/>
+      <w:bookmarkStart w:id="13" w:name="_Toc242733531"/>
       <w:r>
         <w:t>Step 3 — Download the waveforms</w:t>
       </w:r>
@@ -8359,7 +8340,7 @@
       <w:pPr>
         <w:pStyle w:val="Heading2"/>
       </w:pPr>
-      <w:bookmarkStart w:id="14" w:name="_Toc242735648"/>
+      <w:bookmarkStart w:id="14" w:name="_Toc242733532"/>
       <w:r>
         <w:t>Step 4 — Quality checks and instrument correction</w:t>
       </w:r>
@@ -8908,7 +8889,7 @@
       <w:pPr>
         <w:pStyle w:val="Heading2"/>
       </w:pPr>
-      <w:bookmarkStart w:id="15" w:name="_Toc242735649"/>
+      <w:bookmarkStart w:id="15" w:name="_Toc242733533"/>
       <w:r>
         <w:t>Step 5 — Azimuthal selection</w:t>
       </w:r>
@@ -9091,7 +9072,7 @@
       <w:pPr>
         <w:pStyle w:val="Heading1"/>
       </w:pPr>
-      <w:bookmarkStart w:id="16" w:name="_Toc242735650"/>
+      <w:bookmarkStart w:id="16" w:name="_Toc242733534"/>
       <w:r>
         <w:lastRenderedPageBreak/>
         <w:t>Computation Configuration</w:t>
@@ -9175,7 +9156,7 @@
       <w:pPr>
         <w:pStyle w:val="Heading2"/>
       </w:pPr>
-      <w:bookmarkStart w:id="17" w:name="_Toc242735651"/>
+      <w:bookmarkStart w:id="17" w:name="_Toc242733535"/>
       <w:r>
         <w:t>Green's Functions</w:t>
       </w:r>
@@ -9185,7 +9166,7 @@
       <w:pPr>
         <w:pStyle w:val="Heading3"/>
       </w:pPr>
-      <w:bookmarkStart w:id="18" w:name="_Toc242735652"/>
+      <w:bookmarkStart w:id="18" w:name="_Toc242733536"/>
       <w:r>
         <w:t>Regional velocity models</w:t>
       </w:r>
@@ -9370,7 +9351,7 @@
       <w:pPr>
         <w:pStyle w:val="Heading3"/>
       </w:pPr>
-      <w:bookmarkStart w:id="19" w:name="_Toc242735653"/>
+      <w:bookmarkStart w:id="19" w:name="_Toc242733537"/>
       <w:r>
         <w:t>Source grid</w:t>
       </w:r>
@@ -9828,7 +9809,7 @@
       <w:pPr>
         <w:pStyle w:val="Heading3"/>
       </w:pPr>
-      <w:bookmarkStart w:id="20" w:name="_Toc242735654"/>
+      <w:bookmarkStart w:id="20" w:name="_Toc242733538"/>
       <w:r>
         <w:t>Frequency content</w:t>
       </w:r>
@@ -9951,7 +9932,7 @@
       <w:pPr>
         <w:pStyle w:val="Heading2"/>
       </w:pPr>
-      <w:bookmarkStart w:id="21" w:name="_Toc242735655"/>
+      <w:bookmarkStart w:id="21" w:name="_Toc242733539"/>
       <w:r>
         <w:lastRenderedPageBreak/>
         <w:t>Inversion Parameters</w:t>
@@ -9970,7 +9951,7 @@
       <w:pPr>
         <w:pStyle w:val="Heading3"/>
       </w:pPr>
-      <w:bookmarkStart w:id="22" w:name="_Toc242735656"/>
+      <w:bookmarkStart w:id="22" w:name="_Toc242733540"/>
       <w:r>
         <w:t>Frequency band</w:t>
       </w:r>
@@ -10135,7 +10116,7 @@
       <w:pPr>
         <w:pStyle w:val="Heading3"/>
       </w:pPr>
-      <w:bookmarkStart w:id="23" w:name="_Toc242735657"/>
+      <w:bookmarkStart w:id="23" w:name="_Toc242733541"/>
       <w:r>
         <w:t>Waveform window</w:t>
       </w:r>
@@ -10320,7 +10301,7 @@
       <w:pPr>
         <w:pStyle w:val="Heading3"/>
       </w:pPr>
-      <w:bookmarkStart w:id="24" w:name="_Toc242735658"/>
+      <w:bookmarkStart w:id="24" w:name="_Toc242733542"/>
       <w:r>
         <w:lastRenderedPageBreak/>
         <w:t>Centroid time search</w:t>
@@ -10464,7 +10445,7 @@
       <w:pPr>
         <w:pStyle w:val="Heading3"/>
       </w:pPr>
-      <w:bookmarkStart w:id="25" w:name="_Toc242735659"/>
+      <w:bookmarkStart w:id="25" w:name="_Toc242733543"/>
       <w:r>
         <w:t>Source time function</w:t>
       </w:r>
@@ -10593,7 +10574,7 @@
       <w:pPr>
         <w:pStyle w:val="Heading3"/>
       </w:pPr>
-      <w:bookmarkStart w:id="26" w:name="_Toc242735660"/>
+      <w:bookmarkStart w:id="26" w:name="_Toc242733544"/>
       <w:r>
         <w:t>Deviatoric and full moment tensor</w:t>
       </w:r>
@@ -10760,7 +10741,7 @@
       <w:pPr>
         <w:pStyle w:val="Heading2"/>
       </w:pPr>
-      <w:bookmarkStart w:id="27" w:name="_Toc242735661"/>
+      <w:bookmarkStart w:id="27" w:name="_Toc242733545"/>
       <w:r>
         <w:lastRenderedPageBreak/>
         <w:t>Bayesian Bootstrap</w:t>
@@ -11427,7 +11408,7 @@
       <w:pPr>
         <w:pStyle w:val="Heading1"/>
       </w:pPr>
-      <w:bookmarkStart w:id="28" w:name="_Toc242735662"/>
+      <w:bookmarkStart w:id="28" w:name="_Toc242733546"/>
       <w:r>
         <w:lastRenderedPageBreak/>
         <w:t>Outputs</w:t>
@@ -11762,7 +11743,7 @@
       <w:pPr>
         <w:pStyle w:val="Heading2"/>
       </w:pPr>
-      <w:bookmarkStart w:id="29" w:name="_Toc242735663"/>
+      <w:bookmarkStart w:id="29" w:name="_Toc242733547"/>
       <w:r>
         <w:t>Result files</w:t>
       </w:r>
@@ -12617,7 +12598,7 @@
       <w:pPr>
         <w:pStyle w:val="Heading2"/>
       </w:pPr>
-      <w:bookmarkStart w:id="30" w:name="_Toc242735664"/>
+      <w:bookmarkStart w:id="30" w:name="_Toc242733548"/>
       <w:r>
         <w:t>Figures</w:t>
       </w:r>
@@ -13866,7 +13847,7 @@
       <w:pPr>
         <w:pStyle w:val="Heading2"/>
       </w:pPr>
-      <w:bookmarkStart w:id="31" w:name="_Toc242735665"/>
+      <w:bookmarkStart w:id="31" w:name="_Toc242733549"/>
       <w:r>
         <w:t>Web pages</w:t>
       </w:r>
@@ -14294,7 +14275,7 @@
       <w:pPr>
         <w:pStyle w:val="Heading2"/>
       </w:pPr>
-      <w:bookmarkStart w:id="32" w:name="_Toc242735666"/>
+      <w:bookmarkStart w:id="32" w:name="_Toc242733550"/>
       <w:r>
         <w:t>Log</w:t>
       </w:r>
@@ -14312,7 +14293,7 @@
       <w:pPr>
         <w:pStyle w:val="Heading1"/>
       </w:pPr>
-      <w:bookmarkStart w:id="33" w:name="_Toc242735667"/>
+      <w:bookmarkStart w:id="33" w:name="_Toc242733551"/>
       <w:r>
         <w:lastRenderedPageBreak/>
         <w:t>Other Settings</w:t>
@@ -15124,7 +15105,7 @@
       <w:pPr>
         <w:pStyle w:val="Heading1"/>
       </w:pPr>
-      <w:bookmarkStart w:id="34" w:name="_Toc242735668"/>
+      <w:bookmarkStart w:id="34" w:name="_Toc242733552"/>
       <w:r>
         <w:lastRenderedPageBreak/>
         <w:t>Usage</w:t>
@@ -15508,7 +15489,7 @@
       <w:pPr>
         <w:pStyle w:val="Heading2"/>
       </w:pPr>
-      <w:bookmarkStart w:id="35" w:name="_Toc242735669"/>
+      <w:bookmarkStart w:id="35" w:name="_Toc242733553"/>
       <w:r>
         <w:t>Single event (-e)</w:t>
       </w:r>
@@ -15797,7 +15778,7 @@
       <w:pPr>
         <w:pStyle w:val="Heading2"/>
       </w:pPr>
-      <w:bookmarkStart w:id="36" w:name="_Toc242735670"/>
+      <w:bookmarkStart w:id="36" w:name="_Toc242733554"/>
       <w:r>
         <w:lastRenderedPageBreak/>
         <w:t>Event file (--event-file)</w:t>
@@ -16136,7 +16117,7 @@
       <w:pPr>
         <w:pStyle w:val="Heading2"/>
       </w:pPr>
-      <w:bookmarkStart w:id="37" w:name="_Toc242735671"/>
+      <w:bookmarkStart w:id="37" w:name="_Toc242733555"/>
       <w:r>
         <w:t>QuakeML file (--event-xml)</w:t>
       </w:r>
@@ -16203,7 +16184,7 @@
       <w:pPr>
         <w:pStyle w:val="Heading2"/>
       </w:pPr>
-      <w:bookmarkStart w:id="38" w:name="_Toc242735672"/>
+      <w:bookmarkStart w:id="38" w:name="_Toc242733556"/>
       <w:r>
         <w:t>Datetime range (-d)</w:t>
       </w:r>
@@ -16282,7 +16263,7 @@
       <w:pPr>
         <w:pStyle w:val="Heading2"/>
       </w:pPr>
-      <w:bookmarkStart w:id="39" w:name="_Toc242735673"/>
+      <w:bookmarkStart w:id="39" w:name="_Toc242733557"/>
       <w:r>
         <w:lastRenderedPageBreak/>
         <w:t>Real time (--real-time)</w:t>
@@ -16443,7 +16424,7 @@
       <w:pPr>
         <w:pStyle w:val="Heading2"/>
       </w:pPr>
-      <w:bookmarkStart w:id="40" w:name="_Toc242735674"/>
+      <w:bookmarkStart w:id="40" w:name="_Toc242733558"/>
       <w:r>
         <w:t>Revise (--revise)</w:t>
       </w:r>
@@ -17434,7 +17415,7 @@
       <w:pPr>
         <w:pStyle w:val="Heading2"/>
       </w:pPr>
-      <w:bookmarkStart w:id="41" w:name="_Toc242735675"/>
+      <w:bookmarkStart w:id="41" w:name="_Toc242733559"/>
       <w:r>
         <w:t>Web pages (--home)</w:t>
       </w:r>
@@ -17625,7 +17606,7 @@
       <w:pPr>
         <w:pStyle w:val="Heading2"/>
       </w:pPr>
-      <w:bookmarkStart w:id="42" w:name="_Toc242735676"/>
+      <w:bookmarkStart w:id="42" w:name="_Toc242733560"/>
       <w:r>
         <w:t>PPSD tool (for ppsdoffline)</w:t>
       </w:r>
@@ -17742,7 +17723,7 @@
       <w:pPr>
         <w:pStyle w:val="Heading2"/>
       </w:pPr>
-      <w:bookmarkStart w:id="43" w:name="_Toc242735677"/>
+      <w:bookmarkStart w:id="43" w:name="_Toc242733561"/>
       <w:r>
         <w:t>Runtime Overrides</w:t>
       </w:r>
@@ -19208,7 +19189,7 @@
       <w:pPr>
         <w:pStyle w:val="Heading2"/>
       </w:pPr>
-      <w:bookmarkStart w:id="44" w:name="_Toc242735678"/>
+      <w:bookmarkStart w:id="44" w:name="_Toc242733562"/>
       <w:r>
         <w:t>Operational Notes</w:t>
       </w:r>
@@ -19550,7 +19531,7 @@
       <w:pPr>
         <w:pStyle w:val="Heading1"/>
       </w:pPr>
-      <w:bookmarkStart w:id="45" w:name="_Toc242735679"/>
+      <w:bookmarkStart w:id="45" w:name="_Toc242733563"/>
       <w:r>
         <w:lastRenderedPageBreak/>
         <w:t>References</w:t>

</xml_diff>

<commit_message>
Add TRANSFORM2 acknowledgments and logo to README and manual
</commit_message>
<xml_diff>
--- a/docs/GisolaBaBoo_User_Manual.docx
+++ b/docs/GisolaBaBoo_User_Manual.docx
@@ -149,7 +149,7 @@
       <w:r>
         <w:fldChar w:fldCharType="separate"/>
       </w:r>
-      <w:hyperlink w:anchor="_Toc242733518" w:history="1">
+      <w:hyperlink w:anchor="_Toc242739177" w:history="1">
         <w:r>
           <w:rPr>
             <w:rStyle w:val="Hyperlink"/>
@@ -195,7 +195,7 @@
             <w:noProof/>
             <w:webHidden/>
           </w:rPr>
-          <w:instrText xml:space="preserve"> PAGEREF _Toc242733518 \h </w:instrText>
+          <w:instrText xml:space="preserve"> PAGEREF _Toc242739177 \h </w:instrText>
         </w:r>
         <w:r>
           <w:rPr>
@@ -243,7 +243,7 @@
           <w14:ligatures w14:val="standardContextual"/>
         </w:rPr>
       </w:pPr>
-      <w:hyperlink w:anchor="_Toc242733519" w:history="1">
+      <w:hyperlink w:anchor="_Toc242739178" w:history="1">
         <w:r>
           <w:rPr>
             <w:rStyle w:val="Hyperlink"/>
@@ -289,7 +289,7 @@
             <w:noProof/>
             <w:webHidden/>
           </w:rPr>
-          <w:instrText xml:space="preserve"> PAGEREF _Toc242733519 \h </w:instrText>
+          <w:instrText xml:space="preserve"> PAGEREF _Toc242739178 \h </w:instrText>
         </w:r>
         <w:r>
           <w:rPr>
@@ -337,7 +337,7 @@
           <w14:ligatures w14:val="standardContextual"/>
         </w:rPr>
       </w:pPr>
-      <w:hyperlink w:anchor="_Toc242733520" w:history="1">
+      <w:hyperlink w:anchor="_Toc242739179" w:history="1">
         <w:r>
           <w:rPr>
             <w:rStyle w:val="Hyperlink"/>
@@ -383,7 +383,7 @@
             <w:noProof/>
             <w:webHidden/>
           </w:rPr>
-          <w:instrText xml:space="preserve"> PAGEREF _Toc242733520 \h </w:instrText>
+          <w:instrText xml:space="preserve"> PAGEREF _Toc242739179 \h </w:instrText>
         </w:r>
         <w:r>
           <w:rPr>
@@ -431,7 +431,7 @@
           <w14:ligatures w14:val="standardContextual"/>
         </w:rPr>
       </w:pPr>
-      <w:hyperlink w:anchor="_Toc242733521" w:history="1">
+      <w:hyperlink w:anchor="_Toc242739180" w:history="1">
         <w:r>
           <w:rPr>
             <w:rStyle w:val="Hyperlink"/>
@@ -477,7 +477,7 @@
             <w:noProof/>
             <w:webHidden/>
           </w:rPr>
-          <w:instrText xml:space="preserve"> PAGEREF _Toc242733521 \h </w:instrText>
+          <w:instrText xml:space="preserve"> PAGEREF _Toc242739180 \h </w:instrText>
         </w:r>
         <w:r>
           <w:rPr>
@@ -525,7 +525,7 @@
           <w14:ligatures w14:val="standardContextual"/>
         </w:rPr>
       </w:pPr>
-      <w:hyperlink w:anchor="_Toc242733522" w:history="1">
+      <w:hyperlink w:anchor="_Toc242739181" w:history="1">
         <w:r>
           <w:rPr>
             <w:rStyle w:val="Hyperlink"/>
@@ -571,7 +571,7 @@
             <w:noProof/>
             <w:webHidden/>
           </w:rPr>
-          <w:instrText xml:space="preserve"> PAGEREF _Toc242733522 \h </w:instrText>
+          <w:instrText xml:space="preserve"> PAGEREF _Toc242739181 \h </w:instrText>
         </w:r>
         <w:r>
           <w:rPr>
@@ -619,7 +619,7 @@
           <w14:ligatures w14:val="standardContextual"/>
         </w:rPr>
       </w:pPr>
-      <w:hyperlink w:anchor="_Toc242733523" w:history="1">
+      <w:hyperlink w:anchor="_Toc242739182" w:history="1">
         <w:r>
           <w:rPr>
             <w:rStyle w:val="Hyperlink"/>
@@ -665,7 +665,7 @@
             <w:noProof/>
             <w:webHidden/>
           </w:rPr>
-          <w:instrText xml:space="preserve"> PAGEREF _Toc242733523 \h </w:instrText>
+          <w:instrText xml:space="preserve"> PAGEREF _Toc242739182 \h </w:instrText>
         </w:r>
         <w:r>
           <w:rPr>
@@ -713,7 +713,7 @@
           <w14:ligatures w14:val="standardContextual"/>
         </w:rPr>
       </w:pPr>
-      <w:hyperlink w:anchor="_Toc242733524" w:history="1">
+      <w:hyperlink w:anchor="_Toc242739183" w:history="1">
         <w:r>
           <w:rPr>
             <w:rStyle w:val="Hyperlink"/>
@@ -759,7 +759,7 @@
             <w:noProof/>
             <w:webHidden/>
           </w:rPr>
-          <w:instrText xml:space="preserve"> PAGEREF _Toc242733524 \h </w:instrText>
+          <w:instrText xml:space="preserve"> PAGEREF _Toc242739183 \h </w:instrText>
         </w:r>
         <w:r>
           <w:rPr>
@@ -807,7 +807,7 @@
           <w14:ligatures w14:val="standardContextual"/>
         </w:rPr>
       </w:pPr>
-      <w:hyperlink w:anchor="_Toc242733525" w:history="1">
+      <w:hyperlink w:anchor="_Toc242739184" w:history="1">
         <w:r>
           <w:rPr>
             <w:rStyle w:val="Hyperlink"/>
@@ -853,7 +853,7 @@
             <w:noProof/>
             <w:webHidden/>
           </w:rPr>
-          <w:instrText xml:space="preserve"> PAGEREF _Toc242733525 \h </w:instrText>
+          <w:instrText xml:space="preserve"> PAGEREF _Toc242739184 \h </w:instrText>
         </w:r>
         <w:r>
           <w:rPr>
@@ -901,7 +901,7 @@
           <w14:ligatures w14:val="standardContextual"/>
         </w:rPr>
       </w:pPr>
-      <w:hyperlink w:anchor="_Toc242733526" w:history="1">
+      <w:hyperlink w:anchor="_Toc242739185" w:history="1">
         <w:r>
           <w:rPr>
             <w:rStyle w:val="Hyperlink"/>
@@ -947,7 +947,7 @@
             <w:noProof/>
             <w:webHidden/>
           </w:rPr>
-          <w:instrText xml:space="preserve"> PAGEREF _Toc242733526 \h </w:instrText>
+          <w:instrText xml:space="preserve"> PAGEREF _Toc242739185 \h </w:instrText>
         </w:r>
         <w:r>
           <w:rPr>
@@ -995,7 +995,7 @@
           <w14:ligatures w14:val="standardContextual"/>
         </w:rPr>
       </w:pPr>
-      <w:hyperlink w:anchor="_Toc242733527" w:history="1">
+      <w:hyperlink w:anchor="_Toc242739186" w:history="1">
         <w:r>
           <w:rPr>
             <w:rStyle w:val="Hyperlink"/>
@@ -1041,7 +1041,7 @@
             <w:noProof/>
             <w:webHidden/>
           </w:rPr>
-          <w:instrText xml:space="preserve"> PAGEREF _Toc242733527 \h </w:instrText>
+          <w:instrText xml:space="preserve"> PAGEREF _Toc242739186 \h </w:instrText>
         </w:r>
         <w:r>
           <w:rPr>
@@ -1089,7 +1089,7 @@
           <w14:ligatures w14:val="standardContextual"/>
         </w:rPr>
       </w:pPr>
-      <w:hyperlink w:anchor="_Toc242733528" w:history="1">
+      <w:hyperlink w:anchor="_Toc242739187" w:history="1">
         <w:r>
           <w:rPr>
             <w:rStyle w:val="Hyperlink"/>
@@ -1135,7 +1135,7 @@
             <w:noProof/>
             <w:webHidden/>
           </w:rPr>
-          <w:instrText xml:space="preserve"> PAGEREF _Toc242733528 \h </w:instrText>
+          <w:instrText xml:space="preserve"> PAGEREF _Toc242739187 \h </w:instrText>
         </w:r>
         <w:r>
           <w:rPr>
@@ -1183,7 +1183,7 @@
           <w14:ligatures w14:val="standardContextual"/>
         </w:rPr>
       </w:pPr>
-      <w:hyperlink w:anchor="_Toc242733529" w:history="1">
+      <w:hyperlink w:anchor="_Toc242739188" w:history="1">
         <w:r>
           <w:rPr>
             <w:rStyle w:val="Hyperlink"/>
@@ -1229,7 +1229,7 @@
             <w:noProof/>
             <w:webHidden/>
           </w:rPr>
-          <w:instrText xml:space="preserve"> PAGEREF _Toc242733529 \h </w:instrText>
+          <w:instrText xml:space="preserve"> PAGEREF _Toc242739188 \h </w:instrText>
         </w:r>
         <w:r>
           <w:rPr>
@@ -1277,7 +1277,7 @@
           <w14:ligatures w14:val="standardContextual"/>
         </w:rPr>
       </w:pPr>
-      <w:hyperlink w:anchor="_Toc242733530" w:history="1">
+      <w:hyperlink w:anchor="_Toc242739189" w:history="1">
         <w:r>
           <w:rPr>
             <w:rStyle w:val="Hyperlink"/>
@@ -1323,7 +1323,7 @@
             <w:noProof/>
             <w:webHidden/>
           </w:rPr>
-          <w:instrText xml:space="preserve"> PAGEREF _Toc242733530 \h </w:instrText>
+          <w:instrText xml:space="preserve"> PAGEREF _Toc242739189 \h </w:instrText>
         </w:r>
         <w:r>
           <w:rPr>
@@ -1371,7 +1371,7 @@
           <w14:ligatures w14:val="standardContextual"/>
         </w:rPr>
       </w:pPr>
-      <w:hyperlink w:anchor="_Toc242733531" w:history="1">
+      <w:hyperlink w:anchor="_Toc242739190" w:history="1">
         <w:r>
           <w:rPr>
             <w:rStyle w:val="Hyperlink"/>
@@ -1417,7 +1417,7 @@
             <w:noProof/>
             <w:webHidden/>
           </w:rPr>
-          <w:instrText xml:space="preserve"> PAGEREF _Toc242733531 \h </w:instrText>
+          <w:instrText xml:space="preserve"> PAGEREF _Toc242739190 \h </w:instrText>
         </w:r>
         <w:r>
           <w:rPr>
@@ -1465,7 +1465,7 @@
           <w14:ligatures w14:val="standardContextual"/>
         </w:rPr>
       </w:pPr>
-      <w:hyperlink w:anchor="_Toc242733532" w:history="1">
+      <w:hyperlink w:anchor="_Toc242739191" w:history="1">
         <w:r>
           <w:rPr>
             <w:rStyle w:val="Hyperlink"/>
@@ -1511,7 +1511,7 @@
             <w:noProof/>
             <w:webHidden/>
           </w:rPr>
-          <w:instrText xml:space="preserve"> PAGEREF _Toc242733532 \h </w:instrText>
+          <w:instrText xml:space="preserve"> PAGEREF _Toc242739191 \h </w:instrText>
         </w:r>
         <w:r>
           <w:rPr>
@@ -1559,7 +1559,7 @@
           <w14:ligatures w14:val="standardContextual"/>
         </w:rPr>
       </w:pPr>
-      <w:hyperlink w:anchor="_Toc242733533" w:history="1">
+      <w:hyperlink w:anchor="_Toc242739192" w:history="1">
         <w:r>
           <w:rPr>
             <w:rStyle w:val="Hyperlink"/>
@@ -1605,7 +1605,7 @@
             <w:noProof/>
             <w:webHidden/>
           </w:rPr>
-          <w:instrText xml:space="preserve"> PAGEREF _Toc242733533 \h </w:instrText>
+          <w:instrText xml:space="preserve"> PAGEREF _Toc242739192 \h </w:instrText>
         </w:r>
         <w:r>
           <w:rPr>
@@ -1653,7 +1653,7 @@
           <w14:ligatures w14:val="standardContextual"/>
         </w:rPr>
       </w:pPr>
-      <w:hyperlink w:anchor="_Toc242733534" w:history="1">
+      <w:hyperlink w:anchor="_Toc242739193" w:history="1">
         <w:r>
           <w:rPr>
             <w:rStyle w:val="Hyperlink"/>
@@ -1699,7 +1699,7 @@
             <w:noProof/>
             <w:webHidden/>
           </w:rPr>
-          <w:instrText xml:space="preserve"> PAGEREF _Toc242733534 \h </w:instrText>
+          <w:instrText xml:space="preserve"> PAGEREF _Toc242739193 \h </w:instrText>
         </w:r>
         <w:r>
           <w:rPr>
@@ -1747,7 +1747,7 @@
           <w14:ligatures w14:val="standardContextual"/>
         </w:rPr>
       </w:pPr>
-      <w:hyperlink w:anchor="_Toc242733535" w:history="1">
+      <w:hyperlink w:anchor="_Toc242739194" w:history="1">
         <w:r>
           <w:rPr>
             <w:rStyle w:val="Hyperlink"/>
@@ -1793,7 +1793,7 @@
             <w:noProof/>
             <w:webHidden/>
           </w:rPr>
-          <w:instrText xml:space="preserve"> PAGEREF _Toc242733535 \h </w:instrText>
+          <w:instrText xml:space="preserve"> PAGEREF _Toc242739194 \h </w:instrText>
         </w:r>
         <w:r>
           <w:rPr>
@@ -1841,7 +1841,7 @@
           <w14:ligatures w14:val="standardContextual"/>
         </w:rPr>
       </w:pPr>
-      <w:hyperlink w:anchor="_Toc242733536" w:history="1">
+      <w:hyperlink w:anchor="_Toc242739195" w:history="1">
         <w:r>
           <w:rPr>
             <w:rStyle w:val="Hyperlink"/>
@@ -1887,7 +1887,7 @@
             <w:noProof/>
             <w:webHidden/>
           </w:rPr>
-          <w:instrText xml:space="preserve"> PAGEREF _Toc242733536 \h </w:instrText>
+          <w:instrText xml:space="preserve"> PAGEREF _Toc242739195 \h </w:instrText>
         </w:r>
         <w:r>
           <w:rPr>
@@ -1935,7 +1935,7 @@
           <w14:ligatures w14:val="standardContextual"/>
         </w:rPr>
       </w:pPr>
-      <w:hyperlink w:anchor="_Toc242733537" w:history="1">
+      <w:hyperlink w:anchor="_Toc242739196" w:history="1">
         <w:r>
           <w:rPr>
             <w:rStyle w:val="Hyperlink"/>
@@ -1981,7 +1981,7 @@
             <w:noProof/>
             <w:webHidden/>
           </w:rPr>
-          <w:instrText xml:space="preserve"> PAGEREF _Toc242733537 \h </w:instrText>
+          <w:instrText xml:space="preserve"> PAGEREF _Toc242739196 \h </w:instrText>
         </w:r>
         <w:r>
           <w:rPr>
@@ -2029,7 +2029,7 @@
           <w14:ligatures w14:val="standardContextual"/>
         </w:rPr>
       </w:pPr>
-      <w:hyperlink w:anchor="_Toc242733538" w:history="1">
+      <w:hyperlink w:anchor="_Toc242739197" w:history="1">
         <w:r>
           <w:rPr>
             <w:rStyle w:val="Hyperlink"/>
@@ -2075,7 +2075,7 @@
             <w:noProof/>
             <w:webHidden/>
           </w:rPr>
-          <w:instrText xml:space="preserve"> PAGEREF _Toc242733538 \h </w:instrText>
+          <w:instrText xml:space="preserve"> PAGEREF _Toc242739197 \h </w:instrText>
         </w:r>
         <w:r>
           <w:rPr>
@@ -2123,7 +2123,7 @@
           <w14:ligatures w14:val="standardContextual"/>
         </w:rPr>
       </w:pPr>
-      <w:hyperlink w:anchor="_Toc242733539" w:history="1">
+      <w:hyperlink w:anchor="_Toc242739198" w:history="1">
         <w:r>
           <w:rPr>
             <w:rStyle w:val="Hyperlink"/>
@@ -2169,7 +2169,7 @@
             <w:noProof/>
             <w:webHidden/>
           </w:rPr>
-          <w:instrText xml:space="preserve"> PAGEREF _Toc242733539 \h </w:instrText>
+          <w:instrText xml:space="preserve"> PAGEREF _Toc242739198 \h </w:instrText>
         </w:r>
         <w:r>
           <w:rPr>
@@ -2217,7 +2217,7 @@
           <w14:ligatures w14:val="standardContextual"/>
         </w:rPr>
       </w:pPr>
-      <w:hyperlink w:anchor="_Toc242733540" w:history="1">
+      <w:hyperlink w:anchor="_Toc242739199" w:history="1">
         <w:r>
           <w:rPr>
             <w:rStyle w:val="Hyperlink"/>
@@ -2263,7 +2263,7 @@
             <w:noProof/>
             <w:webHidden/>
           </w:rPr>
-          <w:instrText xml:space="preserve"> PAGEREF _Toc242733540 \h </w:instrText>
+          <w:instrText xml:space="preserve"> PAGEREF _Toc242739199 \h </w:instrText>
         </w:r>
         <w:r>
           <w:rPr>
@@ -2311,7 +2311,7 @@
           <w14:ligatures w14:val="standardContextual"/>
         </w:rPr>
       </w:pPr>
-      <w:hyperlink w:anchor="_Toc242733541" w:history="1">
+      <w:hyperlink w:anchor="_Toc242739200" w:history="1">
         <w:r>
           <w:rPr>
             <w:rStyle w:val="Hyperlink"/>
@@ -2357,7 +2357,7 @@
             <w:noProof/>
             <w:webHidden/>
           </w:rPr>
-          <w:instrText xml:space="preserve"> PAGEREF _Toc242733541 \h </w:instrText>
+          <w:instrText xml:space="preserve"> PAGEREF _Toc242739200 \h </w:instrText>
         </w:r>
         <w:r>
           <w:rPr>
@@ -2405,7 +2405,7 @@
           <w14:ligatures w14:val="standardContextual"/>
         </w:rPr>
       </w:pPr>
-      <w:hyperlink w:anchor="_Toc242733542" w:history="1">
+      <w:hyperlink w:anchor="_Toc242739201" w:history="1">
         <w:r>
           <w:rPr>
             <w:rStyle w:val="Hyperlink"/>
@@ -2451,7 +2451,7 @@
             <w:noProof/>
             <w:webHidden/>
           </w:rPr>
-          <w:instrText xml:space="preserve"> PAGEREF _Toc242733542 \h </w:instrText>
+          <w:instrText xml:space="preserve"> PAGEREF _Toc242739201 \h </w:instrText>
         </w:r>
         <w:r>
           <w:rPr>
@@ -2499,7 +2499,7 @@
           <w14:ligatures w14:val="standardContextual"/>
         </w:rPr>
       </w:pPr>
-      <w:hyperlink w:anchor="_Toc242733543" w:history="1">
+      <w:hyperlink w:anchor="_Toc242739202" w:history="1">
         <w:r>
           <w:rPr>
             <w:rStyle w:val="Hyperlink"/>
@@ -2545,7 +2545,7 @@
             <w:noProof/>
             <w:webHidden/>
           </w:rPr>
-          <w:instrText xml:space="preserve"> PAGEREF _Toc242733543 \h </w:instrText>
+          <w:instrText xml:space="preserve"> PAGEREF _Toc242739202 \h </w:instrText>
         </w:r>
         <w:r>
           <w:rPr>
@@ -2593,7 +2593,7 @@
           <w14:ligatures w14:val="standardContextual"/>
         </w:rPr>
       </w:pPr>
-      <w:hyperlink w:anchor="_Toc242733544" w:history="1">
+      <w:hyperlink w:anchor="_Toc242739203" w:history="1">
         <w:r>
           <w:rPr>
             <w:rStyle w:val="Hyperlink"/>
@@ -2639,7 +2639,7 @@
             <w:noProof/>
             <w:webHidden/>
           </w:rPr>
-          <w:instrText xml:space="preserve"> PAGEREF _Toc242733544 \h </w:instrText>
+          <w:instrText xml:space="preserve"> PAGEREF _Toc242739203 \h </w:instrText>
         </w:r>
         <w:r>
           <w:rPr>
@@ -2687,7 +2687,7 @@
           <w14:ligatures w14:val="standardContextual"/>
         </w:rPr>
       </w:pPr>
-      <w:hyperlink w:anchor="_Toc242733545" w:history="1">
+      <w:hyperlink w:anchor="_Toc242739204" w:history="1">
         <w:r>
           <w:rPr>
             <w:rStyle w:val="Hyperlink"/>
@@ -2733,7 +2733,7 @@
             <w:noProof/>
             <w:webHidden/>
           </w:rPr>
-          <w:instrText xml:space="preserve"> PAGEREF _Toc242733545 \h </w:instrText>
+          <w:instrText xml:space="preserve"> PAGEREF _Toc242739204 \h </w:instrText>
         </w:r>
         <w:r>
           <w:rPr>
@@ -2781,7 +2781,7 @@
           <w14:ligatures w14:val="standardContextual"/>
         </w:rPr>
       </w:pPr>
-      <w:hyperlink w:anchor="_Toc242733546" w:history="1">
+      <w:hyperlink w:anchor="_Toc242739205" w:history="1">
         <w:r>
           <w:rPr>
             <w:rStyle w:val="Hyperlink"/>
@@ -2827,7 +2827,7 @@
             <w:noProof/>
             <w:webHidden/>
           </w:rPr>
-          <w:instrText xml:space="preserve"> PAGEREF _Toc242733546 \h </w:instrText>
+          <w:instrText xml:space="preserve"> PAGEREF _Toc242739205 \h </w:instrText>
         </w:r>
         <w:r>
           <w:rPr>
@@ -2875,7 +2875,7 @@
           <w14:ligatures w14:val="standardContextual"/>
         </w:rPr>
       </w:pPr>
-      <w:hyperlink w:anchor="_Toc242733547" w:history="1">
+      <w:hyperlink w:anchor="_Toc242739206" w:history="1">
         <w:r>
           <w:rPr>
             <w:rStyle w:val="Hyperlink"/>
@@ -2921,7 +2921,7 @@
             <w:noProof/>
             <w:webHidden/>
           </w:rPr>
-          <w:instrText xml:space="preserve"> PAGEREF _Toc242733547 \h </w:instrText>
+          <w:instrText xml:space="preserve"> PAGEREF _Toc242739206 \h </w:instrText>
         </w:r>
         <w:r>
           <w:rPr>
@@ -2969,7 +2969,7 @@
           <w14:ligatures w14:val="standardContextual"/>
         </w:rPr>
       </w:pPr>
-      <w:hyperlink w:anchor="_Toc242733548" w:history="1">
+      <w:hyperlink w:anchor="_Toc242739207" w:history="1">
         <w:r>
           <w:rPr>
             <w:rStyle w:val="Hyperlink"/>
@@ -3015,7 +3015,7 @@
             <w:noProof/>
             <w:webHidden/>
           </w:rPr>
-          <w:instrText xml:space="preserve"> PAGEREF _Toc242733548 \h </w:instrText>
+          <w:instrText xml:space="preserve"> PAGEREF _Toc242739207 \h </w:instrText>
         </w:r>
         <w:r>
           <w:rPr>
@@ -3063,7 +3063,7 @@
           <w14:ligatures w14:val="standardContextual"/>
         </w:rPr>
       </w:pPr>
-      <w:hyperlink w:anchor="_Toc242733549" w:history="1">
+      <w:hyperlink w:anchor="_Toc242739208" w:history="1">
         <w:r>
           <w:rPr>
             <w:rStyle w:val="Hyperlink"/>
@@ -3109,7 +3109,7 @@
             <w:noProof/>
             <w:webHidden/>
           </w:rPr>
-          <w:instrText xml:space="preserve"> PAGEREF _Toc242733549 \h </w:instrText>
+          <w:instrText xml:space="preserve"> PAGEREF _Toc242739208 \h </w:instrText>
         </w:r>
         <w:r>
           <w:rPr>
@@ -3157,7 +3157,7 @@
           <w14:ligatures w14:val="standardContextual"/>
         </w:rPr>
       </w:pPr>
-      <w:hyperlink w:anchor="_Toc242733550" w:history="1">
+      <w:hyperlink w:anchor="_Toc242739209" w:history="1">
         <w:r>
           <w:rPr>
             <w:rStyle w:val="Hyperlink"/>
@@ -3203,7 +3203,7 @@
             <w:noProof/>
             <w:webHidden/>
           </w:rPr>
-          <w:instrText xml:space="preserve"> PAGEREF _Toc242733550 \h </w:instrText>
+          <w:instrText xml:space="preserve"> PAGEREF _Toc242739209 \h </w:instrText>
         </w:r>
         <w:r>
           <w:rPr>
@@ -3251,7 +3251,7 @@
           <w14:ligatures w14:val="standardContextual"/>
         </w:rPr>
       </w:pPr>
-      <w:hyperlink w:anchor="_Toc242733551" w:history="1">
+      <w:hyperlink w:anchor="_Toc242739210" w:history="1">
         <w:r>
           <w:rPr>
             <w:rStyle w:val="Hyperlink"/>
@@ -3297,7 +3297,7 @@
             <w:noProof/>
             <w:webHidden/>
           </w:rPr>
-          <w:instrText xml:space="preserve"> PAGEREF _Toc242733551 \h </w:instrText>
+          <w:instrText xml:space="preserve"> PAGEREF _Toc242739210 \h </w:instrText>
         </w:r>
         <w:r>
           <w:rPr>
@@ -3345,7 +3345,7 @@
           <w14:ligatures w14:val="standardContextual"/>
         </w:rPr>
       </w:pPr>
-      <w:hyperlink w:anchor="_Toc242733552" w:history="1">
+      <w:hyperlink w:anchor="_Toc242739211" w:history="1">
         <w:r>
           <w:rPr>
             <w:rStyle w:val="Hyperlink"/>
@@ -3391,7 +3391,7 @@
             <w:noProof/>
             <w:webHidden/>
           </w:rPr>
-          <w:instrText xml:space="preserve"> PAGEREF _Toc242733552 \h </w:instrText>
+          <w:instrText xml:space="preserve"> PAGEREF _Toc242739211 \h </w:instrText>
         </w:r>
         <w:r>
           <w:rPr>
@@ -3439,7 +3439,7 @@
           <w14:ligatures w14:val="standardContextual"/>
         </w:rPr>
       </w:pPr>
-      <w:hyperlink w:anchor="_Toc242733553" w:history="1">
+      <w:hyperlink w:anchor="_Toc242739212" w:history="1">
         <w:r>
           <w:rPr>
             <w:rStyle w:val="Hyperlink"/>
@@ -3485,7 +3485,7 @@
             <w:noProof/>
             <w:webHidden/>
           </w:rPr>
-          <w:instrText xml:space="preserve"> PAGEREF _Toc242733553 \h </w:instrText>
+          <w:instrText xml:space="preserve"> PAGEREF _Toc242739212 \h </w:instrText>
         </w:r>
         <w:r>
           <w:rPr>
@@ -3533,7 +3533,7 @@
           <w14:ligatures w14:val="standardContextual"/>
         </w:rPr>
       </w:pPr>
-      <w:hyperlink w:anchor="_Toc242733554" w:history="1">
+      <w:hyperlink w:anchor="_Toc242739213" w:history="1">
         <w:r>
           <w:rPr>
             <w:rStyle w:val="Hyperlink"/>
@@ -3579,7 +3579,7 @@
             <w:noProof/>
             <w:webHidden/>
           </w:rPr>
-          <w:instrText xml:space="preserve"> PAGEREF _Toc242733554 \h </w:instrText>
+          <w:instrText xml:space="preserve"> PAGEREF _Toc242739213 \h </w:instrText>
         </w:r>
         <w:r>
           <w:rPr>
@@ -3627,7 +3627,7 @@
           <w14:ligatures w14:val="standardContextual"/>
         </w:rPr>
       </w:pPr>
-      <w:hyperlink w:anchor="_Toc242733555" w:history="1">
+      <w:hyperlink w:anchor="_Toc242739214" w:history="1">
         <w:r>
           <w:rPr>
             <w:rStyle w:val="Hyperlink"/>
@@ -3673,7 +3673,7 @@
             <w:noProof/>
             <w:webHidden/>
           </w:rPr>
-          <w:instrText xml:space="preserve"> PAGEREF _Toc242733555 \h </w:instrText>
+          <w:instrText xml:space="preserve"> PAGEREF _Toc242739214 \h </w:instrText>
         </w:r>
         <w:r>
           <w:rPr>
@@ -3721,7 +3721,7 @@
           <w14:ligatures w14:val="standardContextual"/>
         </w:rPr>
       </w:pPr>
-      <w:hyperlink w:anchor="_Toc242733556" w:history="1">
+      <w:hyperlink w:anchor="_Toc242739215" w:history="1">
         <w:r>
           <w:rPr>
             <w:rStyle w:val="Hyperlink"/>
@@ -3767,7 +3767,7 @@
             <w:noProof/>
             <w:webHidden/>
           </w:rPr>
-          <w:instrText xml:space="preserve"> PAGEREF _Toc242733556 \h </w:instrText>
+          <w:instrText xml:space="preserve"> PAGEREF _Toc242739215 \h </w:instrText>
         </w:r>
         <w:r>
           <w:rPr>
@@ -3815,7 +3815,7 @@
           <w14:ligatures w14:val="standardContextual"/>
         </w:rPr>
       </w:pPr>
-      <w:hyperlink w:anchor="_Toc242733557" w:history="1">
+      <w:hyperlink w:anchor="_Toc242739216" w:history="1">
         <w:r>
           <w:rPr>
             <w:rStyle w:val="Hyperlink"/>
@@ -3861,7 +3861,7 @@
             <w:noProof/>
             <w:webHidden/>
           </w:rPr>
-          <w:instrText xml:space="preserve"> PAGEREF _Toc242733557 \h </w:instrText>
+          <w:instrText xml:space="preserve"> PAGEREF _Toc242739216 \h </w:instrText>
         </w:r>
         <w:r>
           <w:rPr>
@@ -3909,7 +3909,7 @@
           <w14:ligatures w14:val="standardContextual"/>
         </w:rPr>
       </w:pPr>
-      <w:hyperlink w:anchor="_Toc242733558" w:history="1">
+      <w:hyperlink w:anchor="_Toc242739217" w:history="1">
         <w:r>
           <w:rPr>
             <w:rStyle w:val="Hyperlink"/>
@@ -3955,7 +3955,7 @@
             <w:noProof/>
             <w:webHidden/>
           </w:rPr>
-          <w:instrText xml:space="preserve"> PAGEREF _Toc242733558 \h </w:instrText>
+          <w:instrText xml:space="preserve"> PAGEREF _Toc242739217 \h </w:instrText>
         </w:r>
         <w:r>
           <w:rPr>
@@ -4003,7 +4003,7 @@
           <w14:ligatures w14:val="standardContextual"/>
         </w:rPr>
       </w:pPr>
-      <w:hyperlink w:anchor="_Toc242733559" w:history="1">
+      <w:hyperlink w:anchor="_Toc242739218" w:history="1">
         <w:r>
           <w:rPr>
             <w:rStyle w:val="Hyperlink"/>
@@ -4049,7 +4049,7 @@
             <w:noProof/>
             <w:webHidden/>
           </w:rPr>
-          <w:instrText xml:space="preserve"> PAGEREF _Toc242733559 \h </w:instrText>
+          <w:instrText xml:space="preserve"> PAGEREF _Toc242739218 \h </w:instrText>
         </w:r>
         <w:r>
           <w:rPr>
@@ -4097,7 +4097,7 @@
           <w14:ligatures w14:val="standardContextual"/>
         </w:rPr>
       </w:pPr>
-      <w:hyperlink w:anchor="_Toc242733560" w:history="1">
+      <w:hyperlink w:anchor="_Toc242739219" w:history="1">
         <w:r>
           <w:rPr>
             <w:rStyle w:val="Hyperlink"/>
@@ -4143,7 +4143,7 @@
             <w:noProof/>
             <w:webHidden/>
           </w:rPr>
-          <w:instrText xml:space="preserve"> PAGEREF _Toc242733560 \h </w:instrText>
+          <w:instrText xml:space="preserve"> PAGEREF _Toc242739219 \h </w:instrText>
         </w:r>
         <w:r>
           <w:rPr>
@@ -4191,7 +4191,7 @@
           <w14:ligatures w14:val="standardContextual"/>
         </w:rPr>
       </w:pPr>
-      <w:hyperlink w:anchor="_Toc242733561" w:history="1">
+      <w:hyperlink w:anchor="_Toc242739220" w:history="1">
         <w:r>
           <w:rPr>
             <w:rStyle w:val="Hyperlink"/>
@@ -4237,7 +4237,7 @@
             <w:noProof/>
             <w:webHidden/>
           </w:rPr>
-          <w:instrText xml:space="preserve"> PAGEREF _Toc242733561 \h </w:instrText>
+          <w:instrText xml:space="preserve"> PAGEREF _Toc242739220 \h </w:instrText>
         </w:r>
         <w:r>
           <w:rPr>
@@ -4285,7 +4285,7 @@
           <w14:ligatures w14:val="standardContextual"/>
         </w:rPr>
       </w:pPr>
-      <w:hyperlink w:anchor="_Toc242733562" w:history="1">
+      <w:hyperlink w:anchor="_Toc242739221" w:history="1">
         <w:r>
           <w:rPr>
             <w:rStyle w:val="Hyperlink"/>
@@ -4331,7 +4331,7 @@
             <w:noProof/>
             <w:webHidden/>
           </w:rPr>
-          <w:instrText xml:space="preserve"> PAGEREF _Toc242733562 \h </w:instrText>
+          <w:instrText xml:space="preserve"> PAGEREF _Toc242739221 \h </w:instrText>
         </w:r>
         <w:r>
           <w:rPr>
@@ -4379,7 +4379,7 @@
           <w14:ligatures w14:val="standardContextual"/>
         </w:rPr>
       </w:pPr>
-      <w:hyperlink w:anchor="_Toc242733563" w:history="1">
+      <w:hyperlink w:anchor="_Toc242739222" w:history="1">
         <w:r>
           <w:rPr>
             <w:rStyle w:val="Hyperlink"/>
@@ -4425,7 +4425,7 @@
             <w:noProof/>
             <w:webHidden/>
           </w:rPr>
-          <w:instrText xml:space="preserve"> PAGEREF _Toc242733563 \h </w:instrText>
+          <w:instrText xml:space="preserve"> PAGEREF _Toc242739222 \h </w:instrText>
         </w:r>
         <w:r>
           <w:rPr>
@@ -4457,15 +4457,109 @@
       </w:hyperlink>
     </w:p>
     <w:p>
-      <w:r>
-        <w:fldChar w:fldCharType="end"/>
-      </w:r>
+      <w:pPr>
+        <w:pStyle w:val="TOC1"/>
+        <w:tabs>
+          <w:tab w:val="left" w:pos="720"/>
+          <w:tab w:val="right" w:leader="dot" w:pos="9062"/>
+        </w:tabs>
+        <w:rPr>
+          <w:rFonts w:asciiTheme="minorHAnsi" w:eastAsiaTheme="minorEastAsia" w:hAnsiTheme="minorHAnsi"/>
+          <w:noProof/>
+          <w:color w:val="auto"/>
+          <w:kern w:val="2"/>
+          <w:sz w:val="24"/>
+          <w:szCs w:val="24"/>
+          <w14:ligatures w14:val="standardContextual"/>
+        </w:rPr>
+      </w:pPr>
+      <w:hyperlink w:anchor="_Toc242739223" w:history="1">
+        <w:r>
+          <w:rPr>
+            <w:rStyle w:val="Hyperlink"/>
+            <w:noProof/>
+          </w:rPr>
+          <w:t>10</w:t>
+        </w:r>
+        <w:r>
+          <w:rPr>
+            <w:rFonts w:asciiTheme="minorHAnsi" w:eastAsiaTheme="minorEastAsia" w:hAnsiTheme="minorHAnsi"/>
+            <w:noProof/>
+            <w:color w:val="auto"/>
+            <w:kern w:val="2"/>
+            <w:sz w:val="24"/>
+            <w:szCs w:val="24"/>
+            <w14:ligatures w14:val="standardContextual"/>
+          </w:rPr>
+          <w:tab/>
+        </w:r>
+        <w:r>
+          <w:rPr>
+            <w:rStyle w:val="Hyperlink"/>
+            <w:noProof/>
+          </w:rPr>
+          <w:t>Acknowledgments</w:t>
+        </w:r>
+        <w:r>
+          <w:rPr>
+            <w:noProof/>
+            <w:webHidden/>
+          </w:rPr>
+          <w:tab/>
+        </w:r>
+        <w:r>
+          <w:rPr>
+            <w:noProof/>
+            <w:webHidden/>
+          </w:rPr>
+          <w:fldChar w:fldCharType="begin"/>
+        </w:r>
+        <w:r>
+          <w:rPr>
+            <w:noProof/>
+            <w:webHidden/>
+          </w:rPr>
+          <w:instrText xml:space="preserve"> PAGEREF _Toc242739223 \h </w:instrText>
+        </w:r>
+        <w:r>
+          <w:rPr>
+            <w:noProof/>
+            <w:webHidden/>
+          </w:rPr>
+        </w:r>
+        <w:r>
+          <w:rPr>
+            <w:noProof/>
+            <w:webHidden/>
+          </w:rPr>
+          <w:fldChar w:fldCharType="separate"/>
+        </w:r>
+        <w:r>
+          <w:rPr>
+            <w:noProof/>
+            <w:webHidden/>
+          </w:rPr>
+          <w:t>32</w:t>
+        </w:r>
+        <w:r>
+          <w:rPr>
+            <w:noProof/>
+            <w:webHidden/>
+          </w:rPr>
+          <w:fldChar w:fldCharType="end"/>
+        </w:r>
+      </w:hyperlink>
     </w:p>
     <w:p>
+      <w:r>
+        <w:fldChar w:fldCharType="end"/>
+      </w:r>
+    </w:p>
+    <w:p>
       <w:pPr>
         <w:pStyle w:val="Heading1"/>
       </w:pPr>
-      <w:bookmarkStart w:id="0" w:name="_Toc242733518"/>
+      <w:bookmarkStart w:id="0" w:name="_Toc242739177"/>
       <w:r>
         <w:lastRenderedPageBreak/>
         <w:t>Overview</w:t>
@@ -4622,7 +4716,7 @@
       <w:pPr>
         <w:pStyle w:val="Heading1"/>
       </w:pPr>
-      <w:bookmarkStart w:id="1" w:name="_Toc242733519"/>
+      <w:bookmarkStart w:id="1" w:name="_Toc242739178"/>
       <w:r>
         <w:lastRenderedPageBreak/>
         <w:t>Installation</w:t>
@@ -4665,7 +4759,7 @@
       <w:pPr>
         <w:pStyle w:val="Heading2"/>
       </w:pPr>
-      <w:bookmarkStart w:id="2" w:name="_Toc242733520"/>
+      <w:bookmarkStart w:id="2" w:name="_Toc242739179"/>
       <w:r>
         <w:t>Automatic installation</w:t>
       </w:r>
@@ -5014,7 +5108,7 @@
       <w:pPr>
         <w:pStyle w:val="Heading2"/>
       </w:pPr>
-      <w:bookmarkStart w:id="3" w:name="_Toc242733521"/>
+      <w:bookmarkStart w:id="3" w:name="_Toc242739180"/>
       <w:r>
         <w:t>Manual installation</w:t>
       </w:r>
@@ -5177,7 +5271,7 @@
       <w:pPr>
         <w:pStyle w:val="Heading2"/>
       </w:pPr>
-      <w:bookmarkStart w:id="4" w:name="_Toc242733522"/>
+      <w:bookmarkStart w:id="4" w:name="_Toc242739181"/>
       <w:r>
         <w:lastRenderedPageBreak/>
         <w:t>Testing the installation</w:t>
@@ -5375,7 +5469,7 @@
       <w:pPr>
         <w:pStyle w:val="Heading2"/>
       </w:pPr>
-      <w:bookmarkStart w:id="5" w:name="_Toc242733523"/>
+      <w:bookmarkStart w:id="5" w:name="_Toc242739182"/>
       <w:r>
         <w:t>GPU support (if you have an NVIDIA GPU)</w:t>
       </w:r>
@@ -5730,7 +5824,7 @@
       <w:pPr>
         <w:pStyle w:val="Heading2"/>
       </w:pPr>
-      <w:bookmarkStart w:id="6" w:name="_Toc242733524"/>
+      <w:bookmarkStart w:id="6" w:name="_Toc242739183"/>
       <w:r>
         <w:t>Pre-compiled kernels</w:t>
       </w:r>
@@ -5811,7 +5905,7 @@
       <w:pPr>
         <w:pStyle w:val="Heading1"/>
       </w:pPr>
-      <w:bookmarkStart w:id="7" w:name="_Toc242733525"/>
+      <w:bookmarkStart w:id="7" w:name="_Toc242739184"/>
       <w:r>
         <w:lastRenderedPageBreak/>
         <w:t>Input Handling</w:t>
@@ -6288,7 +6382,7 @@
       <w:pPr>
         <w:pStyle w:val="Heading2"/>
       </w:pPr>
-      <w:bookmarkStart w:id="8" w:name="_Toc242733526"/>
+      <w:bookmarkStart w:id="8" w:name="_Toc242739185"/>
       <w:r>
         <w:t>External Data Sources</w:t>
       </w:r>
@@ -6898,7 +6992,7 @@
       <w:pPr>
         <w:pStyle w:val="Heading2"/>
       </w:pPr>
-      <w:bookmarkStart w:id="9" w:name="_Toc242733527"/>
+      <w:bookmarkStart w:id="9" w:name="_Toc242739186"/>
       <w:r>
         <w:lastRenderedPageBreak/>
         <w:t>Event Selection (Watcher)</w:t>
@@ -7404,7 +7498,7 @@
       <w:pPr>
         <w:pStyle w:val="Heading1"/>
       </w:pPr>
-      <w:bookmarkStart w:id="10" w:name="_Toc242733528"/>
+      <w:bookmarkStart w:id="10" w:name="_Toc242739187"/>
       <w:r>
         <w:lastRenderedPageBreak/>
         <w:t>Station and Signal Selection</w:t>
@@ -7534,7 +7628,7 @@
       <w:pPr>
         <w:pStyle w:val="Heading2"/>
       </w:pPr>
-      <w:bookmarkStart w:id="11" w:name="_Toc242733529"/>
+      <w:bookmarkStart w:id="11" w:name="_Toc242739188"/>
       <w:r>
         <w:t>Step 1 — Retrieve the event</w:t>
       </w:r>
@@ -7552,7 +7646,7 @@
       <w:pPr>
         <w:pStyle w:val="Heading2"/>
       </w:pPr>
-      <w:bookmarkStart w:id="12" w:name="_Toc242733530"/>
+      <w:bookmarkStart w:id="12" w:name="_Toc242739189"/>
       <w:r>
         <w:t>Step 2 — Retrieve the station metadata</w:t>
       </w:r>
@@ -8322,7 +8416,7 @@
       <w:pPr>
         <w:pStyle w:val="Heading2"/>
       </w:pPr>
-      <w:bookmarkStart w:id="13" w:name="_Toc242733531"/>
+      <w:bookmarkStart w:id="13" w:name="_Toc242739190"/>
       <w:r>
         <w:t>Step 3 — Download the waveforms</w:t>
       </w:r>
@@ -8340,7 +8434,7 @@
       <w:pPr>
         <w:pStyle w:val="Heading2"/>
       </w:pPr>
-      <w:bookmarkStart w:id="14" w:name="_Toc242733532"/>
+      <w:bookmarkStart w:id="14" w:name="_Toc242739191"/>
       <w:r>
         <w:t>Step 4 — Quality checks and instrument correction</w:t>
       </w:r>
@@ -8889,7 +8983,7 @@
       <w:pPr>
         <w:pStyle w:val="Heading2"/>
       </w:pPr>
-      <w:bookmarkStart w:id="15" w:name="_Toc242733533"/>
+      <w:bookmarkStart w:id="15" w:name="_Toc242739192"/>
       <w:r>
         <w:t>Step 5 — Azimuthal selection</w:t>
       </w:r>
@@ -9072,7 +9166,7 @@
       <w:pPr>
         <w:pStyle w:val="Heading1"/>
       </w:pPr>
-      <w:bookmarkStart w:id="16" w:name="_Toc242733534"/>
+      <w:bookmarkStart w:id="16" w:name="_Toc242739193"/>
       <w:r>
         <w:lastRenderedPageBreak/>
         <w:t>Computation Configuration</w:t>
@@ -9156,7 +9250,7 @@
       <w:pPr>
         <w:pStyle w:val="Heading2"/>
       </w:pPr>
-      <w:bookmarkStart w:id="17" w:name="_Toc242733535"/>
+      <w:bookmarkStart w:id="17" w:name="_Toc242739194"/>
       <w:r>
         <w:t>Green's Functions</w:t>
       </w:r>
@@ -9166,7 +9260,7 @@
       <w:pPr>
         <w:pStyle w:val="Heading3"/>
       </w:pPr>
-      <w:bookmarkStart w:id="18" w:name="_Toc242733536"/>
+      <w:bookmarkStart w:id="18" w:name="_Toc242739195"/>
       <w:r>
         <w:t>Regional velocity models</w:t>
       </w:r>
@@ -9351,7 +9445,7 @@
       <w:pPr>
         <w:pStyle w:val="Heading3"/>
       </w:pPr>
-      <w:bookmarkStart w:id="19" w:name="_Toc242733537"/>
+      <w:bookmarkStart w:id="19" w:name="_Toc242739196"/>
       <w:r>
         <w:t>Source grid</w:t>
       </w:r>
@@ -9809,7 +9903,7 @@
       <w:pPr>
         <w:pStyle w:val="Heading3"/>
       </w:pPr>
-      <w:bookmarkStart w:id="20" w:name="_Toc242733538"/>
+      <w:bookmarkStart w:id="20" w:name="_Toc242739197"/>
       <w:r>
         <w:t>Frequency content</w:t>
       </w:r>
@@ -9932,7 +10026,7 @@
       <w:pPr>
         <w:pStyle w:val="Heading2"/>
       </w:pPr>
-      <w:bookmarkStart w:id="21" w:name="_Toc242733539"/>
+      <w:bookmarkStart w:id="21" w:name="_Toc242739198"/>
       <w:r>
         <w:lastRenderedPageBreak/>
         <w:t>Inversion Parameters</w:t>
@@ -9951,7 +10045,7 @@
       <w:pPr>
         <w:pStyle w:val="Heading3"/>
       </w:pPr>
-      <w:bookmarkStart w:id="22" w:name="_Toc242733540"/>
+      <w:bookmarkStart w:id="22" w:name="_Toc242739199"/>
       <w:r>
         <w:t>Frequency band</w:t>
       </w:r>
@@ -10116,7 +10210,7 @@
       <w:pPr>
         <w:pStyle w:val="Heading3"/>
       </w:pPr>
-      <w:bookmarkStart w:id="23" w:name="_Toc242733541"/>
+      <w:bookmarkStart w:id="23" w:name="_Toc242739200"/>
       <w:r>
         <w:t>Waveform window</w:t>
       </w:r>
@@ -10301,7 +10395,7 @@
       <w:pPr>
         <w:pStyle w:val="Heading3"/>
       </w:pPr>
-      <w:bookmarkStart w:id="24" w:name="_Toc242733542"/>
+      <w:bookmarkStart w:id="24" w:name="_Toc242739201"/>
       <w:r>
         <w:lastRenderedPageBreak/>
         <w:t>Centroid time search</w:t>
@@ -10445,7 +10539,7 @@
       <w:pPr>
         <w:pStyle w:val="Heading3"/>
       </w:pPr>
-      <w:bookmarkStart w:id="25" w:name="_Toc242733543"/>
+      <w:bookmarkStart w:id="25" w:name="_Toc242739202"/>
       <w:r>
         <w:t>Source time function</w:t>
       </w:r>
@@ -10574,7 +10668,7 @@
       <w:pPr>
         <w:pStyle w:val="Heading3"/>
       </w:pPr>
-      <w:bookmarkStart w:id="26" w:name="_Toc242733544"/>
+      <w:bookmarkStart w:id="26" w:name="_Toc242739203"/>
       <w:r>
         <w:t>Deviatoric and full moment tensor</w:t>
       </w:r>
@@ -10741,7 +10835,7 @@
       <w:pPr>
         <w:pStyle w:val="Heading2"/>
       </w:pPr>
-      <w:bookmarkStart w:id="27" w:name="_Toc242733545"/>
+      <w:bookmarkStart w:id="27" w:name="_Toc242739204"/>
       <w:r>
         <w:lastRenderedPageBreak/>
         <w:t>Bayesian Bootstrap</w:t>
@@ -11408,7 +11502,7 @@
       <w:pPr>
         <w:pStyle w:val="Heading1"/>
       </w:pPr>
-      <w:bookmarkStart w:id="28" w:name="_Toc242733546"/>
+      <w:bookmarkStart w:id="28" w:name="_Toc242739205"/>
       <w:r>
         <w:lastRenderedPageBreak/>
         <w:t>Outputs</w:t>
@@ -11743,7 +11837,7 @@
       <w:pPr>
         <w:pStyle w:val="Heading2"/>
       </w:pPr>
-      <w:bookmarkStart w:id="29" w:name="_Toc242733547"/>
+      <w:bookmarkStart w:id="29" w:name="_Toc242739206"/>
       <w:r>
         <w:t>Result files</w:t>
       </w:r>
@@ -12598,7 +12692,7 @@
       <w:pPr>
         <w:pStyle w:val="Heading2"/>
       </w:pPr>
-      <w:bookmarkStart w:id="30" w:name="_Toc242733548"/>
+      <w:bookmarkStart w:id="30" w:name="_Toc242739207"/>
       <w:r>
         <w:t>Figures</w:t>
       </w:r>
@@ -13847,7 +13941,7 @@
       <w:pPr>
         <w:pStyle w:val="Heading2"/>
       </w:pPr>
-      <w:bookmarkStart w:id="31" w:name="_Toc242733549"/>
+      <w:bookmarkStart w:id="31" w:name="_Toc242739208"/>
       <w:r>
         <w:t>Web pages</w:t>
       </w:r>
@@ -14275,7 +14369,7 @@
       <w:pPr>
         <w:pStyle w:val="Heading2"/>
       </w:pPr>
-      <w:bookmarkStart w:id="32" w:name="_Toc242733550"/>
+      <w:bookmarkStart w:id="32" w:name="_Toc242739209"/>
       <w:r>
         <w:t>Log</w:t>
       </w:r>
@@ -14293,7 +14387,7 @@
       <w:pPr>
         <w:pStyle w:val="Heading1"/>
       </w:pPr>
-      <w:bookmarkStart w:id="33" w:name="_Toc242733551"/>
+      <w:bookmarkStart w:id="33" w:name="_Toc242739210"/>
       <w:r>
         <w:lastRenderedPageBreak/>
         <w:t>Other Settings</w:t>
@@ -15105,7 +15199,7 @@
       <w:pPr>
         <w:pStyle w:val="Heading1"/>
       </w:pPr>
-      <w:bookmarkStart w:id="34" w:name="_Toc242733552"/>
+      <w:bookmarkStart w:id="34" w:name="_Toc242739211"/>
       <w:r>
         <w:lastRenderedPageBreak/>
         <w:t>Usage</w:t>
@@ -15489,7 +15583,7 @@
       <w:pPr>
         <w:pStyle w:val="Heading2"/>
       </w:pPr>
-      <w:bookmarkStart w:id="35" w:name="_Toc242733553"/>
+      <w:bookmarkStart w:id="35" w:name="_Toc242739212"/>
       <w:r>
         <w:t>Single event (-e)</w:t>
       </w:r>
@@ -15778,7 +15872,7 @@
       <w:pPr>
         <w:pStyle w:val="Heading2"/>
       </w:pPr>
-      <w:bookmarkStart w:id="36" w:name="_Toc242733554"/>
+      <w:bookmarkStart w:id="36" w:name="_Toc242739213"/>
       <w:r>
         <w:lastRenderedPageBreak/>
         <w:t>Event file (--event-file)</w:t>
@@ -16117,7 +16211,7 @@
       <w:pPr>
         <w:pStyle w:val="Heading2"/>
       </w:pPr>
-      <w:bookmarkStart w:id="37" w:name="_Toc242733555"/>
+      <w:bookmarkStart w:id="37" w:name="_Toc242739214"/>
       <w:r>
         <w:t>QuakeML file (--event-xml)</w:t>
       </w:r>
@@ -16184,7 +16278,7 @@
       <w:pPr>
         <w:pStyle w:val="Heading2"/>
       </w:pPr>
-      <w:bookmarkStart w:id="38" w:name="_Toc242733556"/>
+      <w:bookmarkStart w:id="38" w:name="_Toc242739215"/>
       <w:r>
         <w:t>Datetime range (-d)</w:t>
       </w:r>
@@ -16263,7 +16357,7 @@
       <w:pPr>
         <w:pStyle w:val="Heading2"/>
       </w:pPr>
-      <w:bookmarkStart w:id="39" w:name="_Toc242733557"/>
+      <w:bookmarkStart w:id="39" w:name="_Toc242739216"/>
       <w:r>
         <w:lastRenderedPageBreak/>
         <w:t>Real time (--real-time)</w:t>
@@ -16424,7 +16518,7 @@
       <w:pPr>
         <w:pStyle w:val="Heading2"/>
       </w:pPr>
-      <w:bookmarkStart w:id="40" w:name="_Toc242733558"/>
+      <w:bookmarkStart w:id="40" w:name="_Toc242739217"/>
       <w:r>
         <w:t>Revise (--revise)</w:t>
       </w:r>
@@ -17415,7 +17509,7 @@
       <w:pPr>
         <w:pStyle w:val="Heading2"/>
       </w:pPr>
-      <w:bookmarkStart w:id="41" w:name="_Toc242733559"/>
+      <w:bookmarkStart w:id="41" w:name="_Toc242739218"/>
       <w:r>
         <w:t>Web pages (--home)</w:t>
       </w:r>
@@ -17606,7 +17700,7 @@
       <w:pPr>
         <w:pStyle w:val="Heading2"/>
       </w:pPr>
-      <w:bookmarkStart w:id="42" w:name="_Toc242733560"/>
+      <w:bookmarkStart w:id="42" w:name="_Toc242739219"/>
       <w:r>
         <w:t>PPSD tool (for ppsdoffline)</w:t>
       </w:r>
@@ -17723,7 +17817,7 @@
       <w:pPr>
         <w:pStyle w:val="Heading2"/>
       </w:pPr>
-      <w:bookmarkStart w:id="43" w:name="_Toc242733561"/>
+      <w:bookmarkStart w:id="43" w:name="_Toc242739220"/>
       <w:r>
         <w:t>Runtime Overrides</w:t>
       </w:r>
@@ -19189,7 +19283,7 @@
       <w:pPr>
         <w:pStyle w:val="Heading2"/>
       </w:pPr>
-      <w:bookmarkStart w:id="44" w:name="_Toc242733562"/>
+      <w:bookmarkStart w:id="44" w:name="_Toc242739221"/>
       <w:r>
         <w:t>Operational Notes</w:t>
       </w:r>
@@ -19531,7 +19625,7 @@
       <w:pPr>
         <w:pStyle w:val="Heading1"/>
       </w:pPr>
-      <w:bookmarkStart w:id="45" w:name="_Toc242733563"/>
+      <w:bookmarkStart w:id="45" w:name="_Toc242739222"/>
       <w:r>
         <w:lastRenderedPageBreak/>
         <w:t>References</w:t>
@@ -19568,9 +19662,73 @@
         <w:t>Triantafyllis, N., Venetis, I. E., Fountoulakis, I., Pikoulis, E.-V., Sokos, E., Evangelidis, C. P. (2021). Gisola: A High-Performance Computing Application for Real-Time Moment Tensor Inversion. Seismological Research Letters. https://doi.org/10.1785/0220210153</w:t>
       </w:r>
     </w:p>
+    <w:p>
+      <w:pPr>
+        <w:pStyle w:val="Heading1"/>
+      </w:pPr>
+      <w:bookmarkStart w:id="46" w:name="_Toc242739223"/>
+      <w:r>
+        <w:lastRenderedPageBreak/>
+        <w:t>Acknowledgments</w:t>
+      </w:r>
+      <w:bookmarkEnd w:id="46"/>
+    </w:p>
+    <w:p>
+      <w:pPr>
+        <w:jc w:val="both"/>
+      </w:pPr>
+      <w:r>
+        <w:t>This work is supported by TRANSFORM², which is funded by the European Union under project number 101188365 within the HORIZON-INFRA-2024-DEV-01-01 call.</w:t>
+      </w:r>
+    </w:p>
+    <w:p>
+      <w:pPr>
+        <w:jc w:val="center"/>
+      </w:pPr>
+      <w:r>
+        <w:rPr>
+          <w:noProof/>
+        </w:rPr>
+        <w:drawing>
+          <wp:inline distT="0" distB="0" distL="0" distR="0">
+            <wp:extent cx="1800000" cy="1599000"/>
+            <wp:effectExtent l="0" t="0" r="0" b="0"/>
+            <wp:docPr id="1" name="Picture 1"/>
+            <wp:cNvGraphicFramePr>
+              <a:graphicFrameLocks xmlns:a="http://schemas.openxmlformats.org/drawingml/2006/main" noChangeAspect="1"/>
+            </wp:cNvGraphicFramePr>
+            <a:graphic xmlns:a="http://schemas.openxmlformats.org/drawingml/2006/main">
+              <a:graphicData uri="http://schemas.openxmlformats.org/drawingml/2006/picture">
+                <pic:pic xmlns:pic="http://schemas.openxmlformats.org/drawingml/2006/picture">
+                  <pic:nvPicPr>
+                    <pic:cNvPr id="0" name="transform2_logo.png"/>
+                    <pic:cNvPicPr/>
+                  </pic:nvPicPr>
+                  <pic:blipFill>
+                    <a:blip r:embed="rId8"/>
+                    <a:stretch>
+                      <a:fillRect/>
+                    </a:stretch>
+                  </pic:blipFill>
+                  <pic:spPr>
+                    <a:xfrm>
+                      <a:off x="0" y="0"/>
+                      <a:ext cx="1800000" cy="1599000"/>
+                    </a:xfrm>
+                    <a:prstGeom prst="rect">
+                      <a:avLst/>
+                    </a:prstGeom>
+                  </pic:spPr>
+                </pic:pic>
+              </a:graphicData>
+            </a:graphic>
+          </wp:inline>
+        </w:drawing>
+      </w:r>
+    </w:p>
     <w:sectPr>
-      <w:headerReference w:type="default" r:id="rId8"/>
-      <w:footerReference w:type="default" r:id="rId9"/>
+      <w:headerReference w:type="default" r:id="rId9"/>
+      <w:footerReference w:type="default" r:id="rId10"/>
       <w:pgSz w:w="11906" w:h="16838"/>
       <w:pgMar w:top="1417" w:right="1417" w:bottom="1304" w:left="1417" w:header="680" w:footer="624" w:gutter="0"/>
       <w:cols w:space="720"/>

</xml_diff>

<commit_message>
numba-cuda GPU install, RandomSeed, RunMemoryMB default 3000, reorganised configuration files
</commit_message>
<xml_diff>
--- a/docs/GisolaBaBoo_User_Manual.docx
+++ b/docs/GisolaBaBoo_User_Manual.docx
@@ -149,7 +149,7 @@
       <w:r>
         <w:fldChar w:fldCharType="separate"/>
       </w:r>
-      <w:hyperlink w:anchor="_Toc242739177" w:history="1">
+      <w:hyperlink w:anchor="_Toc242802424" w:history="1">
         <w:r>
           <w:rPr>
             <w:rStyle w:val="Hyperlink"/>
@@ -195,7 +195,7 @@
             <w:noProof/>
             <w:webHidden/>
           </w:rPr>
-          <w:instrText xml:space="preserve"> PAGEREF _Toc242739177 \h </w:instrText>
+          <w:instrText xml:space="preserve"> PAGEREF _Toc242802424 \h </w:instrText>
         </w:r>
         <w:r>
           <w:rPr>
@@ -243,7 +243,7 @@
           <w14:ligatures w14:val="standardContextual"/>
         </w:rPr>
       </w:pPr>
-      <w:hyperlink w:anchor="_Toc242739178" w:history="1">
+      <w:hyperlink w:anchor="_Toc242802425" w:history="1">
         <w:r>
           <w:rPr>
             <w:rStyle w:val="Hyperlink"/>
@@ -289,7 +289,7 @@
             <w:noProof/>
             <w:webHidden/>
           </w:rPr>
-          <w:instrText xml:space="preserve"> PAGEREF _Toc242739178 \h </w:instrText>
+          <w:instrText xml:space="preserve"> PAGEREF _Toc242802425 \h </w:instrText>
         </w:r>
         <w:r>
           <w:rPr>
@@ -337,7 +337,7 @@
           <w14:ligatures w14:val="standardContextual"/>
         </w:rPr>
       </w:pPr>
-      <w:hyperlink w:anchor="_Toc242739179" w:history="1">
+      <w:hyperlink w:anchor="_Toc242802426" w:history="1">
         <w:r>
           <w:rPr>
             <w:rStyle w:val="Hyperlink"/>
@@ -383,7 +383,7 @@
             <w:noProof/>
             <w:webHidden/>
           </w:rPr>
-          <w:instrText xml:space="preserve"> PAGEREF _Toc242739179 \h </w:instrText>
+          <w:instrText xml:space="preserve"> PAGEREF _Toc242802426 \h </w:instrText>
         </w:r>
         <w:r>
           <w:rPr>
@@ -431,7 +431,7 @@
           <w14:ligatures w14:val="standardContextual"/>
         </w:rPr>
       </w:pPr>
-      <w:hyperlink w:anchor="_Toc242739180" w:history="1">
+      <w:hyperlink w:anchor="_Toc242802427" w:history="1">
         <w:r>
           <w:rPr>
             <w:rStyle w:val="Hyperlink"/>
@@ -477,7 +477,7 @@
             <w:noProof/>
             <w:webHidden/>
           </w:rPr>
-          <w:instrText xml:space="preserve"> PAGEREF _Toc242739180 \h </w:instrText>
+          <w:instrText xml:space="preserve"> PAGEREF _Toc242802427 \h </w:instrText>
         </w:r>
         <w:r>
           <w:rPr>
@@ -525,7 +525,7 @@
           <w14:ligatures w14:val="standardContextual"/>
         </w:rPr>
       </w:pPr>
-      <w:hyperlink w:anchor="_Toc242739181" w:history="1">
+      <w:hyperlink w:anchor="_Toc242802428" w:history="1">
         <w:r>
           <w:rPr>
             <w:rStyle w:val="Hyperlink"/>
@@ -571,7 +571,7 @@
             <w:noProof/>
             <w:webHidden/>
           </w:rPr>
-          <w:instrText xml:space="preserve"> PAGEREF _Toc242739181 \h </w:instrText>
+          <w:instrText xml:space="preserve"> PAGEREF _Toc242802428 \h </w:instrText>
         </w:r>
         <w:r>
           <w:rPr>
@@ -619,7 +619,7 @@
           <w14:ligatures w14:val="standardContextual"/>
         </w:rPr>
       </w:pPr>
-      <w:hyperlink w:anchor="_Toc242739182" w:history="1">
+      <w:hyperlink w:anchor="_Toc242802429" w:history="1">
         <w:r>
           <w:rPr>
             <w:rStyle w:val="Hyperlink"/>
@@ -665,7 +665,7 @@
             <w:noProof/>
             <w:webHidden/>
           </w:rPr>
-          <w:instrText xml:space="preserve"> PAGEREF _Toc242739182 \h </w:instrText>
+          <w:instrText xml:space="preserve"> PAGEREF _Toc242802429 \h </w:instrText>
         </w:r>
         <w:r>
           <w:rPr>
@@ -713,7 +713,7 @@
           <w14:ligatures w14:val="standardContextual"/>
         </w:rPr>
       </w:pPr>
-      <w:hyperlink w:anchor="_Toc242739183" w:history="1">
+      <w:hyperlink w:anchor="_Toc242802430" w:history="1">
         <w:r>
           <w:rPr>
             <w:rStyle w:val="Hyperlink"/>
@@ -759,7 +759,7 @@
             <w:noProof/>
             <w:webHidden/>
           </w:rPr>
-          <w:instrText xml:space="preserve"> PAGEREF _Toc242739183 \h </w:instrText>
+          <w:instrText xml:space="preserve"> PAGEREF _Toc242802430 \h </w:instrText>
         </w:r>
         <w:r>
           <w:rPr>
@@ -807,7 +807,7 @@
           <w14:ligatures w14:val="standardContextual"/>
         </w:rPr>
       </w:pPr>
-      <w:hyperlink w:anchor="_Toc242739184" w:history="1">
+      <w:hyperlink w:anchor="_Toc242802431" w:history="1">
         <w:r>
           <w:rPr>
             <w:rStyle w:val="Hyperlink"/>
@@ -853,7 +853,7 @@
             <w:noProof/>
             <w:webHidden/>
           </w:rPr>
-          <w:instrText xml:space="preserve"> PAGEREF _Toc242739184 \h </w:instrText>
+          <w:instrText xml:space="preserve"> PAGEREF _Toc242802431 \h </w:instrText>
         </w:r>
         <w:r>
           <w:rPr>
@@ -901,7 +901,7 @@
           <w14:ligatures w14:val="standardContextual"/>
         </w:rPr>
       </w:pPr>
-      <w:hyperlink w:anchor="_Toc242739185" w:history="1">
+      <w:hyperlink w:anchor="_Toc242802432" w:history="1">
         <w:r>
           <w:rPr>
             <w:rStyle w:val="Hyperlink"/>
@@ -947,7 +947,7 @@
             <w:noProof/>
             <w:webHidden/>
           </w:rPr>
-          <w:instrText xml:space="preserve"> PAGEREF _Toc242739185 \h </w:instrText>
+          <w:instrText xml:space="preserve"> PAGEREF _Toc242802432 \h </w:instrText>
         </w:r>
         <w:r>
           <w:rPr>
@@ -995,7 +995,7 @@
           <w14:ligatures w14:val="standardContextual"/>
         </w:rPr>
       </w:pPr>
-      <w:hyperlink w:anchor="_Toc242739186" w:history="1">
+      <w:hyperlink w:anchor="_Toc242802433" w:history="1">
         <w:r>
           <w:rPr>
             <w:rStyle w:val="Hyperlink"/>
@@ -1041,7 +1041,7 @@
             <w:noProof/>
             <w:webHidden/>
           </w:rPr>
-          <w:instrText xml:space="preserve"> PAGEREF _Toc242739186 \h </w:instrText>
+          <w:instrText xml:space="preserve"> PAGEREF _Toc242802433 \h </w:instrText>
         </w:r>
         <w:r>
           <w:rPr>
@@ -1089,7 +1089,7 @@
           <w14:ligatures w14:val="standardContextual"/>
         </w:rPr>
       </w:pPr>
-      <w:hyperlink w:anchor="_Toc242739187" w:history="1">
+      <w:hyperlink w:anchor="_Toc242802434" w:history="1">
         <w:r>
           <w:rPr>
             <w:rStyle w:val="Hyperlink"/>
@@ -1135,7 +1135,7 @@
             <w:noProof/>
             <w:webHidden/>
           </w:rPr>
-          <w:instrText xml:space="preserve"> PAGEREF _Toc242739187 \h </w:instrText>
+          <w:instrText xml:space="preserve"> PAGEREF _Toc242802434 \h </w:instrText>
         </w:r>
         <w:r>
           <w:rPr>
@@ -1183,7 +1183,7 @@
           <w14:ligatures w14:val="standardContextual"/>
         </w:rPr>
       </w:pPr>
-      <w:hyperlink w:anchor="_Toc242739188" w:history="1">
+      <w:hyperlink w:anchor="_Toc242802435" w:history="1">
         <w:r>
           <w:rPr>
             <w:rStyle w:val="Hyperlink"/>
@@ -1229,7 +1229,7 @@
             <w:noProof/>
             <w:webHidden/>
           </w:rPr>
-          <w:instrText xml:space="preserve"> PAGEREF _Toc242739188 \h </w:instrText>
+          <w:instrText xml:space="preserve"> PAGEREF _Toc242802435 \h </w:instrText>
         </w:r>
         <w:r>
           <w:rPr>
@@ -1277,7 +1277,7 @@
           <w14:ligatures w14:val="standardContextual"/>
         </w:rPr>
       </w:pPr>
-      <w:hyperlink w:anchor="_Toc242739189" w:history="1">
+      <w:hyperlink w:anchor="_Toc242802436" w:history="1">
         <w:r>
           <w:rPr>
             <w:rStyle w:val="Hyperlink"/>
@@ -1323,7 +1323,7 @@
             <w:noProof/>
             <w:webHidden/>
           </w:rPr>
-          <w:instrText xml:space="preserve"> PAGEREF _Toc242739189 \h </w:instrText>
+          <w:instrText xml:space="preserve"> PAGEREF _Toc242802436 \h </w:instrText>
         </w:r>
         <w:r>
           <w:rPr>
@@ -1371,7 +1371,7 @@
           <w14:ligatures w14:val="standardContextual"/>
         </w:rPr>
       </w:pPr>
-      <w:hyperlink w:anchor="_Toc242739190" w:history="1">
+      <w:hyperlink w:anchor="_Toc242802437" w:history="1">
         <w:r>
           <w:rPr>
             <w:rStyle w:val="Hyperlink"/>
@@ -1417,7 +1417,7 @@
             <w:noProof/>
             <w:webHidden/>
           </w:rPr>
-          <w:instrText xml:space="preserve"> PAGEREF _Toc242739190 \h </w:instrText>
+          <w:instrText xml:space="preserve"> PAGEREF _Toc242802437 \h </w:instrText>
         </w:r>
         <w:r>
           <w:rPr>
@@ -1465,7 +1465,7 @@
           <w14:ligatures w14:val="standardContextual"/>
         </w:rPr>
       </w:pPr>
-      <w:hyperlink w:anchor="_Toc242739191" w:history="1">
+      <w:hyperlink w:anchor="_Toc242802438" w:history="1">
         <w:r>
           <w:rPr>
             <w:rStyle w:val="Hyperlink"/>
@@ -1511,7 +1511,7 @@
             <w:noProof/>
             <w:webHidden/>
           </w:rPr>
-          <w:instrText xml:space="preserve"> PAGEREF _Toc242739191 \h </w:instrText>
+          <w:instrText xml:space="preserve"> PAGEREF _Toc242802438 \h </w:instrText>
         </w:r>
         <w:r>
           <w:rPr>
@@ -1559,7 +1559,7 @@
           <w14:ligatures w14:val="standardContextual"/>
         </w:rPr>
       </w:pPr>
-      <w:hyperlink w:anchor="_Toc242739192" w:history="1">
+      <w:hyperlink w:anchor="_Toc242802439" w:history="1">
         <w:r>
           <w:rPr>
             <w:rStyle w:val="Hyperlink"/>
@@ -1605,7 +1605,7 @@
             <w:noProof/>
             <w:webHidden/>
           </w:rPr>
-          <w:instrText xml:space="preserve"> PAGEREF _Toc242739192 \h </w:instrText>
+          <w:instrText xml:space="preserve"> PAGEREF _Toc242802439 \h </w:instrText>
         </w:r>
         <w:r>
           <w:rPr>
@@ -1653,7 +1653,7 @@
           <w14:ligatures w14:val="standardContextual"/>
         </w:rPr>
       </w:pPr>
-      <w:hyperlink w:anchor="_Toc242739193" w:history="1">
+      <w:hyperlink w:anchor="_Toc242802440" w:history="1">
         <w:r>
           <w:rPr>
             <w:rStyle w:val="Hyperlink"/>
@@ -1699,7 +1699,7 @@
             <w:noProof/>
             <w:webHidden/>
           </w:rPr>
-          <w:instrText xml:space="preserve"> PAGEREF _Toc242739193 \h </w:instrText>
+          <w:instrText xml:space="preserve"> PAGEREF _Toc242802440 \h </w:instrText>
         </w:r>
         <w:r>
           <w:rPr>
@@ -1747,7 +1747,7 @@
           <w14:ligatures w14:val="standardContextual"/>
         </w:rPr>
       </w:pPr>
-      <w:hyperlink w:anchor="_Toc242739194" w:history="1">
+      <w:hyperlink w:anchor="_Toc242802441" w:history="1">
         <w:r>
           <w:rPr>
             <w:rStyle w:val="Hyperlink"/>
@@ -1793,7 +1793,7 @@
             <w:noProof/>
             <w:webHidden/>
           </w:rPr>
-          <w:instrText xml:space="preserve"> PAGEREF _Toc242739194 \h </w:instrText>
+          <w:instrText xml:space="preserve"> PAGEREF _Toc242802441 \h </w:instrText>
         </w:r>
         <w:r>
           <w:rPr>
@@ -1841,7 +1841,7 @@
           <w14:ligatures w14:val="standardContextual"/>
         </w:rPr>
       </w:pPr>
-      <w:hyperlink w:anchor="_Toc242739195" w:history="1">
+      <w:hyperlink w:anchor="_Toc242802442" w:history="1">
         <w:r>
           <w:rPr>
             <w:rStyle w:val="Hyperlink"/>
@@ -1887,7 +1887,7 @@
             <w:noProof/>
             <w:webHidden/>
           </w:rPr>
-          <w:instrText xml:space="preserve"> PAGEREF _Toc242739195 \h </w:instrText>
+          <w:instrText xml:space="preserve"> PAGEREF _Toc242802442 \h </w:instrText>
         </w:r>
         <w:r>
           <w:rPr>
@@ -1935,7 +1935,7 @@
           <w14:ligatures w14:val="standardContextual"/>
         </w:rPr>
       </w:pPr>
-      <w:hyperlink w:anchor="_Toc242739196" w:history="1">
+      <w:hyperlink w:anchor="_Toc242802443" w:history="1">
         <w:r>
           <w:rPr>
             <w:rStyle w:val="Hyperlink"/>
@@ -1981,7 +1981,7 @@
             <w:noProof/>
             <w:webHidden/>
           </w:rPr>
-          <w:instrText xml:space="preserve"> PAGEREF _Toc242739196 \h </w:instrText>
+          <w:instrText xml:space="preserve"> PAGEREF _Toc242802443 \h </w:instrText>
         </w:r>
         <w:r>
           <w:rPr>
@@ -2029,7 +2029,7 @@
           <w14:ligatures w14:val="standardContextual"/>
         </w:rPr>
       </w:pPr>
-      <w:hyperlink w:anchor="_Toc242739197" w:history="1">
+      <w:hyperlink w:anchor="_Toc242802444" w:history="1">
         <w:r>
           <w:rPr>
             <w:rStyle w:val="Hyperlink"/>
@@ -2075,7 +2075,7 @@
             <w:noProof/>
             <w:webHidden/>
           </w:rPr>
-          <w:instrText xml:space="preserve"> PAGEREF _Toc242739197 \h </w:instrText>
+          <w:instrText xml:space="preserve"> PAGEREF _Toc242802444 \h </w:instrText>
         </w:r>
         <w:r>
           <w:rPr>
@@ -2123,7 +2123,7 @@
           <w14:ligatures w14:val="standardContextual"/>
         </w:rPr>
       </w:pPr>
-      <w:hyperlink w:anchor="_Toc242739198" w:history="1">
+      <w:hyperlink w:anchor="_Toc242802445" w:history="1">
         <w:r>
           <w:rPr>
             <w:rStyle w:val="Hyperlink"/>
@@ -2169,7 +2169,7 @@
             <w:noProof/>
             <w:webHidden/>
           </w:rPr>
-          <w:instrText xml:space="preserve"> PAGEREF _Toc242739198 \h </w:instrText>
+          <w:instrText xml:space="preserve"> PAGEREF _Toc242802445 \h </w:instrText>
         </w:r>
         <w:r>
           <w:rPr>
@@ -2217,7 +2217,7 @@
           <w14:ligatures w14:val="standardContextual"/>
         </w:rPr>
       </w:pPr>
-      <w:hyperlink w:anchor="_Toc242739199" w:history="1">
+      <w:hyperlink w:anchor="_Toc242802446" w:history="1">
         <w:r>
           <w:rPr>
             <w:rStyle w:val="Hyperlink"/>
@@ -2263,7 +2263,7 @@
             <w:noProof/>
             <w:webHidden/>
           </w:rPr>
-          <w:instrText xml:space="preserve"> PAGEREF _Toc242739199 \h </w:instrText>
+          <w:instrText xml:space="preserve"> PAGEREF _Toc242802446 \h </w:instrText>
         </w:r>
         <w:r>
           <w:rPr>
@@ -2311,7 +2311,7 @@
           <w14:ligatures w14:val="standardContextual"/>
         </w:rPr>
       </w:pPr>
-      <w:hyperlink w:anchor="_Toc242739200" w:history="1">
+      <w:hyperlink w:anchor="_Toc242802447" w:history="1">
         <w:r>
           <w:rPr>
             <w:rStyle w:val="Hyperlink"/>
@@ -2357,7 +2357,7 @@
             <w:noProof/>
             <w:webHidden/>
           </w:rPr>
-          <w:instrText xml:space="preserve"> PAGEREF _Toc242739200 \h </w:instrText>
+          <w:instrText xml:space="preserve"> PAGEREF _Toc242802447 \h </w:instrText>
         </w:r>
         <w:r>
           <w:rPr>
@@ -2405,7 +2405,7 @@
           <w14:ligatures w14:val="standardContextual"/>
         </w:rPr>
       </w:pPr>
-      <w:hyperlink w:anchor="_Toc242739201" w:history="1">
+      <w:hyperlink w:anchor="_Toc242802448" w:history="1">
         <w:r>
           <w:rPr>
             <w:rStyle w:val="Hyperlink"/>
@@ -2451,7 +2451,7 @@
             <w:noProof/>
             <w:webHidden/>
           </w:rPr>
-          <w:instrText xml:space="preserve"> PAGEREF _Toc242739201 \h </w:instrText>
+          <w:instrText xml:space="preserve"> PAGEREF _Toc242802448 \h </w:instrText>
         </w:r>
         <w:r>
           <w:rPr>
@@ -2499,7 +2499,7 @@
           <w14:ligatures w14:val="standardContextual"/>
         </w:rPr>
       </w:pPr>
-      <w:hyperlink w:anchor="_Toc242739202" w:history="1">
+      <w:hyperlink w:anchor="_Toc242802449" w:history="1">
         <w:r>
           <w:rPr>
             <w:rStyle w:val="Hyperlink"/>
@@ -2545,7 +2545,7 @@
             <w:noProof/>
             <w:webHidden/>
           </w:rPr>
-          <w:instrText xml:space="preserve"> PAGEREF _Toc242739202 \h </w:instrText>
+          <w:instrText xml:space="preserve"> PAGEREF _Toc242802449 \h </w:instrText>
         </w:r>
         <w:r>
           <w:rPr>
@@ -2593,7 +2593,7 @@
           <w14:ligatures w14:val="standardContextual"/>
         </w:rPr>
       </w:pPr>
-      <w:hyperlink w:anchor="_Toc242739203" w:history="1">
+      <w:hyperlink w:anchor="_Toc242802450" w:history="1">
         <w:r>
           <w:rPr>
             <w:rStyle w:val="Hyperlink"/>
@@ -2639,7 +2639,7 @@
             <w:noProof/>
             <w:webHidden/>
           </w:rPr>
-          <w:instrText xml:space="preserve"> PAGEREF _Toc242739203 \h </w:instrText>
+          <w:instrText xml:space="preserve"> PAGEREF _Toc242802450 \h </w:instrText>
         </w:r>
         <w:r>
           <w:rPr>
@@ -2687,7 +2687,7 @@
           <w14:ligatures w14:val="standardContextual"/>
         </w:rPr>
       </w:pPr>
-      <w:hyperlink w:anchor="_Toc242739204" w:history="1">
+      <w:hyperlink w:anchor="_Toc242802451" w:history="1">
         <w:r>
           <w:rPr>
             <w:rStyle w:val="Hyperlink"/>
@@ -2733,7 +2733,7 @@
             <w:noProof/>
             <w:webHidden/>
           </w:rPr>
-          <w:instrText xml:space="preserve"> PAGEREF _Toc242739204 \h </w:instrText>
+          <w:instrText xml:space="preserve"> PAGEREF _Toc242802451 \h </w:instrText>
         </w:r>
         <w:r>
           <w:rPr>
@@ -2781,7 +2781,7 @@
           <w14:ligatures w14:val="standardContextual"/>
         </w:rPr>
       </w:pPr>
-      <w:hyperlink w:anchor="_Toc242739205" w:history="1">
+      <w:hyperlink w:anchor="_Toc242802452" w:history="1">
         <w:r>
           <w:rPr>
             <w:rStyle w:val="Hyperlink"/>
@@ -2827,7 +2827,7 @@
             <w:noProof/>
             <w:webHidden/>
           </w:rPr>
-          <w:instrText xml:space="preserve"> PAGEREF _Toc242739205 \h </w:instrText>
+          <w:instrText xml:space="preserve"> PAGEREF _Toc242802452 \h </w:instrText>
         </w:r>
         <w:r>
           <w:rPr>
@@ -2875,7 +2875,7 @@
           <w14:ligatures w14:val="standardContextual"/>
         </w:rPr>
       </w:pPr>
-      <w:hyperlink w:anchor="_Toc242739206" w:history="1">
+      <w:hyperlink w:anchor="_Toc242802453" w:history="1">
         <w:r>
           <w:rPr>
             <w:rStyle w:val="Hyperlink"/>
@@ -2921,7 +2921,7 @@
             <w:noProof/>
             <w:webHidden/>
           </w:rPr>
-          <w:instrText xml:space="preserve"> PAGEREF _Toc242739206 \h </w:instrText>
+          <w:instrText xml:space="preserve"> PAGEREF _Toc242802453 \h </w:instrText>
         </w:r>
         <w:r>
           <w:rPr>
@@ -2969,7 +2969,7 @@
           <w14:ligatures w14:val="standardContextual"/>
         </w:rPr>
       </w:pPr>
-      <w:hyperlink w:anchor="_Toc242739207" w:history="1">
+      <w:hyperlink w:anchor="_Toc242802454" w:history="1">
         <w:r>
           <w:rPr>
             <w:rStyle w:val="Hyperlink"/>
@@ -3015,7 +3015,7 @@
             <w:noProof/>
             <w:webHidden/>
           </w:rPr>
-          <w:instrText xml:space="preserve"> PAGEREF _Toc242739207 \h </w:instrText>
+          <w:instrText xml:space="preserve"> PAGEREF _Toc242802454 \h </w:instrText>
         </w:r>
         <w:r>
           <w:rPr>
@@ -3063,7 +3063,7 @@
           <w14:ligatures w14:val="standardContextual"/>
         </w:rPr>
       </w:pPr>
-      <w:hyperlink w:anchor="_Toc242739208" w:history="1">
+      <w:hyperlink w:anchor="_Toc242802455" w:history="1">
         <w:r>
           <w:rPr>
             <w:rStyle w:val="Hyperlink"/>
@@ -3109,7 +3109,7 @@
             <w:noProof/>
             <w:webHidden/>
           </w:rPr>
-          <w:instrText xml:space="preserve"> PAGEREF _Toc242739208 \h </w:instrText>
+          <w:instrText xml:space="preserve"> PAGEREF _Toc242802455 \h </w:instrText>
         </w:r>
         <w:r>
           <w:rPr>
@@ -3157,7 +3157,7 @@
           <w14:ligatures w14:val="standardContextual"/>
         </w:rPr>
       </w:pPr>
-      <w:hyperlink w:anchor="_Toc242739209" w:history="1">
+      <w:hyperlink w:anchor="_Toc242802456" w:history="1">
         <w:r>
           <w:rPr>
             <w:rStyle w:val="Hyperlink"/>
@@ -3203,7 +3203,7 @@
             <w:noProof/>
             <w:webHidden/>
           </w:rPr>
-          <w:instrText xml:space="preserve"> PAGEREF _Toc242739209 \h </w:instrText>
+          <w:instrText xml:space="preserve"> PAGEREF _Toc242802456 \h </w:instrText>
         </w:r>
         <w:r>
           <w:rPr>
@@ -3251,7 +3251,7 @@
           <w14:ligatures w14:val="standardContextual"/>
         </w:rPr>
       </w:pPr>
-      <w:hyperlink w:anchor="_Toc242739210" w:history="1">
+      <w:hyperlink w:anchor="_Toc242802457" w:history="1">
         <w:r>
           <w:rPr>
             <w:rStyle w:val="Hyperlink"/>
@@ -3297,7 +3297,7 @@
             <w:noProof/>
             <w:webHidden/>
           </w:rPr>
-          <w:instrText xml:space="preserve"> PAGEREF _Toc242739210 \h </w:instrText>
+          <w:instrText xml:space="preserve"> PAGEREF _Toc242802457 \h </w:instrText>
         </w:r>
         <w:r>
           <w:rPr>
@@ -3345,7 +3345,7 @@
           <w14:ligatures w14:val="standardContextual"/>
         </w:rPr>
       </w:pPr>
-      <w:hyperlink w:anchor="_Toc242739211" w:history="1">
+      <w:hyperlink w:anchor="_Toc242802458" w:history="1">
         <w:r>
           <w:rPr>
             <w:rStyle w:val="Hyperlink"/>
@@ -3391,7 +3391,7 @@
             <w:noProof/>
             <w:webHidden/>
           </w:rPr>
-          <w:instrText xml:space="preserve"> PAGEREF _Toc242739211 \h </w:instrText>
+          <w:instrText xml:space="preserve"> PAGEREF _Toc242802458 \h </w:instrText>
         </w:r>
         <w:r>
           <w:rPr>
@@ -3439,7 +3439,7 @@
           <w14:ligatures w14:val="standardContextual"/>
         </w:rPr>
       </w:pPr>
-      <w:hyperlink w:anchor="_Toc242739212" w:history="1">
+      <w:hyperlink w:anchor="_Toc242802459" w:history="1">
         <w:r>
           <w:rPr>
             <w:rStyle w:val="Hyperlink"/>
@@ -3485,7 +3485,7 @@
             <w:noProof/>
             <w:webHidden/>
           </w:rPr>
-          <w:instrText xml:space="preserve"> PAGEREF _Toc242739212 \h </w:instrText>
+          <w:instrText xml:space="preserve"> PAGEREF _Toc242802459 \h </w:instrText>
         </w:r>
         <w:r>
           <w:rPr>
@@ -3533,7 +3533,7 @@
           <w14:ligatures w14:val="standardContextual"/>
         </w:rPr>
       </w:pPr>
-      <w:hyperlink w:anchor="_Toc242739213" w:history="1">
+      <w:hyperlink w:anchor="_Toc242802460" w:history="1">
         <w:r>
           <w:rPr>
             <w:rStyle w:val="Hyperlink"/>
@@ -3579,7 +3579,7 @@
             <w:noProof/>
             <w:webHidden/>
           </w:rPr>
-          <w:instrText xml:space="preserve"> PAGEREF _Toc242739213 \h </w:instrText>
+          <w:instrText xml:space="preserve"> PAGEREF _Toc242802460 \h </w:instrText>
         </w:r>
         <w:r>
           <w:rPr>
@@ -3627,7 +3627,7 @@
           <w14:ligatures w14:val="standardContextual"/>
         </w:rPr>
       </w:pPr>
-      <w:hyperlink w:anchor="_Toc242739214" w:history="1">
+      <w:hyperlink w:anchor="_Toc242802461" w:history="1">
         <w:r>
           <w:rPr>
             <w:rStyle w:val="Hyperlink"/>
@@ -3673,7 +3673,7 @@
             <w:noProof/>
             <w:webHidden/>
           </w:rPr>
-          <w:instrText xml:space="preserve"> PAGEREF _Toc242739214 \h </w:instrText>
+          <w:instrText xml:space="preserve"> PAGEREF _Toc242802461 \h </w:instrText>
         </w:r>
         <w:r>
           <w:rPr>
@@ -3721,7 +3721,7 @@
           <w14:ligatures w14:val="standardContextual"/>
         </w:rPr>
       </w:pPr>
-      <w:hyperlink w:anchor="_Toc242739215" w:history="1">
+      <w:hyperlink w:anchor="_Toc242802462" w:history="1">
         <w:r>
           <w:rPr>
             <w:rStyle w:val="Hyperlink"/>
@@ -3767,7 +3767,7 @@
             <w:noProof/>
             <w:webHidden/>
           </w:rPr>
-          <w:instrText xml:space="preserve"> PAGEREF _Toc242739215 \h </w:instrText>
+          <w:instrText xml:space="preserve"> PAGEREF _Toc242802462 \h </w:instrText>
         </w:r>
         <w:r>
           <w:rPr>
@@ -3815,7 +3815,7 @@
           <w14:ligatures w14:val="standardContextual"/>
         </w:rPr>
       </w:pPr>
-      <w:hyperlink w:anchor="_Toc242739216" w:history="1">
+      <w:hyperlink w:anchor="_Toc242802463" w:history="1">
         <w:r>
           <w:rPr>
             <w:rStyle w:val="Hyperlink"/>
@@ -3861,7 +3861,7 @@
             <w:noProof/>
             <w:webHidden/>
           </w:rPr>
-          <w:instrText xml:space="preserve"> PAGEREF _Toc242739216 \h </w:instrText>
+          <w:instrText xml:space="preserve"> PAGEREF _Toc242802463 \h </w:instrText>
         </w:r>
         <w:r>
           <w:rPr>
@@ -3909,7 +3909,7 @@
           <w14:ligatures w14:val="standardContextual"/>
         </w:rPr>
       </w:pPr>
-      <w:hyperlink w:anchor="_Toc242739217" w:history="1">
+      <w:hyperlink w:anchor="_Toc242802464" w:history="1">
         <w:r>
           <w:rPr>
             <w:rStyle w:val="Hyperlink"/>
@@ -3955,7 +3955,7 @@
             <w:noProof/>
             <w:webHidden/>
           </w:rPr>
-          <w:instrText xml:space="preserve"> PAGEREF _Toc242739217 \h </w:instrText>
+          <w:instrText xml:space="preserve"> PAGEREF _Toc242802464 \h </w:instrText>
         </w:r>
         <w:r>
           <w:rPr>
@@ -4003,7 +4003,7 @@
           <w14:ligatures w14:val="standardContextual"/>
         </w:rPr>
       </w:pPr>
-      <w:hyperlink w:anchor="_Toc242739218" w:history="1">
+      <w:hyperlink w:anchor="_Toc242802465" w:history="1">
         <w:r>
           <w:rPr>
             <w:rStyle w:val="Hyperlink"/>
@@ -4049,7 +4049,7 @@
             <w:noProof/>
             <w:webHidden/>
           </w:rPr>
-          <w:instrText xml:space="preserve"> PAGEREF _Toc242739218 \h </w:instrText>
+          <w:instrText xml:space="preserve"> PAGEREF _Toc242802465 \h </w:instrText>
         </w:r>
         <w:r>
           <w:rPr>
@@ -4097,7 +4097,7 @@
           <w14:ligatures w14:val="standardContextual"/>
         </w:rPr>
       </w:pPr>
-      <w:hyperlink w:anchor="_Toc242739219" w:history="1">
+      <w:hyperlink w:anchor="_Toc242802466" w:history="1">
         <w:r>
           <w:rPr>
             <w:rStyle w:val="Hyperlink"/>
@@ -4143,7 +4143,7 @@
             <w:noProof/>
             <w:webHidden/>
           </w:rPr>
-          <w:instrText xml:space="preserve"> PAGEREF _Toc242739219 \h </w:instrText>
+          <w:instrText xml:space="preserve"> PAGEREF _Toc242802466 \h </w:instrText>
         </w:r>
         <w:r>
           <w:rPr>
@@ -4191,7 +4191,7 @@
           <w14:ligatures w14:val="standardContextual"/>
         </w:rPr>
       </w:pPr>
-      <w:hyperlink w:anchor="_Toc242739220" w:history="1">
+      <w:hyperlink w:anchor="_Toc242802467" w:history="1">
         <w:r>
           <w:rPr>
             <w:rStyle w:val="Hyperlink"/>
@@ -4237,7 +4237,7 @@
             <w:noProof/>
             <w:webHidden/>
           </w:rPr>
-          <w:instrText xml:space="preserve"> PAGEREF _Toc242739220 \h </w:instrText>
+          <w:instrText xml:space="preserve"> PAGEREF _Toc242802467 \h </w:instrText>
         </w:r>
         <w:r>
           <w:rPr>
@@ -4285,7 +4285,7 @@
           <w14:ligatures w14:val="standardContextual"/>
         </w:rPr>
       </w:pPr>
-      <w:hyperlink w:anchor="_Toc242739221" w:history="1">
+      <w:hyperlink w:anchor="_Toc242802468" w:history="1">
         <w:r>
           <w:rPr>
             <w:rStyle w:val="Hyperlink"/>
@@ -4331,7 +4331,7 @@
             <w:noProof/>
             <w:webHidden/>
           </w:rPr>
-          <w:instrText xml:space="preserve"> PAGEREF _Toc242739221 \h </w:instrText>
+          <w:instrText xml:space="preserve"> PAGEREF _Toc242802468 \h </w:instrText>
         </w:r>
         <w:r>
           <w:rPr>
@@ -4379,7 +4379,7 @@
           <w14:ligatures w14:val="standardContextual"/>
         </w:rPr>
       </w:pPr>
-      <w:hyperlink w:anchor="_Toc242739222" w:history="1">
+      <w:hyperlink w:anchor="_Toc242802469" w:history="1">
         <w:r>
           <w:rPr>
             <w:rStyle w:val="Hyperlink"/>
@@ -4425,7 +4425,7 @@
             <w:noProof/>
             <w:webHidden/>
           </w:rPr>
-          <w:instrText xml:space="preserve"> PAGEREF _Toc242739222 \h </w:instrText>
+          <w:instrText xml:space="preserve"> PAGEREF _Toc242802469 \h </w:instrText>
         </w:r>
         <w:r>
           <w:rPr>
@@ -4473,7 +4473,7 @@
           <w14:ligatures w14:val="standardContextual"/>
         </w:rPr>
       </w:pPr>
-      <w:hyperlink w:anchor="_Toc242739223" w:history="1">
+      <w:hyperlink w:anchor="_Toc242802470" w:history="1">
         <w:r>
           <w:rPr>
             <w:rStyle w:val="Hyperlink"/>
@@ -4519,7 +4519,7 @@
             <w:noProof/>
             <w:webHidden/>
           </w:rPr>
-          <w:instrText xml:space="preserve"> PAGEREF _Toc242739223 \h </w:instrText>
+          <w:instrText xml:space="preserve"> PAGEREF _Toc242802470 \h </w:instrText>
         </w:r>
         <w:r>
           <w:rPr>
@@ -4559,7 +4559,7 @@
       <w:pPr>
         <w:pStyle w:val="Heading1"/>
       </w:pPr>
-      <w:bookmarkStart w:id="0" w:name="_Toc242739177"/>
+      <w:bookmarkStart w:id="0" w:name="_Toc242802424"/>
       <w:r>
         <w:lastRenderedPageBreak/>
         <w:t>Overview</w:t>
@@ -4716,7 +4716,7 @@
       <w:pPr>
         <w:pStyle w:val="Heading1"/>
       </w:pPr>
-      <w:bookmarkStart w:id="1" w:name="_Toc242739178"/>
+      <w:bookmarkStart w:id="1" w:name="_Toc242802425"/>
       <w:r>
         <w:lastRenderedPageBreak/>
         <w:t>Installation</w:t>
@@ -4759,7 +4759,7 @@
       <w:pPr>
         <w:pStyle w:val="Heading2"/>
       </w:pPr>
-      <w:bookmarkStart w:id="2" w:name="_Toc242739179"/>
+      <w:bookmarkStart w:id="2" w:name="_Toc242802426"/>
       <w:r>
         <w:t>Automatic installation</w:t>
       </w:r>
@@ -5108,7 +5108,7 @@
       <w:pPr>
         <w:pStyle w:val="Heading2"/>
       </w:pPr>
-      <w:bookmarkStart w:id="3" w:name="_Toc242739180"/>
+      <w:bookmarkStart w:id="3" w:name="_Toc242802427"/>
       <w:r>
         <w:t>Manual installation</w:t>
       </w:r>
@@ -5271,7 +5271,7 @@
       <w:pPr>
         <w:pStyle w:val="Heading2"/>
       </w:pPr>
-      <w:bookmarkStart w:id="4" w:name="_Toc242739181"/>
+      <w:bookmarkStart w:id="4" w:name="_Toc242802428"/>
       <w:r>
         <w:lastRenderedPageBreak/>
         <w:t>Testing the installation</w:t>
@@ -5438,7 +5438,19 @@
         <w:jc w:val="both"/>
       </w:pPr>
       <w:r>
-        <w:t xml:space="preserve">The first call needs no network, and takes about 2 minutes (Mw 7.0, variance reduction about 79 %). The second call downloads 10 events, and takes 5 to 15 minutes. The results go to </w:t>
+        <w:t>The first call needs no network, and takes about 1 minute (Mw 7.0, variance reduction 79.6 %). The test configuration has a fixed seed (</w:t>
+      </w:r>
+      <w:r>
+        <w:rPr>
+          <w:rFonts w:ascii="Consolas" w:hAnsi="Consolas"/>
+          <w:color w:val="1F3864"/>
+          <w:sz w:val="19"/>
+          <w:shd w:val="clear" w:color="auto" w:fill="EEF1F6"/>
+        </w:rPr>
+        <w:t>RandomSeed: 42</w:t>
+      </w:r>
+      <w:r>
+        <w:t xml:space="preserve">), so the benchmark gives the same results on every run. The second call downloads 10 events, and takes 5 to 15 minutes. The results go to </w:t>
       </w:r>
       <w:r>
         <w:rPr>
@@ -5469,7 +5481,7 @@
       <w:pPr>
         <w:pStyle w:val="Heading2"/>
       </w:pPr>
-      <w:bookmarkStart w:id="5" w:name="_Toc242739182"/>
+      <w:bookmarkStart w:id="5" w:name="_Toc242802429"/>
       <w:r>
         <w:t>GPU support (if you have an NVIDIA GPU)</w:t>
       </w:r>
@@ -5530,7 +5542,19 @@
         <w:t>check_gpu.py</w:t>
       </w:r>
       <w:r>
-        <w:t xml:space="preserve">). If the test fails because the CUDA libraries are missing, the installer asks your permission and tries to install them into the environment. At the end it prints </w:t>
+        <w:t xml:space="preserve">). If the test fails (the CUDA libraries are missing, or the driver is newer than the Numba version supports), the installer asks your permission and installs </w:t>
+      </w:r>
+      <w:r>
+        <w:rPr>
+          <w:rFonts w:ascii="Consolas" w:hAnsi="Consolas"/>
+          <w:color w:val="1F3864"/>
+          <w:sz w:val="19"/>
+          <w:shd w:val="clear" w:color="auto" w:fill="EEF1F6"/>
+        </w:rPr>
+        <w:t>numba-cuda</w:t>
+      </w:r>
+      <w:r>
+        <w:t xml:space="preserve">, the NVIDIA package that brings the CUDA libraries, into the environment (about 600 MB). It uses the variant for CUDA 12 or for CUDA 13, as your driver supports. At the end it prints </w:t>
       </w:r>
       <w:r>
         <w:rPr>
@@ -5542,7 +5566,7 @@
         <w:t>GPU: ready</w:t>
       </w:r>
       <w:r>
-        <w:t>, or the reason why the GPU cannot be used. The NVIDIA driver is part of the operating system, so the installer never installs it.</w:t>
+        <w:t>, or the reason why the GPU cannot be used; then the program runs on the CPU. The NVIDIA driver is part of the operating system, so the installer never installs it.</w:t>
       </w:r>
     </w:p>
     <w:p>
@@ -5556,7 +5580,7 @@
         <w:t>If the automatic set-up failed, set up the GPU yourself.</w:t>
       </w:r>
       <w:r>
-        <w:t xml:space="preserve"> The CUDA libraries have to fit your GPU and your driver, and the installer can choose them only when this is clear. By hand:</w:t>
+        <w:t xml:space="preserve"> The libraries have to fit your GPU and your driver. By hand:</w:t>
       </w:r>
     </w:p>
     <w:p>
@@ -5649,7 +5673,7 @@
         <w:t>The libraries.</w:t>
       </w:r>
       <w:r>
-        <w:t xml:space="preserve"> Install a CUDA version that is new enough for your GPU and not newer than the driver supports (</w:t>
+        <w:t xml:space="preserve"> Install numba-cuda, the NVIDIA package that brings the CUDA libraries, in the variant of your driver: </w:t>
       </w:r>
       <w:r>
         <w:rPr>
@@ -5658,10 +5682,34 @@
           <w:sz w:val="19"/>
           <w:shd w:val="clear" w:color="auto" w:fill="EEF1F6"/>
         </w:rPr>
-        <w:t>X.Y</w:t>
-      </w:r>
-      <w:r>
-        <w:t xml:space="preserve"> in the command is that version):</w:t>
+        <w:t>cu12</w:t>
+      </w:r>
+      <w:r>
+        <w:t xml:space="preserve"> for a driver that supports CUDA 12.x, </w:t>
+      </w:r>
+      <w:r>
+        <w:rPr>
+          <w:rFonts w:ascii="Consolas" w:hAnsi="Consolas"/>
+          <w:color w:val="1F3864"/>
+          <w:sz w:val="19"/>
+          <w:shd w:val="clear" w:color="auto" w:fill="EEF1F6"/>
+        </w:rPr>
+        <w:t>cu13</w:t>
+      </w:r>
+      <w:r>
+        <w:t xml:space="preserve"> for CUDA 13.x. The first command updates </w:t>
+      </w:r>
+      <w:r>
+        <w:rPr>
+          <w:rFonts w:ascii="Consolas" w:hAnsi="Consolas"/>
+          <w:color w:val="1F3864"/>
+          <w:sz w:val="19"/>
+          <w:shd w:val="clear" w:color="auto" w:fill="EEF1F6"/>
+        </w:rPr>
+        <w:t>pip</w:t>
+      </w:r>
+      <w:r>
+        <w:t>, which is too old for numba-cuda:</w:t>
       </w:r>
     </w:p>
     <w:tbl>
@@ -5706,21 +5754,27 @@
                 <w:color w:val="1A1A1A"/>
                 <w:sz w:val="18"/>
               </w:rPr>
-              <w:t>conda install -n GisolaBaBoo -c conda-forge --override-channels "cuda-version=X.Y" cuda-cudart cuda-nvvm-impl cuda-nvvm-tools</w:t>
+              <w:t>python -m pip install -U "pip&lt;25"</w:t>
+            </w:r>
+          </w:p>
+          <w:p>
+            <w:pPr>
+              <w:keepNext/>
+              <w:spacing w:after="0" w:line="240" w:lineRule="auto"/>
+            </w:pPr>
+            <w:r>
+              <w:rPr>
+                <w:rFonts w:ascii="Consolas" w:hAnsi="Consolas"/>
+                <w:color w:val="1A1A1A"/>
+                <w:sz w:val="18"/>
+              </w:rPr>
+              <w:t>python -m pip install "numba-cuda[cu12]==0.20.1"</w:t>
             </w:r>
           </w:p>
         </w:tc>
       </w:tr>
     </w:tbl>
     <w:p/>
-    <w:p>
-      <w:pPr>
-        <w:jc w:val="both"/>
-      </w:pPr>
-      <w:r>
-        <w:t>You can also follow NVIDIA's instructions for your system (https://developer.nvidia.com/cuda-downloads).</w:t>
-      </w:r>
-    </w:p>
     <w:p>
       <w:pPr>
         <w:pStyle w:val="ListNumber"/>
@@ -5734,6 +5788,7 @@
         <w:rPr>
           <w:b/>
         </w:rPr>
+        <w:lastRenderedPageBreak/>
         <w:t>The check.</w:t>
       </w:r>
       <w:r>
@@ -5789,7 +5844,6 @@
         <w:rPr>
           <w:b/>
         </w:rPr>
-        <w:lastRenderedPageBreak/>
         <w:t>Switch it on.</w:t>
       </w:r>
       <w:r>
@@ -5805,7 +5859,43 @@
         <w:t>ComputeDevice: GPU</w:t>
       </w:r>
       <w:r>
-        <w:t xml:space="preserve"> in the configuration file, and run </w:t>
+        <w:t xml:space="preserve"> in the configuration file. In the </w:t>
+      </w:r>
+      <w:r>
+        <w:rPr>
+          <w:rFonts w:ascii="Consolas" w:hAnsi="Consolas"/>
+          <w:color w:val="1F3864"/>
+          <w:sz w:val="19"/>
+          <w:shd w:val="clear" w:color="auto" w:fill="EEF1F6"/>
+        </w:rPr>
+        <w:t>src</w:t>
+      </w:r>
+      <w:r>
+        <w:t xml:space="preserve"> folder delete </w:t>
+      </w:r>
+      <w:r>
+        <w:rPr>
+          <w:rFonts w:ascii="Consolas" w:hAnsi="Consolas"/>
+          <w:color w:val="1F3864"/>
+          <w:sz w:val="19"/>
+          <w:shd w:val="clear" w:color="auto" w:fill="EEF1F6"/>
+        </w:rPr>
+        <w:t>__pycache__</w:t>
+      </w:r>
+      <w:r>
+        <w:t xml:space="preserve"> and </w:t>
+      </w:r>
+      <w:r>
+        <w:rPr>
+          <w:rFonts w:ascii="Consolas" w:hAnsi="Consolas"/>
+          <w:color w:val="1F3864"/>
+          <w:sz w:val="19"/>
+          <w:shd w:val="clear" w:color="auto" w:fill="EEF1F6"/>
+        </w:rPr>
+        <w:t>modules/__pycache__</w:t>
+      </w:r>
+      <w:r>
+        <w:t xml:space="preserve"> (kernels saved before cannot be read by numba-cuda), and run </w:t>
       </w:r>
       <w:r>
         <w:rPr>
@@ -5824,7 +5914,7 @@
       <w:pPr>
         <w:pStyle w:val="Heading2"/>
       </w:pPr>
-      <w:bookmarkStart w:id="6" w:name="_Toc242739183"/>
+      <w:bookmarkStart w:id="6" w:name="_Toc242802430"/>
       <w:r>
         <w:t>Pre-compiled kernels</w:t>
       </w:r>
@@ -5905,7 +5995,7 @@
       <w:pPr>
         <w:pStyle w:val="Heading1"/>
       </w:pPr>
-      <w:bookmarkStart w:id="7" w:name="_Toc242739184"/>
+      <w:bookmarkStart w:id="7" w:name="_Toc242802431"/>
       <w:r>
         <w:lastRenderedPageBreak/>
         <w:t>Input Handling</w:t>
@@ -6382,7 +6472,7 @@
       <w:pPr>
         <w:pStyle w:val="Heading2"/>
       </w:pPr>
-      <w:bookmarkStart w:id="8" w:name="_Toc242739185"/>
+      <w:bookmarkStart w:id="8" w:name="_Toc242802432"/>
       <w:r>
         <w:t>External Data Sources</w:t>
       </w:r>
@@ -6992,7 +7082,7 @@
       <w:pPr>
         <w:pStyle w:val="Heading2"/>
       </w:pPr>
-      <w:bookmarkStart w:id="9" w:name="_Toc242739186"/>
+      <w:bookmarkStart w:id="9" w:name="_Toc242802433"/>
       <w:r>
         <w:lastRenderedPageBreak/>
         <w:t>Event Selection (Watcher)</w:t>
@@ -7498,7 +7588,7 @@
       <w:pPr>
         <w:pStyle w:val="Heading1"/>
       </w:pPr>
-      <w:bookmarkStart w:id="10" w:name="_Toc242739187"/>
+      <w:bookmarkStart w:id="10" w:name="_Toc242802434"/>
       <w:r>
         <w:lastRenderedPageBreak/>
         <w:t>Station and Signal Selection</w:t>
@@ -7628,7 +7718,7 @@
       <w:pPr>
         <w:pStyle w:val="Heading2"/>
       </w:pPr>
-      <w:bookmarkStart w:id="11" w:name="_Toc242739188"/>
+      <w:bookmarkStart w:id="11" w:name="_Toc242802435"/>
       <w:r>
         <w:t>Step 1 — Retrieve the event</w:t>
       </w:r>
@@ -7646,7 +7736,7 @@
       <w:pPr>
         <w:pStyle w:val="Heading2"/>
       </w:pPr>
-      <w:bookmarkStart w:id="12" w:name="_Toc242739189"/>
+      <w:bookmarkStart w:id="12" w:name="_Toc242802436"/>
       <w:r>
         <w:t>Step 2 — Retrieve the station metadata</w:t>
       </w:r>
@@ -8416,7 +8506,7 @@
       <w:pPr>
         <w:pStyle w:val="Heading2"/>
       </w:pPr>
-      <w:bookmarkStart w:id="13" w:name="_Toc242739190"/>
+      <w:bookmarkStart w:id="13" w:name="_Toc242802437"/>
       <w:r>
         <w:t>Step 3 — Download the waveforms</w:t>
       </w:r>
@@ -8434,7 +8524,7 @@
       <w:pPr>
         <w:pStyle w:val="Heading2"/>
       </w:pPr>
-      <w:bookmarkStart w:id="14" w:name="_Toc242739191"/>
+      <w:bookmarkStart w:id="14" w:name="_Toc242802438"/>
       <w:r>
         <w:t>Step 4 — Quality checks and instrument correction</w:t>
       </w:r>
@@ -8983,7 +9073,7 @@
       <w:pPr>
         <w:pStyle w:val="Heading2"/>
       </w:pPr>
-      <w:bookmarkStart w:id="15" w:name="_Toc242739192"/>
+      <w:bookmarkStart w:id="15" w:name="_Toc242802439"/>
       <w:r>
         <w:t>Step 5 — Azimuthal selection</w:t>
       </w:r>
@@ -9166,7 +9256,7 @@
       <w:pPr>
         <w:pStyle w:val="Heading1"/>
       </w:pPr>
-      <w:bookmarkStart w:id="16" w:name="_Toc242739193"/>
+      <w:bookmarkStart w:id="16" w:name="_Toc242802440"/>
       <w:r>
         <w:lastRenderedPageBreak/>
         <w:t>Computation Configuration</w:t>
@@ -9250,7 +9340,7 @@
       <w:pPr>
         <w:pStyle w:val="Heading2"/>
       </w:pPr>
-      <w:bookmarkStart w:id="17" w:name="_Toc242739194"/>
+      <w:bookmarkStart w:id="17" w:name="_Toc242802441"/>
       <w:r>
         <w:t>Green's Functions</w:t>
       </w:r>
@@ -9260,7 +9350,7 @@
       <w:pPr>
         <w:pStyle w:val="Heading3"/>
       </w:pPr>
-      <w:bookmarkStart w:id="18" w:name="_Toc242739195"/>
+      <w:bookmarkStart w:id="18" w:name="_Toc242802442"/>
       <w:r>
         <w:t>Regional velocity models</w:t>
       </w:r>
@@ -9445,7 +9535,7 @@
       <w:pPr>
         <w:pStyle w:val="Heading3"/>
       </w:pPr>
-      <w:bookmarkStart w:id="19" w:name="_Toc242739196"/>
+      <w:bookmarkStart w:id="19" w:name="_Toc242802443"/>
       <w:r>
         <w:t>Source grid</w:t>
       </w:r>
@@ -9903,7 +9993,7 @@
       <w:pPr>
         <w:pStyle w:val="Heading3"/>
       </w:pPr>
-      <w:bookmarkStart w:id="20" w:name="_Toc242739197"/>
+      <w:bookmarkStart w:id="20" w:name="_Toc242802444"/>
       <w:r>
         <w:t>Frequency content</w:t>
       </w:r>
@@ -10026,7 +10116,7 @@
       <w:pPr>
         <w:pStyle w:val="Heading2"/>
       </w:pPr>
-      <w:bookmarkStart w:id="21" w:name="_Toc242739198"/>
+      <w:bookmarkStart w:id="21" w:name="_Toc242802445"/>
       <w:r>
         <w:lastRenderedPageBreak/>
         <w:t>Inversion Parameters</w:t>
@@ -10045,7 +10135,7 @@
       <w:pPr>
         <w:pStyle w:val="Heading3"/>
       </w:pPr>
-      <w:bookmarkStart w:id="22" w:name="_Toc242739199"/>
+      <w:bookmarkStart w:id="22" w:name="_Toc242802446"/>
       <w:r>
         <w:t>Frequency band</w:t>
       </w:r>
@@ -10210,7 +10300,7 @@
       <w:pPr>
         <w:pStyle w:val="Heading3"/>
       </w:pPr>
-      <w:bookmarkStart w:id="23" w:name="_Toc242739200"/>
+      <w:bookmarkStart w:id="23" w:name="_Toc242802447"/>
       <w:r>
         <w:t>Waveform window</w:t>
       </w:r>
@@ -10395,7 +10485,7 @@
       <w:pPr>
         <w:pStyle w:val="Heading3"/>
       </w:pPr>
-      <w:bookmarkStart w:id="24" w:name="_Toc242739201"/>
+      <w:bookmarkStart w:id="24" w:name="_Toc242802448"/>
       <w:r>
         <w:lastRenderedPageBreak/>
         <w:t>Centroid time search</w:t>
@@ -10539,7 +10629,7 @@
       <w:pPr>
         <w:pStyle w:val="Heading3"/>
       </w:pPr>
-      <w:bookmarkStart w:id="25" w:name="_Toc242739202"/>
+      <w:bookmarkStart w:id="25" w:name="_Toc242802449"/>
       <w:r>
         <w:t>Source time function</w:t>
       </w:r>
@@ -10668,7 +10758,7 @@
       <w:pPr>
         <w:pStyle w:val="Heading3"/>
       </w:pPr>
-      <w:bookmarkStart w:id="26" w:name="_Toc242739203"/>
+      <w:bookmarkStart w:id="26" w:name="_Toc242802450"/>
       <w:r>
         <w:t>Deviatoric and full moment tensor</w:t>
       </w:r>
@@ -10835,7 +10925,7 @@
       <w:pPr>
         <w:pStyle w:val="Heading2"/>
       </w:pPr>
-      <w:bookmarkStart w:id="27" w:name="_Toc242739204"/>
+      <w:bookmarkStart w:id="27" w:name="_Toc242802451"/>
       <w:r>
         <w:lastRenderedPageBreak/>
         <w:t>Bayesian Bootstrap</w:t>
@@ -11502,7 +11592,7 @@
       <w:pPr>
         <w:pStyle w:val="Heading1"/>
       </w:pPr>
-      <w:bookmarkStart w:id="28" w:name="_Toc242739205"/>
+      <w:bookmarkStart w:id="28" w:name="_Toc242802452"/>
       <w:r>
         <w:lastRenderedPageBreak/>
         <w:t>Outputs</w:t>
@@ -11837,7 +11927,7 @@
       <w:pPr>
         <w:pStyle w:val="Heading2"/>
       </w:pPr>
-      <w:bookmarkStart w:id="29" w:name="_Toc242739206"/>
+      <w:bookmarkStart w:id="29" w:name="_Toc242802453"/>
       <w:r>
         <w:t>Result files</w:t>
       </w:r>
@@ -12692,7 +12782,7 @@
       <w:pPr>
         <w:pStyle w:val="Heading2"/>
       </w:pPr>
-      <w:bookmarkStart w:id="30" w:name="_Toc242739207"/>
+      <w:bookmarkStart w:id="30" w:name="_Toc242802454"/>
       <w:r>
         <w:t>Figures</w:t>
       </w:r>
@@ -13941,7 +14031,7 @@
       <w:pPr>
         <w:pStyle w:val="Heading2"/>
       </w:pPr>
-      <w:bookmarkStart w:id="31" w:name="_Toc242739208"/>
+      <w:bookmarkStart w:id="31" w:name="_Toc242802455"/>
       <w:r>
         <w:t>Web pages</w:t>
       </w:r>
@@ -14369,7 +14459,7 @@
       <w:pPr>
         <w:pStyle w:val="Heading2"/>
       </w:pPr>
-      <w:bookmarkStart w:id="32" w:name="_Toc242739209"/>
+      <w:bookmarkStart w:id="32" w:name="_Toc242802456"/>
       <w:r>
         <w:t>Log</w:t>
       </w:r>
@@ -14387,7 +14477,7 @@
       <w:pPr>
         <w:pStyle w:val="Heading1"/>
       </w:pPr>
-      <w:bookmarkStart w:id="33" w:name="_Toc242739210"/>
+      <w:bookmarkStart w:id="33" w:name="_Toc242802457"/>
       <w:r>
         <w:lastRenderedPageBreak/>
         <w:t>Other Settings</w:t>
@@ -14451,6 +14541,20 @@
                 <w:sz w:val="18"/>
               </w:rPr>
               <w:t>MaxCores: null              # null = all available cores</w:t>
+            </w:r>
+          </w:p>
+          <w:p>
+            <w:pPr>
+              <w:keepNext/>
+              <w:spacing w:after="0" w:line="240" w:lineRule="auto"/>
+            </w:pPr>
+            <w:r>
+              <w:rPr>
+                <w:rFonts w:ascii="Consolas" w:hAnsi="Consolas"/>
+                <w:color w:val="1A1A1A"/>
+                <w:sz w:val="18"/>
+              </w:rPr>
+              <w:t>RandomSeed: null            # null = random; a whole number = repeatable results</w:t>
             </w:r>
           </w:p>
           <w:p>
@@ -14951,6 +15055,70 @@
               <w:bottom w:val="single" w:sz="4" w:space="0" w:color="BFC7D5"/>
               <w:right w:val="single" w:sz="4" w:space="0" w:color="BFC7D5"/>
             </w:tcBorders>
+            <w:shd w:val="clear" w:color="auto" w:fill="F2F5FA"/>
+            <w:tcMar>
+              <w:top w:w="60" w:type="dxa"/>
+              <w:left w:w="110" w:type="dxa"/>
+              <w:bottom w:w="60" w:type="dxa"/>
+              <w:right w:w="110" w:type="dxa"/>
+            </w:tcMar>
+          </w:tcPr>
+          <w:p>
+            <w:pPr>
+              <w:spacing w:after="0" w:line="252" w:lineRule="auto"/>
+            </w:pPr>
+            <w:r>
+              <w:rPr>
+                <w:sz w:val="19"/>
+              </w:rPr>
+              <w:t>RandomSeed</w:t>
+            </w:r>
+          </w:p>
+        </w:tc>
+        <w:tc>
+          <w:tcPr>
+            <w:tcW w:w="6770" w:type="dxa"/>
+            <w:tcBorders>
+              <w:top w:val="single" w:sz="4" w:space="0" w:color="BFC7D5"/>
+              <w:left w:val="single" w:sz="4" w:space="0" w:color="BFC7D5"/>
+              <w:bottom w:val="single" w:sz="4" w:space="0" w:color="BFC7D5"/>
+              <w:right w:val="single" w:sz="4" w:space="0" w:color="BFC7D5"/>
+            </w:tcBorders>
+            <w:shd w:val="clear" w:color="auto" w:fill="F2F5FA"/>
+            <w:tcMar>
+              <w:top w:w="60" w:type="dxa"/>
+              <w:left w:w="110" w:type="dxa"/>
+              <w:bottom w:w="60" w:type="dxa"/>
+              <w:right w:w="110" w:type="dxa"/>
+            </w:tcMar>
+          </w:tcPr>
+          <w:p>
+            <w:pPr>
+              <w:spacing w:after="0" w:line="252" w:lineRule="auto"/>
+            </w:pPr>
+            <w:r>
+              <w:rPr>
+                <w:sz w:val="19"/>
+              </w:rPr>
+              <w:t>null (default): the random numbers of the clipping check and of the bootstrap differ from run to run, so the result of a borderline event changes slightly (the benchmark gives a variance reduction between 78 and 80 %). A whole number (e.g. 42): the same results on every run on the same computer, also for an event alone or in a list of events. Use it for tests and to compare the CPU with the GPU; the test configuration of the benchmark (test/config.yaml) sets 42.</w:t>
+            </w:r>
+          </w:p>
+        </w:tc>
+      </w:tr>
+      <w:tr>
+        <w:trPr>
+          <w:cantSplit/>
+          <w:jc w:val="center"/>
+        </w:trPr>
+        <w:tc>
+          <w:tcPr>
+            <w:tcW w:w="2300" w:type="dxa"/>
+            <w:tcBorders>
+              <w:top w:val="single" w:sz="4" w:space="0" w:color="BFC7D5"/>
+              <w:left w:val="single" w:sz="4" w:space="0" w:color="BFC7D5"/>
+              <w:bottom w:val="single" w:sz="4" w:space="0" w:color="BFC7D5"/>
+              <w:right w:val="single" w:sz="4" w:space="0" w:color="BFC7D5"/>
+            </w:tcBorders>
             <w:tcMar>
               <w:top w:w="60" w:type="dxa"/>
               <w:left w:w="110" w:type="dxa"/>
@@ -15199,7 +15367,7 @@
       <w:pPr>
         <w:pStyle w:val="Heading1"/>
       </w:pPr>
-      <w:bookmarkStart w:id="34" w:name="_Toc242739211"/>
+      <w:bookmarkStart w:id="34" w:name="_Toc242802458"/>
       <w:r>
         <w:lastRenderedPageBreak/>
         <w:t>Usage</w:t>
@@ -15583,7 +15751,7 @@
       <w:pPr>
         <w:pStyle w:val="Heading2"/>
       </w:pPr>
-      <w:bookmarkStart w:id="35" w:name="_Toc242739212"/>
+      <w:bookmarkStart w:id="35" w:name="_Toc242802459"/>
       <w:r>
         <w:t>Single event (-e)</w:t>
       </w:r>
@@ -15872,7 +16040,7 @@
       <w:pPr>
         <w:pStyle w:val="Heading2"/>
       </w:pPr>
-      <w:bookmarkStart w:id="36" w:name="_Toc242739213"/>
+      <w:bookmarkStart w:id="36" w:name="_Toc242802460"/>
       <w:r>
         <w:lastRenderedPageBreak/>
         <w:t>Event file (--event-file)</w:t>
@@ -16211,7 +16379,7 @@
       <w:pPr>
         <w:pStyle w:val="Heading2"/>
       </w:pPr>
-      <w:bookmarkStart w:id="37" w:name="_Toc242739214"/>
+      <w:bookmarkStart w:id="37" w:name="_Toc242802461"/>
       <w:r>
         <w:t>QuakeML file (--event-xml)</w:t>
       </w:r>
@@ -16278,7 +16446,7 @@
       <w:pPr>
         <w:pStyle w:val="Heading2"/>
       </w:pPr>
-      <w:bookmarkStart w:id="38" w:name="_Toc242739215"/>
+      <w:bookmarkStart w:id="38" w:name="_Toc242802462"/>
       <w:r>
         <w:t>Datetime range (-d)</w:t>
       </w:r>
@@ -16357,7 +16525,7 @@
       <w:pPr>
         <w:pStyle w:val="Heading2"/>
       </w:pPr>
-      <w:bookmarkStart w:id="39" w:name="_Toc242739216"/>
+      <w:bookmarkStart w:id="39" w:name="_Toc242802463"/>
       <w:r>
         <w:lastRenderedPageBreak/>
         <w:t>Real time (--real-time)</w:t>
@@ -16518,7 +16686,7 @@
       <w:pPr>
         <w:pStyle w:val="Heading2"/>
       </w:pPr>
-      <w:bookmarkStart w:id="40" w:name="_Toc242739217"/>
+      <w:bookmarkStart w:id="40" w:name="_Toc242802464"/>
       <w:r>
         <w:t>Revise (--revise)</w:t>
       </w:r>
@@ -17509,7 +17677,7 @@
       <w:pPr>
         <w:pStyle w:val="Heading2"/>
       </w:pPr>
-      <w:bookmarkStart w:id="41" w:name="_Toc242739218"/>
+      <w:bookmarkStart w:id="41" w:name="_Toc242802465"/>
       <w:r>
         <w:t>Web pages (--home)</w:t>
       </w:r>
@@ -17700,7 +17868,7 @@
       <w:pPr>
         <w:pStyle w:val="Heading2"/>
       </w:pPr>
-      <w:bookmarkStart w:id="42" w:name="_Toc242739219"/>
+      <w:bookmarkStart w:id="42" w:name="_Toc242802466"/>
       <w:r>
         <w:t>PPSD tool (for ppsdoffline)</w:t>
       </w:r>
@@ -17817,7 +17985,7 @@
       <w:pPr>
         <w:pStyle w:val="Heading2"/>
       </w:pPr>
-      <w:bookmarkStart w:id="43" w:name="_Toc242739220"/>
+      <w:bookmarkStart w:id="43" w:name="_Toc242802467"/>
       <w:r>
         <w:t>Runtime Overrides</w:t>
       </w:r>
@@ -19283,7 +19451,7 @@
       <w:pPr>
         <w:pStyle w:val="Heading2"/>
       </w:pPr>
-      <w:bookmarkStart w:id="44" w:name="_Toc242739221"/>
+      <w:bookmarkStart w:id="44" w:name="_Toc242802468"/>
       <w:r>
         <w:t>Operational Notes</w:t>
       </w:r>
@@ -19625,7 +19793,7 @@
       <w:pPr>
         <w:pStyle w:val="Heading1"/>
       </w:pPr>
-      <w:bookmarkStart w:id="45" w:name="_Toc242739222"/>
+      <w:bookmarkStart w:id="45" w:name="_Toc242802469"/>
       <w:r>
         <w:lastRenderedPageBreak/>
         <w:t>References</w:t>
@@ -19666,7 +19834,7 @@
       <w:pPr>
         <w:pStyle w:val="Heading1"/>
       </w:pPr>
-      <w:bookmarkStart w:id="46" w:name="_Toc242739223"/>
+      <w:bookmarkStart w:id="46" w:name="_Toc242802470"/>
       <w:r>
         <w:lastRenderedPageBreak/>
         <w:t>Acknowledgments</w:t>
@@ -19690,7 +19858,7 @@
           <w:noProof/>
         </w:rPr>
         <w:drawing>
-          <wp:inline distT="0" distB="0" distL="0" distR="0">
+          <wp:inline distT="0" distB="0" distL="0" distR="0" wp14:anchorId="44D01AEC" wp14:editId="7EA5B51C">
             <wp:extent cx="1800000" cy="1599000"/>
             <wp:effectExtent l="0" t="0" r="0" b="0"/>
             <wp:docPr id="1" name="Picture 1"/>

</xml_diff>

<commit_message>
install.sh: when the GPU stays unusable after installing numba-cuda, print the command that removes it; manual updated
</commit_message>
<xml_diff>
--- a/docs/GisolaBaBoo_User_Manual.docx
+++ b/docs/GisolaBaBoo_User_Manual.docx
@@ -149,7 +149,7 @@
       <w:r>
         <w:fldChar w:fldCharType="separate"/>
       </w:r>
-      <w:hyperlink w:anchor="_Toc242802424" w:history="1">
+      <w:hyperlink w:anchor="_Toc242821310" w:history="1">
         <w:r>
           <w:rPr>
             <w:rStyle w:val="Hyperlink"/>
@@ -195,7 +195,7 @@
             <w:noProof/>
             <w:webHidden/>
           </w:rPr>
-          <w:instrText xml:space="preserve"> PAGEREF _Toc242802424 \h </w:instrText>
+          <w:instrText xml:space="preserve"> PAGEREF _Toc242821310 \h </w:instrText>
         </w:r>
         <w:r>
           <w:rPr>
@@ -243,7 +243,7 @@
           <w14:ligatures w14:val="standardContextual"/>
         </w:rPr>
       </w:pPr>
-      <w:hyperlink w:anchor="_Toc242802425" w:history="1">
+      <w:hyperlink w:anchor="_Toc242821311" w:history="1">
         <w:r>
           <w:rPr>
             <w:rStyle w:val="Hyperlink"/>
@@ -289,7 +289,7 @@
             <w:noProof/>
             <w:webHidden/>
           </w:rPr>
-          <w:instrText xml:space="preserve"> PAGEREF _Toc242802425 \h </w:instrText>
+          <w:instrText xml:space="preserve"> PAGEREF _Toc242821311 \h </w:instrText>
         </w:r>
         <w:r>
           <w:rPr>
@@ -337,7 +337,7 @@
           <w14:ligatures w14:val="standardContextual"/>
         </w:rPr>
       </w:pPr>
-      <w:hyperlink w:anchor="_Toc242802426" w:history="1">
+      <w:hyperlink w:anchor="_Toc242821312" w:history="1">
         <w:r>
           <w:rPr>
             <w:rStyle w:val="Hyperlink"/>
@@ -383,7 +383,7 @@
             <w:noProof/>
             <w:webHidden/>
           </w:rPr>
-          <w:instrText xml:space="preserve"> PAGEREF _Toc242802426 \h </w:instrText>
+          <w:instrText xml:space="preserve"> PAGEREF _Toc242821312 \h </w:instrText>
         </w:r>
         <w:r>
           <w:rPr>
@@ -431,7 +431,7 @@
           <w14:ligatures w14:val="standardContextual"/>
         </w:rPr>
       </w:pPr>
-      <w:hyperlink w:anchor="_Toc242802427" w:history="1">
+      <w:hyperlink w:anchor="_Toc242821313" w:history="1">
         <w:r>
           <w:rPr>
             <w:rStyle w:val="Hyperlink"/>
@@ -477,7 +477,7 @@
             <w:noProof/>
             <w:webHidden/>
           </w:rPr>
-          <w:instrText xml:space="preserve"> PAGEREF _Toc242802427 \h </w:instrText>
+          <w:instrText xml:space="preserve"> PAGEREF _Toc242821313 \h </w:instrText>
         </w:r>
         <w:r>
           <w:rPr>
@@ -525,7 +525,7 @@
           <w14:ligatures w14:val="standardContextual"/>
         </w:rPr>
       </w:pPr>
-      <w:hyperlink w:anchor="_Toc242802428" w:history="1">
+      <w:hyperlink w:anchor="_Toc242821314" w:history="1">
         <w:r>
           <w:rPr>
             <w:rStyle w:val="Hyperlink"/>
@@ -571,7 +571,7 @@
             <w:noProof/>
             <w:webHidden/>
           </w:rPr>
-          <w:instrText xml:space="preserve"> PAGEREF _Toc242802428 \h </w:instrText>
+          <w:instrText xml:space="preserve"> PAGEREF _Toc242821314 \h </w:instrText>
         </w:r>
         <w:r>
           <w:rPr>
@@ -619,7 +619,7 @@
           <w14:ligatures w14:val="standardContextual"/>
         </w:rPr>
       </w:pPr>
-      <w:hyperlink w:anchor="_Toc242802429" w:history="1">
+      <w:hyperlink w:anchor="_Toc242821315" w:history="1">
         <w:r>
           <w:rPr>
             <w:rStyle w:val="Hyperlink"/>
@@ -665,7 +665,7 @@
             <w:noProof/>
             <w:webHidden/>
           </w:rPr>
-          <w:instrText xml:space="preserve"> PAGEREF _Toc242802429 \h </w:instrText>
+          <w:instrText xml:space="preserve"> PAGEREF _Toc242821315 \h </w:instrText>
         </w:r>
         <w:r>
           <w:rPr>
@@ -713,7 +713,7 @@
           <w14:ligatures w14:val="standardContextual"/>
         </w:rPr>
       </w:pPr>
-      <w:hyperlink w:anchor="_Toc242802430" w:history="1">
+      <w:hyperlink w:anchor="_Toc242821316" w:history="1">
         <w:r>
           <w:rPr>
             <w:rStyle w:val="Hyperlink"/>
@@ -759,7 +759,7 @@
             <w:noProof/>
             <w:webHidden/>
           </w:rPr>
-          <w:instrText xml:space="preserve"> PAGEREF _Toc242802430 \h </w:instrText>
+          <w:instrText xml:space="preserve"> PAGEREF _Toc242821316 \h </w:instrText>
         </w:r>
         <w:r>
           <w:rPr>
@@ -807,7 +807,7 @@
           <w14:ligatures w14:val="standardContextual"/>
         </w:rPr>
       </w:pPr>
-      <w:hyperlink w:anchor="_Toc242802431" w:history="1">
+      <w:hyperlink w:anchor="_Toc242821317" w:history="1">
         <w:r>
           <w:rPr>
             <w:rStyle w:val="Hyperlink"/>
@@ -853,7 +853,7 @@
             <w:noProof/>
             <w:webHidden/>
           </w:rPr>
-          <w:instrText xml:space="preserve"> PAGEREF _Toc242802431 \h </w:instrText>
+          <w:instrText xml:space="preserve"> PAGEREF _Toc242821317 \h </w:instrText>
         </w:r>
         <w:r>
           <w:rPr>
@@ -901,7 +901,7 @@
           <w14:ligatures w14:val="standardContextual"/>
         </w:rPr>
       </w:pPr>
-      <w:hyperlink w:anchor="_Toc242802432" w:history="1">
+      <w:hyperlink w:anchor="_Toc242821318" w:history="1">
         <w:r>
           <w:rPr>
             <w:rStyle w:val="Hyperlink"/>
@@ -947,7 +947,7 @@
             <w:noProof/>
             <w:webHidden/>
           </w:rPr>
-          <w:instrText xml:space="preserve"> PAGEREF _Toc242802432 \h </w:instrText>
+          <w:instrText xml:space="preserve"> PAGEREF _Toc242821318 \h </w:instrText>
         </w:r>
         <w:r>
           <w:rPr>
@@ -995,7 +995,7 @@
           <w14:ligatures w14:val="standardContextual"/>
         </w:rPr>
       </w:pPr>
-      <w:hyperlink w:anchor="_Toc242802433" w:history="1">
+      <w:hyperlink w:anchor="_Toc242821319" w:history="1">
         <w:r>
           <w:rPr>
             <w:rStyle w:val="Hyperlink"/>
@@ -1041,7 +1041,7 @@
             <w:noProof/>
             <w:webHidden/>
           </w:rPr>
-          <w:instrText xml:space="preserve"> PAGEREF _Toc242802433 \h </w:instrText>
+          <w:instrText xml:space="preserve"> PAGEREF _Toc242821319 \h </w:instrText>
         </w:r>
         <w:r>
           <w:rPr>
@@ -1089,7 +1089,7 @@
           <w14:ligatures w14:val="standardContextual"/>
         </w:rPr>
       </w:pPr>
-      <w:hyperlink w:anchor="_Toc242802434" w:history="1">
+      <w:hyperlink w:anchor="_Toc242821320" w:history="1">
         <w:r>
           <w:rPr>
             <w:rStyle w:val="Hyperlink"/>
@@ -1135,7 +1135,7 @@
             <w:noProof/>
             <w:webHidden/>
           </w:rPr>
-          <w:instrText xml:space="preserve"> PAGEREF _Toc242802434 \h </w:instrText>
+          <w:instrText xml:space="preserve"> PAGEREF _Toc242821320 \h </w:instrText>
         </w:r>
         <w:r>
           <w:rPr>
@@ -1183,7 +1183,7 @@
           <w14:ligatures w14:val="standardContextual"/>
         </w:rPr>
       </w:pPr>
-      <w:hyperlink w:anchor="_Toc242802435" w:history="1">
+      <w:hyperlink w:anchor="_Toc242821321" w:history="1">
         <w:r>
           <w:rPr>
             <w:rStyle w:val="Hyperlink"/>
@@ -1229,7 +1229,7 @@
             <w:noProof/>
             <w:webHidden/>
           </w:rPr>
-          <w:instrText xml:space="preserve"> PAGEREF _Toc242802435 \h </w:instrText>
+          <w:instrText xml:space="preserve"> PAGEREF _Toc242821321 \h </w:instrText>
         </w:r>
         <w:r>
           <w:rPr>
@@ -1277,7 +1277,7 @@
           <w14:ligatures w14:val="standardContextual"/>
         </w:rPr>
       </w:pPr>
-      <w:hyperlink w:anchor="_Toc242802436" w:history="1">
+      <w:hyperlink w:anchor="_Toc242821322" w:history="1">
         <w:r>
           <w:rPr>
             <w:rStyle w:val="Hyperlink"/>
@@ -1323,7 +1323,7 @@
             <w:noProof/>
             <w:webHidden/>
           </w:rPr>
-          <w:instrText xml:space="preserve"> PAGEREF _Toc242802436 \h </w:instrText>
+          <w:instrText xml:space="preserve"> PAGEREF _Toc242821322 \h </w:instrText>
         </w:r>
         <w:r>
           <w:rPr>
@@ -1371,7 +1371,7 @@
           <w14:ligatures w14:val="standardContextual"/>
         </w:rPr>
       </w:pPr>
-      <w:hyperlink w:anchor="_Toc242802437" w:history="1">
+      <w:hyperlink w:anchor="_Toc242821323" w:history="1">
         <w:r>
           <w:rPr>
             <w:rStyle w:val="Hyperlink"/>
@@ -1417,7 +1417,7 @@
             <w:noProof/>
             <w:webHidden/>
           </w:rPr>
-          <w:instrText xml:space="preserve"> PAGEREF _Toc242802437 \h </w:instrText>
+          <w:instrText xml:space="preserve"> PAGEREF _Toc242821323 \h </w:instrText>
         </w:r>
         <w:r>
           <w:rPr>
@@ -1465,7 +1465,7 @@
           <w14:ligatures w14:val="standardContextual"/>
         </w:rPr>
       </w:pPr>
-      <w:hyperlink w:anchor="_Toc242802438" w:history="1">
+      <w:hyperlink w:anchor="_Toc242821324" w:history="1">
         <w:r>
           <w:rPr>
             <w:rStyle w:val="Hyperlink"/>
@@ -1511,7 +1511,7 @@
             <w:noProof/>
             <w:webHidden/>
           </w:rPr>
-          <w:instrText xml:space="preserve"> PAGEREF _Toc242802438 \h </w:instrText>
+          <w:instrText xml:space="preserve"> PAGEREF _Toc242821324 \h </w:instrText>
         </w:r>
         <w:r>
           <w:rPr>
@@ -1559,7 +1559,7 @@
           <w14:ligatures w14:val="standardContextual"/>
         </w:rPr>
       </w:pPr>
-      <w:hyperlink w:anchor="_Toc242802439" w:history="1">
+      <w:hyperlink w:anchor="_Toc242821325" w:history="1">
         <w:r>
           <w:rPr>
             <w:rStyle w:val="Hyperlink"/>
@@ -1605,7 +1605,7 @@
             <w:noProof/>
             <w:webHidden/>
           </w:rPr>
-          <w:instrText xml:space="preserve"> PAGEREF _Toc242802439 \h </w:instrText>
+          <w:instrText xml:space="preserve"> PAGEREF _Toc242821325 \h </w:instrText>
         </w:r>
         <w:r>
           <w:rPr>
@@ -1653,7 +1653,7 @@
           <w14:ligatures w14:val="standardContextual"/>
         </w:rPr>
       </w:pPr>
-      <w:hyperlink w:anchor="_Toc242802440" w:history="1">
+      <w:hyperlink w:anchor="_Toc242821326" w:history="1">
         <w:r>
           <w:rPr>
             <w:rStyle w:val="Hyperlink"/>
@@ -1699,7 +1699,7 @@
             <w:noProof/>
             <w:webHidden/>
           </w:rPr>
-          <w:instrText xml:space="preserve"> PAGEREF _Toc242802440 \h </w:instrText>
+          <w:instrText xml:space="preserve"> PAGEREF _Toc242821326 \h </w:instrText>
         </w:r>
         <w:r>
           <w:rPr>
@@ -1747,7 +1747,7 @@
           <w14:ligatures w14:val="standardContextual"/>
         </w:rPr>
       </w:pPr>
-      <w:hyperlink w:anchor="_Toc242802441" w:history="1">
+      <w:hyperlink w:anchor="_Toc242821327" w:history="1">
         <w:r>
           <w:rPr>
             <w:rStyle w:val="Hyperlink"/>
@@ -1793,7 +1793,7 @@
             <w:noProof/>
             <w:webHidden/>
           </w:rPr>
-          <w:instrText xml:space="preserve"> PAGEREF _Toc242802441 \h </w:instrText>
+          <w:instrText xml:space="preserve"> PAGEREF _Toc242821327 \h </w:instrText>
         </w:r>
         <w:r>
           <w:rPr>
@@ -1841,7 +1841,7 @@
           <w14:ligatures w14:val="standardContextual"/>
         </w:rPr>
       </w:pPr>
-      <w:hyperlink w:anchor="_Toc242802442" w:history="1">
+      <w:hyperlink w:anchor="_Toc242821328" w:history="1">
         <w:r>
           <w:rPr>
             <w:rStyle w:val="Hyperlink"/>
@@ -1887,7 +1887,7 @@
             <w:noProof/>
             <w:webHidden/>
           </w:rPr>
-          <w:instrText xml:space="preserve"> PAGEREF _Toc242802442 \h </w:instrText>
+          <w:instrText xml:space="preserve"> PAGEREF _Toc242821328 \h </w:instrText>
         </w:r>
         <w:r>
           <w:rPr>
@@ -1935,7 +1935,7 @@
           <w14:ligatures w14:val="standardContextual"/>
         </w:rPr>
       </w:pPr>
-      <w:hyperlink w:anchor="_Toc242802443" w:history="1">
+      <w:hyperlink w:anchor="_Toc242821329" w:history="1">
         <w:r>
           <w:rPr>
             <w:rStyle w:val="Hyperlink"/>
@@ -1981,7 +1981,7 @@
             <w:noProof/>
             <w:webHidden/>
           </w:rPr>
-          <w:instrText xml:space="preserve"> PAGEREF _Toc242802443 \h </w:instrText>
+          <w:instrText xml:space="preserve"> PAGEREF _Toc242821329 \h </w:instrText>
         </w:r>
         <w:r>
           <w:rPr>
@@ -2029,7 +2029,7 @@
           <w14:ligatures w14:val="standardContextual"/>
         </w:rPr>
       </w:pPr>
-      <w:hyperlink w:anchor="_Toc242802444" w:history="1">
+      <w:hyperlink w:anchor="_Toc242821330" w:history="1">
         <w:r>
           <w:rPr>
             <w:rStyle w:val="Hyperlink"/>
@@ -2075,7 +2075,7 @@
             <w:noProof/>
             <w:webHidden/>
           </w:rPr>
-          <w:instrText xml:space="preserve"> PAGEREF _Toc242802444 \h </w:instrText>
+          <w:instrText xml:space="preserve"> PAGEREF _Toc242821330 \h </w:instrText>
         </w:r>
         <w:r>
           <w:rPr>
@@ -2123,7 +2123,7 @@
           <w14:ligatures w14:val="standardContextual"/>
         </w:rPr>
       </w:pPr>
-      <w:hyperlink w:anchor="_Toc242802445" w:history="1">
+      <w:hyperlink w:anchor="_Toc242821331" w:history="1">
         <w:r>
           <w:rPr>
             <w:rStyle w:val="Hyperlink"/>
@@ -2169,7 +2169,7 @@
             <w:noProof/>
             <w:webHidden/>
           </w:rPr>
-          <w:instrText xml:space="preserve"> PAGEREF _Toc242802445 \h </w:instrText>
+          <w:instrText xml:space="preserve"> PAGEREF _Toc242821331 \h </w:instrText>
         </w:r>
         <w:r>
           <w:rPr>
@@ -2217,7 +2217,7 @@
           <w14:ligatures w14:val="standardContextual"/>
         </w:rPr>
       </w:pPr>
-      <w:hyperlink w:anchor="_Toc242802446" w:history="1">
+      <w:hyperlink w:anchor="_Toc242821332" w:history="1">
         <w:r>
           <w:rPr>
             <w:rStyle w:val="Hyperlink"/>
@@ -2263,7 +2263,7 @@
             <w:noProof/>
             <w:webHidden/>
           </w:rPr>
-          <w:instrText xml:space="preserve"> PAGEREF _Toc242802446 \h </w:instrText>
+          <w:instrText xml:space="preserve"> PAGEREF _Toc242821332 \h </w:instrText>
         </w:r>
         <w:r>
           <w:rPr>
@@ -2311,7 +2311,7 @@
           <w14:ligatures w14:val="standardContextual"/>
         </w:rPr>
       </w:pPr>
-      <w:hyperlink w:anchor="_Toc242802447" w:history="1">
+      <w:hyperlink w:anchor="_Toc242821333" w:history="1">
         <w:r>
           <w:rPr>
             <w:rStyle w:val="Hyperlink"/>
@@ -2357,7 +2357,7 @@
             <w:noProof/>
             <w:webHidden/>
           </w:rPr>
-          <w:instrText xml:space="preserve"> PAGEREF _Toc242802447 \h </w:instrText>
+          <w:instrText xml:space="preserve"> PAGEREF _Toc242821333 \h </w:instrText>
         </w:r>
         <w:r>
           <w:rPr>
@@ -2405,7 +2405,7 @@
           <w14:ligatures w14:val="standardContextual"/>
         </w:rPr>
       </w:pPr>
-      <w:hyperlink w:anchor="_Toc242802448" w:history="1">
+      <w:hyperlink w:anchor="_Toc242821334" w:history="1">
         <w:r>
           <w:rPr>
             <w:rStyle w:val="Hyperlink"/>
@@ -2451,7 +2451,7 @@
             <w:noProof/>
             <w:webHidden/>
           </w:rPr>
-          <w:instrText xml:space="preserve"> PAGEREF _Toc242802448 \h </w:instrText>
+          <w:instrText xml:space="preserve"> PAGEREF _Toc242821334 \h </w:instrText>
         </w:r>
         <w:r>
           <w:rPr>
@@ -2499,7 +2499,7 @@
           <w14:ligatures w14:val="standardContextual"/>
         </w:rPr>
       </w:pPr>
-      <w:hyperlink w:anchor="_Toc242802449" w:history="1">
+      <w:hyperlink w:anchor="_Toc242821335" w:history="1">
         <w:r>
           <w:rPr>
             <w:rStyle w:val="Hyperlink"/>
@@ -2545,7 +2545,7 @@
             <w:noProof/>
             <w:webHidden/>
           </w:rPr>
-          <w:instrText xml:space="preserve"> PAGEREF _Toc242802449 \h </w:instrText>
+          <w:instrText xml:space="preserve"> PAGEREF _Toc242821335 \h </w:instrText>
         </w:r>
         <w:r>
           <w:rPr>
@@ -2593,7 +2593,7 @@
           <w14:ligatures w14:val="standardContextual"/>
         </w:rPr>
       </w:pPr>
-      <w:hyperlink w:anchor="_Toc242802450" w:history="1">
+      <w:hyperlink w:anchor="_Toc242821336" w:history="1">
         <w:r>
           <w:rPr>
             <w:rStyle w:val="Hyperlink"/>
@@ -2639,7 +2639,7 @@
             <w:noProof/>
             <w:webHidden/>
           </w:rPr>
-          <w:instrText xml:space="preserve"> PAGEREF _Toc242802450 \h </w:instrText>
+          <w:instrText xml:space="preserve"> PAGEREF _Toc242821336 \h </w:instrText>
         </w:r>
         <w:r>
           <w:rPr>
@@ -2687,7 +2687,7 @@
           <w14:ligatures w14:val="standardContextual"/>
         </w:rPr>
       </w:pPr>
-      <w:hyperlink w:anchor="_Toc242802451" w:history="1">
+      <w:hyperlink w:anchor="_Toc242821337" w:history="1">
         <w:r>
           <w:rPr>
             <w:rStyle w:val="Hyperlink"/>
@@ -2733,7 +2733,7 @@
             <w:noProof/>
             <w:webHidden/>
           </w:rPr>
-          <w:instrText xml:space="preserve"> PAGEREF _Toc242802451 \h </w:instrText>
+          <w:instrText xml:space="preserve"> PAGEREF _Toc242821337 \h </w:instrText>
         </w:r>
         <w:r>
           <w:rPr>
@@ -2781,7 +2781,7 @@
           <w14:ligatures w14:val="standardContextual"/>
         </w:rPr>
       </w:pPr>
-      <w:hyperlink w:anchor="_Toc242802452" w:history="1">
+      <w:hyperlink w:anchor="_Toc242821338" w:history="1">
         <w:r>
           <w:rPr>
             <w:rStyle w:val="Hyperlink"/>
@@ -2827,7 +2827,7 @@
             <w:noProof/>
             <w:webHidden/>
           </w:rPr>
-          <w:instrText xml:space="preserve"> PAGEREF _Toc242802452 \h </w:instrText>
+          <w:instrText xml:space="preserve"> PAGEREF _Toc242821338 \h </w:instrText>
         </w:r>
         <w:r>
           <w:rPr>
@@ -2875,7 +2875,7 @@
           <w14:ligatures w14:val="standardContextual"/>
         </w:rPr>
       </w:pPr>
-      <w:hyperlink w:anchor="_Toc242802453" w:history="1">
+      <w:hyperlink w:anchor="_Toc242821339" w:history="1">
         <w:r>
           <w:rPr>
             <w:rStyle w:val="Hyperlink"/>
@@ -2921,7 +2921,7 @@
             <w:noProof/>
             <w:webHidden/>
           </w:rPr>
-          <w:instrText xml:space="preserve"> PAGEREF _Toc242802453 \h </w:instrText>
+          <w:instrText xml:space="preserve"> PAGEREF _Toc242821339 \h </w:instrText>
         </w:r>
         <w:r>
           <w:rPr>
@@ -2969,7 +2969,7 @@
           <w14:ligatures w14:val="standardContextual"/>
         </w:rPr>
       </w:pPr>
-      <w:hyperlink w:anchor="_Toc242802454" w:history="1">
+      <w:hyperlink w:anchor="_Toc242821340" w:history="1">
         <w:r>
           <w:rPr>
             <w:rStyle w:val="Hyperlink"/>
@@ -3015,7 +3015,7 @@
             <w:noProof/>
             <w:webHidden/>
           </w:rPr>
-          <w:instrText xml:space="preserve"> PAGEREF _Toc242802454 \h </w:instrText>
+          <w:instrText xml:space="preserve"> PAGEREF _Toc242821340 \h </w:instrText>
         </w:r>
         <w:r>
           <w:rPr>
@@ -3063,7 +3063,7 @@
           <w14:ligatures w14:val="standardContextual"/>
         </w:rPr>
       </w:pPr>
-      <w:hyperlink w:anchor="_Toc242802455" w:history="1">
+      <w:hyperlink w:anchor="_Toc242821341" w:history="1">
         <w:r>
           <w:rPr>
             <w:rStyle w:val="Hyperlink"/>
@@ -3109,7 +3109,7 @@
             <w:noProof/>
             <w:webHidden/>
           </w:rPr>
-          <w:instrText xml:space="preserve"> PAGEREF _Toc242802455 \h </w:instrText>
+          <w:instrText xml:space="preserve"> PAGEREF _Toc242821341 \h </w:instrText>
         </w:r>
         <w:r>
           <w:rPr>
@@ -3157,7 +3157,7 @@
           <w14:ligatures w14:val="standardContextual"/>
         </w:rPr>
       </w:pPr>
-      <w:hyperlink w:anchor="_Toc242802456" w:history="1">
+      <w:hyperlink w:anchor="_Toc242821342" w:history="1">
         <w:r>
           <w:rPr>
             <w:rStyle w:val="Hyperlink"/>
@@ -3203,7 +3203,7 @@
             <w:noProof/>
             <w:webHidden/>
           </w:rPr>
-          <w:instrText xml:space="preserve"> PAGEREF _Toc242802456 \h </w:instrText>
+          <w:instrText xml:space="preserve"> PAGEREF _Toc242821342 \h </w:instrText>
         </w:r>
         <w:r>
           <w:rPr>
@@ -3251,7 +3251,7 @@
           <w14:ligatures w14:val="standardContextual"/>
         </w:rPr>
       </w:pPr>
-      <w:hyperlink w:anchor="_Toc242802457" w:history="1">
+      <w:hyperlink w:anchor="_Toc242821343" w:history="1">
         <w:r>
           <w:rPr>
             <w:rStyle w:val="Hyperlink"/>
@@ -3297,7 +3297,7 @@
             <w:noProof/>
             <w:webHidden/>
           </w:rPr>
-          <w:instrText xml:space="preserve"> PAGEREF _Toc242802457 \h </w:instrText>
+          <w:instrText xml:space="preserve"> PAGEREF _Toc242821343 \h </w:instrText>
         </w:r>
         <w:r>
           <w:rPr>
@@ -3345,7 +3345,7 @@
           <w14:ligatures w14:val="standardContextual"/>
         </w:rPr>
       </w:pPr>
-      <w:hyperlink w:anchor="_Toc242802458" w:history="1">
+      <w:hyperlink w:anchor="_Toc242821344" w:history="1">
         <w:r>
           <w:rPr>
             <w:rStyle w:val="Hyperlink"/>
@@ -3391,7 +3391,7 @@
             <w:noProof/>
             <w:webHidden/>
           </w:rPr>
-          <w:instrText xml:space="preserve"> PAGEREF _Toc242802458 \h </w:instrText>
+          <w:instrText xml:space="preserve"> PAGEREF _Toc242821344 \h </w:instrText>
         </w:r>
         <w:r>
           <w:rPr>
@@ -3439,7 +3439,7 @@
           <w14:ligatures w14:val="standardContextual"/>
         </w:rPr>
       </w:pPr>
-      <w:hyperlink w:anchor="_Toc242802459" w:history="1">
+      <w:hyperlink w:anchor="_Toc242821345" w:history="1">
         <w:r>
           <w:rPr>
             <w:rStyle w:val="Hyperlink"/>
@@ -3485,7 +3485,7 @@
             <w:noProof/>
             <w:webHidden/>
           </w:rPr>
-          <w:instrText xml:space="preserve"> PAGEREF _Toc242802459 \h </w:instrText>
+          <w:instrText xml:space="preserve"> PAGEREF _Toc242821345 \h </w:instrText>
         </w:r>
         <w:r>
           <w:rPr>
@@ -3533,7 +3533,7 @@
           <w14:ligatures w14:val="standardContextual"/>
         </w:rPr>
       </w:pPr>
-      <w:hyperlink w:anchor="_Toc242802460" w:history="1">
+      <w:hyperlink w:anchor="_Toc242821346" w:history="1">
         <w:r>
           <w:rPr>
             <w:rStyle w:val="Hyperlink"/>
@@ -3579,7 +3579,7 @@
             <w:noProof/>
             <w:webHidden/>
           </w:rPr>
-          <w:instrText xml:space="preserve"> PAGEREF _Toc242802460 \h </w:instrText>
+          <w:instrText xml:space="preserve"> PAGEREF _Toc242821346 \h </w:instrText>
         </w:r>
         <w:r>
           <w:rPr>
@@ -3627,7 +3627,7 @@
           <w14:ligatures w14:val="standardContextual"/>
         </w:rPr>
       </w:pPr>
-      <w:hyperlink w:anchor="_Toc242802461" w:history="1">
+      <w:hyperlink w:anchor="_Toc242821347" w:history="1">
         <w:r>
           <w:rPr>
             <w:rStyle w:val="Hyperlink"/>
@@ -3673,7 +3673,7 @@
             <w:noProof/>
             <w:webHidden/>
           </w:rPr>
-          <w:instrText xml:space="preserve"> PAGEREF _Toc242802461 \h </w:instrText>
+          <w:instrText xml:space="preserve"> PAGEREF _Toc242821347 \h </w:instrText>
         </w:r>
         <w:r>
           <w:rPr>
@@ -3721,7 +3721,7 @@
           <w14:ligatures w14:val="standardContextual"/>
         </w:rPr>
       </w:pPr>
-      <w:hyperlink w:anchor="_Toc242802462" w:history="1">
+      <w:hyperlink w:anchor="_Toc242821348" w:history="1">
         <w:r>
           <w:rPr>
             <w:rStyle w:val="Hyperlink"/>
@@ -3767,7 +3767,7 @@
             <w:noProof/>
             <w:webHidden/>
           </w:rPr>
-          <w:instrText xml:space="preserve"> PAGEREF _Toc242802462 \h </w:instrText>
+          <w:instrText xml:space="preserve"> PAGEREF _Toc242821348 \h </w:instrText>
         </w:r>
         <w:r>
           <w:rPr>
@@ -3815,7 +3815,7 @@
           <w14:ligatures w14:val="standardContextual"/>
         </w:rPr>
       </w:pPr>
-      <w:hyperlink w:anchor="_Toc242802463" w:history="1">
+      <w:hyperlink w:anchor="_Toc242821349" w:history="1">
         <w:r>
           <w:rPr>
             <w:rStyle w:val="Hyperlink"/>
@@ -3861,7 +3861,7 @@
             <w:noProof/>
             <w:webHidden/>
           </w:rPr>
-          <w:instrText xml:space="preserve"> PAGEREF _Toc242802463 \h </w:instrText>
+          <w:instrText xml:space="preserve"> PAGEREF _Toc242821349 \h </w:instrText>
         </w:r>
         <w:r>
           <w:rPr>
@@ -3909,7 +3909,7 @@
           <w14:ligatures w14:val="standardContextual"/>
         </w:rPr>
       </w:pPr>
-      <w:hyperlink w:anchor="_Toc242802464" w:history="1">
+      <w:hyperlink w:anchor="_Toc242821350" w:history="1">
         <w:r>
           <w:rPr>
             <w:rStyle w:val="Hyperlink"/>
@@ -3955,7 +3955,7 @@
             <w:noProof/>
             <w:webHidden/>
           </w:rPr>
-          <w:instrText xml:space="preserve"> PAGEREF _Toc242802464 \h </w:instrText>
+          <w:instrText xml:space="preserve"> PAGEREF _Toc242821350 \h </w:instrText>
         </w:r>
         <w:r>
           <w:rPr>
@@ -4003,7 +4003,7 @@
           <w14:ligatures w14:val="standardContextual"/>
         </w:rPr>
       </w:pPr>
-      <w:hyperlink w:anchor="_Toc242802465" w:history="1">
+      <w:hyperlink w:anchor="_Toc242821351" w:history="1">
         <w:r>
           <w:rPr>
             <w:rStyle w:val="Hyperlink"/>
@@ -4049,7 +4049,7 @@
             <w:noProof/>
             <w:webHidden/>
           </w:rPr>
-          <w:instrText xml:space="preserve"> PAGEREF _Toc242802465 \h </w:instrText>
+          <w:instrText xml:space="preserve"> PAGEREF _Toc242821351 \h </w:instrText>
         </w:r>
         <w:r>
           <w:rPr>
@@ -4097,7 +4097,7 @@
           <w14:ligatures w14:val="standardContextual"/>
         </w:rPr>
       </w:pPr>
-      <w:hyperlink w:anchor="_Toc242802466" w:history="1">
+      <w:hyperlink w:anchor="_Toc242821352" w:history="1">
         <w:r>
           <w:rPr>
             <w:rStyle w:val="Hyperlink"/>
@@ -4143,7 +4143,7 @@
             <w:noProof/>
             <w:webHidden/>
           </w:rPr>
-          <w:instrText xml:space="preserve"> PAGEREF _Toc242802466 \h </w:instrText>
+          <w:instrText xml:space="preserve"> PAGEREF _Toc242821352 \h </w:instrText>
         </w:r>
         <w:r>
           <w:rPr>
@@ -4191,7 +4191,7 @@
           <w14:ligatures w14:val="standardContextual"/>
         </w:rPr>
       </w:pPr>
-      <w:hyperlink w:anchor="_Toc242802467" w:history="1">
+      <w:hyperlink w:anchor="_Toc242821353" w:history="1">
         <w:r>
           <w:rPr>
             <w:rStyle w:val="Hyperlink"/>
@@ -4237,7 +4237,7 @@
             <w:noProof/>
             <w:webHidden/>
           </w:rPr>
-          <w:instrText xml:space="preserve"> PAGEREF _Toc242802467 \h </w:instrText>
+          <w:instrText xml:space="preserve"> PAGEREF _Toc242821353 \h </w:instrText>
         </w:r>
         <w:r>
           <w:rPr>
@@ -4285,7 +4285,7 @@
           <w14:ligatures w14:val="standardContextual"/>
         </w:rPr>
       </w:pPr>
-      <w:hyperlink w:anchor="_Toc242802468" w:history="1">
+      <w:hyperlink w:anchor="_Toc242821354" w:history="1">
         <w:r>
           <w:rPr>
             <w:rStyle w:val="Hyperlink"/>
@@ -4331,7 +4331,7 @@
             <w:noProof/>
             <w:webHidden/>
           </w:rPr>
-          <w:instrText xml:space="preserve"> PAGEREF _Toc242802468 \h </w:instrText>
+          <w:instrText xml:space="preserve"> PAGEREF _Toc242821354 \h </w:instrText>
         </w:r>
         <w:r>
           <w:rPr>
@@ -4379,7 +4379,7 @@
           <w14:ligatures w14:val="standardContextual"/>
         </w:rPr>
       </w:pPr>
-      <w:hyperlink w:anchor="_Toc242802469" w:history="1">
+      <w:hyperlink w:anchor="_Toc242821355" w:history="1">
         <w:r>
           <w:rPr>
             <w:rStyle w:val="Hyperlink"/>
@@ -4425,7 +4425,7 @@
             <w:noProof/>
             <w:webHidden/>
           </w:rPr>
-          <w:instrText xml:space="preserve"> PAGEREF _Toc242802469 \h </w:instrText>
+          <w:instrText xml:space="preserve"> PAGEREF _Toc242821355 \h </w:instrText>
         </w:r>
         <w:r>
           <w:rPr>
@@ -4473,7 +4473,7 @@
           <w14:ligatures w14:val="standardContextual"/>
         </w:rPr>
       </w:pPr>
-      <w:hyperlink w:anchor="_Toc242802470" w:history="1">
+      <w:hyperlink w:anchor="_Toc242821356" w:history="1">
         <w:r>
           <w:rPr>
             <w:rStyle w:val="Hyperlink"/>
@@ -4519,7 +4519,7 @@
             <w:noProof/>
             <w:webHidden/>
           </w:rPr>
-          <w:instrText xml:space="preserve"> PAGEREF _Toc242802470 \h </w:instrText>
+          <w:instrText xml:space="preserve"> PAGEREF _Toc242821356 \h </w:instrText>
         </w:r>
         <w:r>
           <w:rPr>
@@ -4559,7 +4559,7 @@
       <w:pPr>
         <w:pStyle w:val="Heading1"/>
       </w:pPr>
-      <w:bookmarkStart w:id="0" w:name="_Toc242802424"/>
+      <w:bookmarkStart w:id="0" w:name="_Toc242821310"/>
       <w:r>
         <w:lastRenderedPageBreak/>
         <w:t>Overview</w:t>
@@ -4716,7 +4716,7 @@
       <w:pPr>
         <w:pStyle w:val="Heading1"/>
       </w:pPr>
-      <w:bookmarkStart w:id="1" w:name="_Toc242802425"/>
+      <w:bookmarkStart w:id="1" w:name="_Toc242821311"/>
       <w:r>
         <w:lastRenderedPageBreak/>
         <w:t>Installation</w:t>
@@ -4759,7 +4759,7 @@
       <w:pPr>
         <w:pStyle w:val="Heading2"/>
       </w:pPr>
-      <w:bookmarkStart w:id="2" w:name="_Toc242802426"/>
+      <w:bookmarkStart w:id="2" w:name="_Toc242821312"/>
       <w:r>
         <w:t>Automatic installation</w:t>
       </w:r>
@@ -5108,7 +5108,7 @@
       <w:pPr>
         <w:pStyle w:val="Heading2"/>
       </w:pPr>
-      <w:bookmarkStart w:id="3" w:name="_Toc242802427"/>
+      <w:bookmarkStart w:id="3" w:name="_Toc242821313"/>
       <w:r>
         <w:t>Manual installation</w:t>
       </w:r>
@@ -5271,7 +5271,7 @@
       <w:pPr>
         <w:pStyle w:val="Heading2"/>
       </w:pPr>
-      <w:bookmarkStart w:id="4" w:name="_Toc242802428"/>
+      <w:bookmarkStart w:id="4" w:name="_Toc242821314"/>
       <w:r>
         <w:lastRenderedPageBreak/>
         <w:t>Testing the installation</w:t>
@@ -5481,7 +5481,7 @@
       <w:pPr>
         <w:pStyle w:val="Heading2"/>
       </w:pPr>
-      <w:bookmarkStart w:id="5" w:name="_Toc242802429"/>
+      <w:bookmarkStart w:id="5" w:name="_Toc242821315"/>
       <w:r>
         <w:t>GPU support (if you have an NVIDIA GPU)</w:t>
       </w:r>
@@ -5566,7 +5566,7 @@
         <w:t>GPU: ready</w:t>
       </w:r>
       <w:r>
-        <w:t>, or the reason why the GPU cannot be used; then the program runs on the CPU. The NVIDIA driver is part of the operating system, so the installer never installs it.</w:t>
+        <w:t>, or the reason why the GPU cannot be used; then the program runs on the CPU. If the GPU still cannot be used after the install, the message also gives the command that removes the installed packages. The NVIDIA driver is part of the operating system, so the installer never installs it.</w:t>
       </w:r>
     </w:p>
     <w:p>
@@ -5914,7 +5914,7 @@
       <w:pPr>
         <w:pStyle w:val="Heading2"/>
       </w:pPr>
-      <w:bookmarkStart w:id="6" w:name="_Toc242802430"/>
+      <w:bookmarkStart w:id="6" w:name="_Toc242821316"/>
       <w:r>
         <w:t>Pre-compiled kernels</w:t>
       </w:r>
@@ -5995,7 +5995,7 @@
       <w:pPr>
         <w:pStyle w:val="Heading1"/>
       </w:pPr>
-      <w:bookmarkStart w:id="7" w:name="_Toc242802431"/>
+      <w:bookmarkStart w:id="7" w:name="_Toc242821317"/>
       <w:r>
         <w:lastRenderedPageBreak/>
         <w:t>Input Handling</w:t>
@@ -6472,7 +6472,7 @@
       <w:pPr>
         <w:pStyle w:val="Heading2"/>
       </w:pPr>
-      <w:bookmarkStart w:id="8" w:name="_Toc242802432"/>
+      <w:bookmarkStart w:id="8" w:name="_Toc242821318"/>
       <w:r>
         <w:t>External Data Sources</w:t>
       </w:r>
@@ -7082,7 +7082,7 @@
       <w:pPr>
         <w:pStyle w:val="Heading2"/>
       </w:pPr>
-      <w:bookmarkStart w:id="9" w:name="_Toc242802433"/>
+      <w:bookmarkStart w:id="9" w:name="_Toc242821319"/>
       <w:r>
         <w:lastRenderedPageBreak/>
         <w:t>Event Selection (Watcher)</w:t>
@@ -7588,7 +7588,7 @@
       <w:pPr>
         <w:pStyle w:val="Heading1"/>
       </w:pPr>
-      <w:bookmarkStart w:id="10" w:name="_Toc242802434"/>
+      <w:bookmarkStart w:id="10" w:name="_Toc242821320"/>
       <w:r>
         <w:lastRenderedPageBreak/>
         <w:t>Station and Signal Selection</w:t>
@@ -7718,7 +7718,7 @@
       <w:pPr>
         <w:pStyle w:val="Heading2"/>
       </w:pPr>
-      <w:bookmarkStart w:id="11" w:name="_Toc242802435"/>
+      <w:bookmarkStart w:id="11" w:name="_Toc242821321"/>
       <w:r>
         <w:t>Step 1 — Retrieve the event</w:t>
       </w:r>
@@ -7736,7 +7736,7 @@
       <w:pPr>
         <w:pStyle w:val="Heading2"/>
       </w:pPr>
-      <w:bookmarkStart w:id="12" w:name="_Toc242802436"/>
+      <w:bookmarkStart w:id="12" w:name="_Toc242821322"/>
       <w:r>
         <w:t>Step 2 — Retrieve the station metadata</w:t>
       </w:r>
@@ -8506,7 +8506,7 @@
       <w:pPr>
         <w:pStyle w:val="Heading2"/>
       </w:pPr>
-      <w:bookmarkStart w:id="13" w:name="_Toc242802437"/>
+      <w:bookmarkStart w:id="13" w:name="_Toc242821323"/>
       <w:r>
         <w:t>Step 3 — Download the waveforms</w:t>
       </w:r>
@@ -8524,7 +8524,7 @@
       <w:pPr>
         <w:pStyle w:val="Heading2"/>
       </w:pPr>
-      <w:bookmarkStart w:id="14" w:name="_Toc242802438"/>
+      <w:bookmarkStart w:id="14" w:name="_Toc242821324"/>
       <w:r>
         <w:t>Step 4 — Quality checks and instrument correction</w:t>
       </w:r>
@@ -9073,7 +9073,7 @@
       <w:pPr>
         <w:pStyle w:val="Heading2"/>
       </w:pPr>
-      <w:bookmarkStart w:id="15" w:name="_Toc242802439"/>
+      <w:bookmarkStart w:id="15" w:name="_Toc242821325"/>
       <w:r>
         <w:t>Step 5 — Azimuthal selection</w:t>
       </w:r>
@@ -9256,7 +9256,7 @@
       <w:pPr>
         <w:pStyle w:val="Heading1"/>
       </w:pPr>
-      <w:bookmarkStart w:id="16" w:name="_Toc242802440"/>
+      <w:bookmarkStart w:id="16" w:name="_Toc242821326"/>
       <w:r>
         <w:lastRenderedPageBreak/>
         <w:t>Computation Configuration</w:t>
@@ -9340,7 +9340,7 @@
       <w:pPr>
         <w:pStyle w:val="Heading2"/>
       </w:pPr>
-      <w:bookmarkStart w:id="17" w:name="_Toc242802441"/>
+      <w:bookmarkStart w:id="17" w:name="_Toc242821327"/>
       <w:r>
         <w:t>Green's Functions</w:t>
       </w:r>
@@ -9350,7 +9350,7 @@
       <w:pPr>
         <w:pStyle w:val="Heading3"/>
       </w:pPr>
-      <w:bookmarkStart w:id="18" w:name="_Toc242802442"/>
+      <w:bookmarkStart w:id="18" w:name="_Toc242821328"/>
       <w:r>
         <w:t>Regional velocity models</w:t>
       </w:r>
@@ -9535,7 +9535,7 @@
       <w:pPr>
         <w:pStyle w:val="Heading3"/>
       </w:pPr>
-      <w:bookmarkStart w:id="19" w:name="_Toc242802443"/>
+      <w:bookmarkStart w:id="19" w:name="_Toc242821329"/>
       <w:r>
         <w:t>Source grid</w:t>
       </w:r>
@@ -9993,7 +9993,7 @@
       <w:pPr>
         <w:pStyle w:val="Heading3"/>
       </w:pPr>
-      <w:bookmarkStart w:id="20" w:name="_Toc242802444"/>
+      <w:bookmarkStart w:id="20" w:name="_Toc242821330"/>
       <w:r>
         <w:t>Frequency content</w:t>
       </w:r>
@@ -10116,7 +10116,7 @@
       <w:pPr>
         <w:pStyle w:val="Heading2"/>
       </w:pPr>
-      <w:bookmarkStart w:id="21" w:name="_Toc242802445"/>
+      <w:bookmarkStart w:id="21" w:name="_Toc242821331"/>
       <w:r>
         <w:lastRenderedPageBreak/>
         <w:t>Inversion Parameters</w:t>
@@ -10135,7 +10135,7 @@
       <w:pPr>
         <w:pStyle w:val="Heading3"/>
       </w:pPr>
-      <w:bookmarkStart w:id="22" w:name="_Toc242802446"/>
+      <w:bookmarkStart w:id="22" w:name="_Toc242821332"/>
       <w:r>
         <w:t>Frequency band</w:t>
       </w:r>
@@ -10300,7 +10300,7 @@
       <w:pPr>
         <w:pStyle w:val="Heading3"/>
       </w:pPr>
-      <w:bookmarkStart w:id="23" w:name="_Toc242802447"/>
+      <w:bookmarkStart w:id="23" w:name="_Toc242821333"/>
       <w:r>
         <w:t>Waveform window</w:t>
       </w:r>
@@ -10485,7 +10485,7 @@
       <w:pPr>
         <w:pStyle w:val="Heading3"/>
       </w:pPr>
-      <w:bookmarkStart w:id="24" w:name="_Toc242802448"/>
+      <w:bookmarkStart w:id="24" w:name="_Toc242821334"/>
       <w:r>
         <w:lastRenderedPageBreak/>
         <w:t>Centroid time search</w:t>
@@ -10629,7 +10629,7 @@
       <w:pPr>
         <w:pStyle w:val="Heading3"/>
       </w:pPr>
-      <w:bookmarkStart w:id="25" w:name="_Toc242802449"/>
+      <w:bookmarkStart w:id="25" w:name="_Toc242821335"/>
       <w:r>
         <w:t>Source time function</w:t>
       </w:r>
@@ -10758,7 +10758,7 @@
       <w:pPr>
         <w:pStyle w:val="Heading3"/>
       </w:pPr>
-      <w:bookmarkStart w:id="26" w:name="_Toc242802450"/>
+      <w:bookmarkStart w:id="26" w:name="_Toc242821336"/>
       <w:r>
         <w:t>Deviatoric and full moment tensor</w:t>
       </w:r>
@@ -10925,7 +10925,7 @@
       <w:pPr>
         <w:pStyle w:val="Heading2"/>
       </w:pPr>
-      <w:bookmarkStart w:id="27" w:name="_Toc242802451"/>
+      <w:bookmarkStart w:id="27" w:name="_Toc242821337"/>
       <w:r>
         <w:lastRenderedPageBreak/>
         <w:t>Bayesian Bootstrap</w:t>
@@ -11592,7 +11592,7 @@
       <w:pPr>
         <w:pStyle w:val="Heading1"/>
       </w:pPr>
-      <w:bookmarkStart w:id="28" w:name="_Toc242802452"/>
+      <w:bookmarkStart w:id="28" w:name="_Toc242821338"/>
       <w:r>
         <w:lastRenderedPageBreak/>
         <w:t>Outputs</w:t>
@@ -11927,7 +11927,7 @@
       <w:pPr>
         <w:pStyle w:val="Heading2"/>
       </w:pPr>
-      <w:bookmarkStart w:id="29" w:name="_Toc242802453"/>
+      <w:bookmarkStart w:id="29" w:name="_Toc242821339"/>
       <w:r>
         <w:t>Result files</w:t>
       </w:r>
@@ -12782,7 +12782,7 @@
       <w:pPr>
         <w:pStyle w:val="Heading2"/>
       </w:pPr>
-      <w:bookmarkStart w:id="30" w:name="_Toc242802454"/>
+      <w:bookmarkStart w:id="30" w:name="_Toc242821340"/>
       <w:r>
         <w:t>Figures</w:t>
       </w:r>
@@ -14031,7 +14031,7 @@
       <w:pPr>
         <w:pStyle w:val="Heading2"/>
       </w:pPr>
-      <w:bookmarkStart w:id="31" w:name="_Toc242802455"/>
+      <w:bookmarkStart w:id="31" w:name="_Toc242821341"/>
       <w:r>
         <w:t>Web pages</w:t>
       </w:r>
@@ -14459,7 +14459,7 @@
       <w:pPr>
         <w:pStyle w:val="Heading2"/>
       </w:pPr>
-      <w:bookmarkStart w:id="32" w:name="_Toc242802456"/>
+      <w:bookmarkStart w:id="32" w:name="_Toc242821342"/>
       <w:r>
         <w:t>Log</w:t>
       </w:r>
@@ -14477,7 +14477,7 @@
       <w:pPr>
         <w:pStyle w:val="Heading1"/>
       </w:pPr>
-      <w:bookmarkStart w:id="33" w:name="_Toc242802457"/>
+      <w:bookmarkStart w:id="33" w:name="_Toc242821343"/>
       <w:r>
         <w:lastRenderedPageBreak/>
         <w:t>Other Settings</w:t>
@@ -15367,7 +15367,7 @@
       <w:pPr>
         <w:pStyle w:val="Heading1"/>
       </w:pPr>
-      <w:bookmarkStart w:id="34" w:name="_Toc242802458"/>
+      <w:bookmarkStart w:id="34" w:name="_Toc242821344"/>
       <w:r>
         <w:lastRenderedPageBreak/>
         <w:t>Usage</w:t>
@@ -15751,7 +15751,7 @@
       <w:pPr>
         <w:pStyle w:val="Heading2"/>
       </w:pPr>
-      <w:bookmarkStart w:id="35" w:name="_Toc242802459"/>
+      <w:bookmarkStart w:id="35" w:name="_Toc242821345"/>
       <w:r>
         <w:t>Single event (-e)</w:t>
       </w:r>
@@ -16040,7 +16040,7 @@
       <w:pPr>
         <w:pStyle w:val="Heading2"/>
       </w:pPr>
-      <w:bookmarkStart w:id="36" w:name="_Toc242802460"/>
+      <w:bookmarkStart w:id="36" w:name="_Toc242821346"/>
       <w:r>
         <w:lastRenderedPageBreak/>
         <w:t>Event file (--event-file)</w:t>
@@ -16379,7 +16379,7 @@
       <w:pPr>
         <w:pStyle w:val="Heading2"/>
       </w:pPr>
-      <w:bookmarkStart w:id="37" w:name="_Toc242802461"/>
+      <w:bookmarkStart w:id="37" w:name="_Toc242821347"/>
       <w:r>
         <w:t>QuakeML file (--event-xml)</w:t>
       </w:r>
@@ -16446,7 +16446,7 @@
       <w:pPr>
         <w:pStyle w:val="Heading2"/>
       </w:pPr>
-      <w:bookmarkStart w:id="38" w:name="_Toc242802462"/>
+      <w:bookmarkStart w:id="38" w:name="_Toc242821348"/>
       <w:r>
         <w:t>Datetime range (-d)</w:t>
       </w:r>
@@ -16525,7 +16525,7 @@
       <w:pPr>
         <w:pStyle w:val="Heading2"/>
       </w:pPr>
-      <w:bookmarkStart w:id="39" w:name="_Toc242802463"/>
+      <w:bookmarkStart w:id="39" w:name="_Toc242821349"/>
       <w:r>
         <w:lastRenderedPageBreak/>
         <w:t>Real time (--real-time)</w:t>
@@ -16686,7 +16686,7 @@
       <w:pPr>
         <w:pStyle w:val="Heading2"/>
       </w:pPr>
-      <w:bookmarkStart w:id="40" w:name="_Toc242802464"/>
+      <w:bookmarkStart w:id="40" w:name="_Toc242821350"/>
       <w:r>
         <w:t>Revise (--revise)</w:t>
       </w:r>
@@ -17677,7 +17677,7 @@
       <w:pPr>
         <w:pStyle w:val="Heading2"/>
       </w:pPr>
-      <w:bookmarkStart w:id="41" w:name="_Toc242802465"/>
+      <w:bookmarkStart w:id="41" w:name="_Toc242821351"/>
       <w:r>
         <w:t>Web pages (--home)</w:t>
       </w:r>
@@ -17868,7 +17868,7 @@
       <w:pPr>
         <w:pStyle w:val="Heading2"/>
       </w:pPr>
-      <w:bookmarkStart w:id="42" w:name="_Toc242802466"/>
+      <w:bookmarkStart w:id="42" w:name="_Toc242821352"/>
       <w:r>
         <w:t>PPSD tool (for ppsdoffline)</w:t>
       </w:r>
@@ -17985,7 +17985,7 @@
       <w:pPr>
         <w:pStyle w:val="Heading2"/>
       </w:pPr>
-      <w:bookmarkStart w:id="43" w:name="_Toc242802467"/>
+      <w:bookmarkStart w:id="43" w:name="_Toc242821353"/>
       <w:r>
         <w:t>Runtime Overrides</w:t>
       </w:r>
@@ -19451,7 +19451,7 @@
       <w:pPr>
         <w:pStyle w:val="Heading2"/>
       </w:pPr>
-      <w:bookmarkStart w:id="44" w:name="_Toc242802468"/>
+      <w:bookmarkStart w:id="44" w:name="_Toc242821354"/>
       <w:r>
         <w:t>Operational Notes</w:t>
       </w:r>
@@ -19793,7 +19793,7 @@
       <w:pPr>
         <w:pStyle w:val="Heading1"/>
       </w:pPr>
-      <w:bookmarkStart w:id="45" w:name="_Toc242802469"/>
+      <w:bookmarkStart w:id="45" w:name="_Toc242821355"/>
       <w:r>
         <w:lastRenderedPageBreak/>
         <w:t>References</w:t>
@@ -19834,7 +19834,7 @@
       <w:pPr>
         <w:pStyle w:val="Heading1"/>
       </w:pPr>
-      <w:bookmarkStart w:id="46" w:name="_Toc242802470"/>
+      <w:bookmarkStart w:id="46" w:name="_Toc242821356"/>
       <w:r>
         <w:lastRenderedPageBreak/>
         <w:t>Acknowledgments</w:t>

</xml_diff>

<commit_message>
Manual: simpler wording about the NVIDIA driver
</commit_message>
<xml_diff>
--- a/docs/GisolaBaBoo_User_Manual.docx
+++ b/docs/GisolaBaBoo_User_Manual.docx
@@ -149,7 +149,7 @@
       <w:r>
         <w:fldChar w:fldCharType="separate"/>
       </w:r>
-      <w:hyperlink w:anchor="_Toc242821310" w:history="1">
+      <w:hyperlink w:anchor="_Toc242821861" w:history="1">
         <w:r>
           <w:rPr>
             <w:rStyle w:val="Hyperlink"/>
@@ -195,7 +195,7 @@
             <w:noProof/>
             <w:webHidden/>
           </w:rPr>
-          <w:instrText xml:space="preserve"> PAGEREF _Toc242821310 \h </w:instrText>
+          <w:instrText xml:space="preserve"> PAGEREF _Toc242821861 \h </w:instrText>
         </w:r>
         <w:r>
           <w:rPr>
@@ -243,7 +243,7 @@
           <w14:ligatures w14:val="standardContextual"/>
         </w:rPr>
       </w:pPr>
-      <w:hyperlink w:anchor="_Toc242821311" w:history="1">
+      <w:hyperlink w:anchor="_Toc242821862" w:history="1">
         <w:r>
           <w:rPr>
             <w:rStyle w:val="Hyperlink"/>
@@ -289,7 +289,7 @@
             <w:noProof/>
             <w:webHidden/>
           </w:rPr>
-          <w:instrText xml:space="preserve"> PAGEREF _Toc242821311 \h </w:instrText>
+          <w:instrText xml:space="preserve"> PAGEREF _Toc242821862 \h </w:instrText>
         </w:r>
         <w:r>
           <w:rPr>
@@ -337,7 +337,7 @@
           <w14:ligatures w14:val="standardContextual"/>
         </w:rPr>
       </w:pPr>
-      <w:hyperlink w:anchor="_Toc242821312" w:history="1">
+      <w:hyperlink w:anchor="_Toc242821863" w:history="1">
         <w:r>
           <w:rPr>
             <w:rStyle w:val="Hyperlink"/>
@@ -383,7 +383,7 @@
             <w:noProof/>
             <w:webHidden/>
           </w:rPr>
-          <w:instrText xml:space="preserve"> PAGEREF _Toc242821312 \h </w:instrText>
+          <w:instrText xml:space="preserve"> PAGEREF _Toc242821863 \h </w:instrText>
         </w:r>
         <w:r>
           <w:rPr>
@@ -431,7 +431,7 @@
           <w14:ligatures w14:val="standardContextual"/>
         </w:rPr>
       </w:pPr>
-      <w:hyperlink w:anchor="_Toc242821313" w:history="1">
+      <w:hyperlink w:anchor="_Toc242821864" w:history="1">
         <w:r>
           <w:rPr>
             <w:rStyle w:val="Hyperlink"/>
@@ -477,7 +477,7 @@
             <w:noProof/>
             <w:webHidden/>
           </w:rPr>
-          <w:instrText xml:space="preserve"> PAGEREF _Toc242821313 \h </w:instrText>
+          <w:instrText xml:space="preserve"> PAGEREF _Toc242821864 \h </w:instrText>
         </w:r>
         <w:r>
           <w:rPr>
@@ -525,7 +525,7 @@
           <w14:ligatures w14:val="standardContextual"/>
         </w:rPr>
       </w:pPr>
-      <w:hyperlink w:anchor="_Toc242821314" w:history="1">
+      <w:hyperlink w:anchor="_Toc242821865" w:history="1">
         <w:r>
           <w:rPr>
             <w:rStyle w:val="Hyperlink"/>
@@ -571,7 +571,7 @@
             <w:noProof/>
             <w:webHidden/>
           </w:rPr>
-          <w:instrText xml:space="preserve"> PAGEREF _Toc242821314 \h </w:instrText>
+          <w:instrText xml:space="preserve"> PAGEREF _Toc242821865 \h </w:instrText>
         </w:r>
         <w:r>
           <w:rPr>
@@ -619,7 +619,7 @@
           <w14:ligatures w14:val="standardContextual"/>
         </w:rPr>
       </w:pPr>
-      <w:hyperlink w:anchor="_Toc242821315" w:history="1">
+      <w:hyperlink w:anchor="_Toc242821866" w:history="1">
         <w:r>
           <w:rPr>
             <w:rStyle w:val="Hyperlink"/>
@@ -665,7 +665,7 @@
             <w:noProof/>
             <w:webHidden/>
           </w:rPr>
-          <w:instrText xml:space="preserve"> PAGEREF _Toc242821315 \h </w:instrText>
+          <w:instrText xml:space="preserve"> PAGEREF _Toc242821866 \h </w:instrText>
         </w:r>
         <w:r>
           <w:rPr>
@@ -713,7 +713,7 @@
           <w14:ligatures w14:val="standardContextual"/>
         </w:rPr>
       </w:pPr>
-      <w:hyperlink w:anchor="_Toc242821316" w:history="1">
+      <w:hyperlink w:anchor="_Toc242821867" w:history="1">
         <w:r>
           <w:rPr>
             <w:rStyle w:val="Hyperlink"/>
@@ -759,7 +759,7 @@
             <w:noProof/>
             <w:webHidden/>
           </w:rPr>
-          <w:instrText xml:space="preserve"> PAGEREF _Toc242821316 \h </w:instrText>
+          <w:instrText xml:space="preserve"> PAGEREF _Toc242821867 \h </w:instrText>
         </w:r>
         <w:r>
           <w:rPr>
@@ -807,7 +807,7 @@
           <w14:ligatures w14:val="standardContextual"/>
         </w:rPr>
       </w:pPr>
-      <w:hyperlink w:anchor="_Toc242821317" w:history="1">
+      <w:hyperlink w:anchor="_Toc242821868" w:history="1">
         <w:r>
           <w:rPr>
             <w:rStyle w:val="Hyperlink"/>
@@ -853,7 +853,7 @@
             <w:noProof/>
             <w:webHidden/>
           </w:rPr>
-          <w:instrText xml:space="preserve"> PAGEREF _Toc242821317 \h </w:instrText>
+          <w:instrText xml:space="preserve"> PAGEREF _Toc242821868 \h </w:instrText>
         </w:r>
         <w:r>
           <w:rPr>
@@ -901,7 +901,7 @@
           <w14:ligatures w14:val="standardContextual"/>
         </w:rPr>
       </w:pPr>
-      <w:hyperlink w:anchor="_Toc242821318" w:history="1">
+      <w:hyperlink w:anchor="_Toc242821869" w:history="1">
         <w:r>
           <w:rPr>
             <w:rStyle w:val="Hyperlink"/>
@@ -947,7 +947,7 @@
             <w:noProof/>
             <w:webHidden/>
           </w:rPr>
-          <w:instrText xml:space="preserve"> PAGEREF _Toc242821318 \h </w:instrText>
+          <w:instrText xml:space="preserve"> PAGEREF _Toc242821869 \h </w:instrText>
         </w:r>
         <w:r>
           <w:rPr>
@@ -995,7 +995,7 @@
           <w14:ligatures w14:val="standardContextual"/>
         </w:rPr>
       </w:pPr>
-      <w:hyperlink w:anchor="_Toc242821319" w:history="1">
+      <w:hyperlink w:anchor="_Toc242821870" w:history="1">
         <w:r>
           <w:rPr>
             <w:rStyle w:val="Hyperlink"/>
@@ -1041,7 +1041,7 @@
             <w:noProof/>
             <w:webHidden/>
           </w:rPr>
-          <w:instrText xml:space="preserve"> PAGEREF _Toc242821319 \h </w:instrText>
+          <w:instrText xml:space="preserve"> PAGEREF _Toc242821870 \h </w:instrText>
         </w:r>
         <w:r>
           <w:rPr>
@@ -1089,7 +1089,7 @@
           <w14:ligatures w14:val="standardContextual"/>
         </w:rPr>
       </w:pPr>
-      <w:hyperlink w:anchor="_Toc242821320" w:history="1">
+      <w:hyperlink w:anchor="_Toc242821871" w:history="1">
         <w:r>
           <w:rPr>
             <w:rStyle w:val="Hyperlink"/>
@@ -1135,7 +1135,7 @@
             <w:noProof/>
             <w:webHidden/>
           </w:rPr>
-          <w:instrText xml:space="preserve"> PAGEREF _Toc242821320 \h </w:instrText>
+          <w:instrText xml:space="preserve"> PAGEREF _Toc242821871 \h </w:instrText>
         </w:r>
         <w:r>
           <w:rPr>
@@ -1183,7 +1183,7 @@
           <w14:ligatures w14:val="standardContextual"/>
         </w:rPr>
       </w:pPr>
-      <w:hyperlink w:anchor="_Toc242821321" w:history="1">
+      <w:hyperlink w:anchor="_Toc242821872" w:history="1">
         <w:r>
           <w:rPr>
             <w:rStyle w:val="Hyperlink"/>
@@ -1229,7 +1229,7 @@
             <w:noProof/>
             <w:webHidden/>
           </w:rPr>
-          <w:instrText xml:space="preserve"> PAGEREF _Toc242821321 \h </w:instrText>
+          <w:instrText xml:space="preserve"> PAGEREF _Toc242821872 \h </w:instrText>
         </w:r>
         <w:r>
           <w:rPr>
@@ -1277,7 +1277,7 @@
           <w14:ligatures w14:val="standardContextual"/>
         </w:rPr>
       </w:pPr>
-      <w:hyperlink w:anchor="_Toc242821322" w:history="1">
+      <w:hyperlink w:anchor="_Toc242821873" w:history="1">
         <w:r>
           <w:rPr>
             <w:rStyle w:val="Hyperlink"/>
@@ -1323,7 +1323,7 @@
             <w:noProof/>
             <w:webHidden/>
           </w:rPr>
-          <w:instrText xml:space="preserve"> PAGEREF _Toc242821322 \h </w:instrText>
+          <w:instrText xml:space="preserve"> PAGEREF _Toc242821873 \h </w:instrText>
         </w:r>
         <w:r>
           <w:rPr>
@@ -1371,7 +1371,7 @@
           <w14:ligatures w14:val="standardContextual"/>
         </w:rPr>
       </w:pPr>
-      <w:hyperlink w:anchor="_Toc242821323" w:history="1">
+      <w:hyperlink w:anchor="_Toc242821874" w:history="1">
         <w:r>
           <w:rPr>
             <w:rStyle w:val="Hyperlink"/>
@@ -1417,7 +1417,7 @@
             <w:noProof/>
             <w:webHidden/>
           </w:rPr>
-          <w:instrText xml:space="preserve"> PAGEREF _Toc242821323 \h </w:instrText>
+          <w:instrText xml:space="preserve"> PAGEREF _Toc242821874 \h </w:instrText>
         </w:r>
         <w:r>
           <w:rPr>
@@ -1465,7 +1465,7 @@
           <w14:ligatures w14:val="standardContextual"/>
         </w:rPr>
       </w:pPr>
-      <w:hyperlink w:anchor="_Toc242821324" w:history="1">
+      <w:hyperlink w:anchor="_Toc242821875" w:history="1">
         <w:r>
           <w:rPr>
             <w:rStyle w:val="Hyperlink"/>
@@ -1511,7 +1511,7 @@
             <w:noProof/>
             <w:webHidden/>
           </w:rPr>
-          <w:instrText xml:space="preserve"> PAGEREF _Toc242821324 \h </w:instrText>
+          <w:instrText xml:space="preserve"> PAGEREF _Toc242821875 \h </w:instrText>
         </w:r>
         <w:r>
           <w:rPr>
@@ -1559,7 +1559,7 @@
           <w14:ligatures w14:val="standardContextual"/>
         </w:rPr>
       </w:pPr>
-      <w:hyperlink w:anchor="_Toc242821325" w:history="1">
+      <w:hyperlink w:anchor="_Toc242821876" w:history="1">
         <w:r>
           <w:rPr>
             <w:rStyle w:val="Hyperlink"/>
@@ -1605,7 +1605,7 @@
             <w:noProof/>
             <w:webHidden/>
           </w:rPr>
-          <w:instrText xml:space="preserve"> PAGEREF _Toc242821325 \h </w:instrText>
+          <w:instrText xml:space="preserve"> PAGEREF _Toc242821876 \h </w:instrText>
         </w:r>
         <w:r>
           <w:rPr>
@@ -1653,7 +1653,7 @@
           <w14:ligatures w14:val="standardContextual"/>
         </w:rPr>
       </w:pPr>
-      <w:hyperlink w:anchor="_Toc242821326" w:history="1">
+      <w:hyperlink w:anchor="_Toc242821877" w:history="1">
         <w:r>
           <w:rPr>
             <w:rStyle w:val="Hyperlink"/>
@@ -1699,7 +1699,7 @@
             <w:noProof/>
             <w:webHidden/>
           </w:rPr>
-          <w:instrText xml:space="preserve"> PAGEREF _Toc242821326 \h </w:instrText>
+          <w:instrText xml:space="preserve"> PAGEREF _Toc242821877 \h </w:instrText>
         </w:r>
         <w:r>
           <w:rPr>
@@ -1747,7 +1747,7 @@
           <w14:ligatures w14:val="standardContextual"/>
         </w:rPr>
       </w:pPr>
-      <w:hyperlink w:anchor="_Toc242821327" w:history="1">
+      <w:hyperlink w:anchor="_Toc242821878" w:history="1">
         <w:r>
           <w:rPr>
             <w:rStyle w:val="Hyperlink"/>
@@ -1793,7 +1793,7 @@
             <w:noProof/>
             <w:webHidden/>
           </w:rPr>
-          <w:instrText xml:space="preserve"> PAGEREF _Toc242821327 \h </w:instrText>
+          <w:instrText xml:space="preserve"> PAGEREF _Toc242821878 \h </w:instrText>
         </w:r>
         <w:r>
           <w:rPr>
@@ -1841,7 +1841,7 @@
           <w14:ligatures w14:val="standardContextual"/>
         </w:rPr>
       </w:pPr>
-      <w:hyperlink w:anchor="_Toc242821328" w:history="1">
+      <w:hyperlink w:anchor="_Toc242821879" w:history="1">
         <w:r>
           <w:rPr>
             <w:rStyle w:val="Hyperlink"/>
@@ -1887,7 +1887,7 @@
             <w:noProof/>
             <w:webHidden/>
           </w:rPr>
-          <w:instrText xml:space="preserve"> PAGEREF _Toc242821328 \h </w:instrText>
+          <w:instrText xml:space="preserve"> PAGEREF _Toc242821879 \h </w:instrText>
         </w:r>
         <w:r>
           <w:rPr>
@@ -1935,7 +1935,7 @@
           <w14:ligatures w14:val="standardContextual"/>
         </w:rPr>
       </w:pPr>
-      <w:hyperlink w:anchor="_Toc242821329" w:history="1">
+      <w:hyperlink w:anchor="_Toc242821880" w:history="1">
         <w:r>
           <w:rPr>
             <w:rStyle w:val="Hyperlink"/>
@@ -1981,7 +1981,7 @@
             <w:noProof/>
             <w:webHidden/>
           </w:rPr>
-          <w:instrText xml:space="preserve"> PAGEREF _Toc242821329 \h </w:instrText>
+          <w:instrText xml:space="preserve"> PAGEREF _Toc242821880 \h </w:instrText>
         </w:r>
         <w:r>
           <w:rPr>
@@ -2029,7 +2029,7 @@
           <w14:ligatures w14:val="standardContextual"/>
         </w:rPr>
       </w:pPr>
-      <w:hyperlink w:anchor="_Toc242821330" w:history="1">
+      <w:hyperlink w:anchor="_Toc242821881" w:history="1">
         <w:r>
           <w:rPr>
             <w:rStyle w:val="Hyperlink"/>
@@ -2075,7 +2075,7 @@
             <w:noProof/>
             <w:webHidden/>
           </w:rPr>
-          <w:instrText xml:space="preserve"> PAGEREF _Toc242821330 \h </w:instrText>
+          <w:instrText xml:space="preserve"> PAGEREF _Toc242821881 \h </w:instrText>
         </w:r>
         <w:r>
           <w:rPr>
@@ -2123,7 +2123,7 @@
           <w14:ligatures w14:val="standardContextual"/>
         </w:rPr>
       </w:pPr>
-      <w:hyperlink w:anchor="_Toc242821331" w:history="1">
+      <w:hyperlink w:anchor="_Toc242821882" w:history="1">
         <w:r>
           <w:rPr>
             <w:rStyle w:val="Hyperlink"/>
@@ -2169,7 +2169,7 @@
             <w:noProof/>
             <w:webHidden/>
           </w:rPr>
-          <w:instrText xml:space="preserve"> PAGEREF _Toc242821331 \h </w:instrText>
+          <w:instrText xml:space="preserve"> PAGEREF _Toc242821882 \h </w:instrText>
         </w:r>
         <w:r>
           <w:rPr>
@@ -2217,7 +2217,7 @@
           <w14:ligatures w14:val="standardContextual"/>
         </w:rPr>
       </w:pPr>
-      <w:hyperlink w:anchor="_Toc242821332" w:history="1">
+      <w:hyperlink w:anchor="_Toc242821883" w:history="1">
         <w:r>
           <w:rPr>
             <w:rStyle w:val="Hyperlink"/>
@@ -2263,7 +2263,7 @@
             <w:noProof/>
             <w:webHidden/>
           </w:rPr>
-          <w:instrText xml:space="preserve"> PAGEREF _Toc242821332 \h </w:instrText>
+          <w:instrText xml:space="preserve"> PAGEREF _Toc242821883 \h </w:instrText>
         </w:r>
         <w:r>
           <w:rPr>
@@ -2311,7 +2311,7 @@
           <w14:ligatures w14:val="standardContextual"/>
         </w:rPr>
       </w:pPr>
-      <w:hyperlink w:anchor="_Toc242821333" w:history="1">
+      <w:hyperlink w:anchor="_Toc242821884" w:history="1">
         <w:r>
           <w:rPr>
             <w:rStyle w:val="Hyperlink"/>
@@ -2357,7 +2357,7 @@
             <w:noProof/>
             <w:webHidden/>
           </w:rPr>
-          <w:instrText xml:space="preserve"> PAGEREF _Toc242821333 \h </w:instrText>
+          <w:instrText xml:space="preserve"> PAGEREF _Toc242821884 \h </w:instrText>
         </w:r>
         <w:r>
           <w:rPr>
@@ -2405,7 +2405,7 @@
           <w14:ligatures w14:val="standardContextual"/>
         </w:rPr>
       </w:pPr>
-      <w:hyperlink w:anchor="_Toc242821334" w:history="1">
+      <w:hyperlink w:anchor="_Toc242821885" w:history="1">
         <w:r>
           <w:rPr>
             <w:rStyle w:val="Hyperlink"/>
@@ -2451,7 +2451,7 @@
             <w:noProof/>
             <w:webHidden/>
           </w:rPr>
-          <w:instrText xml:space="preserve"> PAGEREF _Toc242821334 \h </w:instrText>
+          <w:instrText xml:space="preserve"> PAGEREF _Toc242821885 \h </w:instrText>
         </w:r>
         <w:r>
           <w:rPr>
@@ -2499,7 +2499,7 @@
           <w14:ligatures w14:val="standardContextual"/>
         </w:rPr>
       </w:pPr>
-      <w:hyperlink w:anchor="_Toc242821335" w:history="1">
+      <w:hyperlink w:anchor="_Toc242821886" w:history="1">
         <w:r>
           <w:rPr>
             <w:rStyle w:val="Hyperlink"/>
@@ -2545,7 +2545,7 @@
             <w:noProof/>
             <w:webHidden/>
           </w:rPr>
-          <w:instrText xml:space="preserve"> PAGEREF _Toc242821335 \h </w:instrText>
+          <w:instrText xml:space="preserve"> PAGEREF _Toc242821886 \h </w:instrText>
         </w:r>
         <w:r>
           <w:rPr>
@@ -2593,7 +2593,7 @@
           <w14:ligatures w14:val="standardContextual"/>
         </w:rPr>
       </w:pPr>
-      <w:hyperlink w:anchor="_Toc242821336" w:history="1">
+      <w:hyperlink w:anchor="_Toc242821887" w:history="1">
         <w:r>
           <w:rPr>
             <w:rStyle w:val="Hyperlink"/>
@@ -2639,7 +2639,7 @@
             <w:noProof/>
             <w:webHidden/>
           </w:rPr>
-          <w:instrText xml:space="preserve"> PAGEREF _Toc242821336 \h </w:instrText>
+          <w:instrText xml:space="preserve"> PAGEREF _Toc242821887 \h </w:instrText>
         </w:r>
         <w:r>
           <w:rPr>
@@ -2687,7 +2687,7 @@
           <w14:ligatures w14:val="standardContextual"/>
         </w:rPr>
       </w:pPr>
-      <w:hyperlink w:anchor="_Toc242821337" w:history="1">
+      <w:hyperlink w:anchor="_Toc242821888" w:history="1">
         <w:r>
           <w:rPr>
             <w:rStyle w:val="Hyperlink"/>
@@ -2733,7 +2733,7 @@
             <w:noProof/>
             <w:webHidden/>
           </w:rPr>
-          <w:instrText xml:space="preserve"> PAGEREF _Toc242821337 \h </w:instrText>
+          <w:instrText xml:space="preserve"> PAGEREF _Toc242821888 \h </w:instrText>
         </w:r>
         <w:r>
           <w:rPr>
@@ -2781,7 +2781,7 @@
           <w14:ligatures w14:val="standardContextual"/>
         </w:rPr>
       </w:pPr>
-      <w:hyperlink w:anchor="_Toc242821338" w:history="1">
+      <w:hyperlink w:anchor="_Toc242821889" w:history="1">
         <w:r>
           <w:rPr>
             <w:rStyle w:val="Hyperlink"/>
@@ -2827,7 +2827,7 @@
             <w:noProof/>
             <w:webHidden/>
           </w:rPr>
-          <w:instrText xml:space="preserve"> PAGEREF _Toc242821338 \h </w:instrText>
+          <w:instrText xml:space="preserve"> PAGEREF _Toc242821889 \h </w:instrText>
         </w:r>
         <w:r>
           <w:rPr>
@@ -2875,7 +2875,7 @@
           <w14:ligatures w14:val="standardContextual"/>
         </w:rPr>
       </w:pPr>
-      <w:hyperlink w:anchor="_Toc242821339" w:history="1">
+      <w:hyperlink w:anchor="_Toc242821890" w:history="1">
         <w:r>
           <w:rPr>
             <w:rStyle w:val="Hyperlink"/>
@@ -2921,7 +2921,7 @@
             <w:noProof/>
             <w:webHidden/>
           </w:rPr>
-          <w:instrText xml:space="preserve"> PAGEREF _Toc242821339 \h </w:instrText>
+          <w:instrText xml:space="preserve"> PAGEREF _Toc242821890 \h </w:instrText>
         </w:r>
         <w:r>
           <w:rPr>
@@ -2969,7 +2969,7 @@
           <w14:ligatures w14:val="standardContextual"/>
         </w:rPr>
       </w:pPr>
-      <w:hyperlink w:anchor="_Toc242821340" w:history="1">
+      <w:hyperlink w:anchor="_Toc242821891" w:history="1">
         <w:r>
           <w:rPr>
             <w:rStyle w:val="Hyperlink"/>
@@ -3015,7 +3015,7 @@
             <w:noProof/>
             <w:webHidden/>
           </w:rPr>
-          <w:instrText xml:space="preserve"> PAGEREF _Toc242821340 \h </w:instrText>
+          <w:instrText xml:space="preserve"> PAGEREF _Toc242821891 \h </w:instrText>
         </w:r>
         <w:r>
           <w:rPr>
@@ -3063,7 +3063,7 @@
           <w14:ligatures w14:val="standardContextual"/>
         </w:rPr>
       </w:pPr>
-      <w:hyperlink w:anchor="_Toc242821341" w:history="1">
+      <w:hyperlink w:anchor="_Toc242821892" w:history="1">
         <w:r>
           <w:rPr>
             <w:rStyle w:val="Hyperlink"/>
@@ -3109,7 +3109,7 @@
             <w:noProof/>
             <w:webHidden/>
           </w:rPr>
-          <w:instrText xml:space="preserve"> PAGEREF _Toc242821341 \h </w:instrText>
+          <w:instrText xml:space="preserve"> PAGEREF _Toc242821892 \h </w:instrText>
         </w:r>
         <w:r>
           <w:rPr>
@@ -3157,7 +3157,7 @@
           <w14:ligatures w14:val="standardContextual"/>
         </w:rPr>
       </w:pPr>
-      <w:hyperlink w:anchor="_Toc242821342" w:history="1">
+      <w:hyperlink w:anchor="_Toc242821893" w:history="1">
         <w:r>
           <w:rPr>
             <w:rStyle w:val="Hyperlink"/>
@@ -3203,7 +3203,7 @@
             <w:noProof/>
             <w:webHidden/>
           </w:rPr>
-          <w:instrText xml:space="preserve"> PAGEREF _Toc242821342 \h </w:instrText>
+          <w:instrText xml:space="preserve"> PAGEREF _Toc242821893 \h </w:instrText>
         </w:r>
         <w:r>
           <w:rPr>
@@ -3251,7 +3251,7 @@
           <w14:ligatures w14:val="standardContextual"/>
         </w:rPr>
       </w:pPr>
-      <w:hyperlink w:anchor="_Toc242821343" w:history="1">
+      <w:hyperlink w:anchor="_Toc242821894" w:history="1">
         <w:r>
           <w:rPr>
             <w:rStyle w:val="Hyperlink"/>
@@ -3297,7 +3297,7 @@
             <w:noProof/>
             <w:webHidden/>
           </w:rPr>
-          <w:instrText xml:space="preserve"> PAGEREF _Toc242821343 \h </w:instrText>
+          <w:instrText xml:space="preserve"> PAGEREF _Toc242821894 \h </w:instrText>
         </w:r>
         <w:r>
           <w:rPr>
@@ -3345,7 +3345,7 @@
           <w14:ligatures w14:val="standardContextual"/>
         </w:rPr>
       </w:pPr>
-      <w:hyperlink w:anchor="_Toc242821344" w:history="1">
+      <w:hyperlink w:anchor="_Toc242821895" w:history="1">
         <w:r>
           <w:rPr>
             <w:rStyle w:val="Hyperlink"/>
@@ -3391,7 +3391,7 @@
             <w:noProof/>
             <w:webHidden/>
           </w:rPr>
-          <w:instrText xml:space="preserve"> PAGEREF _Toc242821344 \h </w:instrText>
+          <w:instrText xml:space="preserve"> PAGEREF _Toc242821895 \h </w:instrText>
         </w:r>
         <w:r>
           <w:rPr>
@@ -3439,7 +3439,7 @@
           <w14:ligatures w14:val="standardContextual"/>
         </w:rPr>
       </w:pPr>
-      <w:hyperlink w:anchor="_Toc242821345" w:history="1">
+      <w:hyperlink w:anchor="_Toc242821896" w:history="1">
         <w:r>
           <w:rPr>
             <w:rStyle w:val="Hyperlink"/>
@@ -3485,7 +3485,7 @@
             <w:noProof/>
             <w:webHidden/>
           </w:rPr>
-          <w:instrText xml:space="preserve"> PAGEREF _Toc242821345 \h </w:instrText>
+          <w:instrText xml:space="preserve"> PAGEREF _Toc242821896 \h </w:instrText>
         </w:r>
         <w:r>
           <w:rPr>
@@ -3533,7 +3533,7 @@
           <w14:ligatures w14:val="standardContextual"/>
         </w:rPr>
       </w:pPr>
-      <w:hyperlink w:anchor="_Toc242821346" w:history="1">
+      <w:hyperlink w:anchor="_Toc242821897" w:history="1">
         <w:r>
           <w:rPr>
             <w:rStyle w:val="Hyperlink"/>
@@ -3579,7 +3579,7 @@
             <w:noProof/>
             <w:webHidden/>
           </w:rPr>
-          <w:instrText xml:space="preserve"> PAGEREF _Toc242821346 \h </w:instrText>
+          <w:instrText xml:space="preserve"> PAGEREF _Toc242821897 \h </w:instrText>
         </w:r>
         <w:r>
           <w:rPr>
@@ -3627,7 +3627,7 @@
           <w14:ligatures w14:val="standardContextual"/>
         </w:rPr>
       </w:pPr>
-      <w:hyperlink w:anchor="_Toc242821347" w:history="1">
+      <w:hyperlink w:anchor="_Toc242821898" w:history="1">
         <w:r>
           <w:rPr>
             <w:rStyle w:val="Hyperlink"/>
@@ -3673,7 +3673,7 @@
             <w:noProof/>
             <w:webHidden/>
           </w:rPr>
-          <w:instrText xml:space="preserve"> PAGEREF _Toc242821347 \h </w:instrText>
+          <w:instrText xml:space="preserve"> PAGEREF _Toc242821898 \h </w:instrText>
         </w:r>
         <w:r>
           <w:rPr>
@@ -3721,7 +3721,7 @@
           <w14:ligatures w14:val="standardContextual"/>
         </w:rPr>
       </w:pPr>
-      <w:hyperlink w:anchor="_Toc242821348" w:history="1">
+      <w:hyperlink w:anchor="_Toc242821899" w:history="1">
         <w:r>
           <w:rPr>
             <w:rStyle w:val="Hyperlink"/>
@@ -3767,7 +3767,7 @@
             <w:noProof/>
             <w:webHidden/>
           </w:rPr>
-          <w:instrText xml:space="preserve"> PAGEREF _Toc242821348 \h </w:instrText>
+          <w:instrText xml:space="preserve"> PAGEREF _Toc242821899 \h </w:instrText>
         </w:r>
         <w:r>
           <w:rPr>
@@ -3815,7 +3815,7 @@
           <w14:ligatures w14:val="standardContextual"/>
         </w:rPr>
       </w:pPr>
-      <w:hyperlink w:anchor="_Toc242821349" w:history="1">
+      <w:hyperlink w:anchor="_Toc242821900" w:history="1">
         <w:r>
           <w:rPr>
             <w:rStyle w:val="Hyperlink"/>
@@ -3861,7 +3861,7 @@
             <w:noProof/>
             <w:webHidden/>
           </w:rPr>
-          <w:instrText xml:space="preserve"> PAGEREF _Toc242821349 \h </w:instrText>
+          <w:instrText xml:space="preserve"> PAGEREF _Toc242821900 \h </w:instrText>
         </w:r>
         <w:r>
           <w:rPr>
@@ -3909,7 +3909,7 @@
           <w14:ligatures w14:val="standardContextual"/>
         </w:rPr>
       </w:pPr>
-      <w:hyperlink w:anchor="_Toc242821350" w:history="1">
+      <w:hyperlink w:anchor="_Toc242821901" w:history="1">
         <w:r>
           <w:rPr>
             <w:rStyle w:val="Hyperlink"/>
@@ -3955,7 +3955,7 @@
             <w:noProof/>
             <w:webHidden/>
           </w:rPr>
-          <w:instrText xml:space="preserve"> PAGEREF _Toc242821350 \h </w:instrText>
+          <w:instrText xml:space="preserve"> PAGEREF _Toc242821901 \h </w:instrText>
         </w:r>
         <w:r>
           <w:rPr>
@@ -4003,7 +4003,7 @@
           <w14:ligatures w14:val="standardContextual"/>
         </w:rPr>
       </w:pPr>
-      <w:hyperlink w:anchor="_Toc242821351" w:history="1">
+      <w:hyperlink w:anchor="_Toc242821902" w:history="1">
         <w:r>
           <w:rPr>
             <w:rStyle w:val="Hyperlink"/>
@@ -4049,7 +4049,7 @@
             <w:noProof/>
             <w:webHidden/>
           </w:rPr>
-          <w:instrText xml:space="preserve"> PAGEREF _Toc242821351 \h </w:instrText>
+          <w:instrText xml:space="preserve"> PAGEREF _Toc242821902 \h </w:instrText>
         </w:r>
         <w:r>
           <w:rPr>
@@ -4097,7 +4097,7 @@
           <w14:ligatures w14:val="standardContextual"/>
         </w:rPr>
       </w:pPr>
-      <w:hyperlink w:anchor="_Toc242821352" w:history="1">
+      <w:hyperlink w:anchor="_Toc242821903" w:history="1">
         <w:r>
           <w:rPr>
             <w:rStyle w:val="Hyperlink"/>
@@ -4143,7 +4143,7 @@
             <w:noProof/>
             <w:webHidden/>
           </w:rPr>
-          <w:instrText xml:space="preserve"> PAGEREF _Toc242821352 \h </w:instrText>
+          <w:instrText xml:space="preserve"> PAGEREF _Toc242821903 \h </w:instrText>
         </w:r>
         <w:r>
           <w:rPr>
@@ -4191,7 +4191,7 @@
           <w14:ligatures w14:val="standardContextual"/>
         </w:rPr>
       </w:pPr>
-      <w:hyperlink w:anchor="_Toc242821353" w:history="1">
+      <w:hyperlink w:anchor="_Toc242821904" w:history="1">
         <w:r>
           <w:rPr>
             <w:rStyle w:val="Hyperlink"/>
@@ -4237,7 +4237,7 @@
             <w:noProof/>
             <w:webHidden/>
           </w:rPr>
-          <w:instrText xml:space="preserve"> PAGEREF _Toc242821353 \h </w:instrText>
+          <w:instrText xml:space="preserve"> PAGEREF _Toc242821904 \h </w:instrText>
         </w:r>
         <w:r>
           <w:rPr>
@@ -4285,7 +4285,7 @@
           <w14:ligatures w14:val="standardContextual"/>
         </w:rPr>
       </w:pPr>
-      <w:hyperlink w:anchor="_Toc242821354" w:history="1">
+      <w:hyperlink w:anchor="_Toc242821905" w:history="1">
         <w:r>
           <w:rPr>
             <w:rStyle w:val="Hyperlink"/>
@@ -4331,7 +4331,7 @@
             <w:noProof/>
             <w:webHidden/>
           </w:rPr>
-          <w:instrText xml:space="preserve"> PAGEREF _Toc242821354 \h </w:instrText>
+          <w:instrText xml:space="preserve"> PAGEREF _Toc242821905 \h </w:instrText>
         </w:r>
         <w:r>
           <w:rPr>
@@ -4379,7 +4379,7 @@
           <w14:ligatures w14:val="standardContextual"/>
         </w:rPr>
       </w:pPr>
-      <w:hyperlink w:anchor="_Toc242821355" w:history="1">
+      <w:hyperlink w:anchor="_Toc242821906" w:history="1">
         <w:r>
           <w:rPr>
             <w:rStyle w:val="Hyperlink"/>
@@ -4425,7 +4425,7 @@
             <w:noProof/>
             <w:webHidden/>
           </w:rPr>
-          <w:instrText xml:space="preserve"> PAGEREF _Toc242821355 \h </w:instrText>
+          <w:instrText xml:space="preserve"> PAGEREF _Toc242821906 \h </w:instrText>
         </w:r>
         <w:r>
           <w:rPr>
@@ -4473,7 +4473,7 @@
           <w14:ligatures w14:val="standardContextual"/>
         </w:rPr>
       </w:pPr>
-      <w:hyperlink w:anchor="_Toc242821356" w:history="1">
+      <w:hyperlink w:anchor="_Toc242821907" w:history="1">
         <w:r>
           <w:rPr>
             <w:rStyle w:val="Hyperlink"/>
@@ -4519,7 +4519,7 @@
             <w:noProof/>
             <w:webHidden/>
           </w:rPr>
-          <w:instrText xml:space="preserve"> PAGEREF _Toc242821356 \h </w:instrText>
+          <w:instrText xml:space="preserve"> PAGEREF _Toc242821907 \h </w:instrText>
         </w:r>
         <w:r>
           <w:rPr>
@@ -4559,7 +4559,7 @@
       <w:pPr>
         <w:pStyle w:val="Heading1"/>
       </w:pPr>
-      <w:bookmarkStart w:id="0" w:name="_Toc242821310"/>
+      <w:bookmarkStart w:id="0" w:name="_Toc242821861"/>
       <w:r>
         <w:lastRenderedPageBreak/>
         <w:t>Overview</w:t>
@@ -4716,7 +4716,7 @@
       <w:pPr>
         <w:pStyle w:val="Heading1"/>
       </w:pPr>
-      <w:bookmarkStart w:id="1" w:name="_Toc242821311"/>
+      <w:bookmarkStart w:id="1" w:name="_Toc242821862"/>
       <w:r>
         <w:lastRenderedPageBreak/>
         <w:t>Installation</w:t>
@@ -4759,7 +4759,7 @@
       <w:pPr>
         <w:pStyle w:val="Heading2"/>
       </w:pPr>
-      <w:bookmarkStart w:id="2" w:name="_Toc242821312"/>
+      <w:bookmarkStart w:id="2" w:name="_Toc242821863"/>
       <w:r>
         <w:t>Automatic installation</w:t>
       </w:r>
@@ -5108,7 +5108,7 @@
       <w:pPr>
         <w:pStyle w:val="Heading2"/>
       </w:pPr>
-      <w:bookmarkStart w:id="3" w:name="_Toc242821313"/>
+      <w:bookmarkStart w:id="3" w:name="_Toc242821864"/>
       <w:r>
         <w:t>Manual installation</w:t>
       </w:r>
@@ -5271,7 +5271,7 @@
       <w:pPr>
         <w:pStyle w:val="Heading2"/>
       </w:pPr>
-      <w:bookmarkStart w:id="4" w:name="_Toc242821314"/>
+      <w:bookmarkStart w:id="4" w:name="_Toc242821865"/>
       <w:r>
         <w:lastRenderedPageBreak/>
         <w:t>Testing the installation</w:t>
@@ -5481,7 +5481,7 @@
       <w:pPr>
         <w:pStyle w:val="Heading2"/>
       </w:pPr>
-      <w:bookmarkStart w:id="5" w:name="_Toc242821315"/>
+      <w:bookmarkStart w:id="5" w:name="_Toc242821866"/>
       <w:r>
         <w:t>GPU support (if you have an NVIDIA GPU)</w:t>
       </w:r>
@@ -5566,7 +5566,7 @@
         <w:t>GPU: ready</w:t>
       </w:r>
       <w:r>
-        <w:t>, or the reason why the GPU cannot be used; then the program runs on the CPU. If the GPU still cannot be used after the install, the message also gives the command that removes the installed packages. The NVIDIA driver is part of the operating system, so the installer never installs it.</w:t>
+        <w:t>, or the reason why the GPU cannot be used; then the program runs on the CPU. If the GPU still cannot be used after the install, the message also gives the command that removes the installed packages. The NVIDIA driver belongs to the operating system and needs administrator rights, so the installer never installs or updates it; update it yourself if the installer says so.</w:t>
       </w:r>
     </w:p>
     <w:p>
@@ -5754,6 +5754,7 @@
                 <w:color w:val="1A1A1A"/>
                 <w:sz w:val="18"/>
               </w:rPr>
+              <w:lastRenderedPageBreak/>
               <w:t>python -m pip install -U "pip&lt;25"</w:t>
             </w:r>
           </w:p>
@@ -5788,7 +5789,6 @@
         <w:rPr>
           <w:b/>
         </w:rPr>
-        <w:lastRenderedPageBreak/>
         <w:t>The check.</w:t>
       </w:r>
       <w:r>
@@ -5914,7 +5914,7 @@
       <w:pPr>
         <w:pStyle w:val="Heading2"/>
       </w:pPr>
-      <w:bookmarkStart w:id="6" w:name="_Toc242821316"/>
+      <w:bookmarkStart w:id="6" w:name="_Toc242821867"/>
       <w:r>
         <w:t>Pre-compiled kernels</w:t>
       </w:r>
@@ -5995,7 +5995,7 @@
       <w:pPr>
         <w:pStyle w:val="Heading1"/>
       </w:pPr>
-      <w:bookmarkStart w:id="7" w:name="_Toc242821317"/>
+      <w:bookmarkStart w:id="7" w:name="_Toc242821868"/>
       <w:r>
         <w:lastRenderedPageBreak/>
         <w:t>Input Handling</w:t>
@@ -6472,7 +6472,7 @@
       <w:pPr>
         <w:pStyle w:val="Heading2"/>
       </w:pPr>
-      <w:bookmarkStart w:id="8" w:name="_Toc242821318"/>
+      <w:bookmarkStart w:id="8" w:name="_Toc242821869"/>
       <w:r>
         <w:t>External Data Sources</w:t>
       </w:r>
@@ -7082,7 +7082,7 @@
       <w:pPr>
         <w:pStyle w:val="Heading2"/>
       </w:pPr>
-      <w:bookmarkStart w:id="9" w:name="_Toc242821319"/>
+      <w:bookmarkStart w:id="9" w:name="_Toc242821870"/>
       <w:r>
         <w:lastRenderedPageBreak/>
         <w:t>Event Selection (Watcher)</w:t>
@@ -7588,7 +7588,7 @@
       <w:pPr>
         <w:pStyle w:val="Heading1"/>
       </w:pPr>
-      <w:bookmarkStart w:id="10" w:name="_Toc242821320"/>
+      <w:bookmarkStart w:id="10" w:name="_Toc242821871"/>
       <w:r>
         <w:lastRenderedPageBreak/>
         <w:t>Station and Signal Selection</w:t>
@@ -7718,7 +7718,7 @@
       <w:pPr>
         <w:pStyle w:val="Heading2"/>
       </w:pPr>
-      <w:bookmarkStart w:id="11" w:name="_Toc242821321"/>
+      <w:bookmarkStart w:id="11" w:name="_Toc242821872"/>
       <w:r>
         <w:t>Step 1 — Retrieve the event</w:t>
       </w:r>
@@ -7736,7 +7736,7 @@
       <w:pPr>
         <w:pStyle w:val="Heading2"/>
       </w:pPr>
-      <w:bookmarkStart w:id="12" w:name="_Toc242821322"/>
+      <w:bookmarkStart w:id="12" w:name="_Toc242821873"/>
       <w:r>
         <w:t>Step 2 — Retrieve the station metadata</w:t>
       </w:r>
@@ -8506,7 +8506,7 @@
       <w:pPr>
         <w:pStyle w:val="Heading2"/>
       </w:pPr>
-      <w:bookmarkStart w:id="13" w:name="_Toc242821323"/>
+      <w:bookmarkStart w:id="13" w:name="_Toc242821874"/>
       <w:r>
         <w:t>Step 3 — Download the waveforms</w:t>
       </w:r>
@@ -8524,7 +8524,7 @@
       <w:pPr>
         <w:pStyle w:val="Heading2"/>
       </w:pPr>
-      <w:bookmarkStart w:id="14" w:name="_Toc242821324"/>
+      <w:bookmarkStart w:id="14" w:name="_Toc242821875"/>
       <w:r>
         <w:t>Step 4 — Quality checks and instrument correction</w:t>
       </w:r>
@@ -9073,7 +9073,7 @@
       <w:pPr>
         <w:pStyle w:val="Heading2"/>
       </w:pPr>
-      <w:bookmarkStart w:id="15" w:name="_Toc242821325"/>
+      <w:bookmarkStart w:id="15" w:name="_Toc242821876"/>
       <w:r>
         <w:t>Step 5 — Azimuthal selection</w:t>
       </w:r>
@@ -9256,7 +9256,7 @@
       <w:pPr>
         <w:pStyle w:val="Heading1"/>
       </w:pPr>
-      <w:bookmarkStart w:id="16" w:name="_Toc242821326"/>
+      <w:bookmarkStart w:id="16" w:name="_Toc242821877"/>
       <w:r>
         <w:lastRenderedPageBreak/>
         <w:t>Computation Configuration</w:t>
@@ -9340,7 +9340,7 @@
       <w:pPr>
         <w:pStyle w:val="Heading2"/>
       </w:pPr>
-      <w:bookmarkStart w:id="17" w:name="_Toc242821327"/>
+      <w:bookmarkStart w:id="17" w:name="_Toc242821878"/>
       <w:r>
         <w:t>Green's Functions</w:t>
       </w:r>
@@ -9350,7 +9350,7 @@
       <w:pPr>
         <w:pStyle w:val="Heading3"/>
       </w:pPr>
-      <w:bookmarkStart w:id="18" w:name="_Toc242821328"/>
+      <w:bookmarkStart w:id="18" w:name="_Toc242821879"/>
       <w:r>
         <w:t>Regional velocity models</w:t>
       </w:r>
@@ -9535,7 +9535,7 @@
       <w:pPr>
         <w:pStyle w:val="Heading3"/>
       </w:pPr>
-      <w:bookmarkStart w:id="19" w:name="_Toc242821329"/>
+      <w:bookmarkStart w:id="19" w:name="_Toc242821880"/>
       <w:r>
         <w:t>Source grid</w:t>
       </w:r>
@@ -9993,7 +9993,7 @@
       <w:pPr>
         <w:pStyle w:val="Heading3"/>
       </w:pPr>
-      <w:bookmarkStart w:id="20" w:name="_Toc242821330"/>
+      <w:bookmarkStart w:id="20" w:name="_Toc242821881"/>
       <w:r>
         <w:t>Frequency content</w:t>
       </w:r>
@@ -10116,7 +10116,7 @@
       <w:pPr>
         <w:pStyle w:val="Heading2"/>
       </w:pPr>
-      <w:bookmarkStart w:id="21" w:name="_Toc242821331"/>
+      <w:bookmarkStart w:id="21" w:name="_Toc242821882"/>
       <w:r>
         <w:lastRenderedPageBreak/>
         <w:t>Inversion Parameters</w:t>
@@ -10135,7 +10135,7 @@
       <w:pPr>
         <w:pStyle w:val="Heading3"/>
       </w:pPr>
-      <w:bookmarkStart w:id="22" w:name="_Toc242821332"/>
+      <w:bookmarkStart w:id="22" w:name="_Toc242821883"/>
       <w:r>
         <w:t>Frequency band</w:t>
       </w:r>
@@ -10300,7 +10300,7 @@
       <w:pPr>
         <w:pStyle w:val="Heading3"/>
       </w:pPr>
-      <w:bookmarkStart w:id="23" w:name="_Toc242821333"/>
+      <w:bookmarkStart w:id="23" w:name="_Toc242821884"/>
       <w:r>
         <w:t>Waveform window</w:t>
       </w:r>
@@ -10485,7 +10485,7 @@
       <w:pPr>
         <w:pStyle w:val="Heading3"/>
       </w:pPr>
-      <w:bookmarkStart w:id="24" w:name="_Toc242821334"/>
+      <w:bookmarkStart w:id="24" w:name="_Toc242821885"/>
       <w:r>
         <w:lastRenderedPageBreak/>
         <w:t>Centroid time search</w:t>
@@ -10629,7 +10629,7 @@
       <w:pPr>
         <w:pStyle w:val="Heading3"/>
       </w:pPr>
-      <w:bookmarkStart w:id="25" w:name="_Toc242821335"/>
+      <w:bookmarkStart w:id="25" w:name="_Toc242821886"/>
       <w:r>
         <w:t>Source time function</w:t>
       </w:r>
@@ -10758,7 +10758,7 @@
       <w:pPr>
         <w:pStyle w:val="Heading3"/>
       </w:pPr>
-      <w:bookmarkStart w:id="26" w:name="_Toc242821336"/>
+      <w:bookmarkStart w:id="26" w:name="_Toc242821887"/>
       <w:r>
         <w:t>Deviatoric and full moment tensor</w:t>
       </w:r>
@@ -10925,7 +10925,7 @@
       <w:pPr>
         <w:pStyle w:val="Heading2"/>
       </w:pPr>
-      <w:bookmarkStart w:id="27" w:name="_Toc242821337"/>
+      <w:bookmarkStart w:id="27" w:name="_Toc242821888"/>
       <w:r>
         <w:lastRenderedPageBreak/>
         <w:t>Bayesian Bootstrap</w:t>
@@ -11592,7 +11592,7 @@
       <w:pPr>
         <w:pStyle w:val="Heading1"/>
       </w:pPr>
-      <w:bookmarkStart w:id="28" w:name="_Toc242821338"/>
+      <w:bookmarkStart w:id="28" w:name="_Toc242821889"/>
       <w:r>
         <w:lastRenderedPageBreak/>
         <w:t>Outputs</w:t>
@@ -11927,7 +11927,7 @@
       <w:pPr>
         <w:pStyle w:val="Heading2"/>
       </w:pPr>
-      <w:bookmarkStart w:id="29" w:name="_Toc242821339"/>
+      <w:bookmarkStart w:id="29" w:name="_Toc242821890"/>
       <w:r>
         <w:t>Result files</w:t>
       </w:r>
@@ -12782,7 +12782,7 @@
       <w:pPr>
         <w:pStyle w:val="Heading2"/>
       </w:pPr>
-      <w:bookmarkStart w:id="30" w:name="_Toc242821340"/>
+      <w:bookmarkStart w:id="30" w:name="_Toc242821891"/>
       <w:r>
         <w:t>Figures</w:t>
       </w:r>
@@ -14031,7 +14031,7 @@
       <w:pPr>
         <w:pStyle w:val="Heading2"/>
       </w:pPr>
-      <w:bookmarkStart w:id="31" w:name="_Toc242821341"/>
+      <w:bookmarkStart w:id="31" w:name="_Toc242821892"/>
       <w:r>
         <w:t>Web pages</w:t>
       </w:r>
@@ -14459,7 +14459,7 @@
       <w:pPr>
         <w:pStyle w:val="Heading2"/>
       </w:pPr>
-      <w:bookmarkStart w:id="32" w:name="_Toc242821342"/>
+      <w:bookmarkStart w:id="32" w:name="_Toc242821893"/>
       <w:r>
         <w:t>Log</w:t>
       </w:r>
@@ -14477,7 +14477,7 @@
       <w:pPr>
         <w:pStyle w:val="Heading1"/>
       </w:pPr>
-      <w:bookmarkStart w:id="33" w:name="_Toc242821343"/>
+      <w:bookmarkStart w:id="33" w:name="_Toc242821894"/>
       <w:r>
         <w:lastRenderedPageBreak/>
         <w:t>Other Settings</w:t>
@@ -15367,7 +15367,7 @@
       <w:pPr>
         <w:pStyle w:val="Heading1"/>
       </w:pPr>
-      <w:bookmarkStart w:id="34" w:name="_Toc242821344"/>
+      <w:bookmarkStart w:id="34" w:name="_Toc242821895"/>
       <w:r>
         <w:lastRenderedPageBreak/>
         <w:t>Usage</w:t>
@@ -15751,7 +15751,7 @@
       <w:pPr>
         <w:pStyle w:val="Heading2"/>
       </w:pPr>
-      <w:bookmarkStart w:id="35" w:name="_Toc242821345"/>
+      <w:bookmarkStart w:id="35" w:name="_Toc242821896"/>
       <w:r>
         <w:t>Single event (-e)</w:t>
       </w:r>
@@ -16040,7 +16040,7 @@
       <w:pPr>
         <w:pStyle w:val="Heading2"/>
       </w:pPr>
-      <w:bookmarkStart w:id="36" w:name="_Toc242821346"/>
+      <w:bookmarkStart w:id="36" w:name="_Toc242821897"/>
       <w:r>
         <w:lastRenderedPageBreak/>
         <w:t>Event file (--event-file)</w:t>
@@ -16379,7 +16379,7 @@
       <w:pPr>
         <w:pStyle w:val="Heading2"/>
       </w:pPr>
-      <w:bookmarkStart w:id="37" w:name="_Toc242821347"/>
+      <w:bookmarkStart w:id="37" w:name="_Toc242821898"/>
       <w:r>
         <w:t>QuakeML file (--event-xml)</w:t>
       </w:r>
@@ -16446,7 +16446,7 @@
       <w:pPr>
         <w:pStyle w:val="Heading2"/>
       </w:pPr>
-      <w:bookmarkStart w:id="38" w:name="_Toc242821348"/>
+      <w:bookmarkStart w:id="38" w:name="_Toc242821899"/>
       <w:r>
         <w:t>Datetime range (-d)</w:t>
       </w:r>
@@ -16525,7 +16525,7 @@
       <w:pPr>
         <w:pStyle w:val="Heading2"/>
       </w:pPr>
-      <w:bookmarkStart w:id="39" w:name="_Toc242821349"/>
+      <w:bookmarkStart w:id="39" w:name="_Toc242821900"/>
       <w:r>
         <w:lastRenderedPageBreak/>
         <w:t>Real time (--real-time)</w:t>
@@ -16686,7 +16686,7 @@
       <w:pPr>
         <w:pStyle w:val="Heading2"/>
       </w:pPr>
-      <w:bookmarkStart w:id="40" w:name="_Toc242821350"/>
+      <w:bookmarkStart w:id="40" w:name="_Toc242821901"/>
       <w:r>
         <w:t>Revise (--revise)</w:t>
       </w:r>
@@ -17677,7 +17677,7 @@
       <w:pPr>
         <w:pStyle w:val="Heading2"/>
       </w:pPr>
-      <w:bookmarkStart w:id="41" w:name="_Toc242821351"/>
+      <w:bookmarkStart w:id="41" w:name="_Toc242821902"/>
       <w:r>
         <w:t>Web pages (--home)</w:t>
       </w:r>
@@ -17868,7 +17868,7 @@
       <w:pPr>
         <w:pStyle w:val="Heading2"/>
       </w:pPr>
-      <w:bookmarkStart w:id="42" w:name="_Toc242821352"/>
+      <w:bookmarkStart w:id="42" w:name="_Toc242821903"/>
       <w:r>
         <w:t>PPSD tool (for ppsdoffline)</w:t>
       </w:r>
@@ -17985,7 +17985,7 @@
       <w:pPr>
         <w:pStyle w:val="Heading2"/>
       </w:pPr>
-      <w:bookmarkStart w:id="43" w:name="_Toc242821353"/>
+      <w:bookmarkStart w:id="43" w:name="_Toc242821904"/>
       <w:r>
         <w:t>Runtime Overrides</w:t>
       </w:r>
@@ -19451,7 +19451,7 @@
       <w:pPr>
         <w:pStyle w:val="Heading2"/>
       </w:pPr>
-      <w:bookmarkStart w:id="44" w:name="_Toc242821354"/>
+      <w:bookmarkStart w:id="44" w:name="_Toc242821905"/>
       <w:r>
         <w:t>Operational Notes</w:t>
       </w:r>
@@ -19793,7 +19793,7 @@
       <w:pPr>
         <w:pStyle w:val="Heading1"/>
       </w:pPr>
-      <w:bookmarkStart w:id="45" w:name="_Toc242821355"/>
+      <w:bookmarkStart w:id="45" w:name="_Toc242821906"/>
       <w:r>
         <w:lastRenderedPageBreak/>
         <w:t>References</w:t>
@@ -19834,7 +19834,7 @@
       <w:pPr>
         <w:pStyle w:val="Heading1"/>
       </w:pPr>
-      <w:bookmarkStart w:id="46" w:name="_Toc242821356"/>
+      <w:bookmarkStart w:id="46" w:name="_Toc242821907"/>
       <w:r>
         <w:lastRenderedPageBreak/>
         <w:t>Acknowledgments</w:t>

</xml_diff>

<commit_message>
Use the mean for the moment tensor and the ensemble statistics; remove the trace correction; update the manual
</commit_message>
<xml_diff>
--- a/docs/GisolaBaBoo_User_Manual.docx
+++ b/docs/GisolaBaBoo_User_Manual.docx
@@ -149,7 +149,7 @@
       <w:r>
         <w:fldChar w:fldCharType="separate"/>
       </w:r>
-      <w:hyperlink w:anchor="_Toc242821861" w:history="1">
+      <w:hyperlink w:anchor="_Toc242972848" w:history="1">
         <w:r>
           <w:rPr>
             <w:rStyle w:val="Hyperlink"/>
@@ -195,7 +195,7 @@
             <w:noProof/>
             <w:webHidden/>
           </w:rPr>
-          <w:instrText xml:space="preserve"> PAGEREF _Toc242821861 \h </w:instrText>
+          <w:instrText xml:space="preserve"> PAGEREF _Toc242972848 \h </w:instrText>
         </w:r>
         <w:r>
           <w:rPr>
@@ -243,7 +243,7 @@
           <w14:ligatures w14:val="standardContextual"/>
         </w:rPr>
       </w:pPr>
-      <w:hyperlink w:anchor="_Toc242821862" w:history="1">
+      <w:hyperlink w:anchor="_Toc242972849" w:history="1">
         <w:r>
           <w:rPr>
             <w:rStyle w:val="Hyperlink"/>
@@ -289,7 +289,7 @@
             <w:noProof/>
             <w:webHidden/>
           </w:rPr>
-          <w:instrText xml:space="preserve"> PAGEREF _Toc242821862 \h </w:instrText>
+          <w:instrText xml:space="preserve"> PAGEREF _Toc242972849 \h </w:instrText>
         </w:r>
         <w:r>
           <w:rPr>
@@ -337,7 +337,7 @@
           <w14:ligatures w14:val="standardContextual"/>
         </w:rPr>
       </w:pPr>
-      <w:hyperlink w:anchor="_Toc242821863" w:history="1">
+      <w:hyperlink w:anchor="_Toc242972850" w:history="1">
         <w:r>
           <w:rPr>
             <w:rStyle w:val="Hyperlink"/>
@@ -383,7 +383,7 @@
             <w:noProof/>
             <w:webHidden/>
           </w:rPr>
-          <w:instrText xml:space="preserve"> PAGEREF _Toc242821863 \h </w:instrText>
+          <w:instrText xml:space="preserve"> PAGEREF _Toc242972850 \h </w:instrText>
         </w:r>
         <w:r>
           <w:rPr>
@@ -431,7 +431,7 @@
           <w14:ligatures w14:val="standardContextual"/>
         </w:rPr>
       </w:pPr>
-      <w:hyperlink w:anchor="_Toc242821864" w:history="1">
+      <w:hyperlink w:anchor="_Toc242972851" w:history="1">
         <w:r>
           <w:rPr>
             <w:rStyle w:val="Hyperlink"/>
@@ -477,7 +477,7 @@
             <w:noProof/>
             <w:webHidden/>
           </w:rPr>
-          <w:instrText xml:space="preserve"> PAGEREF _Toc242821864 \h </w:instrText>
+          <w:instrText xml:space="preserve"> PAGEREF _Toc242972851 \h </w:instrText>
         </w:r>
         <w:r>
           <w:rPr>
@@ -525,7 +525,7 @@
           <w14:ligatures w14:val="standardContextual"/>
         </w:rPr>
       </w:pPr>
-      <w:hyperlink w:anchor="_Toc242821865" w:history="1">
+      <w:hyperlink w:anchor="_Toc242972852" w:history="1">
         <w:r>
           <w:rPr>
             <w:rStyle w:val="Hyperlink"/>
@@ -571,7 +571,7 @@
             <w:noProof/>
             <w:webHidden/>
           </w:rPr>
-          <w:instrText xml:space="preserve"> PAGEREF _Toc242821865 \h </w:instrText>
+          <w:instrText xml:space="preserve"> PAGEREF _Toc242972852 \h </w:instrText>
         </w:r>
         <w:r>
           <w:rPr>
@@ -619,7 +619,7 @@
           <w14:ligatures w14:val="standardContextual"/>
         </w:rPr>
       </w:pPr>
-      <w:hyperlink w:anchor="_Toc242821866" w:history="1">
+      <w:hyperlink w:anchor="_Toc242972853" w:history="1">
         <w:r>
           <w:rPr>
             <w:rStyle w:val="Hyperlink"/>
@@ -665,7 +665,7 @@
             <w:noProof/>
             <w:webHidden/>
           </w:rPr>
-          <w:instrText xml:space="preserve"> PAGEREF _Toc242821866 \h </w:instrText>
+          <w:instrText xml:space="preserve"> PAGEREF _Toc242972853 \h </w:instrText>
         </w:r>
         <w:r>
           <w:rPr>
@@ -713,7 +713,7 @@
           <w14:ligatures w14:val="standardContextual"/>
         </w:rPr>
       </w:pPr>
-      <w:hyperlink w:anchor="_Toc242821867" w:history="1">
+      <w:hyperlink w:anchor="_Toc242972854" w:history="1">
         <w:r>
           <w:rPr>
             <w:rStyle w:val="Hyperlink"/>
@@ -759,7 +759,7 @@
             <w:noProof/>
             <w:webHidden/>
           </w:rPr>
-          <w:instrText xml:space="preserve"> PAGEREF _Toc242821867 \h </w:instrText>
+          <w:instrText xml:space="preserve"> PAGEREF _Toc242972854 \h </w:instrText>
         </w:r>
         <w:r>
           <w:rPr>
@@ -807,7 +807,7 @@
           <w14:ligatures w14:val="standardContextual"/>
         </w:rPr>
       </w:pPr>
-      <w:hyperlink w:anchor="_Toc242821868" w:history="1">
+      <w:hyperlink w:anchor="_Toc242972855" w:history="1">
         <w:r>
           <w:rPr>
             <w:rStyle w:val="Hyperlink"/>
@@ -853,7 +853,7 @@
             <w:noProof/>
             <w:webHidden/>
           </w:rPr>
-          <w:instrText xml:space="preserve"> PAGEREF _Toc242821868 \h </w:instrText>
+          <w:instrText xml:space="preserve"> PAGEREF _Toc242972855 \h </w:instrText>
         </w:r>
         <w:r>
           <w:rPr>
@@ -901,7 +901,7 @@
           <w14:ligatures w14:val="standardContextual"/>
         </w:rPr>
       </w:pPr>
-      <w:hyperlink w:anchor="_Toc242821869" w:history="1">
+      <w:hyperlink w:anchor="_Toc242972856" w:history="1">
         <w:r>
           <w:rPr>
             <w:rStyle w:val="Hyperlink"/>
@@ -947,7 +947,7 @@
             <w:noProof/>
             <w:webHidden/>
           </w:rPr>
-          <w:instrText xml:space="preserve"> PAGEREF _Toc242821869 \h </w:instrText>
+          <w:instrText xml:space="preserve"> PAGEREF _Toc242972856 \h </w:instrText>
         </w:r>
         <w:r>
           <w:rPr>
@@ -995,7 +995,7 @@
           <w14:ligatures w14:val="standardContextual"/>
         </w:rPr>
       </w:pPr>
-      <w:hyperlink w:anchor="_Toc242821870" w:history="1">
+      <w:hyperlink w:anchor="_Toc242972857" w:history="1">
         <w:r>
           <w:rPr>
             <w:rStyle w:val="Hyperlink"/>
@@ -1041,7 +1041,7 @@
             <w:noProof/>
             <w:webHidden/>
           </w:rPr>
-          <w:instrText xml:space="preserve"> PAGEREF _Toc242821870 \h </w:instrText>
+          <w:instrText xml:space="preserve"> PAGEREF _Toc242972857 \h </w:instrText>
         </w:r>
         <w:r>
           <w:rPr>
@@ -1089,7 +1089,7 @@
           <w14:ligatures w14:val="standardContextual"/>
         </w:rPr>
       </w:pPr>
-      <w:hyperlink w:anchor="_Toc242821871" w:history="1">
+      <w:hyperlink w:anchor="_Toc242972858" w:history="1">
         <w:r>
           <w:rPr>
             <w:rStyle w:val="Hyperlink"/>
@@ -1135,7 +1135,7 @@
             <w:noProof/>
             <w:webHidden/>
           </w:rPr>
-          <w:instrText xml:space="preserve"> PAGEREF _Toc242821871 \h </w:instrText>
+          <w:instrText xml:space="preserve"> PAGEREF _Toc242972858 \h </w:instrText>
         </w:r>
         <w:r>
           <w:rPr>
@@ -1183,7 +1183,7 @@
           <w14:ligatures w14:val="standardContextual"/>
         </w:rPr>
       </w:pPr>
-      <w:hyperlink w:anchor="_Toc242821872" w:history="1">
+      <w:hyperlink w:anchor="_Toc242972859" w:history="1">
         <w:r>
           <w:rPr>
             <w:rStyle w:val="Hyperlink"/>
@@ -1229,7 +1229,7 @@
             <w:noProof/>
             <w:webHidden/>
           </w:rPr>
-          <w:instrText xml:space="preserve"> PAGEREF _Toc242821872 \h </w:instrText>
+          <w:instrText xml:space="preserve"> PAGEREF _Toc242972859 \h </w:instrText>
         </w:r>
         <w:r>
           <w:rPr>
@@ -1277,7 +1277,7 @@
           <w14:ligatures w14:val="standardContextual"/>
         </w:rPr>
       </w:pPr>
-      <w:hyperlink w:anchor="_Toc242821873" w:history="1">
+      <w:hyperlink w:anchor="_Toc242972860" w:history="1">
         <w:r>
           <w:rPr>
             <w:rStyle w:val="Hyperlink"/>
@@ -1323,7 +1323,7 @@
             <w:noProof/>
             <w:webHidden/>
           </w:rPr>
-          <w:instrText xml:space="preserve"> PAGEREF _Toc242821873 \h </w:instrText>
+          <w:instrText xml:space="preserve"> PAGEREF _Toc242972860 \h </w:instrText>
         </w:r>
         <w:r>
           <w:rPr>
@@ -1371,7 +1371,7 @@
           <w14:ligatures w14:val="standardContextual"/>
         </w:rPr>
       </w:pPr>
-      <w:hyperlink w:anchor="_Toc242821874" w:history="1">
+      <w:hyperlink w:anchor="_Toc242972861" w:history="1">
         <w:r>
           <w:rPr>
             <w:rStyle w:val="Hyperlink"/>
@@ -1417,7 +1417,7 @@
             <w:noProof/>
             <w:webHidden/>
           </w:rPr>
-          <w:instrText xml:space="preserve"> PAGEREF _Toc242821874 \h </w:instrText>
+          <w:instrText xml:space="preserve"> PAGEREF _Toc242972861 \h </w:instrText>
         </w:r>
         <w:r>
           <w:rPr>
@@ -1465,7 +1465,7 @@
           <w14:ligatures w14:val="standardContextual"/>
         </w:rPr>
       </w:pPr>
-      <w:hyperlink w:anchor="_Toc242821875" w:history="1">
+      <w:hyperlink w:anchor="_Toc242972862" w:history="1">
         <w:r>
           <w:rPr>
             <w:rStyle w:val="Hyperlink"/>
@@ -1511,7 +1511,7 @@
             <w:noProof/>
             <w:webHidden/>
           </w:rPr>
-          <w:instrText xml:space="preserve"> PAGEREF _Toc242821875 \h </w:instrText>
+          <w:instrText xml:space="preserve"> PAGEREF _Toc242972862 \h </w:instrText>
         </w:r>
         <w:r>
           <w:rPr>
@@ -1559,7 +1559,7 @@
           <w14:ligatures w14:val="standardContextual"/>
         </w:rPr>
       </w:pPr>
-      <w:hyperlink w:anchor="_Toc242821876" w:history="1">
+      <w:hyperlink w:anchor="_Toc242972863" w:history="1">
         <w:r>
           <w:rPr>
             <w:rStyle w:val="Hyperlink"/>
@@ -1605,7 +1605,7 @@
             <w:noProof/>
             <w:webHidden/>
           </w:rPr>
-          <w:instrText xml:space="preserve"> PAGEREF _Toc242821876 \h </w:instrText>
+          <w:instrText xml:space="preserve"> PAGEREF _Toc242972863 \h </w:instrText>
         </w:r>
         <w:r>
           <w:rPr>
@@ -1653,7 +1653,7 @@
           <w14:ligatures w14:val="standardContextual"/>
         </w:rPr>
       </w:pPr>
-      <w:hyperlink w:anchor="_Toc242821877" w:history="1">
+      <w:hyperlink w:anchor="_Toc242972864" w:history="1">
         <w:r>
           <w:rPr>
             <w:rStyle w:val="Hyperlink"/>
@@ -1699,7 +1699,7 @@
             <w:noProof/>
             <w:webHidden/>
           </w:rPr>
-          <w:instrText xml:space="preserve"> PAGEREF _Toc242821877 \h </w:instrText>
+          <w:instrText xml:space="preserve"> PAGEREF _Toc242972864 \h </w:instrText>
         </w:r>
         <w:r>
           <w:rPr>
@@ -1747,7 +1747,7 @@
           <w14:ligatures w14:val="standardContextual"/>
         </w:rPr>
       </w:pPr>
-      <w:hyperlink w:anchor="_Toc242821878" w:history="1">
+      <w:hyperlink w:anchor="_Toc242972865" w:history="1">
         <w:r>
           <w:rPr>
             <w:rStyle w:val="Hyperlink"/>
@@ -1793,7 +1793,7 @@
             <w:noProof/>
             <w:webHidden/>
           </w:rPr>
-          <w:instrText xml:space="preserve"> PAGEREF _Toc242821878 \h </w:instrText>
+          <w:instrText xml:space="preserve"> PAGEREF _Toc242972865 \h </w:instrText>
         </w:r>
         <w:r>
           <w:rPr>
@@ -1841,7 +1841,7 @@
           <w14:ligatures w14:val="standardContextual"/>
         </w:rPr>
       </w:pPr>
-      <w:hyperlink w:anchor="_Toc242821879" w:history="1">
+      <w:hyperlink w:anchor="_Toc242972866" w:history="1">
         <w:r>
           <w:rPr>
             <w:rStyle w:val="Hyperlink"/>
@@ -1887,7 +1887,7 @@
             <w:noProof/>
             <w:webHidden/>
           </w:rPr>
-          <w:instrText xml:space="preserve"> PAGEREF _Toc242821879 \h </w:instrText>
+          <w:instrText xml:space="preserve"> PAGEREF _Toc242972866 \h </w:instrText>
         </w:r>
         <w:r>
           <w:rPr>
@@ -1935,7 +1935,7 @@
           <w14:ligatures w14:val="standardContextual"/>
         </w:rPr>
       </w:pPr>
-      <w:hyperlink w:anchor="_Toc242821880" w:history="1">
+      <w:hyperlink w:anchor="_Toc242972867" w:history="1">
         <w:r>
           <w:rPr>
             <w:rStyle w:val="Hyperlink"/>
@@ -1981,7 +1981,7 @@
             <w:noProof/>
             <w:webHidden/>
           </w:rPr>
-          <w:instrText xml:space="preserve"> PAGEREF _Toc242821880 \h </w:instrText>
+          <w:instrText xml:space="preserve"> PAGEREF _Toc242972867 \h </w:instrText>
         </w:r>
         <w:r>
           <w:rPr>
@@ -2029,7 +2029,7 @@
           <w14:ligatures w14:val="standardContextual"/>
         </w:rPr>
       </w:pPr>
-      <w:hyperlink w:anchor="_Toc242821881" w:history="1">
+      <w:hyperlink w:anchor="_Toc242972868" w:history="1">
         <w:r>
           <w:rPr>
             <w:rStyle w:val="Hyperlink"/>
@@ -2075,7 +2075,7 @@
             <w:noProof/>
             <w:webHidden/>
           </w:rPr>
-          <w:instrText xml:space="preserve"> PAGEREF _Toc242821881 \h </w:instrText>
+          <w:instrText xml:space="preserve"> PAGEREF _Toc242972868 \h </w:instrText>
         </w:r>
         <w:r>
           <w:rPr>
@@ -2123,7 +2123,7 @@
           <w14:ligatures w14:val="standardContextual"/>
         </w:rPr>
       </w:pPr>
-      <w:hyperlink w:anchor="_Toc242821882" w:history="1">
+      <w:hyperlink w:anchor="_Toc242972869" w:history="1">
         <w:r>
           <w:rPr>
             <w:rStyle w:val="Hyperlink"/>
@@ -2169,7 +2169,7 @@
             <w:noProof/>
             <w:webHidden/>
           </w:rPr>
-          <w:instrText xml:space="preserve"> PAGEREF _Toc242821882 \h </w:instrText>
+          <w:instrText xml:space="preserve"> PAGEREF _Toc242972869 \h </w:instrText>
         </w:r>
         <w:r>
           <w:rPr>
@@ -2217,7 +2217,7 @@
           <w14:ligatures w14:val="standardContextual"/>
         </w:rPr>
       </w:pPr>
-      <w:hyperlink w:anchor="_Toc242821883" w:history="1">
+      <w:hyperlink w:anchor="_Toc242972870" w:history="1">
         <w:r>
           <w:rPr>
             <w:rStyle w:val="Hyperlink"/>
@@ -2263,7 +2263,7 @@
             <w:noProof/>
             <w:webHidden/>
           </w:rPr>
-          <w:instrText xml:space="preserve"> PAGEREF _Toc242821883 \h </w:instrText>
+          <w:instrText xml:space="preserve"> PAGEREF _Toc242972870 \h </w:instrText>
         </w:r>
         <w:r>
           <w:rPr>
@@ -2311,7 +2311,7 @@
           <w14:ligatures w14:val="standardContextual"/>
         </w:rPr>
       </w:pPr>
-      <w:hyperlink w:anchor="_Toc242821884" w:history="1">
+      <w:hyperlink w:anchor="_Toc242972871" w:history="1">
         <w:r>
           <w:rPr>
             <w:rStyle w:val="Hyperlink"/>
@@ -2357,7 +2357,7 @@
             <w:noProof/>
             <w:webHidden/>
           </w:rPr>
-          <w:instrText xml:space="preserve"> PAGEREF _Toc242821884 \h </w:instrText>
+          <w:instrText xml:space="preserve"> PAGEREF _Toc242972871 \h </w:instrText>
         </w:r>
         <w:r>
           <w:rPr>
@@ -2405,7 +2405,7 @@
           <w14:ligatures w14:val="standardContextual"/>
         </w:rPr>
       </w:pPr>
-      <w:hyperlink w:anchor="_Toc242821885" w:history="1">
+      <w:hyperlink w:anchor="_Toc242972872" w:history="1">
         <w:r>
           <w:rPr>
             <w:rStyle w:val="Hyperlink"/>
@@ -2451,7 +2451,7 @@
             <w:noProof/>
             <w:webHidden/>
           </w:rPr>
-          <w:instrText xml:space="preserve"> PAGEREF _Toc242821885 \h </w:instrText>
+          <w:instrText xml:space="preserve"> PAGEREF _Toc242972872 \h </w:instrText>
         </w:r>
         <w:r>
           <w:rPr>
@@ -2499,7 +2499,7 @@
           <w14:ligatures w14:val="standardContextual"/>
         </w:rPr>
       </w:pPr>
-      <w:hyperlink w:anchor="_Toc242821886" w:history="1">
+      <w:hyperlink w:anchor="_Toc242972873" w:history="1">
         <w:r>
           <w:rPr>
             <w:rStyle w:val="Hyperlink"/>
@@ -2545,7 +2545,7 @@
             <w:noProof/>
             <w:webHidden/>
           </w:rPr>
-          <w:instrText xml:space="preserve"> PAGEREF _Toc242821886 \h </w:instrText>
+          <w:instrText xml:space="preserve"> PAGEREF _Toc242972873 \h </w:instrText>
         </w:r>
         <w:r>
           <w:rPr>
@@ -2593,7 +2593,7 @@
           <w14:ligatures w14:val="standardContextual"/>
         </w:rPr>
       </w:pPr>
-      <w:hyperlink w:anchor="_Toc242821887" w:history="1">
+      <w:hyperlink w:anchor="_Toc242972874" w:history="1">
         <w:r>
           <w:rPr>
             <w:rStyle w:val="Hyperlink"/>
@@ -2639,7 +2639,7 @@
             <w:noProof/>
             <w:webHidden/>
           </w:rPr>
-          <w:instrText xml:space="preserve"> PAGEREF _Toc242821887 \h </w:instrText>
+          <w:instrText xml:space="preserve"> PAGEREF _Toc242972874 \h </w:instrText>
         </w:r>
         <w:r>
           <w:rPr>
@@ -2687,7 +2687,7 @@
           <w14:ligatures w14:val="standardContextual"/>
         </w:rPr>
       </w:pPr>
-      <w:hyperlink w:anchor="_Toc242821888" w:history="1">
+      <w:hyperlink w:anchor="_Toc242972875" w:history="1">
         <w:r>
           <w:rPr>
             <w:rStyle w:val="Hyperlink"/>
@@ -2733,7 +2733,7 @@
             <w:noProof/>
             <w:webHidden/>
           </w:rPr>
-          <w:instrText xml:space="preserve"> PAGEREF _Toc242821888 \h </w:instrText>
+          <w:instrText xml:space="preserve"> PAGEREF _Toc242972875 \h </w:instrText>
         </w:r>
         <w:r>
           <w:rPr>
@@ -2781,7 +2781,7 @@
           <w14:ligatures w14:val="standardContextual"/>
         </w:rPr>
       </w:pPr>
-      <w:hyperlink w:anchor="_Toc242821889" w:history="1">
+      <w:hyperlink w:anchor="_Toc242972876" w:history="1">
         <w:r>
           <w:rPr>
             <w:rStyle w:val="Hyperlink"/>
@@ -2827,7 +2827,7 @@
             <w:noProof/>
             <w:webHidden/>
           </w:rPr>
-          <w:instrText xml:space="preserve"> PAGEREF _Toc242821889 \h </w:instrText>
+          <w:instrText xml:space="preserve"> PAGEREF _Toc242972876 \h </w:instrText>
         </w:r>
         <w:r>
           <w:rPr>
@@ -2875,7 +2875,7 @@
           <w14:ligatures w14:val="standardContextual"/>
         </w:rPr>
       </w:pPr>
-      <w:hyperlink w:anchor="_Toc242821890" w:history="1">
+      <w:hyperlink w:anchor="_Toc242972877" w:history="1">
         <w:r>
           <w:rPr>
             <w:rStyle w:val="Hyperlink"/>
@@ -2921,7 +2921,7 @@
             <w:noProof/>
             <w:webHidden/>
           </w:rPr>
-          <w:instrText xml:space="preserve"> PAGEREF _Toc242821890 \h </w:instrText>
+          <w:instrText xml:space="preserve"> PAGEREF _Toc242972877 \h </w:instrText>
         </w:r>
         <w:r>
           <w:rPr>
@@ -2969,7 +2969,7 @@
           <w14:ligatures w14:val="standardContextual"/>
         </w:rPr>
       </w:pPr>
-      <w:hyperlink w:anchor="_Toc242821891" w:history="1">
+      <w:hyperlink w:anchor="_Toc242972878" w:history="1">
         <w:r>
           <w:rPr>
             <w:rStyle w:val="Hyperlink"/>
@@ -3015,7 +3015,7 @@
             <w:noProof/>
             <w:webHidden/>
           </w:rPr>
-          <w:instrText xml:space="preserve"> PAGEREF _Toc242821891 \h </w:instrText>
+          <w:instrText xml:space="preserve"> PAGEREF _Toc242972878 \h </w:instrText>
         </w:r>
         <w:r>
           <w:rPr>
@@ -3063,7 +3063,7 @@
           <w14:ligatures w14:val="standardContextual"/>
         </w:rPr>
       </w:pPr>
-      <w:hyperlink w:anchor="_Toc242821892" w:history="1">
+      <w:hyperlink w:anchor="_Toc242972879" w:history="1">
         <w:r>
           <w:rPr>
             <w:rStyle w:val="Hyperlink"/>
@@ -3109,7 +3109,7 @@
             <w:noProof/>
             <w:webHidden/>
           </w:rPr>
-          <w:instrText xml:space="preserve"> PAGEREF _Toc242821892 \h </w:instrText>
+          <w:instrText xml:space="preserve"> PAGEREF _Toc242972879 \h </w:instrText>
         </w:r>
         <w:r>
           <w:rPr>
@@ -3157,7 +3157,7 @@
           <w14:ligatures w14:val="standardContextual"/>
         </w:rPr>
       </w:pPr>
-      <w:hyperlink w:anchor="_Toc242821893" w:history="1">
+      <w:hyperlink w:anchor="_Toc242972880" w:history="1">
         <w:r>
           <w:rPr>
             <w:rStyle w:val="Hyperlink"/>
@@ -3203,7 +3203,7 @@
             <w:noProof/>
             <w:webHidden/>
           </w:rPr>
-          <w:instrText xml:space="preserve"> PAGEREF _Toc242821893 \h </w:instrText>
+          <w:instrText xml:space="preserve"> PAGEREF _Toc242972880 \h </w:instrText>
         </w:r>
         <w:r>
           <w:rPr>
@@ -3251,7 +3251,7 @@
           <w14:ligatures w14:val="standardContextual"/>
         </w:rPr>
       </w:pPr>
-      <w:hyperlink w:anchor="_Toc242821894" w:history="1">
+      <w:hyperlink w:anchor="_Toc242972881" w:history="1">
         <w:r>
           <w:rPr>
             <w:rStyle w:val="Hyperlink"/>
@@ -3297,7 +3297,7 @@
             <w:noProof/>
             <w:webHidden/>
           </w:rPr>
-          <w:instrText xml:space="preserve"> PAGEREF _Toc242821894 \h </w:instrText>
+          <w:instrText xml:space="preserve"> PAGEREF _Toc242972881 \h </w:instrText>
         </w:r>
         <w:r>
           <w:rPr>
@@ -3345,7 +3345,7 @@
           <w14:ligatures w14:val="standardContextual"/>
         </w:rPr>
       </w:pPr>
-      <w:hyperlink w:anchor="_Toc242821895" w:history="1">
+      <w:hyperlink w:anchor="_Toc242972882" w:history="1">
         <w:r>
           <w:rPr>
             <w:rStyle w:val="Hyperlink"/>
@@ -3391,7 +3391,7 @@
             <w:noProof/>
             <w:webHidden/>
           </w:rPr>
-          <w:instrText xml:space="preserve"> PAGEREF _Toc242821895 \h </w:instrText>
+          <w:instrText xml:space="preserve"> PAGEREF _Toc242972882 \h </w:instrText>
         </w:r>
         <w:r>
           <w:rPr>
@@ -3439,7 +3439,7 @@
           <w14:ligatures w14:val="standardContextual"/>
         </w:rPr>
       </w:pPr>
-      <w:hyperlink w:anchor="_Toc242821896" w:history="1">
+      <w:hyperlink w:anchor="_Toc242972883" w:history="1">
         <w:r>
           <w:rPr>
             <w:rStyle w:val="Hyperlink"/>
@@ -3485,7 +3485,7 @@
             <w:noProof/>
             <w:webHidden/>
           </w:rPr>
-          <w:instrText xml:space="preserve"> PAGEREF _Toc242821896 \h </w:instrText>
+          <w:instrText xml:space="preserve"> PAGEREF _Toc242972883 \h </w:instrText>
         </w:r>
         <w:r>
           <w:rPr>
@@ -3533,7 +3533,7 @@
           <w14:ligatures w14:val="standardContextual"/>
         </w:rPr>
       </w:pPr>
-      <w:hyperlink w:anchor="_Toc242821897" w:history="1">
+      <w:hyperlink w:anchor="_Toc242972884" w:history="1">
         <w:r>
           <w:rPr>
             <w:rStyle w:val="Hyperlink"/>
@@ -3579,7 +3579,7 @@
             <w:noProof/>
             <w:webHidden/>
           </w:rPr>
-          <w:instrText xml:space="preserve"> PAGEREF _Toc242821897 \h </w:instrText>
+          <w:instrText xml:space="preserve"> PAGEREF _Toc242972884 \h </w:instrText>
         </w:r>
         <w:r>
           <w:rPr>
@@ -3627,7 +3627,7 @@
           <w14:ligatures w14:val="standardContextual"/>
         </w:rPr>
       </w:pPr>
-      <w:hyperlink w:anchor="_Toc242821898" w:history="1">
+      <w:hyperlink w:anchor="_Toc242972885" w:history="1">
         <w:r>
           <w:rPr>
             <w:rStyle w:val="Hyperlink"/>
@@ -3673,7 +3673,7 @@
             <w:noProof/>
             <w:webHidden/>
           </w:rPr>
-          <w:instrText xml:space="preserve"> PAGEREF _Toc242821898 \h </w:instrText>
+          <w:instrText xml:space="preserve"> PAGEREF _Toc242972885 \h </w:instrText>
         </w:r>
         <w:r>
           <w:rPr>
@@ -3721,7 +3721,7 @@
           <w14:ligatures w14:val="standardContextual"/>
         </w:rPr>
       </w:pPr>
-      <w:hyperlink w:anchor="_Toc242821899" w:history="1">
+      <w:hyperlink w:anchor="_Toc242972886" w:history="1">
         <w:r>
           <w:rPr>
             <w:rStyle w:val="Hyperlink"/>
@@ -3767,7 +3767,7 @@
             <w:noProof/>
             <w:webHidden/>
           </w:rPr>
-          <w:instrText xml:space="preserve"> PAGEREF _Toc242821899 \h </w:instrText>
+          <w:instrText xml:space="preserve"> PAGEREF _Toc242972886 \h </w:instrText>
         </w:r>
         <w:r>
           <w:rPr>
@@ -3815,7 +3815,7 @@
           <w14:ligatures w14:val="standardContextual"/>
         </w:rPr>
       </w:pPr>
-      <w:hyperlink w:anchor="_Toc242821900" w:history="1">
+      <w:hyperlink w:anchor="_Toc242972887" w:history="1">
         <w:r>
           <w:rPr>
             <w:rStyle w:val="Hyperlink"/>
@@ -3861,7 +3861,7 @@
             <w:noProof/>
             <w:webHidden/>
           </w:rPr>
-          <w:instrText xml:space="preserve"> PAGEREF _Toc242821900 \h </w:instrText>
+          <w:instrText xml:space="preserve"> PAGEREF _Toc242972887 \h </w:instrText>
         </w:r>
         <w:r>
           <w:rPr>
@@ -3909,7 +3909,7 @@
           <w14:ligatures w14:val="standardContextual"/>
         </w:rPr>
       </w:pPr>
-      <w:hyperlink w:anchor="_Toc242821901" w:history="1">
+      <w:hyperlink w:anchor="_Toc242972888" w:history="1">
         <w:r>
           <w:rPr>
             <w:rStyle w:val="Hyperlink"/>
@@ -3955,7 +3955,7 @@
             <w:noProof/>
             <w:webHidden/>
           </w:rPr>
-          <w:instrText xml:space="preserve"> PAGEREF _Toc242821901 \h </w:instrText>
+          <w:instrText xml:space="preserve"> PAGEREF _Toc242972888 \h </w:instrText>
         </w:r>
         <w:r>
           <w:rPr>
@@ -4003,7 +4003,7 @@
           <w14:ligatures w14:val="standardContextual"/>
         </w:rPr>
       </w:pPr>
-      <w:hyperlink w:anchor="_Toc242821902" w:history="1">
+      <w:hyperlink w:anchor="_Toc242972889" w:history="1">
         <w:r>
           <w:rPr>
             <w:rStyle w:val="Hyperlink"/>
@@ -4049,7 +4049,7 @@
             <w:noProof/>
             <w:webHidden/>
           </w:rPr>
-          <w:instrText xml:space="preserve"> PAGEREF _Toc242821902 \h </w:instrText>
+          <w:instrText xml:space="preserve"> PAGEREF _Toc242972889 \h </w:instrText>
         </w:r>
         <w:r>
           <w:rPr>
@@ -4097,7 +4097,7 @@
           <w14:ligatures w14:val="standardContextual"/>
         </w:rPr>
       </w:pPr>
-      <w:hyperlink w:anchor="_Toc242821903" w:history="1">
+      <w:hyperlink w:anchor="_Toc242972890" w:history="1">
         <w:r>
           <w:rPr>
             <w:rStyle w:val="Hyperlink"/>
@@ -4143,7 +4143,7 @@
             <w:noProof/>
             <w:webHidden/>
           </w:rPr>
-          <w:instrText xml:space="preserve"> PAGEREF _Toc242821903 \h </w:instrText>
+          <w:instrText xml:space="preserve"> PAGEREF _Toc242972890 \h </w:instrText>
         </w:r>
         <w:r>
           <w:rPr>
@@ -4191,7 +4191,7 @@
           <w14:ligatures w14:val="standardContextual"/>
         </w:rPr>
       </w:pPr>
-      <w:hyperlink w:anchor="_Toc242821904" w:history="1">
+      <w:hyperlink w:anchor="_Toc242972891" w:history="1">
         <w:r>
           <w:rPr>
             <w:rStyle w:val="Hyperlink"/>
@@ -4237,7 +4237,7 @@
             <w:noProof/>
             <w:webHidden/>
           </w:rPr>
-          <w:instrText xml:space="preserve"> PAGEREF _Toc242821904 \h </w:instrText>
+          <w:instrText xml:space="preserve"> PAGEREF _Toc242972891 \h </w:instrText>
         </w:r>
         <w:r>
           <w:rPr>
@@ -4285,7 +4285,7 @@
           <w14:ligatures w14:val="standardContextual"/>
         </w:rPr>
       </w:pPr>
-      <w:hyperlink w:anchor="_Toc242821905" w:history="1">
+      <w:hyperlink w:anchor="_Toc242972892" w:history="1">
         <w:r>
           <w:rPr>
             <w:rStyle w:val="Hyperlink"/>
@@ -4331,7 +4331,7 @@
             <w:noProof/>
             <w:webHidden/>
           </w:rPr>
-          <w:instrText xml:space="preserve"> PAGEREF _Toc242821905 \h </w:instrText>
+          <w:instrText xml:space="preserve"> PAGEREF _Toc242972892 \h </w:instrText>
         </w:r>
         <w:r>
           <w:rPr>
@@ -4379,7 +4379,7 @@
           <w14:ligatures w14:val="standardContextual"/>
         </w:rPr>
       </w:pPr>
-      <w:hyperlink w:anchor="_Toc242821906" w:history="1">
+      <w:hyperlink w:anchor="_Toc242972893" w:history="1">
         <w:r>
           <w:rPr>
             <w:rStyle w:val="Hyperlink"/>
@@ -4425,7 +4425,7 @@
             <w:noProof/>
             <w:webHidden/>
           </w:rPr>
-          <w:instrText xml:space="preserve"> PAGEREF _Toc242821906 \h </w:instrText>
+          <w:instrText xml:space="preserve"> PAGEREF _Toc242972893 \h </w:instrText>
         </w:r>
         <w:r>
           <w:rPr>
@@ -4473,7 +4473,7 @@
           <w14:ligatures w14:val="standardContextual"/>
         </w:rPr>
       </w:pPr>
-      <w:hyperlink w:anchor="_Toc242821907" w:history="1">
+      <w:hyperlink w:anchor="_Toc242972894" w:history="1">
         <w:r>
           <w:rPr>
             <w:rStyle w:val="Hyperlink"/>
@@ -4519,7 +4519,7 @@
             <w:noProof/>
             <w:webHidden/>
           </w:rPr>
-          <w:instrText xml:space="preserve"> PAGEREF _Toc242821907 \h </w:instrText>
+          <w:instrText xml:space="preserve"> PAGEREF _Toc242972894 \h </w:instrText>
         </w:r>
         <w:r>
           <w:rPr>
@@ -4559,7 +4559,7 @@
       <w:pPr>
         <w:pStyle w:val="Heading1"/>
       </w:pPr>
-      <w:bookmarkStart w:id="0" w:name="_Toc242821861"/>
+      <w:bookmarkStart w:id="0" w:name="_Toc242972848"/>
       <w:r>
         <w:lastRenderedPageBreak/>
         <w:t>Overview</w:t>
@@ -4716,7 +4716,7 @@
       <w:pPr>
         <w:pStyle w:val="Heading1"/>
       </w:pPr>
-      <w:bookmarkStart w:id="1" w:name="_Toc242821862"/>
+      <w:bookmarkStart w:id="1" w:name="_Toc242972849"/>
       <w:r>
         <w:lastRenderedPageBreak/>
         <w:t>Installation</w:t>
@@ -4759,7 +4759,7 @@
       <w:pPr>
         <w:pStyle w:val="Heading2"/>
       </w:pPr>
-      <w:bookmarkStart w:id="2" w:name="_Toc242821863"/>
+      <w:bookmarkStart w:id="2" w:name="_Toc242972850"/>
       <w:r>
         <w:t>Automatic installation</w:t>
       </w:r>
@@ -5108,7 +5108,7 @@
       <w:pPr>
         <w:pStyle w:val="Heading2"/>
       </w:pPr>
-      <w:bookmarkStart w:id="3" w:name="_Toc242821864"/>
+      <w:bookmarkStart w:id="3" w:name="_Toc242972851"/>
       <w:r>
         <w:t>Manual installation</w:t>
       </w:r>
@@ -5271,7 +5271,7 @@
       <w:pPr>
         <w:pStyle w:val="Heading2"/>
       </w:pPr>
-      <w:bookmarkStart w:id="4" w:name="_Toc242821865"/>
+      <w:bookmarkStart w:id="4" w:name="_Toc242972852"/>
       <w:r>
         <w:lastRenderedPageBreak/>
         <w:t>Testing the installation</w:t>
@@ -5481,7 +5481,7 @@
       <w:pPr>
         <w:pStyle w:val="Heading2"/>
       </w:pPr>
-      <w:bookmarkStart w:id="5" w:name="_Toc242821866"/>
+      <w:bookmarkStart w:id="5" w:name="_Toc242972853"/>
       <w:r>
         <w:t>GPU support (if you have an NVIDIA GPU)</w:t>
       </w:r>
@@ -5914,7 +5914,7 @@
       <w:pPr>
         <w:pStyle w:val="Heading2"/>
       </w:pPr>
-      <w:bookmarkStart w:id="6" w:name="_Toc242821867"/>
+      <w:bookmarkStart w:id="6" w:name="_Toc242972854"/>
       <w:r>
         <w:t>Pre-compiled kernels</w:t>
       </w:r>
@@ -5995,7 +5995,7 @@
       <w:pPr>
         <w:pStyle w:val="Heading1"/>
       </w:pPr>
-      <w:bookmarkStart w:id="7" w:name="_Toc242821868"/>
+      <w:bookmarkStart w:id="7" w:name="_Toc242972855"/>
       <w:r>
         <w:lastRenderedPageBreak/>
         <w:t>Input Handling</w:t>
@@ -6472,7 +6472,7 @@
       <w:pPr>
         <w:pStyle w:val="Heading2"/>
       </w:pPr>
-      <w:bookmarkStart w:id="8" w:name="_Toc242821869"/>
+      <w:bookmarkStart w:id="8" w:name="_Toc242972856"/>
       <w:r>
         <w:t>External Data Sources</w:t>
       </w:r>
@@ -7082,7 +7082,7 @@
       <w:pPr>
         <w:pStyle w:val="Heading2"/>
       </w:pPr>
-      <w:bookmarkStart w:id="9" w:name="_Toc242821870"/>
+      <w:bookmarkStart w:id="9" w:name="_Toc242972857"/>
       <w:r>
         <w:lastRenderedPageBreak/>
         <w:t>Event Selection (Watcher)</w:t>
@@ -7588,7 +7588,7 @@
       <w:pPr>
         <w:pStyle w:val="Heading1"/>
       </w:pPr>
-      <w:bookmarkStart w:id="10" w:name="_Toc242821871"/>
+      <w:bookmarkStart w:id="10" w:name="_Toc242972858"/>
       <w:r>
         <w:lastRenderedPageBreak/>
         <w:t>Station and Signal Selection</w:t>
@@ -7718,7 +7718,7 @@
       <w:pPr>
         <w:pStyle w:val="Heading2"/>
       </w:pPr>
-      <w:bookmarkStart w:id="11" w:name="_Toc242821872"/>
+      <w:bookmarkStart w:id="11" w:name="_Toc242972859"/>
       <w:r>
         <w:t>Step 1 — Retrieve the event</w:t>
       </w:r>
@@ -7736,7 +7736,7 @@
       <w:pPr>
         <w:pStyle w:val="Heading2"/>
       </w:pPr>
-      <w:bookmarkStart w:id="12" w:name="_Toc242821873"/>
+      <w:bookmarkStart w:id="12" w:name="_Toc242972860"/>
       <w:r>
         <w:t>Step 2 — Retrieve the station metadata</w:t>
       </w:r>
@@ -8506,7 +8506,7 @@
       <w:pPr>
         <w:pStyle w:val="Heading2"/>
       </w:pPr>
-      <w:bookmarkStart w:id="13" w:name="_Toc242821874"/>
+      <w:bookmarkStart w:id="13" w:name="_Toc242972861"/>
       <w:r>
         <w:t>Step 3 — Download the waveforms</w:t>
       </w:r>
@@ -8524,7 +8524,7 @@
       <w:pPr>
         <w:pStyle w:val="Heading2"/>
       </w:pPr>
-      <w:bookmarkStart w:id="14" w:name="_Toc242821875"/>
+      <w:bookmarkStart w:id="14" w:name="_Toc242972862"/>
       <w:r>
         <w:t>Step 4 — Quality checks and instrument correction</w:t>
       </w:r>
@@ -9073,7 +9073,7 @@
       <w:pPr>
         <w:pStyle w:val="Heading2"/>
       </w:pPr>
-      <w:bookmarkStart w:id="15" w:name="_Toc242821876"/>
+      <w:bookmarkStart w:id="15" w:name="_Toc242972863"/>
       <w:r>
         <w:t>Step 5 — Azimuthal selection</w:t>
       </w:r>
@@ -9256,7 +9256,7 @@
       <w:pPr>
         <w:pStyle w:val="Heading1"/>
       </w:pPr>
-      <w:bookmarkStart w:id="16" w:name="_Toc242821877"/>
+      <w:bookmarkStart w:id="16" w:name="_Toc242972864"/>
       <w:r>
         <w:lastRenderedPageBreak/>
         <w:t>Computation Configuration</w:t>
@@ -9340,7 +9340,7 @@
       <w:pPr>
         <w:pStyle w:val="Heading2"/>
       </w:pPr>
-      <w:bookmarkStart w:id="17" w:name="_Toc242821878"/>
+      <w:bookmarkStart w:id="17" w:name="_Toc242972865"/>
       <w:r>
         <w:t>Green's Functions</w:t>
       </w:r>
@@ -9350,7 +9350,7 @@
       <w:pPr>
         <w:pStyle w:val="Heading3"/>
       </w:pPr>
-      <w:bookmarkStart w:id="18" w:name="_Toc242821879"/>
+      <w:bookmarkStart w:id="18" w:name="_Toc242972866"/>
       <w:r>
         <w:t>Regional velocity models</w:t>
       </w:r>
@@ -9535,7 +9535,7 @@
       <w:pPr>
         <w:pStyle w:val="Heading3"/>
       </w:pPr>
-      <w:bookmarkStart w:id="19" w:name="_Toc242821880"/>
+      <w:bookmarkStart w:id="19" w:name="_Toc242972867"/>
       <w:r>
         <w:t>Source grid</w:t>
       </w:r>
@@ -9993,7 +9993,7 @@
       <w:pPr>
         <w:pStyle w:val="Heading3"/>
       </w:pPr>
-      <w:bookmarkStart w:id="20" w:name="_Toc242821881"/>
+      <w:bookmarkStart w:id="20" w:name="_Toc242972868"/>
       <w:r>
         <w:t>Frequency content</w:t>
       </w:r>
@@ -10116,7 +10116,7 @@
       <w:pPr>
         <w:pStyle w:val="Heading2"/>
       </w:pPr>
-      <w:bookmarkStart w:id="21" w:name="_Toc242821882"/>
+      <w:bookmarkStart w:id="21" w:name="_Toc242972869"/>
       <w:r>
         <w:lastRenderedPageBreak/>
         <w:t>Inversion Parameters</w:t>
@@ -10135,7 +10135,7 @@
       <w:pPr>
         <w:pStyle w:val="Heading3"/>
       </w:pPr>
-      <w:bookmarkStart w:id="22" w:name="_Toc242821883"/>
+      <w:bookmarkStart w:id="22" w:name="_Toc242972870"/>
       <w:r>
         <w:t>Frequency band</w:t>
       </w:r>
@@ -10300,7 +10300,7 @@
       <w:pPr>
         <w:pStyle w:val="Heading3"/>
       </w:pPr>
-      <w:bookmarkStart w:id="23" w:name="_Toc242821884"/>
+      <w:bookmarkStart w:id="23" w:name="_Toc242972871"/>
       <w:r>
         <w:t>Waveform window</w:t>
       </w:r>
@@ -10485,7 +10485,7 @@
       <w:pPr>
         <w:pStyle w:val="Heading3"/>
       </w:pPr>
-      <w:bookmarkStart w:id="24" w:name="_Toc242821885"/>
+      <w:bookmarkStart w:id="24" w:name="_Toc242972872"/>
       <w:r>
         <w:lastRenderedPageBreak/>
         <w:t>Centroid time search</w:t>
@@ -10629,7 +10629,7 @@
       <w:pPr>
         <w:pStyle w:val="Heading3"/>
       </w:pPr>
-      <w:bookmarkStart w:id="25" w:name="_Toc242821886"/>
+      <w:bookmarkStart w:id="25" w:name="_Toc242972873"/>
       <w:r>
         <w:t>Source time function</w:t>
       </w:r>
@@ -10758,7 +10758,7 @@
       <w:pPr>
         <w:pStyle w:val="Heading3"/>
       </w:pPr>
-      <w:bookmarkStart w:id="26" w:name="_Toc242821887"/>
+      <w:bookmarkStart w:id="26" w:name="_Toc242972874"/>
       <w:r>
         <w:t>Deviatoric and full moment tensor</w:t>
       </w:r>
@@ -10925,7 +10925,7 @@
       <w:pPr>
         <w:pStyle w:val="Heading2"/>
       </w:pPr>
-      <w:bookmarkStart w:id="27" w:name="_Toc242821888"/>
+      <w:bookmarkStart w:id="27" w:name="_Toc242972875"/>
       <w:r>
         <w:lastRenderedPageBreak/>
         <w:t>Bayesian Bootstrap</w:t>
@@ -11585,14 +11585,14 @@
       </w:pPr>
       <w:r>
         <w:lastRenderedPageBreak/>
-        <w:t>The result is an ensemble of NBEST × Iterations solutions. From it, Gisola-BaBoo computes the median moment tensor, with its nodal planes, M0 and Mw, and the median values and the 68 % and 95 % confidence intervals of the tensor components, M0, Mw, DC, CLVD, ISO, the centroid position and the centroid time.</w:t>
+        <w:t>The result is an ensemble of NBEST × Iterations solutions. From it, Gisola-BaBoo computes the mean moment tensor, with its nodal planes, and the mean values and the 68 % and 95 % confidence intervals of the tensor components, M0, Mw, DC, CLVD, ISO, the centroid position and the centroid time.</w:t>
       </w:r>
     </w:p>
     <w:p>
       <w:pPr>
         <w:pStyle w:val="Heading1"/>
       </w:pPr>
-      <w:bookmarkStart w:id="28" w:name="_Toc242821889"/>
+      <w:bookmarkStart w:id="28" w:name="_Toc242972876"/>
       <w:r>
         <w:lastRenderedPageBreak/>
         <w:t>Outputs</w:t>
@@ -11927,7 +11927,7 @@
       <w:pPr>
         <w:pStyle w:val="Heading2"/>
       </w:pPr>
-      <w:bookmarkStart w:id="29" w:name="_Toc242821890"/>
+      <w:bookmarkStart w:id="29" w:name="_Toc242972877"/>
       <w:r>
         <w:t>Result files</w:t>
       </w:r>
@@ -12451,7 +12451,7 @@
               <w:rPr>
                 <w:sz w:val="19"/>
               </w:rPr>
-              <w:t>ensemble statistics (median, 68 %, 95 %), the median moment tensor and the computation time of the bootstrap.</w:t>
+              <w:t>ensemble statistics (mean, 68 %, 95 %), the mean moment tensor and the computation time of the bootstrap.</w:t>
             </w:r>
           </w:p>
         </w:tc>
@@ -12782,7 +12782,7 @@
       <w:pPr>
         <w:pStyle w:val="Heading2"/>
       </w:pPr>
-      <w:bookmarkStart w:id="30" w:name="_Toc242821891"/>
+      <w:bookmarkStart w:id="30" w:name="_Toc242972878"/>
       <w:r>
         <w:t>Figures</w:t>
       </w:r>
@@ -13789,7 +13789,7 @@
               <w:rPr>
                 <w:sz w:val="19"/>
               </w:rPr>
-              <w:t>hudson_median</w:t>
+              <w:t>hudson_mean</w:t>
             </w:r>
           </w:p>
         </w:tc>
@@ -13817,7 +13817,7 @@
               <w:rPr>
                 <w:sz w:val="19"/>
               </w:rPr>
-              <w:t>the ensemble in the Hudson source-type plot, coloured by VR, with the median solution</w:t>
+              <w:t>the ensemble in the Hudson source-type plot, coloured by VR, with the mean solution</w:t>
             </w:r>
           </w:p>
         </w:tc>
@@ -13852,7 +13852,7 @@
               <w:rPr>
                 <w:sz w:val="19"/>
               </w:rPr>
-              <w:t>lune_median</w:t>
+              <w:t>lune_mean</w:t>
             </w:r>
           </w:p>
         </w:tc>
@@ -13944,7 +13944,7 @@
               <w:rPr>
                 <w:sz w:val="19"/>
               </w:rPr>
-              <w:t>the uncertainty of the mechanism: the shading shows, for each direction, the fraction of ensemble members that have tension (dark) or compression (light) there, with the best (red) and median (green) nodal planes</w:t>
+              <w:t>the uncertainty of the mechanism: the shading shows, for each direction, the fraction of ensemble members that have tension (dark) or compression (light) there, with the best (red) and mean (green) nodal planes</w:t>
             </w:r>
           </w:p>
         </w:tc>
@@ -14024,14 +14024,14 @@
         <w:jc w:val="both"/>
       </w:pPr>
       <w:r>
-        <w:t>In the histograms, the red line is the median, the dashed blue lines are the 68 % interval, the dotted green lines are the 95 % interval and the dashed black line is the best solution.</w:t>
+        <w:t>In the histograms, the red line is the mean, the dashed blue lines are the 68 % interval, the dotted green lines are the 95 % interval and the dashed black line is the best solution.</w:t>
       </w:r>
     </w:p>
     <w:p>
       <w:pPr>
         <w:pStyle w:val="Heading2"/>
       </w:pPr>
-      <w:bookmarkStart w:id="31" w:name="_Toc242821892"/>
+      <w:bookmarkStart w:id="31" w:name="_Toc242972879"/>
       <w:r>
         <w:t>Web pages</w:t>
       </w:r>
@@ -14459,7 +14459,7 @@
       <w:pPr>
         <w:pStyle w:val="Heading2"/>
       </w:pPr>
-      <w:bookmarkStart w:id="32" w:name="_Toc242821893"/>
+      <w:bookmarkStart w:id="32" w:name="_Toc242972880"/>
       <w:r>
         <w:t>Log</w:t>
       </w:r>
@@ -14477,7 +14477,7 @@
       <w:pPr>
         <w:pStyle w:val="Heading1"/>
       </w:pPr>
-      <w:bookmarkStart w:id="33" w:name="_Toc242821894"/>
+      <w:bookmarkStart w:id="33" w:name="_Toc242972881"/>
       <w:r>
         <w:lastRenderedPageBreak/>
         <w:t>Other Settings</w:t>
@@ -15367,7 +15367,7 @@
       <w:pPr>
         <w:pStyle w:val="Heading1"/>
       </w:pPr>
-      <w:bookmarkStart w:id="34" w:name="_Toc242821895"/>
+      <w:bookmarkStart w:id="34" w:name="_Toc242972882"/>
       <w:r>
         <w:lastRenderedPageBreak/>
         <w:t>Usage</w:t>
@@ -15751,7 +15751,7 @@
       <w:pPr>
         <w:pStyle w:val="Heading2"/>
       </w:pPr>
-      <w:bookmarkStart w:id="35" w:name="_Toc242821896"/>
+      <w:bookmarkStart w:id="35" w:name="_Toc242972883"/>
       <w:r>
         <w:t>Single event (-e)</w:t>
       </w:r>
@@ -16040,7 +16040,7 @@
       <w:pPr>
         <w:pStyle w:val="Heading2"/>
       </w:pPr>
-      <w:bookmarkStart w:id="36" w:name="_Toc242821897"/>
+      <w:bookmarkStart w:id="36" w:name="_Toc242972884"/>
       <w:r>
         <w:lastRenderedPageBreak/>
         <w:t>Event file (--event-file)</w:t>
@@ -16379,7 +16379,7 @@
       <w:pPr>
         <w:pStyle w:val="Heading2"/>
       </w:pPr>
-      <w:bookmarkStart w:id="37" w:name="_Toc242821898"/>
+      <w:bookmarkStart w:id="37" w:name="_Toc242972885"/>
       <w:r>
         <w:t>QuakeML file (--event-xml)</w:t>
       </w:r>
@@ -16446,7 +16446,7 @@
       <w:pPr>
         <w:pStyle w:val="Heading2"/>
       </w:pPr>
-      <w:bookmarkStart w:id="38" w:name="_Toc242821899"/>
+      <w:bookmarkStart w:id="38" w:name="_Toc242972886"/>
       <w:r>
         <w:t>Datetime range (-d)</w:t>
       </w:r>
@@ -16525,7 +16525,7 @@
       <w:pPr>
         <w:pStyle w:val="Heading2"/>
       </w:pPr>
-      <w:bookmarkStart w:id="39" w:name="_Toc242821900"/>
+      <w:bookmarkStart w:id="39" w:name="_Toc242972887"/>
       <w:r>
         <w:lastRenderedPageBreak/>
         <w:t>Real time (--real-time)</w:t>
@@ -16686,7 +16686,7 @@
       <w:pPr>
         <w:pStyle w:val="Heading2"/>
       </w:pPr>
-      <w:bookmarkStart w:id="40" w:name="_Toc242821901"/>
+      <w:bookmarkStart w:id="40" w:name="_Toc242972888"/>
       <w:r>
         <w:t>Revise (--revise)</w:t>
       </w:r>
@@ -17677,7 +17677,7 @@
       <w:pPr>
         <w:pStyle w:val="Heading2"/>
       </w:pPr>
-      <w:bookmarkStart w:id="41" w:name="_Toc242821902"/>
+      <w:bookmarkStart w:id="41" w:name="_Toc242972889"/>
       <w:r>
         <w:t>Web pages (--home)</w:t>
       </w:r>
@@ -17868,7 +17868,7 @@
       <w:pPr>
         <w:pStyle w:val="Heading2"/>
       </w:pPr>
-      <w:bookmarkStart w:id="42" w:name="_Toc242821903"/>
+      <w:bookmarkStart w:id="42" w:name="_Toc242972890"/>
       <w:r>
         <w:t>PPSD tool (for ppsdoffline)</w:t>
       </w:r>
@@ -17985,7 +17985,7 @@
       <w:pPr>
         <w:pStyle w:val="Heading2"/>
       </w:pPr>
-      <w:bookmarkStart w:id="43" w:name="_Toc242821904"/>
+      <w:bookmarkStart w:id="43" w:name="_Toc242972891"/>
       <w:r>
         <w:t>Runtime Overrides</w:t>
       </w:r>
@@ -19451,7 +19451,7 @@
       <w:pPr>
         <w:pStyle w:val="Heading2"/>
       </w:pPr>
-      <w:bookmarkStart w:id="44" w:name="_Toc242821905"/>
+      <w:bookmarkStart w:id="44" w:name="_Toc242972892"/>
       <w:r>
         <w:t>Operational Notes</w:t>
       </w:r>
@@ -19793,7 +19793,7 @@
       <w:pPr>
         <w:pStyle w:val="Heading1"/>
       </w:pPr>
-      <w:bookmarkStart w:id="45" w:name="_Toc242821906"/>
+      <w:bookmarkStart w:id="45" w:name="_Toc242972893"/>
       <w:r>
         <w:lastRenderedPageBreak/>
         <w:t>References</w:t>
@@ -19834,7 +19834,7 @@
       <w:pPr>
         <w:pStyle w:val="Heading1"/>
       </w:pPr>
-      <w:bookmarkStart w:id="46" w:name="_Toc242821907"/>
+      <w:bookmarkStart w:id="46" w:name="_Toc242972894"/>
       <w:r>
         <w:lastRenderedPageBreak/>
         <w:t>Acknowledgments</w:t>

</xml_diff>

<commit_message>
Default bootstrap: 1000 iterations, KeepFraction 0 (original Bayesian bootstrap); document the ISOLA-BaBoo variant in the manual
</commit_message>
<xml_diff>
--- a/docs/GisolaBaBoo_User_Manual.docx
+++ b/docs/GisolaBaBoo_User_Manual.docx
@@ -149,7 +149,7 @@
       <w:r>
         <w:fldChar w:fldCharType="separate"/>
       </w:r>
-      <w:hyperlink w:anchor="_Toc242972848" w:history="1">
+      <w:hyperlink w:anchor="_Toc242974562" w:history="1">
         <w:r>
           <w:rPr>
             <w:rStyle w:val="Hyperlink"/>
@@ -195,7 +195,7 @@
             <w:noProof/>
             <w:webHidden/>
           </w:rPr>
-          <w:instrText xml:space="preserve"> PAGEREF _Toc242972848 \h </w:instrText>
+          <w:instrText xml:space="preserve"> PAGEREF _Toc242974562 \h </w:instrText>
         </w:r>
         <w:r>
           <w:rPr>
@@ -243,7 +243,7 @@
           <w14:ligatures w14:val="standardContextual"/>
         </w:rPr>
       </w:pPr>
-      <w:hyperlink w:anchor="_Toc242972849" w:history="1">
+      <w:hyperlink w:anchor="_Toc242974563" w:history="1">
         <w:r>
           <w:rPr>
             <w:rStyle w:val="Hyperlink"/>
@@ -289,7 +289,7 @@
             <w:noProof/>
             <w:webHidden/>
           </w:rPr>
-          <w:instrText xml:space="preserve"> PAGEREF _Toc242972849 \h </w:instrText>
+          <w:instrText xml:space="preserve"> PAGEREF _Toc242974563 \h </w:instrText>
         </w:r>
         <w:r>
           <w:rPr>
@@ -337,7 +337,7 @@
           <w14:ligatures w14:val="standardContextual"/>
         </w:rPr>
       </w:pPr>
-      <w:hyperlink w:anchor="_Toc242972850" w:history="1">
+      <w:hyperlink w:anchor="_Toc242974564" w:history="1">
         <w:r>
           <w:rPr>
             <w:rStyle w:val="Hyperlink"/>
@@ -383,7 +383,7 @@
             <w:noProof/>
             <w:webHidden/>
           </w:rPr>
-          <w:instrText xml:space="preserve"> PAGEREF _Toc242972850 \h </w:instrText>
+          <w:instrText xml:space="preserve"> PAGEREF _Toc242974564 \h </w:instrText>
         </w:r>
         <w:r>
           <w:rPr>
@@ -431,7 +431,7 @@
           <w14:ligatures w14:val="standardContextual"/>
         </w:rPr>
       </w:pPr>
-      <w:hyperlink w:anchor="_Toc242972851" w:history="1">
+      <w:hyperlink w:anchor="_Toc242974565" w:history="1">
         <w:r>
           <w:rPr>
             <w:rStyle w:val="Hyperlink"/>
@@ -477,7 +477,7 @@
             <w:noProof/>
             <w:webHidden/>
           </w:rPr>
-          <w:instrText xml:space="preserve"> PAGEREF _Toc242972851 \h </w:instrText>
+          <w:instrText xml:space="preserve"> PAGEREF _Toc242974565 \h </w:instrText>
         </w:r>
         <w:r>
           <w:rPr>
@@ -525,7 +525,7 @@
           <w14:ligatures w14:val="standardContextual"/>
         </w:rPr>
       </w:pPr>
-      <w:hyperlink w:anchor="_Toc242972852" w:history="1">
+      <w:hyperlink w:anchor="_Toc242974566" w:history="1">
         <w:r>
           <w:rPr>
             <w:rStyle w:val="Hyperlink"/>
@@ -571,7 +571,7 @@
             <w:noProof/>
             <w:webHidden/>
           </w:rPr>
-          <w:instrText xml:space="preserve"> PAGEREF _Toc242972852 \h </w:instrText>
+          <w:instrText xml:space="preserve"> PAGEREF _Toc242974566 \h </w:instrText>
         </w:r>
         <w:r>
           <w:rPr>
@@ -619,7 +619,7 @@
           <w14:ligatures w14:val="standardContextual"/>
         </w:rPr>
       </w:pPr>
-      <w:hyperlink w:anchor="_Toc242972853" w:history="1">
+      <w:hyperlink w:anchor="_Toc242974567" w:history="1">
         <w:r>
           <w:rPr>
             <w:rStyle w:val="Hyperlink"/>
@@ -665,7 +665,7 @@
             <w:noProof/>
             <w:webHidden/>
           </w:rPr>
-          <w:instrText xml:space="preserve"> PAGEREF _Toc242972853 \h </w:instrText>
+          <w:instrText xml:space="preserve"> PAGEREF _Toc242974567 \h </w:instrText>
         </w:r>
         <w:r>
           <w:rPr>
@@ -713,7 +713,7 @@
           <w14:ligatures w14:val="standardContextual"/>
         </w:rPr>
       </w:pPr>
-      <w:hyperlink w:anchor="_Toc242972854" w:history="1">
+      <w:hyperlink w:anchor="_Toc242974568" w:history="1">
         <w:r>
           <w:rPr>
             <w:rStyle w:val="Hyperlink"/>
@@ -759,7 +759,7 @@
             <w:noProof/>
             <w:webHidden/>
           </w:rPr>
-          <w:instrText xml:space="preserve"> PAGEREF _Toc242972854 \h </w:instrText>
+          <w:instrText xml:space="preserve"> PAGEREF _Toc242974568 \h </w:instrText>
         </w:r>
         <w:r>
           <w:rPr>
@@ -807,7 +807,7 @@
           <w14:ligatures w14:val="standardContextual"/>
         </w:rPr>
       </w:pPr>
-      <w:hyperlink w:anchor="_Toc242972855" w:history="1">
+      <w:hyperlink w:anchor="_Toc242974569" w:history="1">
         <w:r>
           <w:rPr>
             <w:rStyle w:val="Hyperlink"/>
@@ -853,7 +853,7 @@
             <w:noProof/>
             <w:webHidden/>
           </w:rPr>
-          <w:instrText xml:space="preserve"> PAGEREF _Toc242972855 \h </w:instrText>
+          <w:instrText xml:space="preserve"> PAGEREF _Toc242974569 \h </w:instrText>
         </w:r>
         <w:r>
           <w:rPr>
@@ -901,7 +901,7 @@
           <w14:ligatures w14:val="standardContextual"/>
         </w:rPr>
       </w:pPr>
-      <w:hyperlink w:anchor="_Toc242972856" w:history="1">
+      <w:hyperlink w:anchor="_Toc242974570" w:history="1">
         <w:r>
           <w:rPr>
             <w:rStyle w:val="Hyperlink"/>
@@ -947,7 +947,7 @@
             <w:noProof/>
             <w:webHidden/>
           </w:rPr>
-          <w:instrText xml:space="preserve"> PAGEREF _Toc242972856 \h </w:instrText>
+          <w:instrText xml:space="preserve"> PAGEREF _Toc242974570 \h </w:instrText>
         </w:r>
         <w:r>
           <w:rPr>
@@ -995,7 +995,7 @@
           <w14:ligatures w14:val="standardContextual"/>
         </w:rPr>
       </w:pPr>
-      <w:hyperlink w:anchor="_Toc242972857" w:history="1">
+      <w:hyperlink w:anchor="_Toc242974571" w:history="1">
         <w:r>
           <w:rPr>
             <w:rStyle w:val="Hyperlink"/>
@@ -1041,7 +1041,7 @@
             <w:noProof/>
             <w:webHidden/>
           </w:rPr>
-          <w:instrText xml:space="preserve"> PAGEREF _Toc242972857 \h </w:instrText>
+          <w:instrText xml:space="preserve"> PAGEREF _Toc242974571 \h </w:instrText>
         </w:r>
         <w:r>
           <w:rPr>
@@ -1089,7 +1089,7 @@
           <w14:ligatures w14:val="standardContextual"/>
         </w:rPr>
       </w:pPr>
-      <w:hyperlink w:anchor="_Toc242972858" w:history="1">
+      <w:hyperlink w:anchor="_Toc242974572" w:history="1">
         <w:r>
           <w:rPr>
             <w:rStyle w:val="Hyperlink"/>
@@ -1135,7 +1135,7 @@
             <w:noProof/>
             <w:webHidden/>
           </w:rPr>
-          <w:instrText xml:space="preserve"> PAGEREF _Toc242972858 \h </w:instrText>
+          <w:instrText xml:space="preserve"> PAGEREF _Toc242974572 \h </w:instrText>
         </w:r>
         <w:r>
           <w:rPr>
@@ -1183,7 +1183,7 @@
           <w14:ligatures w14:val="standardContextual"/>
         </w:rPr>
       </w:pPr>
-      <w:hyperlink w:anchor="_Toc242972859" w:history="1">
+      <w:hyperlink w:anchor="_Toc242974573" w:history="1">
         <w:r>
           <w:rPr>
             <w:rStyle w:val="Hyperlink"/>
@@ -1229,7 +1229,7 @@
             <w:noProof/>
             <w:webHidden/>
           </w:rPr>
-          <w:instrText xml:space="preserve"> PAGEREF _Toc242972859 \h </w:instrText>
+          <w:instrText xml:space="preserve"> PAGEREF _Toc242974573 \h </w:instrText>
         </w:r>
         <w:r>
           <w:rPr>
@@ -1277,7 +1277,7 @@
           <w14:ligatures w14:val="standardContextual"/>
         </w:rPr>
       </w:pPr>
-      <w:hyperlink w:anchor="_Toc242972860" w:history="1">
+      <w:hyperlink w:anchor="_Toc242974574" w:history="1">
         <w:r>
           <w:rPr>
             <w:rStyle w:val="Hyperlink"/>
@@ -1323,7 +1323,7 @@
             <w:noProof/>
             <w:webHidden/>
           </w:rPr>
-          <w:instrText xml:space="preserve"> PAGEREF _Toc242972860 \h </w:instrText>
+          <w:instrText xml:space="preserve"> PAGEREF _Toc242974574 \h </w:instrText>
         </w:r>
         <w:r>
           <w:rPr>
@@ -1371,7 +1371,7 @@
           <w14:ligatures w14:val="standardContextual"/>
         </w:rPr>
       </w:pPr>
-      <w:hyperlink w:anchor="_Toc242972861" w:history="1">
+      <w:hyperlink w:anchor="_Toc242974575" w:history="1">
         <w:r>
           <w:rPr>
             <w:rStyle w:val="Hyperlink"/>
@@ -1417,7 +1417,7 @@
             <w:noProof/>
             <w:webHidden/>
           </w:rPr>
-          <w:instrText xml:space="preserve"> PAGEREF _Toc242972861 \h </w:instrText>
+          <w:instrText xml:space="preserve"> PAGEREF _Toc242974575 \h </w:instrText>
         </w:r>
         <w:r>
           <w:rPr>
@@ -1465,7 +1465,7 @@
           <w14:ligatures w14:val="standardContextual"/>
         </w:rPr>
       </w:pPr>
-      <w:hyperlink w:anchor="_Toc242972862" w:history="1">
+      <w:hyperlink w:anchor="_Toc242974576" w:history="1">
         <w:r>
           <w:rPr>
             <w:rStyle w:val="Hyperlink"/>
@@ -1511,7 +1511,7 @@
             <w:noProof/>
             <w:webHidden/>
           </w:rPr>
-          <w:instrText xml:space="preserve"> PAGEREF _Toc242972862 \h </w:instrText>
+          <w:instrText xml:space="preserve"> PAGEREF _Toc242974576 \h </w:instrText>
         </w:r>
         <w:r>
           <w:rPr>
@@ -1559,7 +1559,7 @@
           <w14:ligatures w14:val="standardContextual"/>
         </w:rPr>
       </w:pPr>
-      <w:hyperlink w:anchor="_Toc242972863" w:history="1">
+      <w:hyperlink w:anchor="_Toc242974577" w:history="1">
         <w:r>
           <w:rPr>
             <w:rStyle w:val="Hyperlink"/>
@@ -1605,7 +1605,7 @@
             <w:noProof/>
             <w:webHidden/>
           </w:rPr>
-          <w:instrText xml:space="preserve"> PAGEREF _Toc242972863 \h </w:instrText>
+          <w:instrText xml:space="preserve"> PAGEREF _Toc242974577 \h </w:instrText>
         </w:r>
         <w:r>
           <w:rPr>
@@ -1653,7 +1653,7 @@
           <w14:ligatures w14:val="standardContextual"/>
         </w:rPr>
       </w:pPr>
-      <w:hyperlink w:anchor="_Toc242972864" w:history="1">
+      <w:hyperlink w:anchor="_Toc242974578" w:history="1">
         <w:r>
           <w:rPr>
             <w:rStyle w:val="Hyperlink"/>
@@ -1699,7 +1699,7 @@
             <w:noProof/>
             <w:webHidden/>
           </w:rPr>
-          <w:instrText xml:space="preserve"> PAGEREF _Toc242972864 \h </w:instrText>
+          <w:instrText xml:space="preserve"> PAGEREF _Toc242974578 \h </w:instrText>
         </w:r>
         <w:r>
           <w:rPr>
@@ -1747,7 +1747,7 @@
           <w14:ligatures w14:val="standardContextual"/>
         </w:rPr>
       </w:pPr>
-      <w:hyperlink w:anchor="_Toc242972865" w:history="1">
+      <w:hyperlink w:anchor="_Toc242974579" w:history="1">
         <w:r>
           <w:rPr>
             <w:rStyle w:val="Hyperlink"/>
@@ -1793,7 +1793,7 @@
             <w:noProof/>
             <w:webHidden/>
           </w:rPr>
-          <w:instrText xml:space="preserve"> PAGEREF _Toc242972865 \h </w:instrText>
+          <w:instrText xml:space="preserve"> PAGEREF _Toc242974579 \h </w:instrText>
         </w:r>
         <w:r>
           <w:rPr>
@@ -1841,7 +1841,7 @@
           <w14:ligatures w14:val="standardContextual"/>
         </w:rPr>
       </w:pPr>
-      <w:hyperlink w:anchor="_Toc242972866" w:history="1">
+      <w:hyperlink w:anchor="_Toc242974580" w:history="1">
         <w:r>
           <w:rPr>
             <w:rStyle w:val="Hyperlink"/>
@@ -1887,7 +1887,7 @@
             <w:noProof/>
             <w:webHidden/>
           </w:rPr>
-          <w:instrText xml:space="preserve"> PAGEREF _Toc242972866 \h </w:instrText>
+          <w:instrText xml:space="preserve"> PAGEREF _Toc242974580 \h </w:instrText>
         </w:r>
         <w:r>
           <w:rPr>
@@ -1935,7 +1935,7 @@
           <w14:ligatures w14:val="standardContextual"/>
         </w:rPr>
       </w:pPr>
-      <w:hyperlink w:anchor="_Toc242972867" w:history="1">
+      <w:hyperlink w:anchor="_Toc242974581" w:history="1">
         <w:r>
           <w:rPr>
             <w:rStyle w:val="Hyperlink"/>
@@ -1981,7 +1981,7 @@
             <w:noProof/>
             <w:webHidden/>
           </w:rPr>
-          <w:instrText xml:space="preserve"> PAGEREF _Toc242972867 \h </w:instrText>
+          <w:instrText xml:space="preserve"> PAGEREF _Toc242974581 \h </w:instrText>
         </w:r>
         <w:r>
           <w:rPr>
@@ -2029,7 +2029,7 @@
           <w14:ligatures w14:val="standardContextual"/>
         </w:rPr>
       </w:pPr>
-      <w:hyperlink w:anchor="_Toc242972868" w:history="1">
+      <w:hyperlink w:anchor="_Toc242974582" w:history="1">
         <w:r>
           <w:rPr>
             <w:rStyle w:val="Hyperlink"/>
@@ -2075,7 +2075,7 @@
             <w:noProof/>
             <w:webHidden/>
           </w:rPr>
-          <w:instrText xml:space="preserve"> PAGEREF _Toc242972868 \h </w:instrText>
+          <w:instrText xml:space="preserve"> PAGEREF _Toc242974582 \h </w:instrText>
         </w:r>
         <w:r>
           <w:rPr>
@@ -2123,7 +2123,7 @@
           <w14:ligatures w14:val="standardContextual"/>
         </w:rPr>
       </w:pPr>
-      <w:hyperlink w:anchor="_Toc242972869" w:history="1">
+      <w:hyperlink w:anchor="_Toc242974583" w:history="1">
         <w:r>
           <w:rPr>
             <w:rStyle w:val="Hyperlink"/>
@@ -2169,7 +2169,7 @@
             <w:noProof/>
             <w:webHidden/>
           </w:rPr>
-          <w:instrText xml:space="preserve"> PAGEREF _Toc242972869 \h </w:instrText>
+          <w:instrText xml:space="preserve"> PAGEREF _Toc242974583 \h </w:instrText>
         </w:r>
         <w:r>
           <w:rPr>
@@ -2217,7 +2217,7 @@
           <w14:ligatures w14:val="standardContextual"/>
         </w:rPr>
       </w:pPr>
-      <w:hyperlink w:anchor="_Toc242972870" w:history="1">
+      <w:hyperlink w:anchor="_Toc242974584" w:history="1">
         <w:r>
           <w:rPr>
             <w:rStyle w:val="Hyperlink"/>
@@ -2263,7 +2263,7 @@
             <w:noProof/>
             <w:webHidden/>
           </w:rPr>
-          <w:instrText xml:space="preserve"> PAGEREF _Toc242972870 \h </w:instrText>
+          <w:instrText xml:space="preserve"> PAGEREF _Toc242974584 \h </w:instrText>
         </w:r>
         <w:r>
           <w:rPr>
@@ -2311,7 +2311,7 @@
           <w14:ligatures w14:val="standardContextual"/>
         </w:rPr>
       </w:pPr>
-      <w:hyperlink w:anchor="_Toc242972871" w:history="1">
+      <w:hyperlink w:anchor="_Toc242974585" w:history="1">
         <w:r>
           <w:rPr>
             <w:rStyle w:val="Hyperlink"/>
@@ -2357,7 +2357,7 @@
             <w:noProof/>
             <w:webHidden/>
           </w:rPr>
-          <w:instrText xml:space="preserve"> PAGEREF _Toc242972871 \h </w:instrText>
+          <w:instrText xml:space="preserve"> PAGEREF _Toc242974585 \h </w:instrText>
         </w:r>
         <w:r>
           <w:rPr>
@@ -2405,7 +2405,7 @@
           <w14:ligatures w14:val="standardContextual"/>
         </w:rPr>
       </w:pPr>
-      <w:hyperlink w:anchor="_Toc242972872" w:history="1">
+      <w:hyperlink w:anchor="_Toc242974586" w:history="1">
         <w:r>
           <w:rPr>
             <w:rStyle w:val="Hyperlink"/>
@@ -2451,7 +2451,7 @@
             <w:noProof/>
             <w:webHidden/>
           </w:rPr>
-          <w:instrText xml:space="preserve"> PAGEREF _Toc242972872 \h </w:instrText>
+          <w:instrText xml:space="preserve"> PAGEREF _Toc242974586 \h </w:instrText>
         </w:r>
         <w:r>
           <w:rPr>
@@ -2499,7 +2499,7 @@
           <w14:ligatures w14:val="standardContextual"/>
         </w:rPr>
       </w:pPr>
-      <w:hyperlink w:anchor="_Toc242972873" w:history="1">
+      <w:hyperlink w:anchor="_Toc242974587" w:history="1">
         <w:r>
           <w:rPr>
             <w:rStyle w:val="Hyperlink"/>
@@ -2545,7 +2545,7 @@
             <w:noProof/>
             <w:webHidden/>
           </w:rPr>
-          <w:instrText xml:space="preserve"> PAGEREF _Toc242972873 \h </w:instrText>
+          <w:instrText xml:space="preserve"> PAGEREF _Toc242974587 \h </w:instrText>
         </w:r>
         <w:r>
           <w:rPr>
@@ -2593,7 +2593,7 @@
           <w14:ligatures w14:val="standardContextual"/>
         </w:rPr>
       </w:pPr>
-      <w:hyperlink w:anchor="_Toc242972874" w:history="1">
+      <w:hyperlink w:anchor="_Toc242974588" w:history="1">
         <w:r>
           <w:rPr>
             <w:rStyle w:val="Hyperlink"/>
@@ -2639,7 +2639,7 @@
             <w:noProof/>
             <w:webHidden/>
           </w:rPr>
-          <w:instrText xml:space="preserve"> PAGEREF _Toc242972874 \h </w:instrText>
+          <w:instrText xml:space="preserve"> PAGEREF _Toc242974588 \h </w:instrText>
         </w:r>
         <w:r>
           <w:rPr>
@@ -2687,7 +2687,7 @@
           <w14:ligatures w14:val="standardContextual"/>
         </w:rPr>
       </w:pPr>
-      <w:hyperlink w:anchor="_Toc242972875" w:history="1">
+      <w:hyperlink w:anchor="_Toc242974589" w:history="1">
         <w:r>
           <w:rPr>
             <w:rStyle w:val="Hyperlink"/>
@@ -2733,7 +2733,7 @@
             <w:noProof/>
             <w:webHidden/>
           </w:rPr>
-          <w:instrText xml:space="preserve"> PAGEREF _Toc242972875 \h </w:instrText>
+          <w:instrText xml:space="preserve"> PAGEREF _Toc242974589 \h </w:instrText>
         </w:r>
         <w:r>
           <w:rPr>
@@ -2781,7 +2781,7 @@
           <w14:ligatures w14:val="standardContextual"/>
         </w:rPr>
       </w:pPr>
-      <w:hyperlink w:anchor="_Toc242972876" w:history="1">
+      <w:hyperlink w:anchor="_Toc242974590" w:history="1">
         <w:r>
           <w:rPr>
             <w:rStyle w:val="Hyperlink"/>
@@ -2827,7 +2827,7 @@
             <w:noProof/>
             <w:webHidden/>
           </w:rPr>
-          <w:instrText xml:space="preserve"> PAGEREF _Toc242972876 \h </w:instrText>
+          <w:instrText xml:space="preserve"> PAGEREF _Toc242974590 \h </w:instrText>
         </w:r>
         <w:r>
           <w:rPr>
@@ -2875,7 +2875,7 @@
           <w14:ligatures w14:val="standardContextual"/>
         </w:rPr>
       </w:pPr>
-      <w:hyperlink w:anchor="_Toc242972877" w:history="1">
+      <w:hyperlink w:anchor="_Toc242974591" w:history="1">
         <w:r>
           <w:rPr>
             <w:rStyle w:val="Hyperlink"/>
@@ -2921,7 +2921,7 @@
             <w:noProof/>
             <w:webHidden/>
           </w:rPr>
-          <w:instrText xml:space="preserve"> PAGEREF _Toc242972877 \h </w:instrText>
+          <w:instrText xml:space="preserve"> PAGEREF _Toc242974591 \h </w:instrText>
         </w:r>
         <w:r>
           <w:rPr>
@@ -2969,7 +2969,7 @@
           <w14:ligatures w14:val="standardContextual"/>
         </w:rPr>
       </w:pPr>
-      <w:hyperlink w:anchor="_Toc242972878" w:history="1">
+      <w:hyperlink w:anchor="_Toc242974592" w:history="1">
         <w:r>
           <w:rPr>
             <w:rStyle w:val="Hyperlink"/>
@@ -3015,7 +3015,7 @@
             <w:noProof/>
             <w:webHidden/>
           </w:rPr>
-          <w:instrText xml:space="preserve"> PAGEREF _Toc242972878 \h </w:instrText>
+          <w:instrText xml:space="preserve"> PAGEREF _Toc242974592 \h </w:instrText>
         </w:r>
         <w:r>
           <w:rPr>
@@ -3063,7 +3063,7 @@
           <w14:ligatures w14:val="standardContextual"/>
         </w:rPr>
       </w:pPr>
-      <w:hyperlink w:anchor="_Toc242972879" w:history="1">
+      <w:hyperlink w:anchor="_Toc242974593" w:history="1">
         <w:r>
           <w:rPr>
             <w:rStyle w:val="Hyperlink"/>
@@ -3109,7 +3109,7 @@
             <w:noProof/>
             <w:webHidden/>
           </w:rPr>
-          <w:instrText xml:space="preserve"> PAGEREF _Toc242972879 \h </w:instrText>
+          <w:instrText xml:space="preserve"> PAGEREF _Toc242974593 \h </w:instrText>
         </w:r>
         <w:r>
           <w:rPr>
@@ -3157,7 +3157,7 @@
           <w14:ligatures w14:val="standardContextual"/>
         </w:rPr>
       </w:pPr>
-      <w:hyperlink w:anchor="_Toc242972880" w:history="1">
+      <w:hyperlink w:anchor="_Toc242974594" w:history="1">
         <w:r>
           <w:rPr>
             <w:rStyle w:val="Hyperlink"/>
@@ -3203,7 +3203,7 @@
             <w:noProof/>
             <w:webHidden/>
           </w:rPr>
-          <w:instrText xml:space="preserve"> PAGEREF _Toc242972880 \h </w:instrText>
+          <w:instrText xml:space="preserve"> PAGEREF _Toc242974594 \h </w:instrText>
         </w:r>
         <w:r>
           <w:rPr>
@@ -3251,7 +3251,7 @@
           <w14:ligatures w14:val="standardContextual"/>
         </w:rPr>
       </w:pPr>
-      <w:hyperlink w:anchor="_Toc242972881" w:history="1">
+      <w:hyperlink w:anchor="_Toc242974595" w:history="1">
         <w:r>
           <w:rPr>
             <w:rStyle w:val="Hyperlink"/>
@@ -3297,7 +3297,7 @@
             <w:noProof/>
             <w:webHidden/>
           </w:rPr>
-          <w:instrText xml:space="preserve"> PAGEREF _Toc242972881 \h </w:instrText>
+          <w:instrText xml:space="preserve"> PAGEREF _Toc242974595 \h </w:instrText>
         </w:r>
         <w:r>
           <w:rPr>
@@ -3345,7 +3345,7 @@
           <w14:ligatures w14:val="standardContextual"/>
         </w:rPr>
       </w:pPr>
-      <w:hyperlink w:anchor="_Toc242972882" w:history="1">
+      <w:hyperlink w:anchor="_Toc242974596" w:history="1">
         <w:r>
           <w:rPr>
             <w:rStyle w:val="Hyperlink"/>
@@ -3391,7 +3391,7 @@
             <w:noProof/>
             <w:webHidden/>
           </w:rPr>
-          <w:instrText xml:space="preserve"> PAGEREF _Toc242972882 \h </w:instrText>
+          <w:instrText xml:space="preserve"> PAGEREF _Toc242974596 \h </w:instrText>
         </w:r>
         <w:r>
           <w:rPr>
@@ -3439,7 +3439,7 @@
           <w14:ligatures w14:val="standardContextual"/>
         </w:rPr>
       </w:pPr>
-      <w:hyperlink w:anchor="_Toc242972883" w:history="1">
+      <w:hyperlink w:anchor="_Toc242974597" w:history="1">
         <w:r>
           <w:rPr>
             <w:rStyle w:val="Hyperlink"/>
@@ -3485,7 +3485,7 @@
             <w:noProof/>
             <w:webHidden/>
           </w:rPr>
-          <w:instrText xml:space="preserve"> PAGEREF _Toc242972883 \h </w:instrText>
+          <w:instrText xml:space="preserve"> PAGEREF _Toc242974597 \h </w:instrText>
         </w:r>
         <w:r>
           <w:rPr>
@@ -3533,7 +3533,7 @@
           <w14:ligatures w14:val="standardContextual"/>
         </w:rPr>
       </w:pPr>
-      <w:hyperlink w:anchor="_Toc242972884" w:history="1">
+      <w:hyperlink w:anchor="_Toc242974598" w:history="1">
         <w:r>
           <w:rPr>
             <w:rStyle w:val="Hyperlink"/>
@@ -3579,7 +3579,7 @@
             <w:noProof/>
             <w:webHidden/>
           </w:rPr>
-          <w:instrText xml:space="preserve"> PAGEREF _Toc242972884 \h </w:instrText>
+          <w:instrText xml:space="preserve"> PAGEREF _Toc242974598 \h </w:instrText>
         </w:r>
         <w:r>
           <w:rPr>
@@ -3627,7 +3627,7 @@
           <w14:ligatures w14:val="standardContextual"/>
         </w:rPr>
       </w:pPr>
-      <w:hyperlink w:anchor="_Toc242972885" w:history="1">
+      <w:hyperlink w:anchor="_Toc242974599" w:history="1">
         <w:r>
           <w:rPr>
             <w:rStyle w:val="Hyperlink"/>
@@ -3673,7 +3673,7 @@
             <w:noProof/>
             <w:webHidden/>
           </w:rPr>
-          <w:instrText xml:space="preserve"> PAGEREF _Toc242972885 \h </w:instrText>
+          <w:instrText xml:space="preserve"> PAGEREF _Toc242974599 \h </w:instrText>
         </w:r>
         <w:r>
           <w:rPr>
@@ -3721,7 +3721,7 @@
           <w14:ligatures w14:val="standardContextual"/>
         </w:rPr>
       </w:pPr>
-      <w:hyperlink w:anchor="_Toc242972886" w:history="1">
+      <w:hyperlink w:anchor="_Toc242974600" w:history="1">
         <w:r>
           <w:rPr>
             <w:rStyle w:val="Hyperlink"/>
@@ -3767,7 +3767,7 @@
             <w:noProof/>
             <w:webHidden/>
           </w:rPr>
-          <w:instrText xml:space="preserve"> PAGEREF _Toc242972886 \h </w:instrText>
+          <w:instrText xml:space="preserve"> PAGEREF _Toc242974600 \h </w:instrText>
         </w:r>
         <w:r>
           <w:rPr>
@@ -3815,7 +3815,7 @@
           <w14:ligatures w14:val="standardContextual"/>
         </w:rPr>
       </w:pPr>
-      <w:hyperlink w:anchor="_Toc242972887" w:history="1">
+      <w:hyperlink w:anchor="_Toc242974601" w:history="1">
         <w:r>
           <w:rPr>
             <w:rStyle w:val="Hyperlink"/>
@@ -3861,7 +3861,7 @@
             <w:noProof/>
             <w:webHidden/>
           </w:rPr>
-          <w:instrText xml:space="preserve"> PAGEREF _Toc242972887 \h </w:instrText>
+          <w:instrText xml:space="preserve"> PAGEREF _Toc242974601 \h </w:instrText>
         </w:r>
         <w:r>
           <w:rPr>
@@ -3909,7 +3909,7 @@
           <w14:ligatures w14:val="standardContextual"/>
         </w:rPr>
       </w:pPr>
-      <w:hyperlink w:anchor="_Toc242972888" w:history="1">
+      <w:hyperlink w:anchor="_Toc242974602" w:history="1">
         <w:r>
           <w:rPr>
             <w:rStyle w:val="Hyperlink"/>
@@ -3955,7 +3955,7 @@
             <w:noProof/>
             <w:webHidden/>
           </w:rPr>
-          <w:instrText xml:space="preserve"> PAGEREF _Toc242972888 \h </w:instrText>
+          <w:instrText xml:space="preserve"> PAGEREF _Toc242974602 \h </w:instrText>
         </w:r>
         <w:r>
           <w:rPr>
@@ -4003,7 +4003,7 @@
           <w14:ligatures w14:val="standardContextual"/>
         </w:rPr>
       </w:pPr>
-      <w:hyperlink w:anchor="_Toc242972889" w:history="1">
+      <w:hyperlink w:anchor="_Toc242974603" w:history="1">
         <w:r>
           <w:rPr>
             <w:rStyle w:val="Hyperlink"/>
@@ -4049,7 +4049,7 @@
             <w:noProof/>
             <w:webHidden/>
           </w:rPr>
-          <w:instrText xml:space="preserve"> PAGEREF _Toc242972889 \h </w:instrText>
+          <w:instrText xml:space="preserve"> PAGEREF _Toc242974603 \h </w:instrText>
         </w:r>
         <w:r>
           <w:rPr>
@@ -4097,7 +4097,7 @@
           <w14:ligatures w14:val="standardContextual"/>
         </w:rPr>
       </w:pPr>
-      <w:hyperlink w:anchor="_Toc242972890" w:history="1">
+      <w:hyperlink w:anchor="_Toc242974604" w:history="1">
         <w:r>
           <w:rPr>
             <w:rStyle w:val="Hyperlink"/>
@@ -4143,7 +4143,7 @@
             <w:noProof/>
             <w:webHidden/>
           </w:rPr>
-          <w:instrText xml:space="preserve"> PAGEREF _Toc242972890 \h </w:instrText>
+          <w:instrText xml:space="preserve"> PAGEREF _Toc242974604 \h </w:instrText>
         </w:r>
         <w:r>
           <w:rPr>
@@ -4191,7 +4191,7 @@
           <w14:ligatures w14:val="standardContextual"/>
         </w:rPr>
       </w:pPr>
-      <w:hyperlink w:anchor="_Toc242972891" w:history="1">
+      <w:hyperlink w:anchor="_Toc242974605" w:history="1">
         <w:r>
           <w:rPr>
             <w:rStyle w:val="Hyperlink"/>
@@ -4237,7 +4237,7 @@
             <w:noProof/>
             <w:webHidden/>
           </w:rPr>
-          <w:instrText xml:space="preserve"> PAGEREF _Toc242972891 \h </w:instrText>
+          <w:instrText xml:space="preserve"> PAGEREF _Toc242974605 \h </w:instrText>
         </w:r>
         <w:r>
           <w:rPr>
@@ -4285,7 +4285,7 @@
           <w14:ligatures w14:val="standardContextual"/>
         </w:rPr>
       </w:pPr>
-      <w:hyperlink w:anchor="_Toc242972892" w:history="1">
+      <w:hyperlink w:anchor="_Toc242974606" w:history="1">
         <w:r>
           <w:rPr>
             <w:rStyle w:val="Hyperlink"/>
@@ -4331,7 +4331,7 @@
             <w:noProof/>
             <w:webHidden/>
           </w:rPr>
-          <w:instrText xml:space="preserve"> PAGEREF _Toc242972892 \h </w:instrText>
+          <w:instrText xml:space="preserve"> PAGEREF _Toc242974606 \h </w:instrText>
         </w:r>
         <w:r>
           <w:rPr>
@@ -4379,7 +4379,7 @@
           <w14:ligatures w14:val="standardContextual"/>
         </w:rPr>
       </w:pPr>
-      <w:hyperlink w:anchor="_Toc242972893" w:history="1">
+      <w:hyperlink w:anchor="_Toc242974607" w:history="1">
         <w:r>
           <w:rPr>
             <w:rStyle w:val="Hyperlink"/>
@@ -4425,7 +4425,7 @@
             <w:noProof/>
             <w:webHidden/>
           </w:rPr>
-          <w:instrText xml:space="preserve"> PAGEREF _Toc242972893 \h </w:instrText>
+          <w:instrText xml:space="preserve"> PAGEREF _Toc242974607 \h </w:instrText>
         </w:r>
         <w:r>
           <w:rPr>
@@ -4473,7 +4473,7 @@
           <w14:ligatures w14:val="standardContextual"/>
         </w:rPr>
       </w:pPr>
-      <w:hyperlink w:anchor="_Toc242972894" w:history="1">
+      <w:hyperlink w:anchor="_Toc242974608" w:history="1">
         <w:r>
           <w:rPr>
             <w:rStyle w:val="Hyperlink"/>
@@ -4519,7 +4519,7 @@
             <w:noProof/>
             <w:webHidden/>
           </w:rPr>
-          <w:instrText xml:space="preserve"> PAGEREF _Toc242972894 \h </w:instrText>
+          <w:instrText xml:space="preserve"> PAGEREF _Toc242974608 \h </w:instrText>
         </w:r>
         <w:r>
           <w:rPr>
@@ -4559,7 +4559,7 @@
       <w:pPr>
         <w:pStyle w:val="Heading1"/>
       </w:pPr>
-      <w:bookmarkStart w:id="0" w:name="_Toc242972848"/>
+      <w:bookmarkStart w:id="0" w:name="_Toc242974562"/>
       <w:r>
         <w:lastRenderedPageBreak/>
         <w:t>Overview</w:t>
@@ -4716,7 +4716,7 @@
       <w:pPr>
         <w:pStyle w:val="Heading1"/>
       </w:pPr>
-      <w:bookmarkStart w:id="1" w:name="_Toc242972849"/>
+      <w:bookmarkStart w:id="1" w:name="_Toc242974563"/>
       <w:r>
         <w:lastRenderedPageBreak/>
         <w:t>Installation</w:t>
@@ -4759,7 +4759,7 @@
       <w:pPr>
         <w:pStyle w:val="Heading2"/>
       </w:pPr>
-      <w:bookmarkStart w:id="2" w:name="_Toc242972850"/>
+      <w:bookmarkStart w:id="2" w:name="_Toc242974564"/>
       <w:r>
         <w:t>Automatic installation</w:t>
       </w:r>
@@ -5108,7 +5108,7 @@
       <w:pPr>
         <w:pStyle w:val="Heading2"/>
       </w:pPr>
-      <w:bookmarkStart w:id="3" w:name="_Toc242972851"/>
+      <w:bookmarkStart w:id="3" w:name="_Toc242974565"/>
       <w:r>
         <w:t>Manual installation</w:t>
       </w:r>
@@ -5271,7 +5271,7 @@
       <w:pPr>
         <w:pStyle w:val="Heading2"/>
       </w:pPr>
-      <w:bookmarkStart w:id="4" w:name="_Toc242972852"/>
+      <w:bookmarkStart w:id="4" w:name="_Toc242974566"/>
       <w:r>
         <w:lastRenderedPageBreak/>
         <w:t>Testing the installation</w:t>
@@ -5481,7 +5481,7 @@
       <w:pPr>
         <w:pStyle w:val="Heading2"/>
       </w:pPr>
-      <w:bookmarkStart w:id="5" w:name="_Toc242972853"/>
+      <w:bookmarkStart w:id="5" w:name="_Toc242974567"/>
       <w:r>
         <w:t>GPU support (if you have an NVIDIA GPU)</w:t>
       </w:r>
@@ -5914,7 +5914,7 @@
       <w:pPr>
         <w:pStyle w:val="Heading2"/>
       </w:pPr>
-      <w:bookmarkStart w:id="6" w:name="_Toc242972854"/>
+      <w:bookmarkStart w:id="6" w:name="_Toc242974568"/>
       <w:r>
         <w:t>Pre-compiled kernels</w:t>
       </w:r>
@@ -5995,7 +5995,7 @@
       <w:pPr>
         <w:pStyle w:val="Heading1"/>
       </w:pPr>
-      <w:bookmarkStart w:id="7" w:name="_Toc242972855"/>
+      <w:bookmarkStart w:id="7" w:name="_Toc242974569"/>
       <w:r>
         <w:lastRenderedPageBreak/>
         <w:t>Input Handling</w:t>
@@ -6472,7 +6472,7 @@
       <w:pPr>
         <w:pStyle w:val="Heading2"/>
       </w:pPr>
-      <w:bookmarkStart w:id="8" w:name="_Toc242972856"/>
+      <w:bookmarkStart w:id="8" w:name="_Toc242974570"/>
       <w:r>
         <w:t>External Data Sources</w:t>
       </w:r>
@@ -7082,7 +7082,7 @@
       <w:pPr>
         <w:pStyle w:val="Heading2"/>
       </w:pPr>
-      <w:bookmarkStart w:id="9" w:name="_Toc242972857"/>
+      <w:bookmarkStart w:id="9" w:name="_Toc242974571"/>
       <w:r>
         <w:lastRenderedPageBreak/>
         <w:t>Event Selection (Watcher)</w:t>
@@ -7588,7 +7588,7 @@
       <w:pPr>
         <w:pStyle w:val="Heading1"/>
       </w:pPr>
-      <w:bookmarkStart w:id="10" w:name="_Toc242972858"/>
+      <w:bookmarkStart w:id="10" w:name="_Toc242974572"/>
       <w:r>
         <w:lastRenderedPageBreak/>
         <w:t>Station and Signal Selection</w:t>
@@ -7718,7 +7718,7 @@
       <w:pPr>
         <w:pStyle w:val="Heading2"/>
       </w:pPr>
-      <w:bookmarkStart w:id="11" w:name="_Toc242972859"/>
+      <w:bookmarkStart w:id="11" w:name="_Toc242974573"/>
       <w:r>
         <w:t>Step 1 — Retrieve the event</w:t>
       </w:r>
@@ -7736,7 +7736,7 @@
       <w:pPr>
         <w:pStyle w:val="Heading2"/>
       </w:pPr>
-      <w:bookmarkStart w:id="12" w:name="_Toc242972860"/>
+      <w:bookmarkStart w:id="12" w:name="_Toc242974574"/>
       <w:r>
         <w:t>Step 2 — Retrieve the station metadata</w:t>
       </w:r>
@@ -8506,7 +8506,7 @@
       <w:pPr>
         <w:pStyle w:val="Heading2"/>
       </w:pPr>
-      <w:bookmarkStart w:id="13" w:name="_Toc242972861"/>
+      <w:bookmarkStart w:id="13" w:name="_Toc242974575"/>
       <w:r>
         <w:t>Step 3 — Download the waveforms</w:t>
       </w:r>
@@ -8524,7 +8524,7 @@
       <w:pPr>
         <w:pStyle w:val="Heading2"/>
       </w:pPr>
-      <w:bookmarkStart w:id="14" w:name="_Toc242972862"/>
+      <w:bookmarkStart w:id="14" w:name="_Toc242974576"/>
       <w:r>
         <w:t>Step 4 — Quality checks and instrument correction</w:t>
       </w:r>
@@ -9073,7 +9073,7 @@
       <w:pPr>
         <w:pStyle w:val="Heading2"/>
       </w:pPr>
-      <w:bookmarkStart w:id="15" w:name="_Toc242972863"/>
+      <w:bookmarkStart w:id="15" w:name="_Toc242974577"/>
       <w:r>
         <w:t>Step 5 — Azimuthal selection</w:t>
       </w:r>
@@ -9256,7 +9256,7 @@
       <w:pPr>
         <w:pStyle w:val="Heading1"/>
       </w:pPr>
-      <w:bookmarkStart w:id="16" w:name="_Toc242972864"/>
+      <w:bookmarkStart w:id="16" w:name="_Toc242974578"/>
       <w:r>
         <w:lastRenderedPageBreak/>
         <w:t>Computation Configuration</w:t>
@@ -9340,7 +9340,7 @@
       <w:pPr>
         <w:pStyle w:val="Heading2"/>
       </w:pPr>
-      <w:bookmarkStart w:id="17" w:name="_Toc242972865"/>
+      <w:bookmarkStart w:id="17" w:name="_Toc242974579"/>
       <w:r>
         <w:t>Green's Functions</w:t>
       </w:r>
@@ -9350,7 +9350,7 @@
       <w:pPr>
         <w:pStyle w:val="Heading3"/>
       </w:pPr>
-      <w:bookmarkStart w:id="18" w:name="_Toc242972866"/>
+      <w:bookmarkStart w:id="18" w:name="_Toc242974580"/>
       <w:r>
         <w:t>Regional velocity models</w:t>
       </w:r>
@@ -9535,7 +9535,7 @@
       <w:pPr>
         <w:pStyle w:val="Heading3"/>
       </w:pPr>
-      <w:bookmarkStart w:id="19" w:name="_Toc242972867"/>
+      <w:bookmarkStart w:id="19" w:name="_Toc242974581"/>
       <w:r>
         <w:t>Source grid</w:t>
       </w:r>
@@ -9993,7 +9993,7 @@
       <w:pPr>
         <w:pStyle w:val="Heading3"/>
       </w:pPr>
-      <w:bookmarkStart w:id="20" w:name="_Toc242972868"/>
+      <w:bookmarkStart w:id="20" w:name="_Toc242974582"/>
       <w:r>
         <w:t>Frequency content</w:t>
       </w:r>
@@ -10116,7 +10116,7 @@
       <w:pPr>
         <w:pStyle w:val="Heading2"/>
       </w:pPr>
-      <w:bookmarkStart w:id="21" w:name="_Toc242972869"/>
+      <w:bookmarkStart w:id="21" w:name="_Toc242974583"/>
       <w:r>
         <w:lastRenderedPageBreak/>
         <w:t>Inversion Parameters</w:t>
@@ -10135,7 +10135,7 @@
       <w:pPr>
         <w:pStyle w:val="Heading3"/>
       </w:pPr>
-      <w:bookmarkStart w:id="22" w:name="_Toc242972870"/>
+      <w:bookmarkStart w:id="22" w:name="_Toc242974584"/>
       <w:r>
         <w:t>Frequency band</w:t>
       </w:r>
@@ -10300,7 +10300,7 @@
       <w:pPr>
         <w:pStyle w:val="Heading3"/>
       </w:pPr>
-      <w:bookmarkStart w:id="23" w:name="_Toc242972871"/>
+      <w:bookmarkStart w:id="23" w:name="_Toc242974585"/>
       <w:r>
         <w:t>Waveform window</w:t>
       </w:r>
@@ -10485,7 +10485,7 @@
       <w:pPr>
         <w:pStyle w:val="Heading3"/>
       </w:pPr>
-      <w:bookmarkStart w:id="24" w:name="_Toc242972872"/>
+      <w:bookmarkStart w:id="24" w:name="_Toc242974586"/>
       <w:r>
         <w:lastRenderedPageBreak/>
         <w:t>Centroid time search</w:t>
@@ -10629,7 +10629,7 @@
       <w:pPr>
         <w:pStyle w:val="Heading3"/>
       </w:pPr>
-      <w:bookmarkStart w:id="25" w:name="_Toc242972873"/>
+      <w:bookmarkStart w:id="25" w:name="_Toc242974587"/>
       <w:r>
         <w:t>Source time function</w:t>
       </w:r>
@@ -10758,7 +10758,7 @@
       <w:pPr>
         <w:pStyle w:val="Heading3"/>
       </w:pPr>
-      <w:bookmarkStart w:id="26" w:name="_Toc242972874"/>
+      <w:bookmarkStart w:id="26" w:name="_Toc242974588"/>
       <w:r>
         <w:t>Deviatoric and full moment tensor</w:t>
       </w:r>
@@ -10925,7 +10925,7 @@
       <w:pPr>
         <w:pStyle w:val="Heading2"/>
       </w:pPr>
-      <w:bookmarkStart w:id="27" w:name="_Toc242972875"/>
+      <w:bookmarkStart w:id="27" w:name="_Toc242974589"/>
       <w:r>
         <w:lastRenderedPageBreak/>
         <w:t>Bayesian Bootstrap</w:t>
@@ -10937,7 +10937,7 @@
         <w:jc w:val="both"/>
       </w:pPr>
       <w:r>
-        <w:t>The Bayesian bootstrap is used to characterize the solution statistically (Zahradník et al. 2026). The inversion is repeated Iterations times (default 100), each time with a different random set of station weights drawn from a Dirichlet distribution. The weights adjust the relative importance of the stations, and all components of a station share the same weight. In each repetition, the best-fitting solutions (NBEST) are retained.</w:t>
+        <w:t>The Bayesian bootstrap is used to characterize the solution statistically (Zahradník et al. 2026). The inversion is repeated Iterations times (default 1000), each time with a different random set of station weights drawn from a Dirichlet distribution. The weights adjust the relative importance of the stations, and all components of a station share the same weight. In each repetition, the best-fitting solutions (NBEST) are retained.</w:t>
       </w:r>
     </w:p>
     <w:tbl>
@@ -11010,7 +11010,7 @@
                 <w:color w:val="1A1A1A"/>
                 <w:sz w:val="18"/>
               </w:rPr>
-              <w:t xml:space="preserve">  Iterations: 100       # number of random sets of station weights</w:t>
+              <w:t xml:space="preserve">  Iterations: 1000      # number of random sets of station weights</w:t>
             </w:r>
           </w:p>
           <w:p>
@@ -11024,7 +11024,7 @@
                 <w:color w:val="1A1A1A"/>
                 <w:sz w:val="18"/>
               </w:rPr>
-              <w:t xml:space="preserve">  KeepFraction: 0.02    # NBEST: fraction of (point, shift) pairs</w:t>
+              <w:t xml:space="preserve">  KeepFraction: 0       # NBEST: fraction of (point, shift) pairs</w:t>
             </w:r>
           </w:p>
           <w:p>
@@ -11324,7 +11324,7 @@
               <w:rPr>
                 <w:sz w:val="19"/>
               </w:rPr>
-              <w:t>number of bootstrap iterations, each with its own random set of station weights (default 100).</w:t>
+              <w:t>number of bootstrap iterations, each with its own random set of station weights (default 1000).</w:t>
             </w:r>
           </w:p>
         </w:tc>
@@ -11386,7 +11386,7 @@
               <w:rPr>
                 <w:sz w:val="19"/>
               </w:rPr>
-              <w:t>NBEST, the number of best (grid point, time shift) pairs kept in each repetition, as a fraction of all pairs in the centroid box (0.02 in the example, 0.1 if the key is missing). With 0, only the single best pair is kept in each repetition, as in the original Bayesian bootstrap. A positive fraction also keeps near-optimal pairs, which gives a smoother ensemble with wider intervals, as in ISOLA-BaBoo (Zahradník et al. 2026). A grid point can enter several times with different time shifts.</w:t>
+              <w:t>NBEST, the number of best (grid point, time shift) pairs kept in each repetition, as a fraction of all pairs in the centroid box (0 in the example, 0.1 if the key is missing). With 0, the default of the configuration file, only the single best pair is kept in each repetition, as in the original Bayesian bootstrap. A positive fraction also keeps the near-optimal pairs of each repetition, to reduce the overconfidence of a single best-fit solution, as in ISOLA-BaBoo (Zahradník et al., 2026). A grid point can enter several times with different time shifts.</w:t>
             </w:r>
           </w:p>
         </w:tc>
@@ -11576,7 +11576,11 @@
         <w:t>Accepted solutions (KeepFraction):</w:t>
       </w:r>
       <w:r>
-        <w:t xml:space="preserve"> NBEST is derived from the fraction as NBEST = KeepFraction × (number of grid points in the search region × number of time shifts), rounded down and at least 1. With 0, NBEST = 1: only the best solution of each repetition is kept, as in the original, strict Bayesian bootstrap. A positive fraction also keeps near-optimal solutions, which gives a smoother ensemble with wider intervals, as in ISOLA-BaBoo.</w:t>
+        <w:t xml:space="preserve"> NBEST is derived from the fraction as NBEST = KeepFraction × (number of grid points in the search region × number of time shifts), rounded down and at least 1. With 0, NBEST = 1: only the best solution of each repetition is kept, as in the original, strict Bayesian bootstrap. A positive fraction also keeps the near-optimal solutions of each repetition, to reduce </w:t>
+      </w:r>
+      <w:r>
+        <w:lastRenderedPageBreak/>
+        <w:t>the overconfidence of a single best-fit solution, as in ISOLA-BaBoo (Zahradník et al., 2026). As in that paper, the median solution changes little with the fraction, while the intervals depend on it.</w:t>
       </w:r>
     </w:p>
     <w:p>
@@ -11584,15 +11588,22 @@
         <w:jc w:val="both"/>
       </w:pPr>
       <w:r>
-        <w:lastRenderedPageBreak/>
-        <w:t>The result is an ensemble of NBEST × Iterations solutions. From it, Gisola-BaBoo computes the mean moment tensor, with its nodal planes, and the mean values and the 68 % and 95 % confidence intervals of the tensor components, M0, Mw, DC, CLVD, ISO, the centroid position and the centroid time.</w:t>
+        <w:t>By default, Gisola-BaBoo runs the original Bayesian bootstrap: Iterations = 1000 and KeepFraction = 0, so that each repetition gives its single best solution. To run the ISOLA-BaBoo version, set Iterations = 100 and a positive KeepFraction, for example 0.02.</w:t>
       </w:r>
     </w:p>
     <w:p>
       <w:pPr>
+        <w:jc w:val="both"/>
+      </w:pPr>
+      <w:r>
+        <w:t>The result is an ensemble of NBEST × Iterations solutions. From it, Gisola-BaBoo computes the mean moment tensor, with its nodal planes, and the mean values and the 68 % and 95 % confidence intervals of the tensor components, M0, Mw, DC, CLVD, ISO, the centroid position and the centroid time.</w:t>
+      </w:r>
+    </w:p>
+    <w:p>
+      <w:pPr>
         <w:pStyle w:val="Heading1"/>
       </w:pPr>
-      <w:bookmarkStart w:id="28" w:name="_Toc242972876"/>
+      <w:bookmarkStart w:id="28" w:name="_Toc242974590"/>
       <w:r>
         <w:lastRenderedPageBreak/>
         <w:t>Outputs</w:t>
@@ -11927,7 +11938,7 @@
       <w:pPr>
         <w:pStyle w:val="Heading2"/>
       </w:pPr>
-      <w:bookmarkStart w:id="29" w:name="_Toc242972877"/>
+      <w:bookmarkStart w:id="29" w:name="_Toc242974591"/>
       <w:r>
         <w:t>Result files</w:t>
       </w:r>
@@ -12782,7 +12793,7 @@
       <w:pPr>
         <w:pStyle w:val="Heading2"/>
       </w:pPr>
-      <w:bookmarkStart w:id="30" w:name="_Toc242972878"/>
+      <w:bookmarkStart w:id="30" w:name="_Toc242974592"/>
       <w:r>
         <w:t>Figures</w:t>
       </w:r>
@@ -14031,7 +14042,7 @@
       <w:pPr>
         <w:pStyle w:val="Heading2"/>
       </w:pPr>
-      <w:bookmarkStart w:id="31" w:name="_Toc242972879"/>
+      <w:bookmarkStart w:id="31" w:name="_Toc242974593"/>
       <w:r>
         <w:t>Web pages</w:t>
       </w:r>
@@ -14459,7 +14470,7 @@
       <w:pPr>
         <w:pStyle w:val="Heading2"/>
       </w:pPr>
-      <w:bookmarkStart w:id="32" w:name="_Toc242972880"/>
+      <w:bookmarkStart w:id="32" w:name="_Toc242974594"/>
       <w:r>
         <w:t>Log</w:t>
       </w:r>
@@ -14477,7 +14488,7 @@
       <w:pPr>
         <w:pStyle w:val="Heading1"/>
       </w:pPr>
-      <w:bookmarkStart w:id="33" w:name="_Toc242972881"/>
+      <w:bookmarkStart w:id="33" w:name="_Toc242974595"/>
       <w:r>
         <w:lastRenderedPageBreak/>
         <w:t>Other Settings</w:t>
@@ -15367,7 +15378,7 @@
       <w:pPr>
         <w:pStyle w:val="Heading1"/>
       </w:pPr>
-      <w:bookmarkStart w:id="34" w:name="_Toc242972882"/>
+      <w:bookmarkStart w:id="34" w:name="_Toc242974596"/>
       <w:r>
         <w:lastRenderedPageBreak/>
         <w:t>Usage</w:t>
@@ -15751,7 +15762,7 @@
       <w:pPr>
         <w:pStyle w:val="Heading2"/>
       </w:pPr>
-      <w:bookmarkStart w:id="35" w:name="_Toc242972883"/>
+      <w:bookmarkStart w:id="35" w:name="_Toc242974597"/>
       <w:r>
         <w:t>Single event (-e)</w:t>
       </w:r>
@@ -16040,7 +16051,7 @@
       <w:pPr>
         <w:pStyle w:val="Heading2"/>
       </w:pPr>
-      <w:bookmarkStart w:id="36" w:name="_Toc242972884"/>
+      <w:bookmarkStart w:id="36" w:name="_Toc242974598"/>
       <w:r>
         <w:lastRenderedPageBreak/>
         <w:t>Event file (--event-file)</w:t>
@@ -16379,7 +16390,7 @@
       <w:pPr>
         <w:pStyle w:val="Heading2"/>
       </w:pPr>
-      <w:bookmarkStart w:id="37" w:name="_Toc242972885"/>
+      <w:bookmarkStart w:id="37" w:name="_Toc242974599"/>
       <w:r>
         <w:t>QuakeML file (--event-xml)</w:t>
       </w:r>
@@ -16446,7 +16457,7 @@
       <w:pPr>
         <w:pStyle w:val="Heading2"/>
       </w:pPr>
-      <w:bookmarkStart w:id="38" w:name="_Toc242972886"/>
+      <w:bookmarkStart w:id="38" w:name="_Toc242974600"/>
       <w:r>
         <w:t>Datetime range (-d)</w:t>
       </w:r>
@@ -16525,7 +16536,7 @@
       <w:pPr>
         <w:pStyle w:val="Heading2"/>
       </w:pPr>
-      <w:bookmarkStart w:id="39" w:name="_Toc242972887"/>
+      <w:bookmarkStart w:id="39" w:name="_Toc242974601"/>
       <w:r>
         <w:lastRenderedPageBreak/>
         <w:t>Real time (--real-time)</w:t>
@@ -16686,7 +16697,7 @@
       <w:pPr>
         <w:pStyle w:val="Heading2"/>
       </w:pPr>
-      <w:bookmarkStart w:id="40" w:name="_Toc242972888"/>
+      <w:bookmarkStart w:id="40" w:name="_Toc242974602"/>
       <w:r>
         <w:t>Revise (--revise)</w:t>
       </w:r>
@@ -17677,7 +17688,7 @@
       <w:pPr>
         <w:pStyle w:val="Heading2"/>
       </w:pPr>
-      <w:bookmarkStart w:id="41" w:name="_Toc242972889"/>
+      <w:bookmarkStart w:id="41" w:name="_Toc242974603"/>
       <w:r>
         <w:t>Web pages (--home)</w:t>
       </w:r>
@@ -17868,7 +17879,7 @@
       <w:pPr>
         <w:pStyle w:val="Heading2"/>
       </w:pPr>
-      <w:bookmarkStart w:id="42" w:name="_Toc242972890"/>
+      <w:bookmarkStart w:id="42" w:name="_Toc242974604"/>
       <w:r>
         <w:t>PPSD tool (for ppsdoffline)</w:t>
       </w:r>
@@ -17985,7 +17996,7 @@
       <w:pPr>
         <w:pStyle w:val="Heading2"/>
       </w:pPr>
-      <w:bookmarkStart w:id="43" w:name="_Toc242972891"/>
+      <w:bookmarkStart w:id="43" w:name="_Toc242974605"/>
       <w:r>
         <w:t>Runtime Overrides</w:t>
       </w:r>
@@ -19451,7 +19462,7 @@
       <w:pPr>
         <w:pStyle w:val="Heading2"/>
       </w:pPr>
-      <w:bookmarkStart w:id="44" w:name="_Toc242972892"/>
+      <w:bookmarkStart w:id="44" w:name="_Toc242974606"/>
       <w:r>
         <w:t>Operational Notes</w:t>
       </w:r>
@@ -19793,7 +19804,7 @@
       <w:pPr>
         <w:pStyle w:val="Heading1"/>
       </w:pPr>
-      <w:bookmarkStart w:id="45" w:name="_Toc242972893"/>
+      <w:bookmarkStart w:id="45" w:name="_Toc242974607"/>
       <w:r>
         <w:lastRenderedPageBreak/>
         <w:t>References</w:t>
@@ -19834,7 +19845,7 @@
       <w:pPr>
         <w:pStyle w:val="Heading1"/>
       </w:pPr>
-      <w:bookmarkStart w:id="46" w:name="_Toc242972894"/>
+      <w:bookmarkStart w:id="46" w:name="_Toc242974608"/>
       <w:r>
         <w:lastRenderedPageBreak/>
         <w:t>Acknowledgments</w:t>

</xml_diff>